<commit_message>
refactor: Expand Introduction with institutional affiliation, mission, and normative functions from municipal decree
</commit_message>
<xml_diff>
--- a/Plan_Trabajo_Concurso_Jefatura_Software.docx
+++ b/Plan_Trabajo_Concurso_Jefatura_Software.docx
@@ -3723,7 +3723,7 @@
     <w:link w:val="EncabezadoCar"/>
     <w:uiPriority w:val="99"/>
     <w:unhideWhenUsed/>
-    <w:rsid w:val="00353CAA"/>
+    <w:rsid w:val="00601D12"/>
     <w:pPr>
       <w:tabs>
         <w:tab w:val="center" w:pos="4252"/>
@@ -3737,7 +3737,7 @@
     <w:basedOn w:val="Fuentedeprrafopredeter"/>
     <w:link w:val="Encabezado"/>
     <w:uiPriority w:val="99"/>
-    <w:rsid w:val="00353CAA"/>
+    <w:rsid w:val="00601D12"/>
   </w:style>
   <w:style w:type="paragraph" w:styleId="Piedepgina">
     <w:name w:val="footer"/>
@@ -3745,7 +3745,7 @@
     <w:link w:val="PiedepginaCar"/>
     <w:uiPriority w:val="99"/>
     <w:unhideWhenUsed/>
-    <w:rsid w:val="00353CAA"/>
+    <w:rsid w:val="00601D12"/>
     <w:pPr>
       <w:tabs>
         <w:tab w:val="center" w:pos="4252"/>
@@ -3759,7 +3759,7 @@
     <w:basedOn w:val="Fuentedeprrafopredeter"/>
     <w:link w:val="Piedepgina"/>
     <w:uiPriority w:val="99"/>
-    <w:rsid w:val="00353CAA"/>
+    <w:rsid w:val="00601D12"/>
   </w:style>
 </w:styles>
 </file>

</xml_diff>

<commit_message>
fix: Ensure docx build reads updated md with institutional functions and intro
</commit_message>
<xml_diff>
--- a/Plan_Trabajo_Concurso_Jefatura_Software.docx
+++ b/Plan_Trabajo_Concurso_Jefatura_Software.docx
@@ -536,6 +536,24 @@
     </w:p>
     <w:p>
       <w:pPr>
+        <w:spacing w:before="200" w:after="60" w:line="240" w:lineRule="auto"/>
+        <w:rPr>
+          <w:rFonts w:ascii="Arial" w:hAnsi="Arial" w:cs="Arial"/>
+          <w:b/>
+          <w:color w:val="222222"/>
+        </w:rPr>
+      </w:pPr>
+      <w:r>
+        <w:rPr>
+          <w:rFonts w:ascii="Arial" w:hAnsi="Arial" w:cs="Arial"/>
+          <w:b/>
+          <w:color w:val="222222"/>
+        </w:rPr>
+        <w:t>2.1. Pertenencia Institucional y Ubicación Orgánica</w:t>
+      </w:r>
+    </w:p>
+    <w:p>
+      <w:pPr>
         <w:spacing w:before="60" w:after="60" w:line="240" w:lineRule="auto"/>
         <w:jc w:val="both"/>
         <w:rPr>
@@ -548,7 +566,25 @@
           <w:rFonts w:ascii="Arial" w:hAnsi="Arial" w:cs="Arial"/>
           <w:color w:val="111111"/>
         </w:rPr>
-        <w:t>El Departamento enfrenta el desafío de administrar un ecosistema tecnológico heterogéneo que combina aplicaciones heredadas (*legacy*) con soluciones modernas, operando con una dotación de personal acotada y distribuida en distintas dependencias físicas. Para dar respuesta a las crecientes demandas de digitalización municipal, la Jefatura debe orquestar estos recursos con una visión gerencial y pragmática.</w:t>
+        <w:t>El Departamento de Gestión, Desarrollo e Innovación en Sistemas de Software se encuentra integrado orgánicamente dentro de la **Subsecretaría de Gobierno Digital y Mejora de Procesos**, dependiente de la **Secretaría de Participación Ciudadana y Descentralización** de la Municipalidad de General Pueyrredon (C.F. 1-31-00-01, N° de Orden 6733). Su ubicación en la estructura municipal lo posiciona como el área técnica responsable de posibilitar la transformación digital y soportar operativamente a la totalidad de las Secretarías y dependencias comunales.</w:t>
+      </w:r>
+    </w:p>
+    <w:p>
+      <w:pPr>
+        <w:spacing w:before="200" w:after="60" w:line="240" w:lineRule="auto"/>
+        <w:rPr>
+          <w:rFonts w:ascii="Arial" w:hAnsi="Arial" w:cs="Arial"/>
+          <w:b/>
+          <w:color w:val="222222"/>
+        </w:rPr>
+      </w:pPr>
+      <w:r>
+        <w:rPr>
+          <w:rFonts w:ascii="Arial" w:hAnsi="Arial" w:cs="Arial"/>
+          <w:b/>
+          <w:color w:val="222222"/>
+        </w:rPr>
+        <w:t>2.2. Misión del Departamento</w:t>
       </w:r>
     </w:p>
     <w:p>
@@ -565,7 +601,42 @@
           <w:rFonts w:ascii="Arial" w:hAnsi="Arial" w:cs="Arial"/>
           <w:color w:val="111111"/>
         </w:rPr>
-        <w:t>El plan se divide metodológicamente en:</w:t>
+        <w:t>La misión institucional del Departamento es **diseñar, construir, mantener, integrar y evolucionar las soluciones de software y aplicaciones municipales**, garantizando la continuidad operativa de los servicios, la soberanía sobre el patrimonio informático del Municipio, la protección de los datos de la ciudadanía y la adopción con sentido de innovaciones tecnológicas para responder con agilidad a las demandas de las gestiones presentes y futuras.</w:t>
+      </w:r>
+    </w:p>
+    <w:p>
+      <w:pPr>
+        <w:spacing w:before="200" w:after="60" w:line="240" w:lineRule="auto"/>
+        <w:rPr>
+          <w:rFonts w:ascii="Arial" w:hAnsi="Arial" w:cs="Arial"/>
+          <w:b/>
+          <w:color w:val="222222"/>
+        </w:rPr>
+      </w:pPr>
+      <w:r>
+        <w:rPr>
+          <w:rFonts w:ascii="Arial" w:hAnsi="Arial" w:cs="Arial"/>
+          <w:b/>
+          <w:color w:val="222222"/>
+        </w:rPr>
+        <w:t>2.3. Funciones Normativas del Departamento (según Decreto / Ordenanza Vigente)</w:t>
+      </w:r>
+    </w:p>
+    <w:p>
+      <w:pPr>
+        <w:spacing w:before="60" w:after="60" w:line="240" w:lineRule="auto"/>
+        <w:jc w:val="both"/>
+        <w:rPr>
+          <w:rFonts w:ascii="Arial" w:hAnsi="Arial" w:cs="Arial"/>
+          <w:color w:val="111111"/>
+        </w:rPr>
+      </w:pPr>
+      <w:r>
+        <w:rPr>
+          <w:rFonts w:ascii="Arial" w:hAnsi="Arial" w:cs="Arial"/>
+          <w:color w:val="111111"/>
+        </w:rPr>
+        <w:t>De acuerdo con la normativa municipal que rige la estructura orgánica y el nomenclador de funciones del área (citada en la bibliografía oficial del concurso), el Departamento tiene encomendadas las siguientes funciones primarias:</w:t>
       </w:r>
     </w:p>
     <w:p>
@@ -582,7 +653,7 @@
           <w:rFonts w:ascii="Arial" w:hAnsi="Arial" w:cs="Arial"/>
           <w:color w:val="111111"/>
         </w:rPr>
-        <w:t>1. **Un Diagnóstico Integral (FODA):** Identificación de fortalezas, cuellos de botella y deudas técnicas reales.</w:t>
+        <w:t>1. **Relevamiento y Análisis de Necesidades:** Relevar, analizar y sistematizar los requerimientos informáticos y funcionales de las distintas dependencias de la administración municipal.</w:t>
       </w:r>
     </w:p>
     <w:p>
@@ -599,7 +670,7 @@
           <w:rFonts w:ascii="Arial" w:hAnsi="Arial" w:cs="Arial"/>
           <w:color w:val="111111"/>
         </w:rPr>
-        <w:t>2. **Definición de Objetivos Estratégicos:** Alineados a la gobernanza del software municipal.</w:t>
+        <w:t>2. **Planificación y Desarrollo de Software:** Planificar, diseñar, codificar, implementar y mantener los sistemas de software, bases de datos y aplicaciones móviles de uso institucional.</w:t>
       </w:r>
     </w:p>
     <w:p>
@@ -616,7 +687,7 @@
           <w:rFonts w:ascii="Arial" w:hAnsi="Arial" w:cs="Arial"/>
           <w:color w:val="111111"/>
         </w:rPr>
-        <w:t>3. **Propuestas de Optimización con Recursos Actuales (Escenario REAL - Costo $0):** Centradas en la agilidad adaptativa, estandarización de arquitectura y buenas prácticas.</w:t>
+        <w:t>3. **Modelos de Desarrollo y Documentación:** Definir y homogenizar los modelos de ciclo de vida de desarrollo de software, dictando pautas de documentación técnica, diccionarios de datos y manuales operativos.</w:t>
       </w:r>
     </w:p>
     <w:p>
@@ -633,7 +704,7 @@
           <w:rFonts w:ascii="Arial" w:hAnsi="Arial" w:cs="Arial"/>
           <w:color w:val="111111"/>
         </w:rPr>
-        <w:t>4. **Proyección con Incorporación de Recursos (Escenario IDEAL - Con Presupuesto):** Inversión escalonada en herramientas tecnológicas, capacitación formal y licencias.</w:t>
+        <w:t>4. **Estándares Técnicos y Calidad:** Establecer y auditar los estándares de codificación, el uso del *template* de arquitectura base municipal, las pautas de *testing* y la seguridad desde la etapa de análisis (*Security by Design*).</w:t>
       </w:r>
     </w:p>
     <w:p>
@@ -650,7 +721,148 @@
           <w:rFonts w:ascii="Arial" w:hAnsi="Arial" w:cs="Arial"/>
           <w:color w:val="111111"/>
         </w:rPr>
-        <w:t>5. **Modelo de Gestión, Implementación por Etapas e Indicadores:** Hoja de ruta por fases y métricas de riesgo operacional.</w:t>
+        <w:t>5. **Investigación, Evaluación e Innovación:** Investigar, evaluar e institucionalizar de manera fundamentada nuevas tecnologías, lenguajes de programación, herramientas de desarrollo, marcos ágiles e Inteligencia Artificial.</w:t>
+      </w:r>
+    </w:p>
+    <w:p>
+      <w:pPr>
+        <w:spacing w:before="80" w:after="40" w:line="240" w:lineRule="auto"/>
+        <w:jc w:val="both"/>
+        <w:rPr>
+          <w:rFonts w:ascii="Arial" w:hAnsi="Arial" w:cs="Arial"/>
+          <w:color w:val="111111"/>
+        </w:rPr>
+      </w:pPr>
+      <w:r>
+        <w:rPr>
+          <w:rFonts w:ascii="Arial" w:hAnsi="Arial" w:cs="Arial"/>
+          <w:color w:val="111111"/>
+        </w:rPr>
+        <w:t>6. **Gobierno Técnico de Tercerizaciones:** Participar activamente en la formulación de pliegos, seguimiento técnico, control de entregables, pruebas de aceptación y recepción de código fuente de las soluciones de software desarrolladas por proveedores externos.</w:t>
+      </w:r>
+    </w:p>
+    <w:p>
+      <w:pPr>
+        <w:spacing w:before="80" w:after="40" w:line="240" w:lineRule="auto"/>
+        <w:jc w:val="both"/>
+        <w:rPr>
+          <w:rFonts w:ascii="Arial" w:hAnsi="Arial" w:cs="Arial"/>
+          <w:color w:val="111111"/>
+        </w:rPr>
+      </w:pPr>
+      <w:r>
+        <w:rPr>
+          <w:rFonts w:ascii="Arial" w:hAnsi="Arial" w:cs="Arial"/>
+          <w:color w:val="111111"/>
+        </w:rPr>
+        <w:t>7. **Interoperabilidad e Integración:** Garantizar la integración, reutilización de componentes y comunicación entre los diferentes sistemas municipales para evitar silos aislados de información.</w:t>
+      </w:r>
+    </w:p>
+    <w:p>
+      <w:pPr>
+        <w:spacing w:before="200" w:after="60" w:line="240" w:lineRule="auto"/>
+        <w:rPr>
+          <w:rFonts w:ascii="Arial" w:hAnsi="Arial" w:cs="Arial"/>
+          <w:b/>
+          <w:color w:val="222222"/>
+        </w:rPr>
+      </w:pPr>
+      <w:r>
+        <w:rPr>
+          <w:rFonts w:ascii="Arial" w:hAnsi="Arial" w:cs="Arial"/>
+          <w:b/>
+          <w:color w:val="222222"/>
+        </w:rPr>
+        <w:t>2.4. Enfoque Metodológico del Plan</w:t>
+      </w:r>
+    </w:p>
+    <w:p>
+      <w:pPr>
+        <w:spacing w:before="60" w:after="60" w:line="240" w:lineRule="auto"/>
+        <w:jc w:val="both"/>
+        <w:rPr>
+          <w:rFonts w:ascii="Arial" w:hAnsi="Arial" w:cs="Arial"/>
+          <w:color w:val="111111"/>
+        </w:rPr>
+      </w:pPr>
+      <w:r>
+        <w:rPr>
+          <w:rFonts w:ascii="Arial" w:hAnsi="Arial" w:cs="Arial"/>
+          <w:color w:val="111111"/>
+        </w:rPr>
+        <w:t>Para cumplir con estas funciones normativas frente a la realidad operativa del sector, el presente Plan de Trabajo parte de un diagnóstico exhaustivo de la situación actual y se articula en torno al tema oficial del concurso, estructurándose en:</w:t>
+      </w:r>
+    </w:p>
+    <w:p>
+      <w:pPr>
+        <w:spacing w:before="40" w:after="40" w:line="240" w:lineRule="auto"/>
+        <w:ind w:left="360"/>
+        <w:jc w:val="both"/>
+        <w:rPr>
+          <w:rFonts w:ascii="Arial" w:hAnsi="Arial" w:cs="Arial"/>
+          <w:color w:val="111111"/>
+        </w:rPr>
+      </w:pPr>
+      <w:r>
+        <w:rPr>
+          <w:rFonts w:ascii="Arial" w:hAnsi="Arial" w:cs="Arial"/>
+          <w:color w:val="111111"/>
+        </w:rPr>
+        <w:t>â€¢  **Diagnóstico Integral (FODA):** Identificación de fortalezas, deudas técnicas y riesgos operacionales reales.</w:t>
+      </w:r>
+    </w:p>
+    <w:p>
+      <w:pPr>
+        <w:spacing w:before="40" w:after="40" w:line="240" w:lineRule="auto"/>
+        <w:ind w:left="360"/>
+        <w:jc w:val="both"/>
+        <w:rPr>
+          <w:rFonts w:ascii="Arial" w:hAnsi="Arial" w:cs="Arial"/>
+          <w:color w:val="111111"/>
+        </w:rPr>
+      </w:pPr>
+      <w:r>
+        <w:rPr>
+          <w:rFonts w:ascii="Arial" w:hAnsi="Arial" w:cs="Arial"/>
+          <w:color w:val="111111"/>
+        </w:rPr>
+        <w:t>â€¢  **Propuesta de Mejora con Recursos Actuales (SIN PRESUPUESTO - Plan Realista):** Soluciones procedimentales, organizacionales y ágiles a costo $0.</w:t>
+      </w:r>
+    </w:p>
+    <w:p>
+      <w:pPr>
+        <w:spacing w:before="40" w:after="40" w:line="240" w:lineRule="auto"/>
+        <w:ind w:left="360"/>
+        <w:jc w:val="both"/>
+        <w:rPr>
+          <w:rFonts w:ascii="Arial" w:hAnsi="Arial" w:cs="Arial"/>
+          <w:color w:val="111111"/>
+        </w:rPr>
+      </w:pPr>
+      <w:r>
+        <w:rPr>
+          <w:rFonts w:ascii="Arial" w:hAnsi="Arial" w:cs="Arial"/>
+          <w:color w:val="111111"/>
+        </w:rPr>
+        <w:t>â€¢  **Proyección con Incorporación de Recursos (CON PRESUPUESTO - Plan Proyectado):** Inversión escalonada en herramientas tecnológicas, licencias corporativas e infraestructura.</w:t>
+      </w:r>
+    </w:p>
+    <w:p>
+      <w:pPr>
+        <w:spacing w:before="40" w:after="40" w:line="240" w:lineRule="auto"/>
+        <w:ind w:left="360"/>
+        <w:jc w:val="both"/>
+        <w:rPr>
+          <w:rFonts w:ascii="Arial" w:hAnsi="Arial" w:cs="Arial"/>
+          <w:color w:val="111111"/>
+        </w:rPr>
+      </w:pPr>
+      <w:r>
+        <w:rPr>
+          <w:rFonts w:ascii="Arial" w:hAnsi="Arial" w:cs="Arial"/>
+          <w:color w:val="111111"/>
+        </w:rPr>
+        <w:t>â€¢  **Modelo de Gestión, Hoja de Ruta en Etapas e Indicadores:** Implementación progresiva y medición de riesgo institucional.</w:t>
       </w:r>
     </w:p>
     <w:p>
@@ -3723,7 +3935,7 @@
     <w:link w:val="EncabezadoCar"/>
     <w:uiPriority w:val="99"/>
     <w:unhideWhenUsed/>
-    <w:rsid w:val="00601D12"/>
+    <w:rsid w:val="0018183E"/>
     <w:pPr>
       <w:tabs>
         <w:tab w:val="center" w:pos="4252"/>
@@ -3737,7 +3949,7 @@
     <w:basedOn w:val="Fuentedeprrafopredeter"/>
     <w:link w:val="Encabezado"/>
     <w:uiPriority w:val="99"/>
-    <w:rsid w:val="00601D12"/>
+    <w:rsid w:val="0018183E"/>
   </w:style>
   <w:style w:type="paragraph" w:styleId="Piedepgina">
     <w:name w:val="footer"/>
@@ -3745,7 +3957,7 @@
     <w:link w:val="PiedepginaCar"/>
     <w:uiPriority w:val="99"/>
     <w:unhideWhenUsed/>
-    <w:rsid w:val="00601D12"/>
+    <w:rsid w:val="0018183E"/>
     <w:pPr>
       <w:tabs>
         <w:tab w:val="center" w:pos="4252"/>
@@ -3759,7 +3971,7 @@
     <w:basedOn w:val="Fuentedeprrafopredeter"/>
     <w:link w:val="Piedepgina"/>
     <w:uiPriority w:val="99"/>
-    <w:rsid w:val="00601D12"/>
+    <w:rsid w:val="0018183E"/>
   </w:style>
 </w:styles>
 </file>

</xml_diff>

<commit_message>
style: Clean Section 2 structure to remove subheadings and keep 10 main chapters
</commit_message>
<xml_diff>
--- a/Plan_Trabajo_Concurso_Jefatura_Software.docx
+++ b/Plan_Trabajo_Concurso_Jefatura_Software.docx
@@ -3935,7 +3935,7 @@
     <w:link w:val="EncabezadoCar"/>
     <w:uiPriority w:val="99"/>
     <w:unhideWhenUsed/>
-    <w:rsid w:val="0018183E"/>
+    <w:rsid w:val="00A22072"/>
     <w:pPr>
       <w:tabs>
         <w:tab w:val="center" w:pos="4252"/>
@@ -3949,7 +3949,7 @@
     <w:basedOn w:val="Fuentedeprrafopredeter"/>
     <w:link w:val="Encabezado"/>
     <w:uiPriority w:val="99"/>
-    <w:rsid w:val="0018183E"/>
+    <w:rsid w:val="00A22072"/>
   </w:style>
   <w:style w:type="paragraph" w:styleId="Piedepgina">
     <w:name w:val="footer"/>
@@ -3957,7 +3957,7 @@
     <w:link w:val="PiedepginaCar"/>
     <w:uiPriority w:val="99"/>
     <w:unhideWhenUsed/>
-    <w:rsid w:val="0018183E"/>
+    <w:rsid w:val="00A22072"/>
     <w:pPr>
       <w:tabs>
         <w:tab w:val="center" w:pos="4252"/>
@@ -3971,7 +3971,7 @@
     <w:basedOn w:val="Fuentedeprrafopredeter"/>
     <w:link w:val="Piedepgina"/>
     <w:uiPriority w:val="99"/>
-    <w:rsid w:val="0018183E"/>
+    <w:rsid w:val="00A22072"/>
   </w:style>
 </w:styles>
 </file>

</xml_diff>

<commit_message>
fix: Rebuild styled DOCX directly from updated artifact MD
</commit_message>
<xml_diff>
--- a/Plan_Trabajo_Concurso_Jefatura_Software.docx
+++ b/Plan_Trabajo_Concurso_Jefatura_Software.docx
@@ -536,24 +536,6 @@
     </w:p>
     <w:p>
       <w:pPr>
-        <w:spacing w:before="200" w:after="60" w:line="240" w:lineRule="auto"/>
-        <w:rPr>
-          <w:rFonts w:ascii="Arial" w:hAnsi="Arial" w:cs="Arial"/>
-          <w:b/>
-          <w:color w:val="222222"/>
-        </w:rPr>
-      </w:pPr>
-      <w:r>
-        <w:rPr>
-          <w:rFonts w:ascii="Arial" w:hAnsi="Arial" w:cs="Arial"/>
-          <w:b/>
-          <w:color w:val="222222"/>
-        </w:rPr>
-        <w:t>2.1. Pertenencia Institucional y Ubicación Orgánica</w:t>
-      </w:r>
-    </w:p>
-    <w:p>
-      <w:pPr>
         <w:spacing w:before="60" w:after="60" w:line="240" w:lineRule="auto"/>
         <w:jc w:val="both"/>
         <w:rPr>
@@ -571,24 +553,6 @@
     </w:p>
     <w:p>
       <w:pPr>
-        <w:spacing w:before="200" w:after="60" w:line="240" w:lineRule="auto"/>
-        <w:rPr>
-          <w:rFonts w:ascii="Arial" w:hAnsi="Arial" w:cs="Arial"/>
-          <w:b/>
-          <w:color w:val="222222"/>
-        </w:rPr>
-      </w:pPr>
-      <w:r>
-        <w:rPr>
-          <w:rFonts w:ascii="Arial" w:hAnsi="Arial" w:cs="Arial"/>
-          <w:b/>
-          <w:color w:val="222222"/>
-        </w:rPr>
-        <w:t>2.2. Misión del Departamento</w:t>
-      </w:r>
-    </w:p>
-    <w:p>
-      <w:pPr>
         <w:spacing w:before="60" w:after="60" w:line="240" w:lineRule="auto"/>
         <w:jc w:val="both"/>
         <w:rPr>
@@ -606,24 +570,6 @@
     </w:p>
     <w:p>
       <w:pPr>
-        <w:spacing w:before="200" w:after="60" w:line="240" w:lineRule="auto"/>
-        <w:rPr>
-          <w:rFonts w:ascii="Arial" w:hAnsi="Arial" w:cs="Arial"/>
-          <w:b/>
-          <w:color w:val="222222"/>
-        </w:rPr>
-      </w:pPr>
-      <w:r>
-        <w:rPr>
-          <w:rFonts w:ascii="Arial" w:hAnsi="Arial" w:cs="Arial"/>
-          <w:b/>
-          <w:color w:val="222222"/>
-        </w:rPr>
-        <w:t>2.3. Funciones Normativas del Departamento (según Decreto / Ordenanza Vigente)</w:t>
-      </w:r>
-    </w:p>
-    <w:p>
-      <w:pPr>
         <w:spacing w:before="60" w:after="60" w:line="240" w:lineRule="auto"/>
         <w:jc w:val="both"/>
         <w:rPr>
@@ -641,139 +587,128 @@
     </w:p>
     <w:p>
       <w:pPr>
-        <w:spacing w:before="80" w:after="40" w:line="240" w:lineRule="auto"/>
-        <w:jc w:val="both"/>
-        <w:rPr>
-          <w:rFonts w:ascii="Arial" w:hAnsi="Arial" w:cs="Arial"/>
-          <w:color w:val="111111"/>
-        </w:rPr>
-      </w:pPr>
-      <w:r>
-        <w:rPr>
-          <w:rFonts w:ascii="Arial" w:hAnsi="Arial" w:cs="Arial"/>
-          <w:color w:val="111111"/>
-        </w:rPr>
-        <w:t>1. **Relevamiento y Análisis de Necesidades:** Relevar, analizar y sistematizar los requerimientos informáticos y funcionales de las distintas dependencias de la administración municipal.</w:t>
-      </w:r>
-    </w:p>
-    <w:p>
-      <w:pPr>
-        <w:spacing w:before="80" w:after="40" w:line="240" w:lineRule="auto"/>
-        <w:jc w:val="both"/>
-        <w:rPr>
-          <w:rFonts w:ascii="Arial" w:hAnsi="Arial" w:cs="Arial"/>
-          <w:color w:val="111111"/>
-        </w:rPr>
-      </w:pPr>
-      <w:r>
-        <w:rPr>
-          <w:rFonts w:ascii="Arial" w:hAnsi="Arial" w:cs="Arial"/>
-          <w:color w:val="111111"/>
-        </w:rPr>
-        <w:t>2. **Planificación y Desarrollo de Software:** Planificar, diseñar, codificar, implementar y mantener los sistemas de software, bases de datos y aplicaciones móviles de uso institucional.</w:t>
-      </w:r>
-    </w:p>
-    <w:p>
-      <w:pPr>
-        <w:spacing w:before="80" w:after="40" w:line="240" w:lineRule="auto"/>
-        <w:jc w:val="both"/>
-        <w:rPr>
-          <w:rFonts w:ascii="Arial" w:hAnsi="Arial" w:cs="Arial"/>
-          <w:color w:val="111111"/>
-        </w:rPr>
-      </w:pPr>
-      <w:r>
-        <w:rPr>
-          <w:rFonts w:ascii="Arial" w:hAnsi="Arial" w:cs="Arial"/>
-          <w:color w:val="111111"/>
-        </w:rPr>
-        <w:t>3. **Modelos de Desarrollo y Documentación:** Definir y homogenizar los modelos de ciclo de vida de desarrollo de software, dictando pautas de documentación técnica, diccionarios de datos y manuales operativos.</w:t>
-      </w:r>
-    </w:p>
-    <w:p>
-      <w:pPr>
-        <w:spacing w:before="80" w:after="40" w:line="240" w:lineRule="auto"/>
-        <w:jc w:val="both"/>
-        <w:rPr>
-          <w:rFonts w:ascii="Arial" w:hAnsi="Arial" w:cs="Arial"/>
-          <w:color w:val="111111"/>
-        </w:rPr>
-      </w:pPr>
-      <w:r>
-        <w:rPr>
-          <w:rFonts w:ascii="Arial" w:hAnsi="Arial" w:cs="Arial"/>
-          <w:color w:val="111111"/>
-        </w:rPr>
-        <w:t>4. **Estándares Técnicos y Calidad:** Establecer y auditar los estándares de codificación, el uso del *template* de arquitectura base municipal, las pautas de *testing* y la seguridad desde la etapa de análisis (*Security by Design*).</w:t>
-      </w:r>
-    </w:p>
-    <w:p>
-      <w:pPr>
-        <w:spacing w:before="80" w:after="40" w:line="240" w:lineRule="auto"/>
-        <w:jc w:val="both"/>
-        <w:rPr>
-          <w:rFonts w:ascii="Arial" w:hAnsi="Arial" w:cs="Arial"/>
-          <w:color w:val="111111"/>
-        </w:rPr>
-      </w:pPr>
-      <w:r>
-        <w:rPr>
-          <w:rFonts w:ascii="Arial" w:hAnsi="Arial" w:cs="Arial"/>
-          <w:color w:val="111111"/>
-        </w:rPr>
-        <w:t>5. **Investigación, Evaluación e Innovación:** Investigar, evaluar e institucionalizar de manera fundamentada nuevas tecnologías, lenguajes de programación, herramientas de desarrollo, marcos ágiles e Inteligencia Artificial.</w:t>
-      </w:r>
-    </w:p>
-    <w:p>
-      <w:pPr>
-        <w:spacing w:before="80" w:after="40" w:line="240" w:lineRule="auto"/>
-        <w:jc w:val="both"/>
-        <w:rPr>
-          <w:rFonts w:ascii="Arial" w:hAnsi="Arial" w:cs="Arial"/>
-          <w:color w:val="111111"/>
-        </w:rPr>
-      </w:pPr>
-      <w:r>
-        <w:rPr>
-          <w:rFonts w:ascii="Arial" w:hAnsi="Arial" w:cs="Arial"/>
-          <w:color w:val="111111"/>
-        </w:rPr>
-        <w:t>6. **Gobierno Técnico de Tercerizaciones:** Participar activamente en la formulación de pliegos, seguimiento técnico, control de entregables, pruebas de aceptación y recepción de código fuente de las soluciones de software desarrolladas por proveedores externos.</w:t>
-      </w:r>
-    </w:p>
-    <w:p>
-      <w:pPr>
-        <w:spacing w:before="80" w:after="40" w:line="240" w:lineRule="auto"/>
-        <w:jc w:val="both"/>
-        <w:rPr>
-          <w:rFonts w:ascii="Arial" w:hAnsi="Arial" w:cs="Arial"/>
-          <w:color w:val="111111"/>
-        </w:rPr>
-      </w:pPr>
-      <w:r>
-        <w:rPr>
-          <w:rFonts w:ascii="Arial" w:hAnsi="Arial" w:cs="Arial"/>
-          <w:color w:val="111111"/>
-        </w:rPr>
-        <w:t>7. **Interoperabilidad e Integración:** Garantizar la integración, reutilización de componentes y comunicación entre los diferentes sistemas municipales para evitar silos aislados de información.</w:t>
-      </w:r>
-    </w:p>
-    <w:p>
-      <w:pPr>
-        <w:spacing w:before="200" w:after="60" w:line="240" w:lineRule="auto"/>
-        <w:rPr>
-          <w:rFonts w:ascii="Arial" w:hAnsi="Arial" w:cs="Arial"/>
-          <w:b/>
-          <w:color w:val="222222"/>
-        </w:rPr>
-      </w:pPr>
-      <w:r>
-        <w:rPr>
-          <w:rFonts w:ascii="Arial" w:hAnsi="Arial" w:cs="Arial"/>
-          <w:b/>
-          <w:color w:val="222222"/>
-        </w:rPr>
-        <w:t>2.4. Enfoque Metodológico del Plan</w:t>
+        <w:spacing w:before="40" w:after="40" w:line="240" w:lineRule="auto"/>
+        <w:ind w:left="360"/>
+        <w:jc w:val="both"/>
+        <w:rPr>
+          <w:rFonts w:ascii="Arial" w:hAnsi="Arial" w:cs="Arial"/>
+          <w:color w:val="111111"/>
+        </w:rPr>
+      </w:pPr>
+      <w:r>
+        <w:rPr>
+          <w:rFonts w:ascii="Arial" w:hAnsi="Arial" w:cs="Arial"/>
+          <w:color w:val="111111"/>
+        </w:rPr>
+        <w:t>â€¢    **Relevamiento y Análisis de Necesidades:** Relevar, analizar y sistematizar los requerimientos informáticos y funcionales de las distintas dependencias de la administración municipal.</w:t>
+      </w:r>
+    </w:p>
+    <w:p>
+      <w:pPr>
+        <w:spacing w:before="40" w:after="40" w:line="240" w:lineRule="auto"/>
+        <w:ind w:left="360"/>
+        <w:jc w:val="both"/>
+        <w:rPr>
+          <w:rFonts w:ascii="Arial" w:hAnsi="Arial" w:cs="Arial"/>
+          <w:color w:val="111111"/>
+        </w:rPr>
+      </w:pPr>
+      <w:r>
+        <w:rPr>
+          <w:rFonts w:ascii="Arial" w:hAnsi="Arial" w:cs="Arial"/>
+          <w:color w:val="111111"/>
+        </w:rPr>
+        <w:t>â€¢    **Planificación y Desarrollo de Software:** Planificar, diseñar, codificar, implementar y mantener los sistemas de software, bases de datos y aplicaciones móviles de uso institucional.</w:t>
+      </w:r>
+    </w:p>
+    <w:p>
+      <w:pPr>
+        <w:spacing w:before="40" w:after="40" w:line="240" w:lineRule="auto"/>
+        <w:ind w:left="360"/>
+        <w:jc w:val="both"/>
+        <w:rPr>
+          <w:rFonts w:ascii="Arial" w:hAnsi="Arial" w:cs="Arial"/>
+          <w:color w:val="111111"/>
+        </w:rPr>
+      </w:pPr>
+      <w:r>
+        <w:rPr>
+          <w:rFonts w:ascii="Arial" w:hAnsi="Arial" w:cs="Arial"/>
+          <w:color w:val="111111"/>
+        </w:rPr>
+        <w:t>â€¢    **Modelos de Desarrollo y Documentación:** Definir y homogenizar los modelos de ciclo de vida de desarrollo de software, dictando pautas de documentación técnica, diccionarios de datos y manuales operativos.</w:t>
+      </w:r>
+    </w:p>
+    <w:p>
+      <w:pPr>
+        <w:spacing w:before="40" w:after="40" w:line="240" w:lineRule="auto"/>
+        <w:ind w:left="360"/>
+        <w:jc w:val="both"/>
+        <w:rPr>
+          <w:rFonts w:ascii="Arial" w:hAnsi="Arial" w:cs="Arial"/>
+          <w:color w:val="111111"/>
+        </w:rPr>
+      </w:pPr>
+      <w:r>
+        <w:rPr>
+          <w:rFonts w:ascii="Arial" w:hAnsi="Arial" w:cs="Arial"/>
+          <w:color w:val="111111"/>
+        </w:rPr>
+        <w:t>â€¢    **Estándares Técnicos y Calidad:** Establecer y auditar los estándares de codificación, el uso del *template* de arquitectura base municipal, las pautas de *testing* y la seguridad desde la etapa de análisis (*Security by Design*).</w:t>
+      </w:r>
+    </w:p>
+    <w:p>
+      <w:pPr>
+        <w:spacing w:before="40" w:after="40" w:line="240" w:lineRule="auto"/>
+        <w:ind w:left="360"/>
+        <w:jc w:val="both"/>
+        <w:rPr>
+          <w:rFonts w:ascii="Arial" w:hAnsi="Arial" w:cs="Arial"/>
+          <w:color w:val="111111"/>
+        </w:rPr>
+      </w:pPr>
+      <w:r>
+        <w:rPr>
+          <w:rFonts w:ascii="Arial" w:hAnsi="Arial" w:cs="Arial"/>
+          <w:color w:val="111111"/>
+        </w:rPr>
+        <w:t>â€¢    **Investigación, Evaluación e Innovación:** Investigar, evaluar e institucionalizar de manera fundamentada nuevas tecnologías, lenguajes de programación, herramientas de desarrollo, marcos ágiles e Inteligencia Artificial.</w:t>
+      </w:r>
+    </w:p>
+    <w:p>
+      <w:pPr>
+        <w:spacing w:before="40" w:after="40" w:line="240" w:lineRule="auto"/>
+        <w:ind w:left="360"/>
+        <w:jc w:val="both"/>
+        <w:rPr>
+          <w:rFonts w:ascii="Arial" w:hAnsi="Arial" w:cs="Arial"/>
+          <w:color w:val="111111"/>
+        </w:rPr>
+      </w:pPr>
+      <w:r>
+        <w:rPr>
+          <w:rFonts w:ascii="Arial" w:hAnsi="Arial" w:cs="Arial"/>
+          <w:color w:val="111111"/>
+        </w:rPr>
+        <w:t>â€¢    **Gobierno Técnico de Tercerizaciones:** Participar activamente en la formulación de pliegos, seguimiento técnico, control de entregables, pruebas de aceptación y recepción de código fuente de las soluciones de software desarrolladas por proveedores externos.</w:t>
+      </w:r>
+    </w:p>
+    <w:p>
+      <w:pPr>
+        <w:spacing w:before="40" w:after="40" w:line="240" w:lineRule="auto"/>
+        <w:ind w:left="360"/>
+        <w:jc w:val="both"/>
+        <w:rPr>
+          <w:rFonts w:ascii="Arial" w:hAnsi="Arial" w:cs="Arial"/>
+          <w:color w:val="111111"/>
+        </w:rPr>
+      </w:pPr>
+      <w:r>
+        <w:rPr>
+          <w:rFonts w:ascii="Arial" w:hAnsi="Arial" w:cs="Arial"/>
+          <w:color w:val="111111"/>
+        </w:rPr>
+        <w:t>â€¢    **Interoperabilidad e Integración:** Garantizar la integración, reutilización de componentes y comunicación entre los diferentes sistemas municipales para evitar silos aislados de información.</w:t>
       </w:r>
     </w:p>
     <w:p>
@@ -790,79 +725,7 @@
           <w:rFonts w:ascii="Arial" w:hAnsi="Arial" w:cs="Arial"/>
           <w:color w:val="111111"/>
         </w:rPr>
-        <w:t>Para cumplir con estas funciones normativas frente a la realidad operativa del sector, el presente Plan de Trabajo parte de un diagnóstico exhaustivo de la situación actual y se articula en torno al tema oficial del concurso, estructurándose en:</w:t>
-      </w:r>
-    </w:p>
-    <w:p>
-      <w:pPr>
-        <w:spacing w:before="40" w:after="40" w:line="240" w:lineRule="auto"/>
-        <w:ind w:left="360"/>
-        <w:jc w:val="both"/>
-        <w:rPr>
-          <w:rFonts w:ascii="Arial" w:hAnsi="Arial" w:cs="Arial"/>
-          <w:color w:val="111111"/>
-        </w:rPr>
-      </w:pPr>
-      <w:r>
-        <w:rPr>
-          <w:rFonts w:ascii="Arial" w:hAnsi="Arial" w:cs="Arial"/>
-          <w:color w:val="111111"/>
-        </w:rPr>
-        <w:t>â€¢  **Diagnóstico Integral (FODA):** Identificación de fortalezas, deudas técnicas y riesgos operacionales reales.</w:t>
-      </w:r>
-    </w:p>
-    <w:p>
-      <w:pPr>
-        <w:spacing w:before="40" w:after="40" w:line="240" w:lineRule="auto"/>
-        <w:ind w:left="360"/>
-        <w:jc w:val="both"/>
-        <w:rPr>
-          <w:rFonts w:ascii="Arial" w:hAnsi="Arial" w:cs="Arial"/>
-          <w:color w:val="111111"/>
-        </w:rPr>
-      </w:pPr>
-      <w:r>
-        <w:rPr>
-          <w:rFonts w:ascii="Arial" w:hAnsi="Arial" w:cs="Arial"/>
-          <w:color w:val="111111"/>
-        </w:rPr>
-        <w:t>â€¢  **Propuesta de Mejora con Recursos Actuales (SIN PRESUPUESTO - Plan Realista):** Soluciones procedimentales, organizacionales y ágiles a costo $0.</w:t>
-      </w:r>
-    </w:p>
-    <w:p>
-      <w:pPr>
-        <w:spacing w:before="40" w:after="40" w:line="240" w:lineRule="auto"/>
-        <w:ind w:left="360"/>
-        <w:jc w:val="both"/>
-        <w:rPr>
-          <w:rFonts w:ascii="Arial" w:hAnsi="Arial" w:cs="Arial"/>
-          <w:color w:val="111111"/>
-        </w:rPr>
-      </w:pPr>
-      <w:r>
-        <w:rPr>
-          <w:rFonts w:ascii="Arial" w:hAnsi="Arial" w:cs="Arial"/>
-          <w:color w:val="111111"/>
-        </w:rPr>
-        <w:t>â€¢  **Proyección con Incorporación de Recursos (CON PRESUPUESTO - Plan Proyectado):** Inversión escalonada en herramientas tecnológicas, licencias corporativas e infraestructura.</w:t>
-      </w:r>
-    </w:p>
-    <w:p>
-      <w:pPr>
-        <w:spacing w:before="40" w:after="40" w:line="240" w:lineRule="auto"/>
-        <w:ind w:left="360"/>
-        <w:jc w:val="both"/>
-        <w:rPr>
-          <w:rFonts w:ascii="Arial" w:hAnsi="Arial" w:cs="Arial"/>
-          <w:color w:val="111111"/>
-        </w:rPr>
-      </w:pPr>
-      <w:r>
-        <w:rPr>
-          <w:rFonts w:ascii="Arial" w:hAnsi="Arial" w:cs="Arial"/>
-          <w:color w:val="111111"/>
-        </w:rPr>
-        <w:t>â€¢  **Modelo de Gestión, Hoja de Ruta en Etapas e Indicadores:** Implementación progresiva y medición de riesgo institucional.</w:t>
+        <w:t>Para cumplir con estas funciones normativas frente a la realidad operativa del sector, el presente Plan de Trabajo parte de un diagnóstico exhaustivo de la situación actual y se articula en torno al tema oficial del concurso, estructurándose en un Diagnóstico Integral (FODA), la formulación de Objetivos, la Propuesta de Mejora y Optimización con Recursos Actuales (SIN PRESUPUESTO - Plan Realista), la Proyección con Incorporación de Recursos (CON PRESUPUESTO - Plan Proyectado), y los mecanismos de Implementación, Gestión e Indicadores de Evaluación.</w:t>
       </w:r>
     </w:p>
     <w:p>
@@ -3935,7 +3798,7 @@
     <w:link w:val="EncabezadoCar"/>
     <w:uiPriority w:val="99"/>
     <w:unhideWhenUsed/>
-    <w:rsid w:val="00A22072"/>
+    <w:rsid w:val="004C34FA"/>
     <w:pPr>
       <w:tabs>
         <w:tab w:val="center" w:pos="4252"/>
@@ -3949,7 +3812,7 @@
     <w:basedOn w:val="Fuentedeprrafopredeter"/>
     <w:link w:val="Encabezado"/>
     <w:uiPriority w:val="99"/>
-    <w:rsid w:val="00A22072"/>
+    <w:rsid w:val="004C34FA"/>
   </w:style>
   <w:style w:type="paragraph" w:styleId="Piedepgina">
     <w:name w:val="footer"/>
@@ -3957,7 +3820,7 @@
     <w:link w:val="PiedepginaCar"/>
     <w:uiPriority w:val="99"/>
     <w:unhideWhenUsed/>
-    <w:rsid w:val="00A22072"/>
+    <w:rsid w:val="004C34FA"/>
     <w:pPr>
       <w:tabs>
         <w:tab w:val="center" w:pos="4252"/>
@@ -3971,7 +3834,7 @@
     <w:basedOn w:val="Fuentedeprrafopredeter"/>
     <w:link w:val="Piedepgina"/>
     <w:uiPriority w:val="99"/>
-    <w:rsid w:val="00A22072"/>
+    <w:rsid w:val="004C34FA"/>
   </w:style>
 </w:styles>
 </file>

</xml_diff>

<commit_message>
fix: Move AI to Opportunities and replace Gobierno Tecnico with Control y Recepcion Tecnica
</commit_message>
<xml_diff>
--- a/Plan_Trabajo_Concurso_Jefatura_Software.docx
+++ b/Plan_Trabajo_Concurso_Jefatura_Software.docx
@@ -227,7 +227,7 @@
           <w:color w:val="666666"/>
           <w:sz w:val="20"/>
         </w:rPr>
-        <w:t>"Optimizando los procedimientos organizacionales como columna vertebral para asegurar un software escalable, seguro y sostenible"</w:t>
+        <w:t>Optimizando los procedimientos organizacionales como columna vertebral para asegurar un software escalable, seguro y sostenible</w:t>
       </w:r>
     </w:p>
     <w:p>
@@ -600,115 +600,115 @@
           <w:rFonts w:ascii="Arial" w:hAnsi="Arial" w:cs="Arial"/>
           <w:color w:val="111111"/>
         </w:rPr>
-        <w:t>â€¢    **Relevamiento y Análisis de Necesidades:** Relevar, analizar y sistematizar los requerimientos informáticos y funcionales de las distintas dependencias de la administración municipal.</w:t>
-      </w:r>
-    </w:p>
-    <w:p>
-      <w:pPr>
-        <w:spacing w:before="40" w:after="40" w:line="240" w:lineRule="auto"/>
-        <w:ind w:left="360"/>
-        <w:jc w:val="both"/>
-        <w:rPr>
-          <w:rFonts w:ascii="Arial" w:hAnsi="Arial" w:cs="Arial"/>
-          <w:color w:val="111111"/>
-        </w:rPr>
-      </w:pPr>
-      <w:r>
-        <w:rPr>
-          <w:rFonts w:ascii="Arial" w:hAnsi="Arial" w:cs="Arial"/>
-          <w:color w:val="111111"/>
-        </w:rPr>
-        <w:t>â€¢    **Planificación y Desarrollo de Software:** Planificar, diseñar, codificar, implementar y mantener los sistemas de software, bases de datos y aplicaciones móviles de uso institucional.</w:t>
-      </w:r>
-    </w:p>
-    <w:p>
-      <w:pPr>
-        <w:spacing w:before="40" w:after="40" w:line="240" w:lineRule="auto"/>
-        <w:ind w:left="360"/>
-        <w:jc w:val="both"/>
-        <w:rPr>
-          <w:rFonts w:ascii="Arial" w:hAnsi="Arial" w:cs="Arial"/>
-          <w:color w:val="111111"/>
-        </w:rPr>
-      </w:pPr>
-      <w:r>
-        <w:rPr>
-          <w:rFonts w:ascii="Arial" w:hAnsi="Arial" w:cs="Arial"/>
-          <w:color w:val="111111"/>
-        </w:rPr>
-        <w:t>â€¢    **Modelos de Desarrollo y Documentación:** Definir y homogenizar los modelos de ciclo de vida de desarrollo de software, dictando pautas de documentación técnica, diccionarios de datos y manuales operativos.</w:t>
-      </w:r>
-    </w:p>
-    <w:p>
-      <w:pPr>
-        <w:spacing w:before="40" w:after="40" w:line="240" w:lineRule="auto"/>
-        <w:ind w:left="360"/>
-        <w:jc w:val="both"/>
-        <w:rPr>
-          <w:rFonts w:ascii="Arial" w:hAnsi="Arial" w:cs="Arial"/>
-          <w:color w:val="111111"/>
-        </w:rPr>
-      </w:pPr>
-      <w:r>
-        <w:rPr>
-          <w:rFonts w:ascii="Arial" w:hAnsi="Arial" w:cs="Arial"/>
-          <w:color w:val="111111"/>
-        </w:rPr>
-        <w:t>â€¢    **Estándares Técnicos y Calidad:** Establecer y auditar los estándares de codificación, el uso del *template* de arquitectura base municipal, las pautas de *testing* y la seguridad desde la etapa de análisis (*Security by Design*).</w:t>
-      </w:r>
-    </w:p>
-    <w:p>
-      <w:pPr>
-        <w:spacing w:before="40" w:after="40" w:line="240" w:lineRule="auto"/>
-        <w:ind w:left="360"/>
-        <w:jc w:val="both"/>
-        <w:rPr>
-          <w:rFonts w:ascii="Arial" w:hAnsi="Arial" w:cs="Arial"/>
-          <w:color w:val="111111"/>
-        </w:rPr>
-      </w:pPr>
-      <w:r>
-        <w:rPr>
-          <w:rFonts w:ascii="Arial" w:hAnsi="Arial" w:cs="Arial"/>
-          <w:color w:val="111111"/>
-        </w:rPr>
-        <w:t>â€¢    **Investigación, Evaluación e Innovación:** Investigar, evaluar e institucionalizar de manera fundamentada nuevas tecnologías, lenguajes de programación, herramientas de desarrollo, marcos ágiles e Inteligencia Artificial.</w:t>
-      </w:r>
-    </w:p>
-    <w:p>
-      <w:pPr>
-        <w:spacing w:before="40" w:after="40" w:line="240" w:lineRule="auto"/>
-        <w:ind w:left="360"/>
-        <w:jc w:val="both"/>
-        <w:rPr>
-          <w:rFonts w:ascii="Arial" w:hAnsi="Arial" w:cs="Arial"/>
-          <w:color w:val="111111"/>
-        </w:rPr>
-      </w:pPr>
-      <w:r>
-        <w:rPr>
-          <w:rFonts w:ascii="Arial" w:hAnsi="Arial" w:cs="Arial"/>
-          <w:color w:val="111111"/>
-        </w:rPr>
-        <w:t>â€¢    **Gobierno Técnico de Tercerizaciones:** Participar activamente en la formulación de pliegos, seguimiento técnico, control de entregables, pruebas de aceptación y recepción de código fuente de las soluciones de software desarrolladas por proveedores externos.</w:t>
-      </w:r>
-    </w:p>
-    <w:p>
-      <w:pPr>
-        <w:spacing w:before="40" w:after="40" w:line="240" w:lineRule="auto"/>
-        <w:ind w:left="360"/>
-        <w:jc w:val="both"/>
-        <w:rPr>
-          <w:rFonts w:ascii="Arial" w:hAnsi="Arial" w:cs="Arial"/>
-          <w:color w:val="111111"/>
-        </w:rPr>
-      </w:pPr>
-      <w:r>
-        <w:rPr>
-          <w:rFonts w:ascii="Arial" w:hAnsi="Arial" w:cs="Arial"/>
-          <w:color w:val="111111"/>
-        </w:rPr>
-        <w:t>â€¢    **Interoperabilidad e Integración:** Garantizar la integración, reutilización de componentes y comunicación entre los diferentes sistemas municipales para evitar silos aislados de información.</w:t>
+        <w:t>•    **Relevamiento y Análisis de Necesidades:** Relevar, analizar y sistematizar los requerimientos informáticos y funcionales de las distintas dependencias de la administración municipal.</w:t>
+      </w:r>
+    </w:p>
+    <w:p>
+      <w:pPr>
+        <w:spacing w:before="40" w:after="40" w:line="240" w:lineRule="auto"/>
+        <w:ind w:left="360"/>
+        <w:jc w:val="both"/>
+        <w:rPr>
+          <w:rFonts w:ascii="Arial" w:hAnsi="Arial" w:cs="Arial"/>
+          <w:color w:val="111111"/>
+        </w:rPr>
+      </w:pPr>
+      <w:r>
+        <w:rPr>
+          <w:rFonts w:ascii="Arial" w:hAnsi="Arial" w:cs="Arial"/>
+          <w:color w:val="111111"/>
+        </w:rPr>
+        <w:t>•    **Planificación y Desarrollo de Software:** Planificar, diseñar, codificar, implementar y mantener los sistemas de software, bases de datos y aplicaciones móviles de uso institucional.</w:t>
+      </w:r>
+    </w:p>
+    <w:p>
+      <w:pPr>
+        <w:spacing w:before="40" w:after="40" w:line="240" w:lineRule="auto"/>
+        <w:ind w:left="360"/>
+        <w:jc w:val="both"/>
+        <w:rPr>
+          <w:rFonts w:ascii="Arial" w:hAnsi="Arial" w:cs="Arial"/>
+          <w:color w:val="111111"/>
+        </w:rPr>
+      </w:pPr>
+      <w:r>
+        <w:rPr>
+          <w:rFonts w:ascii="Arial" w:hAnsi="Arial" w:cs="Arial"/>
+          <w:color w:val="111111"/>
+        </w:rPr>
+        <w:t>•    **Modelos de Desarrollo y Documentación:** Definir y homogenizar los modelos de ciclo de vida de desarrollo de software, dictando pautas de documentación técnica, diccionarios de datos y manuales operativos.</w:t>
+      </w:r>
+    </w:p>
+    <w:p>
+      <w:pPr>
+        <w:spacing w:before="40" w:after="40" w:line="240" w:lineRule="auto"/>
+        <w:ind w:left="360"/>
+        <w:jc w:val="both"/>
+        <w:rPr>
+          <w:rFonts w:ascii="Arial" w:hAnsi="Arial" w:cs="Arial"/>
+          <w:color w:val="111111"/>
+        </w:rPr>
+      </w:pPr>
+      <w:r>
+        <w:rPr>
+          <w:rFonts w:ascii="Arial" w:hAnsi="Arial" w:cs="Arial"/>
+          <w:color w:val="111111"/>
+        </w:rPr>
+        <w:t>•    **Estándares Técnicos y Calidad:** Establecer y auditar los estándares de codificación, el uso del *template* de arquitectura base municipal, las pautas de *testing* y la seguridad desde la etapa de análisis (*Security by Design*).</w:t>
+      </w:r>
+    </w:p>
+    <w:p>
+      <w:pPr>
+        <w:spacing w:before="40" w:after="40" w:line="240" w:lineRule="auto"/>
+        <w:ind w:left="360"/>
+        <w:jc w:val="both"/>
+        <w:rPr>
+          <w:rFonts w:ascii="Arial" w:hAnsi="Arial" w:cs="Arial"/>
+          <w:color w:val="111111"/>
+        </w:rPr>
+      </w:pPr>
+      <w:r>
+        <w:rPr>
+          <w:rFonts w:ascii="Arial" w:hAnsi="Arial" w:cs="Arial"/>
+          <w:color w:val="111111"/>
+        </w:rPr>
+        <w:t>•    **Investigación, Evaluación e Innovación:** Investigar, evaluar e institucionalizar de manera fundamentada nuevas tecnologías, lenguajes de programación, herramientas de desarrollo, marcos ágiles e Inteligencia Artificial.</w:t>
+      </w:r>
+    </w:p>
+    <w:p>
+      <w:pPr>
+        <w:spacing w:before="40" w:after="40" w:line="240" w:lineRule="auto"/>
+        <w:ind w:left="360"/>
+        <w:jc w:val="both"/>
+        <w:rPr>
+          <w:rFonts w:ascii="Arial" w:hAnsi="Arial" w:cs="Arial"/>
+          <w:color w:val="111111"/>
+        </w:rPr>
+      </w:pPr>
+      <w:r>
+        <w:rPr>
+          <w:rFonts w:ascii="Arial" w:hAnsi="Arial" w:cs="Arial"/>
+          <w:color w:val="111111"/>
+        </w:rPr>
+        <w:t>•    **Control y Recepción Técnica de Software Tercerizado:** Participar activamente en el seguimiento técnico, control de entregables, pruebas de aceptación y recepción de código fuente de las soluciones desarrolladas por proveedores externos.</w:t>
+      </w:r>
+    </w:p>
+    <w:p>
+      <w:pPr>
+        <w:spacing w:before="40" w:after="40" w:line="240" w:lineRule="auto"/>
+        <w:ind w:left="360"/>
+        <w:jc w:val="both"/>
+        <w:rPr>
+          <w:rFonts w:ascii="Arial" w:hAnsi="Arial" w:cs="Arial"/>
+          <w:color w:val="111111"/>
+        </w:rPr>
+      </w:pPr>
+      <w:r>
+        <w:rPr>
+          <w:rFonts w:ascii="Arial" w:hAnsi="Arial" w:cs="Arial"/>
+          <w:color w:val="111111"/>
+        </w:rPr>
+        <w:t>•    **Interoperabilidad e Integración:** Garantizar la integración, reutilización de componentes y comunicación entre los diferentes sistemas municipales para evitar silos aislados de información.</w:t>
       </w:r>
     </w:p>
     <w:p>
@@ -781,25 +781,25 @@
           <w:rFonts w:ascii="Arial" w:hAnsi="Arial" w:cs="Arial"/>
           <w:color w:val="111111"/>
         </w:rPr>
-        <w:t>â€¢    **Conocimiento Profundo del Negocio Municipal:** El personal posee un dominio valioso de las normativas, circuitos administrativos, trámites y reglas operativas de la administración pública local.</w:t>
-      </w:r>
-    </w:p>
-    <w:p>
-      <w:pPr>
-        <w:spacing w:before="40" w:after="40" w:line="240" w:lineRule="auto"/>
-        <w:ind w:left="360"/>
-        <w:jc w:val="both"/>
-        <w:rPr>
-          <w:rFonts w:ascii="Arial" w:hAnsi="Arial" w:cs="Arial"/>
-          <w:color w:val="111111"/>
-        </w:rPr>
-      </w:pPr>
-      <w:r>
-        <w:rPr>
-          <w:rFonts w:ascii="Arial" w:hAnsi="Arial" w:cs="Arial"/>
-          <w:color w:val="111111"/>
-        </w:rPr>
-        <w:t>â€¢    **Bases Tecnológicas e Iniciativas Existentes:** Existencia de herramientas consolidadas (repositorios en GitLab, seguimiento en Redmine, entornos dockerizados en ciertos proyectos) y el desarrollo interno de un *template* de arquitectura base en evolución.</w:t>
+        <w:t>•    **Conocimiento Profundo del Negocio Municipal:** El personal posee un dominio valioso de las normativas, circuitos administrativos, trámites y reglas operativas de la administración pública local.</w:t>
+      </w:r>
+    </w:p>
+    <w:p>
+      <w:pPr>
+        <w:spacing w:before="40" w:after="40" w:line="240" w:lineRule="auto"/>
+        <w:ind w:left="360"/>
+        <w:jc w:val="both"/>
+        <w:rPr>
+          <w:rFonts w:ascii="Arial" w:hAnsi="Arial" w:cs="Arial"/>
+          <w:color w:val="111111"/>
+        </w:rPr>
+      </w:pPr>
+      <w:r>
+        <w:rPr>
+          <w:rFonts w:ascii="Arial" w:hAnsi="Arial" w:cs="Arial"/>
+          <w:color w:val="111111"/>
+        </w:rPr>
+        <w:t>•    **Bases Tecnológicas e Iniciativas Existentes:** Existencia de herramientas consolidadas (repositorios en GitLab, seguimiento en Redmine, entornos dockerizados en ciertos proyectos) y el desarrollo interno de un *template* de arquitectura base en evolución.</w:t>
       </w:r>
     </w:p>
     <w:p>
@@ -835,133 +835,115 @@
           <w:rFonts w:ascii="Arial" w:hAnsi="Arial" w:cs="Arial"/>
           <w:color w:val="111111"/>
         </w:rPr>
-        <w:t>â€¢    **Fragmentación Tecnológica y Desintegración Arquitectónica:** Coexistencia caótica de tecnologías obsoletas (WebForms con SQL 2005) junto a tecnologías modernas (.NET, React, Angular, PHP, PostgreSQL). Aunque existe un *template* de arquitectura base, su uso no ha sido obligatorio ni uniforme.</w:t>
-      </w:r>
-    </w:p>
-    <w:p>
-      <w:pPr>
-        <w:spacing w:before="40" w:after="40" w:line="240" w:lineRule="auto"/>
-        <w:ind w:left="360"/>
-        <w:jc w:val="both"/>
-        <w:rPr>
-          <w:rFonts w:ascii="Arial" w:hAnsi="Arial" w:cs="Arial"/>
-          <w:color w:val="111111"/>
-        </w:rPr>
-      </w:pPr>
-      <w:r>
-        <w:rPr>
-          <w:rFonts w:ascii="Arial" w:hAnsi="Arial" w:cs="Arial"/>
-          <w:color w:val="111111"/>
-        </w:rPr>
-        <w:t>â€¢    **Multitarea Extrema y Conocimiento Concentrado (*Single Point of Failure*):** La escasa dotación frente a la alta demanda obliga al personal a atender simultáneamente emergencias *legacy* de diversas áreas y desarrollos nuevos. Esto genera saltos de contexto constantes y un alto riesgo operativo: la existencia de sistemas críticos que dependen del conocimiento exclusivo de una sola persona.</w:t>
-      </w:r>
-    </w:p>
-    <w:p>
-      <w:pPr>
-        <w:spacing w:before="40" w:after="40" w:line="240" w:lineRule="auto"/>
-        <w:ind w:left="360"/>
-        <w:jc w:val="both"/>
-        <w:rPr>
-          <w:rFonts w:ascii="Arial" w:hAnsi="Arial" w:cs="Arial"/>
-          <w:color w:val="111111"/>
-        </w:rPr>
-      </w:pPr>
-      <w:r>
-        <w:rPr>
-          <w:rFonts w:ascii="Arial" w:hAnsi="Arial" w:cs="Arial"/>
-          <w:color w:val="111111"/>
-        </w:rPr>
-        <w:t>â€¢    **Aislamiento Operativo entre Dependencias:** La distribución física del personal en dos oficinas distintas genera descoordinación, aislamiento en silos de información y el riesgo de desarrollar funcionalidades duplicadas por falta de comunicación.</w:t>
-      </w:r>
-    </w:p>
-    <w:p>
-      <w:pPr>
-        <w:spacing w:before="40" w:after="40" w:line="240" w:lineRule="auto"/>
-        <w:ind w:left="360"/>
-        <w:jc w:val="both"/>
-        <w:rPr>
-          <w:rFonts w:ascii="Arial" w:hAnsi="Arial" w:cs="Arial"/>
-          <w:color w:val="111111"/>
-        </w:rPr>
-      </w:pPr>
-      <w:r>
-        <w:rPr>
-          <w:rFonts w:ascii="Arial" w:hAnsi="Arial" w:cs="Arial"/>
-          <w:color w:val="111111"/>
-        </w:rPr>
-        <w:t>â€¢    **Seguimiento y Estimación Caóticos:** Uso fragmentado de herramientas (algunos agentes usan Redmine, otros planillas desactualizadas en Excel o registros informales), impidiendo conocer la capacidad operativa real del departamento.</w:t>
-      </w:r>
-    </w:p>
-    <w:p>
-      <w:pPr>
-        <w:spacing w:before="40" w:after="40" w:line="240" w:lineRule="auto"/>
-        <w:ind w:left="360"/>
-        <w:jc w:val="both"/>
-        <w:rPr>
-          <w:rFonts w:ascii="Arial" w:hAnsi="Arial" w:cs="Arial"/>
-          <w:color w:val="111111"/>
-        </w:rPr>
-      </w:pPr>
-      <w:r>
-        <w:rPr>
-          <w:rFonts w:ascii="Arial" w:hAnsi="Arial" w:cs="Arial"/>
-          <w:color w:val="111111"/>
-        </w:rPr>
-        <w:t>â€¢    **Documentación Inexistente o Desigual:** Falta de manuales técnicos, diccionarios de datos o registros de arquitectura, lo que profundiza la dependencia de programadores específicos.</w:t>
-      </w:r>
-    </w:p>
-    <w:p>
-      <w:pPr>
-        <w:spacing w:before="40" w:after="40" w:line="240" w:lineRule="auto"/>
-        <w:ind w:left="360"/>
-        <w:jc w:val="both"/>
-        <w:rPr>
-          <w:rFonts w:ascii="Arial" w:hAnsi="Arial" w:cs="Arial"/>
-          <w:color w:val="111111"/>
-        </w:rPr>
-      </w:pPr>
-      <w:r>
-        <w:rPr>
-          <w:rFonts w:ascii="Arial" w:hAnsi="Arial" w:cs="Arial"/>
-          <w:color w:val="111111"/>
-        </w:rPr>
-        <w:t>â€¢    **Ausencia de Gobierno Técnico sobre Proveedores Externos:** Los desarrollos contratados a terceros corren el riesgo de entregarse sin documentación suficiente, sin transferir el conocimiento o sin alinearse con los estándares municipales.</w:t>
-      </w:r>
-    </w:p>
-    <w:p>
-      <w:pPr>
-        <w:spacing w:before="40" w:after="40" w:line="240" w:lineRule="auto"/>
-        <w:ind w:left="360"/>
-        <w:jc w:val="both"/>
-        <w:rPr>
-          <w:rFonts w:ascii="Arial" w:hAnsi="Arial" w:cs="Arial"/>
-          <w:color w:val="111111"/>
-        </w:rPr>
-      </w:pPr>
-      <w:r>
-        <w:rPr>
-          <w:rFonts w:ascii="Arial" w:hAnsi="Arial" w:cs="Arial"/>
-          <w:color w:val="111111"/>
-        </w:rPr>
-        <w:t>â€¢    **Pruebas de Software Reactivas:** Al no existir el rol de QA en el organigrama municipal (ni la posibilidad de crear nuevos cargos en el escalafón), la verificación de errores depende del propio desarrollador o salta en post-producción reportada por el usuario.</w:t>
-      </w:r>
-    </w:p>
-    <w:p>
-      <w:pPr>
-        <w:spacing w:before="40" w:after="40" w:line="240" w:lineRule="auto"/>
-        <w:ind w:left="360"/>
-        <w:jc w:val="both"/>
-        <w:rPr>
-          <w:rFonts w:ascii="Arial" w:hAnsi="Arial" w:cs="Arial"/>
-          <w:color w:val="111111"/>
-        </w:rPr>
-      </w:pPr>
-      <w:r>
-        <w:rPr>
-          <w:rFonts w:ascii="Arial" w:hAnsi="Arial" w:cs="Arial"/>
-          <w:color w:val="111111"/>
-        </w:rPr>
-        <w:t>â€¢    **Uso de IA Informal e Inseguro:** La utilización de herramientas de IA se da por iniciativa personal, sin licencias institucionales y sin pautas claras de seguridad sobre la protección de datos sensibles municipales.</w:t>
+        <w:t>•    **Fragmentación Tecnológica y Desintegración Arquitectónica:** Coexistencia caótica de tecnologías obsoletas (WebForms con SQL 2005) junto a tecnologías modernas (.NET, React, Angular, PHP, PostgreSQL). Aunque existe un *template* de arquitectura base, su uso no ha sido obligatorio ni uniforme.</w:t>
+      </w:r>
+    </w:p>
+    <w:p>
+      <w:pPr>
+        <w:spacing w:before="40" w:after="40" w:line="240" w:lineRule="auto"/>
+        <w:ind w:left="360"/>
+        <w:jc w:val="both"/>
+        <w:rPr>
+          <w:rFonts w:ascii="Arial" w:hAnsi="Arial" w:cs="Arial"/>
+          <w:color w:val="111111"/>
+        </w:rPr>
+      </w:pPr>
+      <w:r>
+        <w:rPr>
+          <w:rFonts w:ascii="Arial" w:hAnsi="Arial" w:cs="Arial"/>
+          <w:color w:val="111111"/>
+        </w:rPr>
+        <w:t>•    **Multitarea Extrema y Conocimiento Concentrado (*Single Point of Failure*):** La escasa dotación frente a la alta demanda obliga al personal a atender simultáneamente emergencias *legacy* de diversas áreas y desarrollos nuevos. Esto genera saltos de contexto constantes y un alto riesgo operativo: la existencia de sistemas críticos que dependen del conocimiento exclusivo de una sola persona.</w:t>
+      </w:r>
+    </w:p>
+    <w:p>
+      <w:pPr>
+        <w:spacing w:before="40" w:after="40" w:line="240" w:lineRule="auto"/>
+        <w:ind w:left="360"/>
+        <w:jc w:val="both"/>
+        <w:rPr>
+          <w:rFonts w:ascii="Arial" w:hAnsi="Arial" w:cs="Arial"/>
+          <w:color w:val="111111"/>
+        </w:rPr>
+      </w:pPr>
+      <w:r>
+        <w:rPr>
+          <w:rFonts w:ascii="Arial" w:hAnsi="Arial" w:cs="Arial"/>
+          <w:color w:val="111111"/>
+        </w:rPr>
+        <w:t>•    **Aislamiento Operativo entre Dependencias:** La distribución física del personal en dos oficinas distintas genera descoordinación, aislamiento en silos de información y el riesgo de desarrollar funcionalidades duplicadas por falta de comunicación.</w:t>
+      </w:r>
+    </w:p>
+    <w:p>
+      <w:pPr>
+        <w:spacing w:before="40" w:after="40" w:line="240" w:lineRule="auto"/>
+        <w:ind w:left="360"/>
+        <w:jc w:val="both"/>
+        <w:rPr>
+          <w:rFonts w:ascii="Arial" w:hAnsi="Arial" w:cs="Arial"/>
+          <w:color w:val="111111"/>
+        </w:rPr>
+      </w:pPr>
+      <w:r>
+        <w:rPr>
+          <w:rFonts w:ascii="Arial" w:hAnsi="Arial" w:cs="Arial"/>
+          <w:color w:val="111111"/>
+        </w:rPr>
+        <w:t>•    **Estimación y Seguimiento Caóticos:** Uso fragmentado de herramientas (algunos agentes usan Redmine, otros planillas desactualizadas en Excel o registros informales), impidiendo conocer la capacidad operativa real del departamento.</w:t>
+      </w:r>
+    </w:p>
+    <w:p>
+      <w:pPr>
+        <w:spacing w:before="40" w:after="40" w:line="240" w:lineRule="auto"/>
+        <w:ind w:left="360"/>
+        <w:jc w:val="both"/>
+        <w:rPr>
+          <w:rFonts w:ascii="Arial" w:hAnsi="Arial" w:cs="Arial"/>
+          <w:color w:val="111111"/>
+        </w:rPr>
+      </w:pPr>
+      <w:r>
+        <w:rPr>
+          <w:rFonts w:ascii="Arial" w:hAnsi="Arial" w:cs="Arial"/>
+          <w:color w:val="111111"/>
+        </w:rPr>
+        <w:t>•    **Documentación Inexistente o Desigual:** Falta de manuales técnicos, diccionarios de datos o registros de arquitectura, lo que profundiza la dependencia de programadores específicos.</w:t>
+      </w:r>
+    </w:p>
+    <w:p>
+      <w:pPr>
+        <w:spacing w:before="40" w:after="40" w:line="240" w:lineRule="auto"/>
+        <w:ind w:left="360"/>
+        <w:jc w:val="both"/>
+        <w:rPr>
+          <w:rFonts w:ascii="Arial" w:hAnsi="Arial" w:cs="Arial"/>
+          <w:color w:val="111111"/>
+        </w:rPr>
+      </w:pPr>
+      <w:r>
+        <w:rPr>
+          <w:rFonts w:ascii="Arial" w:hAnsi="Arial" w:cs="Arial"/>
+          <w:color w:val="111111"/>
+        </w:rPr>
+        <w:t>•    **Falta de Control y Recepción Técnica en Software Tercerizado:** Riesgo de recibir sistemas contratados a terceros sin la documentación adecuada, sin la transferencia de conocimiento al personal municipal o sin alineación a los estándares de arquitectura del departamento.</w:t>
+      </w:r>
+    </w:p>
+    <w:p>
+      <w:pPr>
+        <w:spacing w:before="40" w:after="40" w:line="240" w:lineRule="auto"/>
+        <w:ind w:left="360"/>
+        <w:jc w:val="both"/>
+        <w:rPr>
+          <w:rFonts w:ascii="Arial" w:hAnsi="Arial" w:cs="Arial"/>
+          <w:color w:val="111111"/>
+        </w:rPr>
+      </w:pPr>
+      <w:r>
+        <w:rPr>
+          <w:rFonts w:ascii="Arial" w:hAnsi="Arial" w:cs="Arial"/>
+          <w:color w:val="111111"/>
+        </w:rPr>
+        <w:t>•    **Pruebas de Software Reactivas:** Al no existir el rol de QA en el organigrama municipal (ni la posibilidad de crear nuevos cargos en el escalafón), la verificación de errores depende del propio desarrollador o salta en post-producción reportada por el usuario.</w:t>
       </w:r>
     </w:p>
     <w:p>
@@ -997,25 +979,43 @@
           <w:rFonts w:ascii="Arial" w:hAnsi="Arial" w:cs="Arial"/>
           <w:color w:val="111111"/>
         </w:rPr>
-        <w:t>â€¢    **Adopción de Marcos Ágiles Híbridos:** Implementación de metodologías ágiles adaptadas a la realidad municipal a costo cero.</w:t>
-      </w:r>
-    </w:p>
-    <w:p>
-      <w:pPr>
-        <w:spacing w:before="40" w:after="40" w:line="240" w:lineRule="auto"/>
-        <w:ind w:left="360"/>
-        <w:jc w:val="both"/>
-        <w:rPr>
-          <w:rFonts w:ascii="Arial" w:hAnsi="Arial" w:cs="Arial"/>
-          <w:color w:val="111111"/>
-        </w:rPr>
-      </w:pPr>
-      <w:r>
-        <w:rPr>
-          <w:rFonts w:ascii="Arial" w:hAnsi="Arial" w:cs="Arial"/>
-          <w:color w:val="111111"/>
-        </w:rPr>
-        <w:t>â€¢    **Estandarización mediante la Arquitectura Base:** Consolidar el *template* preexistente como norma obligatoria para todos los desarrollos.</w:t>
+        <w:t>•    **Adopción de Inteligencia Artificial para Agilizar la Producción:** Oportunidad de incorporar herramientas asistidas por IA (asistentes en los IDEs) para acelerar la codificación, automatizar tareas repetitivas de documentación y aumentar la productividad general del departamento.</w:t>
+      </w:r>
+    </w:p>
+    <w:p>
+      <w:pPr>
+        <w:spacing w:before="40" w:after="40" w:line="240" w:lineRule="auto"/>
+        <w:ind w:left="360"/>
+        <w:jc w:val="both"/>
+        <w:rPr>
+          <w:rFonts w:ascii="Arial" w:hAnsi="Arial" w:cs="Arial"/>
+          <w:color w:val="111111"/>
+        </w:rPr>
+      </w:pPr>
+      <w:r>
+        <w:rPr>
+          <w:rFonts w:ascii="Arial" w:hAnsi="Arial" w:cs="Arial"/>
+          <w:color w:val="111111"/>
+        </w:rPr>
+        <w:t>•    **Adopción de Marcos Ágiles Híbridos:** Implementación de metodologías ágiles adaptadas a la realidad municipal a costo cero.</w:t>
+      </w:r>
+    </w:p>
+    <w:p>
+      <w:pPr>
+        <w:spacing w:before="40" w:after="40" w:line="240" w:lineRule="auto"/>
+        <w:ind w:left="360"/>
+        <w:jc w:val="both"/>
+        <w:rPr>
+          <w:rFonts w:ascii="Arial" w:hAnsi="Arial" w:cs="Arial"/>
+          <w:color w:val="111111"/>
+        </w:rPr>
+      </w:pPr>
+      <w:r>
+        <w:rPr>
+          <w:rFonts w:ascii="Arial" w:hAnsi="Arial" w:cs="Arial"/>
+          <w:color w:val="111111"/>
+        </w:rPr>
+        <w:t>•    **Estandarización mediante la Arquitectura Base:** Consolidar el *template* preexistente como norma obligatoria para todos los desarrollos.</w:t>
       </w:r>
     </w:p>
     <w:p>
@@ -1051,25 +1051,25 @@
           <w:rFonts w:ascii="Arial" w:hAnsi="Arial" w:cs="Arial"/>
           <w:color w:val="111111"/>
         </w:rPr>
-        <w:t>â€¢    **Cambios Rápidos en Demandas de Gestión:** Necesidad de acelerar entregas sin comprometer la seguridad ni la mantenibilidad.</w:t>
-      </w:r>
-    </w:p>
-    <w:p>
-      <w:pPr>
-        <w:spacing w:before="40" w:after="40" w:line="240" w:lineRule="auto"/>
-        <w:ind w:left="360"/>
-        <w:jc w:val="both"/>
-        <w:rPr>
-          <w:rFonts w:ascii="Arial" w:hAnsi="Arial" w:cs="Arial"/>
-          <w:color w:val="111111"/>
-        </w:rPr>
-      </w:pPr>
-      <w:r>
-        <w:rPr>
-          <w:rFonts w:ascii="Arial" w:hAnsi="Arial" w:cs="Arial"/>
-          <w:color w:val="111111"/>
-        </w:rPr>
-        <w:t>â€¢    **Riesgos de Ciberseguridad y Fuga de Datos:** Vulnerabilidades en código heredado o uso inadvertido de IA pública compartiendo datos institucionales.</w:t>
+        <w:t>•    **Cambios Rápidos en Demandas de Gestión:** Necesidad de acelerar entregas sin comprometer la seguridad ni la mantenibilidad.</w:t>
+      </w:r>
+    </w:p>
+    <w:p>
+      <w:pPr>
+        <w:spacing w:before="40" w:after="40" w:line="240" w:lineRule="auto"/>
+        <w:ind w:left="360"/>
+        <w:jc w:val="both"/>
+        <w:rPr>
+          <w:rFonts w:ascii="Arial" w:hAnsi="Arial" w:cs="Arial"/>
+          <w:color w:val="111111"/>
+        </w:rPr>
+      </w:pPr>
+      <w:r>
+        <w:rPr>
+          <w:rFonts w:ascii="Arial" w:hAnsi="Arial" w:cs="Arial"/>
+          <w:color w:val="111111"/>
+        </w:rPr>
+        <w:t>•    **Riesgos de Ciberseguridad y Fuga de Datos:** Vulnerabilidades en código heredado o uso inadvertido de IA pública compartiendo datos institucionales.</w:t>
       </w:r>
     </w:p>
     <w:p>
@@ -1317,79 +1317,79 @@
           <w:rFonts w:ascii="Arial" w:hAnsi="Arial" w:cs="Arial"/>
           <w:color w:val="111111"/>
         </w:rPr>
-        <w:t>â€¢    **Modelo Híbrido (Kanban + Iteraciones Cortas):** Se aplicará *Kanban* para ordenar el mantenimiento continuo e incidencias de sistemas *legacy*, e *iteraciones cortas* (Sprints) para nuevos desarrollos. No se impondrá Scrum de forma rígida a todo el personal.</w:t>
-      </w:r>
-    </w:p>
-    <w:p>
-      <w:pPr>
-        <w:spacing w:before="40" w:after="40" w:line="240" w:lineRule="auto"/>
-        <w:ind w:left="360"/>
-        <w:jc w:val="both"/>
-        <w:rPr>
-          <w:rFonts w:ascii="Arial" w:hAnsi="Arial" w:cs="Arial"/>
-          <w:color w:val="111111"/>
-        </w:rPr>
-      </w:pPr>
-      <w:r>
-        <w:rPr>
-          <w:rFonts w:ascii="Arial" w:hAnsi="Arial" w:cs="Arial"/>
-          <w:color w:val="111111"/>
-        </w:rPr>
-        <w:t>â€¢    **El Jefe de Departamento como *Scrum Master Global* y Gestor Gerencial:** La Jefatura asumirá un doble rol activo:</w:t>
-      </w:r>
-    </w:p>
-    <w:p>
-      <w:pPr>
-        <w:spacing w:before="40" w:after="40" w:line="240" w:lineRule="auto"/>
-        <w:ind w:left="360"/>
-        <w:jc w:val="both"/>
-        <w:rPr>
-          <w:rFonts w:ascii="Arial" w:hAnsi="Arial" w:cs="Arial"/>
-          <w:color w:val="111111"/>
-        </w:rPr>
-      </w:pPr>
-      <w:r>
-        <w:rPr>
-          <w:rFonts w:ascii="Arial" w:hAnsi="Arial" w:cs="Arial"/>
-          <w:color w:val="111111"/>
-        </w:rPr>
-        <w:t>â€¢    *Como Scrum Master Global:* Orquestará operativamente las células, destrabará bloqueos diarios, facilitará la comunicación entre las dos oficinas físicas y **actuará como filtro coordinador para evitar el desarrollo de funcionalidades duplicadas**.</w:t>
-      </w:r>
-    </w:p>
-    <w:p>
-      <w:pPr>
-        <w:spacing w:before="40" w:after="40" w:line="240" w:lineRule="auto"/>
-        <w:ind w:left="360"/>
-        <w:jc w:val="both"/>
-        <w:rPr>
-          <w:rFonts w:ascii="Arial" w:hAnsi="Arial" w:cs="Arial"/>
-          <w:color w:val="111111"/>
-        </w:rPr>
-      </w:pPr>
-      <w:r>
-        <w:rPr>
-          <w:rFonts w:ascii="Arial" w:hAnsi="Arial" w:cs="Arial"/>
-          <w:color w:val="111111"/>
-        </w:rPr>
-        <w:t>â€¢    *Como Gestor Gerencial:* Evaluará el rendimiento global del departamento, medirá la capacidad operativa en Redmine y garantizará la alineación estratégica con las autoridades.</w:t>
-      </w:r>
-    </w:p>
-    <w:p>
-      <w:pPr>
-        <w:spacing w:before="40" w:after="40" w:line="240" w:lineRule="auto"/>
-        <w:ind w:left="360"/>
-        <w:jc w:val="both"/>
-        <w:rPr>
-          <w:rFonts w:ascii="Arial" w:hAnsi="Arial" w:cs="Arial"/>
-          <w:color w:val="111111"/>
-        </w:rPr>
-      </w:pPr>
-      <w:r>
-        <w:rPr>
-          <w:rFonts w:ascii="Arial" w:hAnsi="Arial" w:cs="Arial"/>
-          <w:color w:val="111111"/>
-        </w:rPr>
-        <w:t>â€¢    **El "Product Owner" Institucional:** El rol de *Product Owner* recaerá en los referentes o jefaturas de las Secretarías usuarias solicitantes, quienes serán responsables de priorizar su propio *Backlog* de necesidades.</w:t>
+        <w:t>•    **Modelo Híbrido (Kanban + Iteraciones Cortas):** Se aplicará *Kanban* para ordenar el mantenimiento continuo e incidencias de sistemas *legacy*, e *iteraciones cortas* (Sprints) para nuevos desarrollos. No se impondrá Scrum de forma rígida a todo el personal.</w:t>
+      </w:r>
+    </w:p>
+    <w:p>
+      <w:pPr>
+        <w:spacing w:before="40" w:after="40" w:line="240" w:lineRule="auto"/>
+        <w:ind w:left="360"/>
+        <w:jc w:val="both"/>
+        <w:rPr>
+          <w:rFonts w:ascii="Arial" w:hAnsi="Arial" w:cs="Arial"/>
+          <w:color w:val="111111"/>
+        </w:rPr>
+      </w:pPr>
+      <w:r>
+        <w:rPr>
+          <w:rFonts w:ascii="Arial" w:hAnsi="Arial" w:cs="Arial"/>
+          <w:color w:val="111111"/>
+        </w:rPr>
+        <w:t>•    **El Jefe de Departamento como *Scrum Master Global* y Gestor Gerencial:** La Jefatura asumirá un doble rol activo:</w:t>
+      </w:r>
+    </w:p>
+    <w:p>
+      <w:pPr>
+        <w:spacing w:before="40" w:after="40" w:line="240" w:lineRule="auto"/>
+        <w:ind w:left="360"/>
+        <w:jc w:val="both"/>
+        <w:rPr>
+          <w:rFonts w:ascii="Arial" w:hAnsi="Arial" w:cs="Arial"/>
+          <w:color w:val="111111"/>
+        </w:rPr>
+      </w:pPr>
+      <w:r>
+        <w:rPr>
+          <w:rFonts w:ascii="Arial" w:hAnsi="Arial" w:cs="Arial"/>
+          <w:color w:val="111111"/>
+        </w:rPr>
+        <w:t>•    *Como Scrum Master Global:* Orquestará operativamente las células, destrabará bloqueos diarios, facilitará la comunicación entre las dos oficinas físicas y **actuará como filtro coordinador para evitar el desarrollo de funcionalidades duplicadas**.</w:t>
+      </w:r>
+    </w:p>
+    <w:p>
+      <w:pPr>
+        <w:spacing w:before="40" w:after="40" w:line="240" w:lineRule="auto"/>
+        <w:ind w:left="360"/>
+        <w:jc w:val="both"/>
+        <w:rPr>
+          <w:rFonts w:ascii="Arial" w:hAnsi="Arial" w:cs="Arial"/>
+          <w:color w:val="111111"/>
+        </w:rPr>
+      </w:pPr>
+      <w:r>
+        <w:rPr>
+          <w:rFonts w:ascii="Arial" w:hAnsi="Arial" w:cs="Arial"/>
+          <w:color w:val="111111"/>
+        </w:rPr>
+        <w:t>•    *Como Gestor Gerencial:* Evaluará el rendimiento global del departamento, medirá la capacidad operativa en Redmine y garantizará la alineación estratégica con las autoridades.</w:t>
+      </w:r>
+    </w:p>
+    <w:p>
+      <w:pPr>
+        <w:spacing w:before="40" w:after="40" w:line="240" w:lineRule="auto"/>
+        <w:ind w:left="360"/>
+        <w:jc w:val="both"/>
+        <w:rPr>
+          <w:rFonts w:ascii="Arial" w:hAnsi="Arial" w:cs="Arial"/>
+          <w:color w:val="111111"/>
+        </w:rPr>
+      </w:pPr>
+      <w:r>
+        <w:rPr>
+          <w:rFonts w:ascii="Arial" w:hAnsi="Arial" w:cs="Arial"/>
+          <w:color w:val="111111"/>
+        </w:rPr>
+        <w:t>•    **El "Product Owner" Institucional:** El rol de *Product Owner* recaerá en los referentes o jefaturas de las Secretarías usuarias solicitantes, quienes serán responsables de priorizar su propio *Backlog* de necesidades.</w:t>
       </w:r>
     </w:p>
     <w:p>
@@ -1425,25 +1425,25 @@
           <w:rFonts w:ascii="Arial" w:hAnsi="Arial" w:cs="Arial"/>
           <w:color w:val="111111"/>
         </w:rPr>
-        <w:t>â€¢    **Comunicación Abierta entre Oficinas:** Se mantendrá la distribución física en dos dependencias, pero se erradicará el aislamiento *operativo* mediante ceremonias ágiles conjuntas (Dailies de 15 min, Plannings) y uso unificado de repositorios.</w:t>
-      </w:r>
-    </w:p>
-    <w:p>
-      <w:pPr>
-        <w:spacing w:before="40" w:after="40" w:line="240" w:lineRule="auto"/>
-        <w:ind w:left="360"/>
-        <w:jc w:val="both"/>
-        <w:rPr>
-          <w:rFonts w:ascii="Arial" w:hAnsi="Arial" w:cs="Arial"/>
-          <w:color w:val="111111"/>
-        </w:rPr>
-      </w:pPr>
-      <w:r>
-        <w:rPr>
-          <w:rFonts w:ascii="Arial" w:hAnsi="Arial" w:cs="Arial"/>
-          <w:color w:val="111111"/>
-        </w:rPr>
-        <w:t>â€¢    **Asignación Dinámica y "Referentes Secundarios":** Para terminar con la dependencia de una sola persona en sistemas críticos, se implementará la figura del *Referente Secundario*. Mediante la asignación dinámica por fases (*shadowing* y capacitación cruzada), un programador acompañará al referente principal en tareas de mantenimiento y análisis, logrando la transferencia práctica del conocimiento sin tocar el escalafón.</w:t>
+        <w:t>•    **Comunicación Abierta entre Oficinas:** Se mantendrá la distribución física en dos dependencias, pero se erradicará el aislamiento *operativo* mediante ceremonias ágiles conjuntas (Dailies de 15 min, Plannings) y uso unificado de repositorios.</w:t>
+      </w:r>
+    </w:p>
+    <w:p>
+      <w:pPr>
+        <w:spacing w:before="40" w:after="40" w:line="240" w:lineRule="auto"/>
+        <w:ind w:left="360"/>
+        <w:jc w:val="both"/>
+        <w:rPr>
+          <w:rFonts w:ascii="Arial" w:hAnsi="Arial" w:cs="Arial"/>
+          <w:color w:val="111111"/>
+        </w:rPr>
+      </w:pPr>
+      <w:r>
+        <w:rPr>
+          <w:rFonts w:ascii="Arial" w:hAnsi="Arial" w:cs="Arial"/>
+          <w:color w:val="111111"/>
+        </w:rPr>
+        <w:t>•    **Asignación Dinámica y "Referentes Secundarios":** Para terminar con la dependencia de una sola persona en sistemas críticos, se implementará la figura del *Referente Secundario*. Mediante la asignación dinámica por fases (*shadowing* y capacitación cruzada), un programador acompañará al referente principal en tareas de mantenimiento y análisis, logrando la transferencia práctica del conocimiento sin tocar el escalafón.</w:t>
       </w:r>
     </w:p>
     <w:p>
@@ -1479,25 +1479,25 @@
           <w:rFonts w:ascii="Arial" w:hAnsi="Arial" w:cs="Arial"/>
           <w:color w:val="111111"/>
         </w:rPr>
-        <w:t>â€¢    Dado que actualmente no se cuenta con herramientas de revisión automatizada y la revisión manual cruzada entre pares sobrecargaría a los programadores Senior, la calidad se asegurará **definiendo y exigiendo buenas prácticas de programación y guías de estilo obligatorias**.</w:t>
-      </w:r>
-    </w:p>
-    <w:p>
-      <w:pPr>
-        <w:spacing w:before="40" w:after="40" w:line="240" w:lineRule="auto"/>
-        <w:ind w:left="360"/>
-        <w:jc w:val="both"/>
-        <w:rPr>
-          <w:rFonts w:ascii="Arial" w:hAnsi="Arial" w:cs="Arial"/>
-          <w:color w:val="111111"/>
-        </w:rPr>
-      </w:pPr>
-      <w:r>
-        <w:rPr>
-          <w:rFonts w:ascii="Arial" w:hAnsi="Arial" w:cs="Arial"/>
-          <w:color w:val="111111"/>
-        </w:rPr>
-        <w:t>â€¢    **Obligatoriedad del Template de Arquitectura Base:** Se establecerá como norma inquebrantable que todo nuevo desarrollo o refactorización relevante deba construirse sobre la arquitectura base desarrollada en la Municipalidad. Ningún desarrollo nuevo podrá iniciarse en tecnologías obsoletas (*Congelamiento Legacy*).</w:t>
+        <w:t>•    Dado que actualmente no se cuenta con herramientas de revisión automatizada y la revisión manual cruzada entre pares sobrecargaría a los programadores Senior, la calidad se asegurará **definiendo y exigiendo buenas prácticas de programación y guías de estilo obligatorias**.</w:t>
+      </w:r>
+    </w:p>
+    <w:p>
+      <w:pPr>
+        <w:spacing w:before="40" w:after="40" w:line="240" w:lineRule="auto"/>
+        <w:ind w:left="360"/>
+        <w:jc w:val="both"/>
+        <w:rPr>
+          <w:rFonts w:ascii="Arial" w:hAnsi="Arial" w:cs="Arial"/>
+          <w:color w:val="111111"/>
+        </w:rPr>
+      </w:pPr>
+      <w:r>
+        <w:rPr>
+          <w:rFonts w:ascii="Arial" w:hAnsi="Arial" w:cs="Arial"/>
+          <w:color w:val="111111"/>
+        </w:rPr>
+        <w:t>•    **Obligatoriedad del Template de Arquitectura Base:** Se establecerá como norma inquebrantable que todo nuevo desarrollo o refactorización relevante deba construirse sobre la arquitectura base desarrollada en la Municipalidad. Ningún desarrollo nuevo podrá iniciarse en tecnologías obsoletas (*Congelamiento Legacy*).</w:t>
       </w:r>
     </w:p>
     <w:p>
@@ -1515,79 +1515,79 @@
           <w:b/>
           <w:color w:val="222222"/>
         </w:rPr>
-        <w:t>4. Gobierno Técnico de Proveedores Externos</w:t>
-      </w:r>
-    </w:p>
-    <w:p>
-      <w:pPr>
-        <w:spacing w:before="40" w:after="40" w:line="240" w:lineRule="auto"/>
-        <w:ind w:left="360"/>
-        <w:jc w:val="both"/>
-        <w:rPr>
-          <w:rFonts w:ascii="Arial" w:hAnsi="Arial" w:cs="Arial"/>
-          <w:color w:val="111111"/>
-        </w:rPr>
-      </w:pPr>
-      <w:r>
-        <w:rPr>
-          <w:rFonts w:ascii="Arial" w:hAnsi="Arial" w:cs="Arial"/>
-          <w:color w:val="111111"/>
-        </w:rPr>
-        <w:t>â€¢    La contratación externa de software no significará la pérdida de control institucional. Se establecerán cláusulas procedimentales donde todo proveedor deba:</w:t>
-      </w:r>
-    </w:p>
-    <w:p>
-      <w:pPr>
-        <w:spacing w:before="40" w:after="40" w:line="240" w:lineRule="auto"/>
-        <w:ind w:left="360"/>
-        <w:jc w:val="both"/>
-        <w:rPr>
-          <w:rFonts w:ascii="Arial" w:hAnsi="Arial" w:cs="Arial"/>
-          <w:color w:val="111111"/>
-        </w:rPr>
-      </w:pPr>
-      <w:r>
-        <w:rPr>
-          <w:rFonts w:ascii="Arial" w:hAnsi="Arial" w:cs="Arial"/>
-          <w:color w:val="111111"/>
-        </w:rPr>
-        <w:t>â€¢    Alinear su desarrollo a los estándares de arquitectura y seguridad del Municipio.</w:t>
-      </w:r>
-    </w:p>
-    <w:p>
-      <w:pPr>
-        <w:spacing w:before="40" w:after="40" w:line="240" w:lineRule="auto"/>
-        <w:ind w:left="360"/>
-        <w:jc w:val="both"/>
-        <w:rPr>
-          <w:rFonts w:ascii="Arial" w:hAnsi="Arial" w:cs="Arial"/>
-          <w:color w:val="111111"/>
-        </w:rPr>
-      </w:pPr>
-      <w:r>
-        <w:rPr>
-          <w:rFonts w:ascii="Arial" w:hAnsi="Arial" w:cs="Arial"/>
-          <w:color w:val="111111"/>
-        </w:rPr>
-        <w:t>â€¢    Entregar obligatoriamente código fuente, manuales técnicos y diccionarios de datos actualizados.</w:t>
-      </w:r>
-    </w:p>
-    <w:p>
-      <w:pPr>
-        <w:spacing w:before="40" w:after="40" w:line="240" w:lineRule="auto"/>
-        <w:ind w:left="360"/>
-        <w:jc w:val="both"/>
-        <w:rPr>
-          <w:rFonts w:ascii="Arial" w:hAnsi="Arial" w:cs="Arial"/>
-          <w:color w:val="111111"/>
-        </w:rPr>
-      </w:pPr>
-      <w:r>
-        <w:rPr>
-          <w:rFonts w:ascii="Arial" w:hAnsi="Arial" w:cs="Arial"/>
-          <w:color w:val="111111"/>
-        </w:rPr>
-        <w:t>â€¢    Someterse a pruebas de recepción validadas por el personal técnico del Departamento antes de la aceptación final.</w:t>
+        <w:t>4. Control y Recepción Técnica de Software Tercerizado</w:t>
+      </w:r>
+    </w:p>
+    <w:p>
+      <w:pPr>
+        <w:spacing w:before="40" w:after="40" w:line="240" w:lineRule="auto"/>
+        <w:ind w:left="360"/>
+        <w:jc w:val="both"/>
+        <w:rPr>
+          <w:rFonts w:ascii="Arial" w:hAnsi="Arial" w:cs="Arial"/>
+          <w:color w:val="111111"/>
+        </w:rPr>
+      </w:pPr>
+      <w:r>
+        <w:rPr>
+          <w:rFonts w:ascii="Arial" w:hAnsi="Arial" w:cs="Arial"/>
+          <w:color w:val="111111"/>
+        </w:rPr>
+        <w:t>•    La contratación externa de software no debe significar la pérdida de control técnico por parte del departamento. Se establecerán pautas procedimentales donde todo proveedor deba:</w:t>
+      </w:r>
+    </w:p>
+    <w:p>
+      <w:pPr>
+        <w:spacing w:before="40" w:after="40" w:line="240" w:lineRule="auto"/>
+        <w:ind w:left="360"/>
+        <w:jc w:val="both"/>
+        <w:rPr>
+          <w:rFonts w:ascii="Arial" w:hAnsi="Arial" w:cs="Arial"/>
+          <w:color w:val="111111"/>
+        </w:rPr>
+      </w:pPr>
+      <w:r>
+        <w:rPr>
+          <w:rFonts w:ascii="Arial" w:hAnsi="Arial" w:cs="Arial"/>
+          <w:color w:val="111111"/>
+        </w:rPr>
+        <w:t>•    Alinear su desarrollo a los estándares de arquitectura del Municipio.</w:t>
+      </w:r>
+    </w:p>
+    <w:p>
+      <w:pPr>
+        <w:spacing w:before="40" w:after="40" w:line="240" w:lineRule="auto"/>
+        <w:ind w:left="360"/>
+        <w:jc w:val="both"/>
+        <w:rPr>
+          <w:rFonts w:ascii="Arial" w:hAnsi="Arial" w:cs="Arial"/>
+          <w:color w:val="111111"/>
+        </w:rPr>
+      </w:pPr>
+      <w:r>
+        <w:rPr>
+          <w:rFonts w:ascii="Arial" w:hAnsi="Arial" w:cs="Arial"/>
+          <w:color w:val="111111"/>
+        </w:rPr>
+        <w:t>•    Entregar obligatoriamente código fuente, manuales técnicos y diccionarios de datos actualizados.</w:t>
+      </w:r>
+    </w:p>
+    <w:p>
+      <w:pPr>
+        <w:spacing w:before="40" w:after="40" w:line="240" w:lineRule="auto"/>
+        <w:ind w:left="360"/>
+        <w:jc w:val="both"/>
+        <w:rPr>
+          <w:rFonts w:ascii="Arial" w:hAnsi="Arial" w:cs="Arial"/>
+          <w:color w:val="111111"/>
+        </w:rPr>
+      </w:pPr>
+      <w:r>
+        <w:rPr>
+          <w:rFonts w:ascii="Arial" w:hAnsi="Arial" w:cs="Arial"/>
+          <w:color w:val="111111"/>
+        </w:rPr>
+        <w:t>•    Someterse a pruebas de recepción validadas por el personal técnico del Departamento antes de la aceptación final.</w:t>
       </w:r>
     </w:p>
     <w:p>
@@ -1605,61 +1605,61 @@
           <w:b/>
           <w:color w:val="222222"/>
         </w:rPr>
-        <w:t>5. Protocolo Institucional de Seguridad y Privacidad para Uso de IA Gratuita</w:t>
-      </w:r>
-    </w:p>
-    <w:p>
-      <w:pPr>
-        <w:spacing w:before="40" w:after="40" w:line="240" w:lineRule="auto"/>
-        <w:ind w:left="360"/>
-        <w:jc w:val="both"/>
-        <w:rPr>
-          <w:rFonts w:ascii="Arial" w:hAnsi="Arial" w:cs="Arial"/>
-          <w:color w:val="111111"/>
-        </w:rPr>
-      </w:pPr>
-      <w:r>
-        <w:rPr>
-          <w:rFonts w:ascii="Arial" w:hAnsi="Arial" w:cs="Arial"/>
-          <w:color w:val="111111"/>
-        </w:rPr>
-        <w:t>â€¢    Ante el uso informal de herramientas gratuitas de IA por parte del personal, se fijará una directiva clara de **Seguridad y Privacidad**:</w:t>
-      </w:r>
-    </w:p>
-    <w:p>
-      <w:pPr>
-        <w:spacing w:before="40" w:after="40" w:line="240" w:lineRule="auto"/>
-        <w:ind w:left="360"/>
-        <w:jc w:val="both"/>
-        <w:rPr>
-          <w:rFonts w:ascii="Arial" w:hAnsi="Arial" w:cs="Arial"/>
-          <w:color w:val="111111"/>
-        </w:rPr>
-      </w:pPr>
-      <w:r>
-        <w:rPr>
-          <w:rFonts w:ascii="Arial" w:hAnsi="Arial" w:cs="Arial"/>
-          <w:color w:val="111111"/>
-        </w:rPr>
-        <w:t>â€¢    Queda estrictamente prohibido introducir en herramientas de IA públicas datos personales de ciudadanos, credenciales de acceso, claves de bases de datos o código fuente institucional sensible.</w:t>
-      </w:r>
-    </w:p>
-    <w:p>
-      <w:pPr>
-        <w:spacing w:before="40" w:after="40" w:line="240" w:lineRule="auto"/>
-        <w:ind w:left="360"/>
-        <w:jc w:val="both"/>
-        <w:rPr>
-          <w:rFonts w:ascii="Arial" w:hAnsi="Arial" w:cs="Arial"/>
-          <w:color w:val="111111"/>
-        </w:rPr>
-      </w:pPr>
-      <w:r>
-        <w:rPr>
-          <w:rFonts w:ascii="Arial" w:hAnsi="Arial" w:cs="Arial"/>
-          <w:color w:val="111111"/>
-        </w:rPr>
-        <w:t>â€¢    La IA se utilizará únicamente como asistente para generación de estructuras auxiliares, aprendizaje o documentación general, quedando siempre sujeta a la revisión profesional humana.</w:t>
+        <w:t>5. Pautas para el Uso e Integración de Inteligencia Artificial para Agilizar la Producción</w:t>
+      </w:r>
+    </w:p>
+    <w:p>
+      <w:pPr>
+        <w:spacing w:before="40" w:after="40" w:line="240" w:lineRule="auto"/>
+        <w:ind w:left="360"/>
+        <w:jc w:val="both"/>
+        <w:rPr>
+          <w:rFonts w:ascii="Arial" w:hAnsi="Arial" w:cs="Arial"/>
+          <w:color w:val="111111"/>
+        </w:rPr>
+      </w:pPr>
+      <w:r>
+        <w:rPr>
+          <w:rFonts w:ascii="Arial" w:hAnsi="Arial" w:cs="Arial"/>
+          <w:color w:val="111111"/>
+        </w:rPr>
+        <w:t>•    Para aprovechar el potencial de la IA en la aceleración de desarrollos sin comprometer la seguridad institucional:</w:t>
+      </w:r>
+    </w:p>
+    <w:p>
+      <w:pPr>
+        <w:spacing w:before="40" w:after="40" w:line="240" w:lineRule="auto"/>
+        <w:ind w:left="360"/>
+        <w:jc w:val="both"/>
+        <w:rPr>
+          <w:rFonts w:ascii="Arial" w:hAnsi="Arial" w:cs="Arial"/>
+          <w:color w:val="111111"/>
+        </w:rPr>
+      </w:pPr>
+      <w:r>
+        <w:rPr>
+          <w:rFonts w:ascii="Arial" w:hAnsi="Arial" w:cs="Arial"/>
+          <w:color w:val="111111"/>
+        </w:rPr>
+        <w:t>•    Se guiará al equipo en el uso de herramientas de IA como asistentes de código para optimizar tiempos de desarrollo y documentación.</w:t>
+      </w:r>
+    </w:p>
+    <w:p>
+      <w:pPr>
+        <w:spacing w:before="40" w:after="40" w:line="240" w:lineRule="auto"/>
+        <w:ind w:left="360"/>
+        <w:jc w:val="both"/>
+        <w:rPr>
+          <w:rFonts w:ascii="Arial" w:hAnsi="Arial" w:cs="Arial"/>
+          <w:color w:val="111111"/>
+        </w:rPr>
+      </w:pPr>
+      <w:r>
+        <w:rPr>
+          <w:rFonts w:ascii="Arial" w:hAnsi="Arial" w:cs="Arial"/>
+          <w:color w:val="111111"/>
+        </w:rPr>
+        <w:t>•    Se fijará la pauta clara de no introducir datos personales de ciudadanos ni credenciales sensibles en servicios públicos de IA.</w:t>
       </w:r>
     </w:p>
     <w:p>
@@ -1732,43 +1732,43 @@
           <w:rFonts w:ascii="Arial" w:hAnsi="Arial" w:cs="Arial"/>
           <w:color w:val="111111"/>
         </w:rPr>
-        <w:t>â€¢    **Licencias Corporativas de IA para IDEs (ej. GitHub Copilot / Tabnine):** Adquisición de licencias corporativas oficiales administradas por el Municipio, garantizando entornos seguros, privados y con tokens oficiales para aumentar drásticamente la productividad del equipo.</w:t>
-      </w:r>
-    </w:p>
-    <w:p>
-      <w:pPr>
-        <w:spacing w:before="40" w:after="40" w:line="240" w:lineRule="auto"/>
-        <w:ind w:left="360"/>
-        <w:jc w:val="both"/>
-        <w:rPr>
-          <w:rFonts w:ascii="Arial" w:hAnsi="Arial" w:cs="Arial"/>
-          <w:color w:val="111111"/>
-        </w:rPr>
-      </w:pPr>
-      <w:r>
-        <w:rPr>
-          <w:rFonts w:ascii="Arial" w:hAnsi="Arial" w:cs="Arial"/>
-          <w:color w:val="111111"/>
-        </w:rPr>
-        <w:t>â€¢    **Plataformas de Control Automático de Calidad (ej. SonarQube):** Adquisición de licencias para herramientas de análisis estático que verifiquen automáticamente el cumplimiento de las guías de estilo y detecten deudas técnicas o vulnerabilidades antes de la entrega.</w:t>
-      </w:r>
-    </w:p>
-    <w:p>
-      <w:pPr>
-        <w:spacing w:before="40" w:after="40" w:line="240" w:lineRule="auto"/>
-        <w:ind w:left="360"/>
-        <w:jc w:val="both"/>
-        <w:rPr>
-          <w:rFonts w:ascii="Arial" w:hAnsi="Arial" w:cs="Arial"/>
-          <w:color w:val="111111"/>
-        </w:rPr>
-      </w:pPr>
-      <w:r>
-        <w:rPr>
-          <w:rFonts w:ascii="Arial" w:hAnsi="Arial" w:cs="Arial"/>
-          <w:color w:val="111111"/>
-        </w:rPr>
-        <w:t>â€¢    **Migración e Infraestructura en Contenedores (Docker):** Asignación de presupuesto y tiempo operativo para migrar paulatinamente sistemas *legacy* hacia entornos *Dockerizados*. Esto facilitará la labor del Departamento de Infraestructura/Redes (encargado exclusivo de los despliegues y DevOps), entregándoles paquetes estandarizados.</w:t>
+        <w:t>•    **Licencias Corporativas de IA para IDEs (ej. GitHub Copilot / Tabnine):** Adquisición de licencias corporativas oficiales administradas por el Municipio, garantizando entornos seguros, privados y con tokens oficiales para aumentar drásticamente la productividad del equipo.</w:t>
+      </w:r>
+    </w:p>
+    <w:p>
+      <w:pPr>
+        <w:spacing w:before="40" w:after="40" w:line="240" w:lineRule="auto"/>
+        <w:ind w:left="360"/>
+        <w:jc w:val="both"/>
+        <w:rPr>
+          <w:rFonts w:ascii="Arial" w:hAnsi="Arial" w:cs="Arial"/>
+          <w:color w:val="111111"/>
+        </w:rPr>
+      </w:pPr>
+      <w:r>
+        <w:rPr>
+          <w:rFonts w:ascii="Arial" w:hAnsi="Arial" w:cs="Arial"/>
+          <w:color w:val="111111"/>
+        </w:rPr>
+        <w:t>•    **Plataformas de Control Automático de Calidad (ej. SonarQube):** Adquisición de licencias para herramientas de análisis estático que verifiquen automáticamente el cumplimiento de las guías de estilo y detecten deudas técnicas o vulnerabilidades antes de la entrega.</w:t>
+      </w:r>
+    </w:p>
+    <w:p>
+      <w:pPr>
+        <w:spacing w:before="40" w:after="40" w:line="240" w:lineRule="auto"/>
+        <w:ind w:left="360"/>
+        <w:jc w:val="both"/>
+        <w:rPr>
+          <w:rFonts w:ascii="Arial" w:hAnsi="Arial" w:cs="Arial"/>
+          <w:color w:val="111111"/>
+        </w:rPr>
+      </w:pPr>
+      <w:r>
+        <w:rPr>
+          <w:rFonts w:ascii="Arial" w:hAnsi="Arial" w:cs="Arial"/>
+          <w:color w:val="111111"/>
+        </w:rPr>
+        <w:t>•    **Migración e Infraestructura en Contenedores (Docker):** Asignación de presupuesto y tiempo operativo para migrar paulatinamente sistemas *legacy* hacia entornos *Dockerizados*. Esto facilitará la labor del Departamento de Infraestructura/Redes (encargado exclusivo de los despliegues y DevOps), entregándoles paquetes estandarizados.</w:t>
       </w:r>
     </w:p>
     <w:p>
@@ -1804,7 +1804,7 @@
           <w:rFonts w:ascii="Arial" w:hAnsi="Arial" w:cs="Arial"/>
           <w:color w:val="111111"/>
         </w:rPr>
-        <w:t>â€¢    Financiamiento de cursos de formación profesional en **Arquitecturas Limpias (*Clean Architecture*)**, Patrones de Diseño, Microservicios y APIs REST.</w:t>
+        <w:t>•    Financiamiento de cursos de formación profesional en **Arquitecturas Limpias (*Clean Architecture*)**, Patrones de Diseño, Microservicios y APIs REST.</w:t>
       </w:r>
     </w:p>
     <w:p>
@@ -1840,7 +1840,7 @@
           <w:rFonts w:ascii="Arial" w:hAnsi="Arial" w:cs="Arial"/>
           <w:color w:val="111111"/>
         </w:rPr>
-        <w:t>â€¢    Provisión de insumos informáticos básicos no cuantitativos: adquisición de **webcams y auriculares con micrófono** para los puestos de trabajo, facilitando las reuniones virtuales de coordinación entre las dos oficinas físicas y las áreas usuarias.</w:t>
+        <w:t>•    Provisión de insumos informáticos básicos no cuantitativos: adquisición de **webcams y auriculares con micrófono** para los puestos de trabajo, facilitando las reuniones virtuales de coordinación entre las dos oficinas físicas y las áreas usuarias.</w:t>
       </w:r>
     </w:p>
     <w:p>
@@ -1988,241 +1988,241 @@
           <w:rFonts w:ascii="Arial" w:hAnsi="Arial" w:cs="Arial"/>
           <w:color w:val="111111"/>
         </w:rPr>
-        <w:t>â€¢    **Etapa I – Conocer y Ordenar (Sprints 1 a 4):**</w:t>
-      </w:r>
-    </w:p>
-    <w:p>
-      <w:pPr>
-        <w:spacing w:before="40" w:after="40" w:line="240" w:lineRule="auto"/>
-        <w:ind w:left="360"/>
-        <w:jc w:val="both"/>
-        <w:rPr>
-          <w:rFonts w:ascii="Arial" w:hAnsi="Arial" w:cs="Arial"/>
-          <w:color w:val="111111"/>
-        </w:rPr>
-      </w:pPr>
-      <w:r>
-        <w:rPr>
-          <w:rFonts w:ascii="Arial" w:hAnsi="Arial" w:cs="Arial"/>
-          <w:color w:val="111111"/>
-        </w:rPr>
-        <w:t>â€¢    Relevamiento de competencias y consolidación del Inventario de Sistemas.</w:t>
-      </w:r>
-    </w:p>
-    <w:p>
-      <w:pPr>
-        <w:spacing w:before="40" w:after="40" w:line="240" w:lineRule="auto"/>
-        <w:ind w:left="360"/>
-        <w:jc w:val="both"/>
-        <w:rPr>
-          <w:rFonts w:ascii="Arial" w:hAnsi="Arial" w:cs="Arial"/>
-          <w:color w:val="111111"/>
-        </w:rPr>
-      </w:pPr>
-      <w:r>
-        <w:rPr>
-          <w:rFonts w:ascii="Arial" w:hAnsi="Arial" w:cs="Arial"/>
-          <w:color w:val="111111"/>
-        </w:rPr>
-        <w:t>â€¢    Conformación de la Cartera Única de Proyectos (evaluación previa de reutilización antes de crear código nuevo).</w:t>
-      </w:r>
-    </w:p>
-    <w:p>
-      <w:pPr>
-        <w:spacing w:before="40" w:after="40" w:line="240" w:lineRule="auto"/>
-        <w:ind w:left="360"/>
-        <w:jc w:val="both"/>
-        <w:rPr>
-          <w:rFonts w:ascii="Arial" w:hAnsi="Arial" w:cs="Arial"/>
-          <w:color w:val="111111"/>
-        </w:rPr>
-      </w:pPr>
-      <w:r>
-        <w:rPr>
-          <w:rFonts w:ascii="Arial" w:hAnsi="Arial" w:cs="Arial"/>
-          <w:color w:val="111111"/>
-        </w:rPr>
-        <w:t>â€¢    Unificación del seguimiento obligatorio en Redmine y asignación de los primeros *Referentes Secundarios*.</w:t>
-      </w:r>
-    </w:p>
-    <w:p>
-      <w:pPr>
-        <w:spacing w:before="40" w:after="40" w:line="240" w:lineRule="auto"/>
-        <w:ind w:left="360"/>
-        <w:jc w:val="both"/>
-        <w:rPr>
-          <w:rFonts w:ascii="Arial" w:hAnsi="Arial" w:cs="Arial"/>
-          <w:color w:val="111111"/>
-        </w:rPr>
-      </w:pPr>
-      <w:r>
-        <w:rPr>
-          <w:rFonts w:ascii="Arial" w:hAnsi="Arial" w:cs="Arial"/>
-          <w:color w:val="111111"/>
-        </w:rPr>
-        <w:t>â€¢    **Etapa II – Integrar y Estandarizar (Sprints 5 a 12):**</w:t>
-      </w:r>
-    </w:p>
-    <w:p>
-      <w:pPr>
-        <w:spacing w:before="40" w:after="40" w:line="240" w:lineRule="auto"/>
-        <w:ind w:left="360"/>
-        <w:jc w:val="both"/>
-        <w:rPr>
-          <w:rFonts w:ascii="Arial" w:hAnsi="Arial" w:cs="Arial"/>
-          <w:color w:val="111111"/>
-        </w:rPr>
-      </w:pPr>
-      <w:r>
-        <w:rPr>
-          <w:rFonts w:ascii="Arial" w:hAnsi="Arial" w:cs="Arial"/>
-          <w:color w:val="111111"/>
-        </w:rPr>
-        <w:t>â€¢    Puesta en marcha de las reuniones de coordinación transversal entre ambas oficinas.</w:t>
-      </w:r>
-    </w:p>
-    <w:p>
-      <w:pPr>
-        <w:spacing w:before="40" w:after="40" w:line="240" w:lineRule="auto"/>
-        <w:ind w:left="360"/>
-        <w:jc w:val="both"/>
-        <w:rPr>
-          <w:rFonts w:ascii="Arial" w:hAnsi="Arial" w:cs="Arial"/>
-          <w:color w:val="111111"/>
-        </w:rPr>
-      </w:pPr>
-      <w:r>
-        <w:rPr>
-          <w:rFonts w:ascii="Arial" w:hAnsi="Arial" w:cs="Arial"/>
-          <w:color w:val="111111"/>
-        </w:rPr>
-        <w:t>â€¢    Difusión y exigencia obligatoria de las Guías de Buenas Prácticas y del Template de Arquitectura Base.</w:t>
-      </w:r>
-    </w:p>
-    <w:p>
-      <w:pPr>
-        <w:spacing w:before="40" w:after="40" w:line="240" w:lineRule="auto"/>
-        <w:ind w:left="360"/>
-        <w:jc w:val="both"/>
-        <w:rPr>
-          <w:rFonts w:ascii="Arial" w:hAnsi="Arial" w:cs="Arial"/>
-          <w:color w:val="111111"/>
-        </w:rPr>
-      </w:pPr>
-      <w:r>
-        <w:rPr>
-          <w:rFonts w:ascii="Arial" w:hAnsi="Arial" w:cs="Arial"/>
-          <w:color w:val="111111"/>
-        </w:rPr>
-        <w:t>â€¢    Implementación del protocolo de Gobierno Técnico de Proveedores Externos.</w:t>
-      </w:r>
-    </w:p>
-    <w:p>
-      <w:pPr>
-        <w:spacing w:before="40" w:after="40" w:line="240" w:lineRule="auto"/>
-        <w:ind w:left="360"/>
-        <w:jc w:val="both"/>
-        <w:rPr>
-          <w:rFonts w:ascii="Arial" w:hAnsi="Arial" w:cs="Arial"/>
-          <w:color w:val="111111"/>
-        </w:rPr>
-      </w:pPr>
-      <w:r>
-        <w:rPr>
-          <w:rFonts w:ascii="Arial" w:hAnsi="Arial" w:cs="Arial"/>
-          <w:color w:val="111111"/>
-        </w:rPr>
-        <w:t>â€¢    **Etapa III – Consolidar y Evaluar (Sprints 13+):**</w:t>
-      </w:r>
-    </w:p>
-    <w:p>
-      <w:pPr>
-        <w:spacing w:before="40" w:after="40" w:line="240" w:lineRule="auto"/>
-        <w:ind w:left="360"/>
-        <w:jc w:val="both"/>
-        <w:rPr>
-          <w:rFonts w:ascii="Arial" w:hAnsi="Arial" w:cs="Arial"/>
-          <w:color w:val="111111"/>
-        </w:rPr>
-      </w:pPr>
-      <w:r>
-        <w:rPr>
-          <w:rFonts w:ascii="Arial" w:hAnsi="Arial" w:cs="Arial"/>
-          <w:color w:val="111111"/>
-        </w:rPr>
-        <w:t>â€¢    Evaluación de los indicadores de riesgo operacional.</w:t>
-      </w:r>
-    </w:p>
-    <w:p>
-      <w:pPr>
-        <w:spacing w:before="40" w:after="40" w:line="240" w:lineRule="auto"/>
-        <w:ind w:left="360"/>
-        <w:jc w:val="both"/>
-        <w:rPr>
-          <w:rFonts w:ascii="Arial" w:hAnsi="Arial" w:cs="Arial"/>
-          <w:color w:val="111111"/>
-        </w:rPr>
-      </w:pPr>
-      <w:r>
-        <w:rPr>
-          <w:rFonts w:ascii="Arial" w:hAnsi="Arial" w:cs="Arial"/>
-          <w:color w:val="111111"/>
-        </w:rPr>
-        <w:t>â€¢    Paso a producción de aplicaciones dockerizadas en sinergia con el área de Redes.</w:t>
-      </w:r>
-    </w:p>
-    <w:p>
-      <w:pPr>
-        <w:spacing w:before="40" w:after="40" w:line="240" w:lineRule="auto"/>
-        <w:ind w:left="360"/>
-        <w:jc w:val="both"/>
-        <w:rPr>
-          <w:rFonts w:ascii="Arial" w:hAnsi="Arial" w:cs="Arial"/>
-          <w:color w:val="111111"/>
-        </w:rPr>
-      </w:pPr>
-      <w:r>
-        <w:rPr>
-          <w:rFonts w:ascii="Arial" w:hAnsi="Arial" w:cs="Arial"/>
-          <w:color w:val="111111"/>
-        </w:rPr>
-        <w:t>â€¢    Implementación gradual de revisiones de código cruzadas (*peer review*) en GitLab para cambios críticos.</w:t>
-      </w:r>
-    </w:p>
-    <w:p>
-      <w:pPr>
-        <w:spacing w:before="40" w:after="40" w:line="240" w:lineRule="auto"/>
-        <w:ind w:left="360"/>
-        <w:jc w:val="both"/>
-        <w:rPr>
-          <w:rFonts w:ascii="Arial" w:hAnsi="Arial" w:cs="Arial"/>
-          <w:color w:val="111111"/>
-        </w:rPr>
-      </w:pPr>
-      <w:r>
-        <w:rPr>
-          <w:rFonts w:ascii="Arial" w:hAnsi="Arial" w:cs="Arial"/>
-          <w:color w:val="111111"/>
-        </w:rPr>
-        <w:t>â€¢    **Proceso Permanente – Mejora Continua e Innovación:**</w:t>
-      </w:r>
-    </w:p>
-    <w:p>
-      <w:pPr>
-        <w:spacing w:before="40" w:after="40" w:line="240" w:lineRule="auto"/>
-        <w:ind w:left="360"/>
-        <w:jc w:val="both"/>
-        <w:rPr>
-          <w:rFonts w:ascii="Arial" w:hAnsi="Arial" w:cs="Arial"/>
-          <w:color w:val="111111"/>
-        </w:rPr>
-      </w:pPr>
-      <w:r>
-        <w:rPr>
-          <w:rFonts w:ascii="Arial" w:hAnsi="Arial" w:cs="Arial"/>
-          <w:color w:val="111111"/>
-        </w:rPr>
-        <w:t>â€¢    Revisión periódica de procedimientos, actualización de capacitaciones y evaluación fundamentada de nuevas tecnologías (IA corporativa y automatización).</w:t>
+        <w:t>•    **Etapa I – Conocer y Ordenar (Sprints 1 a 4):**</w:t>
+      </w:r>
+    </w:p>
+    <w:p>
+      <w:pPr>
+        <w:spacing w:before="40" w:after="40" w:line="240" w:lineRule="auto"/>
+        <w:ind w:left="360"/>
+        <w:jc w:val="both"/>
+        <w:rPr>
+          <w:rFonts w:ascii="Arial" w:hAnsi="Arial" w:cs="Arial"/>
+          <w:color w:val="111111"/>
+        </w:rPr>
+      </w:pPr>
+      <w:r>
+        <w:rPr>
+          <w:rFonts w:ascii="Arial" w:hAnsi="Arial" w:cs="Arial"/>
+          <w:color w:val="111111"/>
+        </w:rPr>
+        <w:t>•    Relevamiento de competencias y consolidación del Inventario de Sistemas.</w:t>
+      </w:r>
+    </w:p>
+    <w:p>
+      <w:pPr>
+        <w:spacing w:before="40" w:after="40" w:line="240" w:lineRule="auto"/>
+        <w:ind w:left="360"/>
+        <w:jc w:val="both"/>
+        <w:rPr>
+          <w:rFonts w:ascii="Arial" w:hAnsi="Arial" w:cs="Arial"/>
+          <w:color w:val="111111"/>
+        </w:rPr>
+      </w:pPr>
+      <w:r>
+        <w:rPr>
+          <w:rFonts w:ascii="Arial" w:hAnsi="Arial" w:cs="Arial"/>
+          <w:color w:val="111111"/>
+        </w:rPr>
+        <w:t>•    Conformación de la Cartera Única de Proyectos (evaluación previa de reutilización antes de crear código nuevo).</w:t>
+      </w:r>
+    </w:p>
+    <w:p>
+      <w:pPr>
+        <w:spacing w:before="40" w:after="40" w:line="240" w:lineRule="auto"/>
+        <w:ind w:left="360"/>
+        <w:jc w:val="both"/>
+        <w:rPr>
+          <w:rFonts w:ascii="Arial" w:hAnsi="Arial" w:cs="Arial"/>
+          <w:color w:val="111111"/>
+        </w:rPr>
+      </w:pPr>
+      <w:r>
+        <w:rPr>
+          <w:rFonts w:ascii="Arial" w:hAnsi="Arial" w:cs="Arial"/>
+          <w:color w:val="111111"/>
+        </w:rPr>
+        <w:t>•    Unificación del seguimiento obligatorio en Redmine y asignación de los primeros *Referentes Secundarios*.</w:t>
+      </w:r>
+    </w:p>
+    <w:p>
+      <w:pPr>
+        <w:spacing w:before="40" w:after="40" w:line="240" w:lineRule="auto"/>
+        <w:ind w:left="360"/>
+        <w:jc w:val="both"/>
+        <w:rPr>
+          <w:rFonts w:ascii="Arial" w:hAnsi="Arial" w:cs="Arial"/>
+          <w:color w:val="111111"/>
+        </w:rPr>
+      </w:pPr>
+      <w:r>
+        <w:rPr>
+          <w:rFonts w:ascii="Arial" w:hAnsi="Arial" w:cs="Arial"/>
+          <w:color w:val="111111"/>
+        </w:rPr>
+        <w:t>•    **Etapa II – Integrar y Estandarizar (Sprints 5 a 12):**</w:t>
+      </w:r>
+    </w:p>
+    <w:p>
+      <w:pPr>
+        <w:spacing w:before="40" w:after="40" w:line="240" w:lineRule="auto"/>
+        <w:ind w:left="360"/>
+        <w:jc w:val="both"/>
+        <w:rPr>
+          <w:rFonts w:ascii="Arial" w:hAnsi="Arial" w:cs="Arial"/>
+          <w:color w:val="111111"/>
+        </w:rPr>
+      </w:pPr>
+      <w:r>
+        <w:rPr>
+          <w:rFonts w:ascii="Arial" w:hAnsi="Arial" w:cs="Arial"/>
+          <w:color w:val="111111"/>
+        </w:rPr>
+        <w:t>•    Puesta en marcha de las reuniones de coordinación transversal entre ambas oficinas.</w:t>
+      </w:r>
+    </w:p>
+    <w:p>
+      <w:pPr>
+        <w:spacing w:before="40" w:after="40" w:line="240" w:lineRule="auto"/>
+        <w:ind w:left="360"/>
+        <w:jc w:val="both"/>
+        <w:rPr>
+          <w:rFonts w:ascii="Arial" w:hAnsi="Arial" w:cs="Arial"/>
+          <w:color w:val="111111"/>
+        </w:rPr>
+      </w:pPr>
+      <w:r>
+        <w:rPr>
+          <w:rFonts w:ascii="Arial" w:hAnsi="Arial" w:cs="Arial"/>
+          <w:color w:val="111111"/>
+        </w:rPr>
+        <w:t>•    Difusión y exigencia obligatoria de las Guías de Buenas Prácticas y del Template de Arquitectura Base.</w:t>
+      </w:r>
+    </w:p>
+    <w:p>
+      <w:pPr>
+        <w:spacing w:before="40" w:after="40" w:line="240" w:lineRule="auto"/>
+        <w:ind w:left="360"/>
+        <w:jc w:val="both"/>
+        <w:rPr>
+          <w:rFonts w:ascii="Arial" w:hAnsi="Arial" w:cs="Arial"/>
+          <w:color w:val="111111"/>
+        </w:rPr>
+      </w:pPr>
+      <w:r>
+        <w:rPr>
+          <w:rFonts w:ascii="Arial" w:hAnsi="Arial" w:cs="Arial"/>
+          <w:color w:val="111111"/>
+        </w:rPr>
+        <w:t>•    Implementación del protocolo de Gobierno Técnico de Proveedores Externos.</w:t>
+      </w:r>
+    </w:p>
+    <w:p>
+      <w:pPr>
+        <w:spacing w:before="40" w:after="40" w:line="240" w:lineRule="auto"/>
+        <w:ind w:left="360"/>
+        <w:jc w:val="both"/>
+        <w:rPr>
+          <w:rFonts w:ascii="Arial" w:hAnsi="Arial" w:cs="Arial"/>
+          <w:color w:val="111111"/>
+        </w:rPr>
+      </w:pPr>
+      <w:r>
+        <w:rPr>
+          <w:rFonts w:ascii="Arial" w:hAnsi="Arial" w:cs="Arial"/>
+          <w:color w:val="111111"/>
+        </w:rPr>
+        <w:t>•    **Etapa III – Consolidar y Evaluar (Sprints 13+):**</w:t>
+      </w:r>
+    </w:p>
+    <w:p>
+      <w:pPr>
+        <w:spacing w:before="40" w:after="40" w:line="240" w:lineRule="auto"/>
+        <w:ind w:left="360"/>
+        <w:jc w:val="both"/>
+        <w:rPr>
+          <w:rFonts w:ascii="Arial" w:hAnsi="Arial" w:cs="Arial"/>
+          <w:color w:val="111111"/>
+        </w:rPr>
+      </w:pPr>
+      <w:r>
+        <w:rPr>
+          <w:rFonts w:ascii="Arial" w:hAnsi="Arial" w:cs="Arial"/>
+          <w:color w:val="111111"/>
+        </w:rPr>
+        <w:t>•    Evaluación de los indicadores de riesgo operacional.</w:t>
+      </w:r>
+    </w:p>
+    <w:p>
+      <w:pPr>
+        <w:spacing w:before="40" w:after="40" w:line="240" w:lineRule="auto"/>
+        <w:ind w:left="360"/>
+        <w:jc w:val="both"/>
+        <w:rPr>
+          <w:rFonts w:ascii="Arial" w:hAnsi="Arial" w:cs="Arial"/>
+          <w:color w:val="111111"/>
+        </w:rPr>
+      </w:pPr>
+      <w:r>
+        <w:rPr>
+          <w:rFonts w:ascii="Arial" w:hAnsi="Arial" w:cs="Arial"/>
+          <w:color w:val="111111"/>
+        </w:rPr>
+        <w:t>•    Paso a producción de aplicaciones dockerizadas en sinergia con el área de Redes.</w:t>
+      </w:r>
+    </w:p>
+    <w:p>
+      <w:pPr>
+        <w:spacing w:before="40" w:after="40" w:line="240" w:lineRule="auto"/>
+        <w:ind w:left="360"/>
+        <w:jc w:val="both"/>
+        <w:rPr>
+          <w:rFonts w:ascii="Arial" w:hAnsi="Arial" w:cs="Arial"/>
+          <w:color w:val="111111"/>
+        </w:rPr>
+      </w:pPr>
+      <w:r>
+        <w:rPr>
+          <w:rFonts w:ascii="Arial" w:hAnsi="Arial" w:cs="Arial"/>
+          <w:color w:val="111111"/>
+        </w:rPr>
+        <w:t>•    Implementación gradual de revisiones de código cruzadas (*peer review*) en GitLab para cambios críticos.</w:t>
+      </w:r>
+    </w:p>
+    <w:p>
+      <w:pPr>
+        <w:spacing w:before="40" w:after="40" w:line="240" w:lineRule="auto"/>
+        <w:ind w:left="360"/>
+        <w:jc w:val="both"/>
+        <w:rPr>
+          <w:rFonts w:ascii="Arial" w:hAnsi="Arial" w:cs="Arial"/>
+          <w:color w:val="111111"/>
+        </w:rPr>
+      </w:pPr>
+      <w:r>
+        <w:rPr>
+          <w:rFonts w:ascii="Arial" w:hAnsi="Arial" w:cs="Arial"/>
+          <w:color w:val="111111"/>
+        </w:rPr>
+        <w:t>•    **Proceso Permanente – Mejora Continua e Innovación:**</w:t>
+      </w:r>
+    </w:p>
+    <w:p>
+      <w:pPr>
+        <w:spacing w:before="40" w:after="40" w:line="240" w:lineRule="auto"/>
+        <w:ind w:left="360"/>
+        <w:jc w:val="both"/>
+        <w:rPr>
+          <w:rFonts w:ascii="Arial" w:hAnsi="Arial" w:cs="Arial"/>
+          <w:color w:val="111111"/>
+        </w:rPr>
+      </w:pPr>
+      <w:r>
+        <w:rPr>
+          <w:rFonts w:ascii="Arial" w:hAnsi="Arial" w:cs="Arial"/>
+          <w:color w:val="111111"/>
+        </w:rPr>
+        <w:t>•    Revisión periódica de procedimientos, actualización de capacitaciones y evaluación fundamentada de nuevas tecnologías (IA corporativa y automatización).</w:t>
       </w:r>
     </w:p>
     <w:p>
@@ -2891,7 +2891,7 @@
                 <w:color w:val="222222"/>
                 <w:sz w:val="18"/>
               </w:rPr>
-              <w:t>% de Desarrollos Externos con Gobierno Técnico Aceptado</w:t>
+              <w:t>% de Desarrollos Externos con Recepción Técnica Aprobada</w:t>
             </w:r>
           </w:p>
         </w:tc>
@@ -2952,7 +2952,7 @@
                 <w:color w:val="222222"/>
                 <w:sz w:val="18"/>
               </w:rPr>
-              <w:t>**Gobernanza de IA**</w:t>
+              <w:t>**Uso de IA**</w:t>
             </w:r>
           </w:p>
         </w:tc>
@@ -2977,7 +2977,7 @@
                 <w:color w:val="222222"/>
                 <w:sz w:val="18"/>
               </w:rPr>
-              <w:t>Cumplimiento del Protocolo de Seguridad en IA</w:t>
+              <w:t>Evaluación e Integración de Herramientas de IA</w:t>
             </w:r>
           </w:p>
         </w:tc>
@@ -3002,7 +3002,7 @@
                 <w:color w:val="222222"/>
                 <w:sz w:val="18"/>
               </w:rPr>
-              <w:t>Proteger el 100% de la información sensible municipal.</w:t>
+              <w:t>Aumentar la productividad del departamento resguardando los datos.</w:t>
             </w:r>
           </w:p>
         </w:tc>
@@ -3798,7 +3798,7 @@
     <w:link w:val="EncabezadoCar"/>
     <w:uiPriority w:val="99"/>
     <w:unhideWhenUsed/>
-    <w:rsid w:val="004C34FA"/>
+    <w:rsid w:val="002B5A75"/>
     <w:pPr>
       <w:tabs>
         <w:tab w:val="center" w:pos="4252"/>
@@ -3812,7 +3812,7 @@
     <w:basedOn w:val="Fuentedeprrafopredeter"/>
     <w:link w:val="Encabezado"/>
     <w:uiPriority w:val="99"/>
-    <w:rsid w:val="004C34FA"/>
+    <w:rsid w:val="002B5A75"/>
   </w:style>
   <w:style w:type="paragraph" w:styleId="Piedepgina">
     <w:name w:val="footer"/>
@@ -3820,7 +3820,7 @@
     <w:link w:val="PiedepginaCar"/>
     <w:uiPriority w:val="99"/>
     <w:unhideWhenUsed/>
-    <w:rsid w:val="004C34FA"/>
+    <w:rsid w:val="002B5A75"/>
     <w:pPr>
       <w:tabs>
         <w:tab w:val="center" w:pos="4252"/>
@@ -3834,7 +3834,7 @@
     <w:basedOn w:val="Fuentedeprrafopredeter"/>
     <w:link w:val="Piedepgina"/>
     <w:uiPriority w:val="99"/>
-    <w:rsid w:val="004C34FA"/>
+    <w:rsid w:val="002B5A75"/>
   </w:style>
 </w:styles>
 </file>

</xml_diff>

<commit_message>
fix: Update SWOT with internal/external classification, political nuance for architecture base, and typo fixes
</commit_message>
<xml_diff>
--- a/Plan_Trabajo_Concurso_Jefatura_Software.docx
+++ b/Plan_Trabajo_Concurso_Jefatura_Software.docx
@@ -781,25 +781,25 @@
           <w:rFonts w:ascii="Arial" w:hAnsi="Arial" w:cs="Arial"/>
           <w:color w:val="111111"/>
         </w:rPr>
-        <w:t>•    **Conocimiento Profundo del Negocio Municipal:** El personal posee un dominio valioso de las normativas, circuitos administrativos, trámites y reglas operativas de la administración pública local.</w:t>
-      </w:r>
-    </w:p>
-    <w:p>
-      <w:pPr>
-        <w:spacing w:before="40" w:after="40" w:line="240" w:lineRule="auto"/>
-        <w:ind w:left="360"/>
-        <w:jc w:val="both"/>
-        <w:rPr>
-          <w:rFonts w:ascii="Arial" w:hAnsi="Arial" w:cs="Arial"/>
-          <w:color w:val="111111"/>
-        </w:rPr>
-      </w:pPr>
-      <w:r>
-        <w:rPr>
-          <w:rFonts w:ascii="Arial" w:hAnsi="Arial" w:cs="Arial"/>
-          <w:color w:val="111111"/>
-        </w:rPr>
-        <w:t>•    **Bases Tecnológicas e Iniciativas Existentes:** Existencia de herramientas consolidadas (repositorios en GitLab, seguimiento en Redmine, entornos dockerizados en ciertos proyectos) y el desarrollo interno de un *template* de arquitectura base en evolución.</w:t>
+        <w:t>•    **Personal Técnico Capacitado:** El Departamento dispone de un plantel técnico capacitado capaz de realizar tareas de relevamiento analítico, desarrollo y pruebas de aplicaciones, con un amplio conocimiento del negocio, las normativas y los circuitos administrativos municipales.</w:t>
+      </w:r>
+    </w:p>
+    <w:p>
+      <w:pPr>
+        <w:spacing w:before="40" w:after="40" w:line="240" w:lineRule="auto"/>
+        <w:ind w:left="360"/>
+        <w:jc w:val="both"/>
+        <w:rPr>
+          <w:rFonts w:ascii="Arial" w:hAnsi="Arial" w:cs="Arial"/>
+          <w:color w:val="111111"/>
+        </w:rPr>
+      </w:pPr>
+      <w:r>
+        <w:rPr>
+          <w:rFonts w:ascii="Arial" w:hAnsi="Arial" w:cs="Arial"/>
+          <w:color w:val="111111"/>
+        </w:rPr>
+        <w:t>•    **Disponibilidad de Medios e Infraestructura Básica:** Se cuenta con el mobiliario, equipos y herramientas técnicas suficientes para llevar a cabo la Misión y Funciones del Departamento.</w:t>
       </w:r>
     </w:p>
     <w:p>
@@ -835,115 +835,133 @@
           <w:rFonts w:ascii="Arial" w:hAnsi="Arial" w:cs="Arial"/>
           <w:color w:val="111111"/>
         </w:rPr>
-        <w:t>•    **Fragmentación Tecnológica y Desintegración Arquitectónica:** Coexistencia caótica de tecnologías obsoletas (WebForms con SQL 2005) junto a tecnologías modernas (.NET, React, Angular, PHP, PostgreSQL). Aunque existe un *template* de arquitectura base, su uso no ha sido obligatorio ni uniforme.</w:t>
-      </w:r>
-    </w:p>
-    <w:p>
-      <w:pPr>
-        <w:spacing w:before="40" w:after="40" w:line="240" w:lineRule="auto"/>
-        <w:ind w:left="360"/>
-        <w:jc w:val="both"/>
-        <w:rPr>
-          <w:rFonts w:ascii="Arial" w:hAnsi="Arial" w:cs="Arial"/>
-          <w:color w:val="111111"/>
-        </w:rPr>
-      </w:pPr>
-      <w:r>
-        <w:rPr>
-          <w:rFonts w:ascii="Arial" w:hAnsi="Arial" w:cs="Arial"/>
-          <w:color w:val="111111"/>
-        </w:rPr>
-        <w:t>•    **Multitarea Extrema y Conocimiento Concentrado (*Single Point of Failure*):** La escasa dotación frente a la alta demanda obliga al personal a atender simultáneamente emergencias *legacy* de diversas áreas y desarrollos nuevos. Esto genera saltos de contexto constantes y un alto riesgo operativo: la existencia de sistemas críticos que dependen del conocimiento exclusivo de una sola persona.</w:t>
-      </w:r>
-    </w:p>
-    <w:p>
-      <w:pPr>
-        <w:spacing w:before="40" w:after="40" w:line="240" w:lineRule="auto"/>
-        <w:ind w:left="360"/>
-        <w:jc w:val="both"/>
-        <w:rPr>
-          <w:rFonts w:ascii="Arial" w:hAnsi="Arial" w:cs="Arial"/>
-          <w:color w:val="111111"/>
-        </w:rPr>
-      </w:pPr>
-      <w:r>
-        <w:rPr>
-          <w:rFonts w:ascii="Arial" w:hAnsi="Arial" w:cs="Arial"/>
-          <w:color w:val="111111"/>
-        </w:rPr>
-        <w:t>•    **Aislamiento Operativo entre Dependencias:** La distribución física del personal en dos oficinas distintas genera descoordinación, aislamiento en silos de información y el riesgo de desarrollar funcionalidades duplicadas por falta de comunicación.</w:t>
-      </w:r>
-    </w:p>
-    <w:p>
-      <w:pPr>
-        <w:spacing w:before="40" w:after="40" w:line="240" w:lineRule="auto"/>
-        <w:ind w:left="360"/>
-        <w:jc w:val="both"/>
-        <w:rPr>
-          <w:rFonts w:ascii="Arial" w:hAnsi="Arial" w:cs="Arial"/>
-          <w:color w:val="111111"/>
-        </w:rPr>
-      </w:pPr>
-      <w:r>
-        <w:rPr>
-          <w:rFonts w:ascii="Arial" w:hAnsi="Arial" w:cs="Arial"/>
-          <w:color w:val="111111"/>
-        </w:rPr>
-        <w:t>•    **Estimación y Seguimiento Caóticos:** Uso fragmentado de herramientas (algunos agentes usan Redmine, otros planillas desactualizadas en Excel o registros informales), impidiendo conocer la capacidad operativa real del departamento.</w:t>
-      </w:r>
-    </w:p>
-    <w:p>
-      <w:pPr>
-        <w:spacing w:before="40" w:after="40" w:line="240" w:lineRule="auto"/>
-        <w:ind w:left="360"/>
-        <w:jc w:val="both"/>
-        <w:rPr>
-          <w:rFonts w:ascii="Arial" w:hAnsi="Arial" w:cs="Arial"/>
-          <w:color w:val="111111"/>
-        </w:rPr>
-      </w:pPr>
-      <w:r>
-        <w:rPr>
-          <w:rFonts w:ascii="Arial" w:hAnsi="Arial" w:cs="Arial"/>
-          <w:color w:val="111111"/>
-        </w:rPr>
-        <w:t>•    **Documentación Inexistente o Desigual:** Falta de manuales técnicos, diccionarios de datos o registros de arquitectura, lo que profundiza la dependencia de programadores específicos.</w:t>
-      </w:r>
-    </w:p>
-    <w:p>
-      <w:pPr>
-        <w:spacing w:before="40" w:after="40" w:line="240" w:lineRule="auto"/>
-        <w:ind w:left="360"/>
-        <w:jc w:val="both"/>
-        <w:rPr>
-          <w:rFonts w:ascii="Arial" w:hAnsi="Arial" w:cs="Arial"/>
-          <w:color w:val="111111"/>
-        </w:rPr>
-      </w:pPr>
-      <w:r>
-        <w:rPr>
-          <w:rFonts w:ascii="Arial" w:hAnsi="Arial" w:cs="Arial"/>
-          <w:color w:val="111111"/>
-        </w:rPr>
-        <w:t>•    **Falta de Control y Recepción Técnica en Software Tercerizado:** Riesgo de recibir sistemas contratados a terceros sin la documentación adecuada, sin la transferencia de conocimiento al personal municipal o sin alineación a los estándares de arquitectura del departamento.</w:t>
-      </w:r>
-    </w:p>
-    <w:p>
-      <w:pPr>
-        <w:spacing w:before="40" w:after="40" w:line="240" w:lineRule="auto"/>
-        <w:ind w:left="360"/>
-        <w:jc w:val="both"/>
-        <w:rPr>
-          <w:rFonts w:ascii="Arial" w:hAnsi="Arial" w:cs="Arial"/>
-          <w:color w:val="111111"/>
-        </w:rPr>
-      </w:pPr>
-      <w:r>
-        <w:rPr>
-          <w:rFonts w:ascii="Arial" w:hAnsi="Arial" w:cs="Arial"/>
-          <w:color w:val="111111"/>
-        </w:rPr>
-        <w:t>•    **Pruebas de Software Reactivas:** Al no existir el rol de QA en el organigrama municipal (ni la posibilidad de crear nuevos cargos en el escalafón), la verificación de errores depende del propio desarrollador o salta en post-producción reportada por el usuario.</w:t>
+        <w:t>•    **Fragmentación Tecnológica y Coexistencia Legacy:** Coexistencia caótica de tecnologías obsoletas y sin soporte (WebForms con SQL 2005) junto a entornos modernos (.NET, React, Angular, PHP, PostgreSQL), dificultando el mantenimiento continuo.</w:t>
+      </w:r>
+    </w:p>
+    <w:p>
+      <w:pPr>
+        <w:spacing w:before="40" w:after="40" w:line="240" w:lineRule="auto"/>
+        <w:ind w:left="360"/>
+        <w:jc w:val="both"/>
+        <w:rPr>
+          <w:rFonts w:ascii="Arial" w:hAnsi="Arial" w:cs="Arial"/>
+          <w:color w:val="111111"/>
+        </w:rPr>
+      </w:pPr>
+      <w:r>
+        <w:rPr>
+          <w:rFonts w:ascii="Arial" w:hAnsi="Arial" w:cs="Arial"/>
+          <w:color w:val="111111"/>
+        </w:rPr>
+        <w:t>•    **Falta de una Arquitectura Base Estandarizada:** Ausencia de un *template* de arquitectura oficial de cumplimiento obligatorio para uniformar las aplicaciones, dificultando la construcción homogénea de sistemas y la rotación de programadores entre proyectos.</w:t>
+      </w:r>
+    </w:p>
+    <w:p>
+      <w:pPr>
+        <w:spacing w:before="40" w:after="40" w:line="240" w:lineRule="auto"/>
+        <w:ind w:left="360"/>
+        <w:jc w:val="both"/>
+        <w:rPr>
+          <w:rFonts w:ascii="Arial" w:hAnsi="Arial" w:cs="Arial"/>
+          <w:color w:val="111111"/>
+        </w:rPr>
+      </w:pPr>
+      <w:r>
+        <w:rPr>
+          <w:rFonts w:ascii="Arial" w:hAnsi="Arial" w:cs="Arial"/>
+          <w:color w:val="111111"/>
+        </w:rPr>
+        <w:t>•    **Multitarea Extrema y Conocimiento Concentrado (*Single Point of Failure*):** La escasa dotación frente a la alta demanda obliga al personal a atender simultáneamente emergencias de sistemas antiguos de diversas áreas y desarrollos nuevos. Esto genera saltos de contexto constantes y un alto riesgo operativo: la existencia de sistemas críticos que dependen del conocimiento exclusivo de una sola persona.</w:t>
+      </w:r>
+    </w:p>
+    <w:p>
+      <w:pPr>
+        <w:spacing w:before="40" w:after="40" w:line="240" w:lineRule="auto"/>
+        <w:ind w:left="360"/>
+        <w:jc w:val="both"/>
+        <w:rPr>
+          <w:rFonts w:ascii="Arial" w:hAnsi="Arial" w:cs="Arial"/>
+          <w:color w:val="111111"/>
+        </w:rPr>
+      </w:pPr>
+      <w:r>
+        <w:rPr>
+          <w:rFonts w:ascii="Arial" w:hAnsi="Arial" w:cs="Arial"/>
+          <w:color w:val="111111"/>
+        </w:rPr>
+        <w:t>•    **Aislamiento Operativo entre Dependencias:** La distribución física del personal en dos oficinas distintas sin una figura de coordinación transversal genera descoordinación, aislamiento en silos de información y el riesgo de desarrollar funcionalidades duplicadas por falta de comunicación.</w:t>
+      </w:r>
+    </w:p>
+    <w:p>
+      <w:pPr>
+        <w:spacing w:before="40" w:after="40" w:line="240" w:lineRule="auto"/>
+        <w:ind w:left="360"/>
+        <w:jc w:val="both"/>
+        <w:rPr>
+          <w:rFonts w:ascii="Arial" w:hAnsi="Arial" w:cs="Arial"/>
+          <w:color w:val="111111"/>
+        </w:rPr>
+      </w:pPr>
+      <w:r>
+        <w:rPr>
+          <w:rFonts w:ascii="Arial" w:hAnsi="Arial" w:cs="Arial"/>
+          <w:color w:val="111111"/>
+        </w:rPr>
+        <w:t>•    **Estimación y Seguimiento Caóticos:** Uso fragmentado de herramientas para documentar el avance de los proyectos (algunos agentes usan Redmine, otros planillas desactualizadas en Excel o registros informales), impidiendo conocer la capacidad operativa real del departamento.</w:t>
+      </w:r>
+    </w:p>
+    <w:p>
+      <w:pPr>
+        <w:spacing w:before="40" w:after="40" w:line="240" w:lineRule="auto"/>
+        <w:ind w:left="360"/>
+        <w:jc w:val="both"/>
+        <w:rPr>
+          <w:rFonts w:ascii="Arial" w:hAnsi="Arial" w:cs="Arial"/>
+          <w:color w:val="111111"/>
+        </w:rPr>
+      </w:pPr>
+      <w:r>
+        <w:rPr>
+          <w:rFonts w:ascii="Arial" w:hAnsi="Arial" w:cs="Arial"/>
+          <w:color w:val="111111"/>
+        </w:rPr>
+        <w:t>•    **Documentación Inexistente o Desigual:** Falta de manuales de relevamiento, documentación técnica o registros de arquitectura, profundizando la dependencia de programadores específicos.</w:t>
+      </w:r>
+    </w:p>
+    <w:p>
+      <w:pPr>
+        <w:spacing w:before="40" w:after="40" w:line="240" w:lineRule="auto"/>
+        <w:ind w:left="360"/>
+        <w:jc w:val="both"/>
+        <w:rPr>
+          <w:rFonts w:ascii="Arial" w:hAnsi="Arial" w:cs="Arial"/>
+          <w:color w:val="111111"/>
+        </w:rPr>
+      </w:pPr>
+      <w:r>
+        <w:rPr>
+          <w:rFonts w:ascii="Arial" w:hAnsi="Arial" w:cs="Arial"/>
+          <w:color w:val="111111"/>
+        </w:rPr>
+        <w:t>•    **Pruebas de Software Reactivas:** Al no existir el rol de QA (Quality Assurance) ni herramientas de testeo estandarizadas, la verificación de errores depende de los propios desarrolladores o de los usuarios de los aplicativos.</w:t>
+      </w:r>
+    </w:p>
+    <w:p>
+      <w:pPr>
+        <w:spacing w:before="40" w:after="40" w:line="240" w:lineRule="auto"/>
+        <w:ind w:left="360"/>
+        <w:jc w:val="both"/>
+        <w:rPr>
+          <w:rFonts w:ascii="Arial" w:hAnsi="Arial" w:cs="Arial"/>
+          <w:color w:val="111111"/>
+        </w:rPr>
+      </w:pPr>
+      <w:r>
+        <w:rPr>
+          <w:rFonts w:ascii="Arial" w:hAnsi="Arial" w:cs="Arial"/>
+          <w:color w:val="111111"/>
+        </w:rPr>
+        <w:t>•    **Resistencia Interna al Cambio:** Cierta reticencia de algunos agentes a aprender nuevas tecnologías y estándares de desarrollo, insistiendo en utilizar lenguajes o esquemas obsoletos y generando dificultades en la optimización de bases de datos.</w:t>
       </w:r>
     </w:p>
     <w:p>
@@ -979,6 +997,24 @@
           <w:rFonts w:ascii="Arial" w:hAnsi="Arial" w:cs="Arial"/>
           <w:color w:val="111111"/>
         </w:rPr>
+        <w:t>•    **Gestión Política Favorable:** Voluntad e interés de las autoridades actuales por optimizar, modernizar y jerarquizar las funciones del Departamento.</w:t>
+      </w:r>
+    </w:p>
+    <w:p>
+      <w:pPr>
+        <w:spacing w:before="40" w:after="40" w:line="240" w:lineRule="auto"/>
+        <w:ind w:left="360"/>
+        <w:jc w:val="both"/>
+        <w:rPr>
+          <w:rFonts w:ascii="Arial" w:hAnsi="Arial" w:cs="Arial"/>
+          <w:color w:val="111111"/>
+        </w:rPr>
+      </w:pPr>
+      <w:r>
+        <w:rPr>
+          <w:rFonts w:ascii="Arial" w:hAnsi="Arial" w:cs="Arial"/>
+          <w:color w:val="111111"/>
+        </w:rPr>
         <w:t>•    **Adopción de Inteligencia Artificial para Agilizar la Producción:** Oportunidad de incorporar herramientas asistidas por IA (asistentes en los IDEs) para acelerar la codificación, automatizar tareas repetitivas de documentación y aumentar la productividad general del departamento.</w:t>
       </w:r>
     </w:p>
@@ -997,25 +1033,43 @@
           <w:rFonts w:ascii="Arial" w:hAnsi="Arial" w:cs="Arial"/>
           <w:color w:val="111111"/>
         </w:rPr>
-        <w:t>•    **Adopción de Marcos Ágiles Híbridos:** Implementación de metodologías ágiles adaptadas a la realidad municipal a costo cero.</w:t>
-      </w:r>
-    </w:p>
-    <w:p>
-      <w:pPr>
-        <w:spacing w:before="40" w:after="40" w:line="240" w:lineRule="auto"/>
-        <w:ind w:left="360"/>
-        <w:jc w:val="both"/>
-        <w:rPr>
-          <w:rFonts w:ascii="Arial" w:hAnsi="Arial" w:cs="Arial"/>
-          <w:color w:val="111111"/>
-        </w:rPr>
-      </w:pPr>
-      <w:r>
-        <w:rPr>
-          <w:rFonts w:ascii="Arial" w:hAnsi="Arial" w:cs="Arial"/>
-          <w:color w:val="111111"/>
-        </w:rPr>
-        <w:t>•    **Estandarización mediante la Arquitectura Base:** Consolidar el *template* preexistente como norma obligatoria para todos los desarrollos.</w:t>
+        <w:t>•    **Oferta de Capacitaciones Accesibles:** Gran disponibilidad de ofertas de capacitación técnica (nuevas tecnologías, metodologías ágiles e IDEs con IA) que pueden ser aprovechadas para calificar al personal del área.</w:t>
+      </w:r>
+    </w:p>
+    <w:p>
+      <w:pPr>
+        <w:spacing w:before="40" w:after="40" w:line="240" w:lineRule="auto"/>
+        <w:ind w:left="360"/>
+        <w:jc w:val="both"/>
+        <w:rPr>
+          <w:rFonts w:ascii="Arial" w:hAnsi="Arial" w:cs="Arial"/>
+          <w:color w:val="111111"/>
+        </w:rPr>
+      </w:pPr>
+      <w:r>
+        <w:rPr>
+          <w:rFonts w:ascii="Arial" w:hAnsi="Arial" w:cs="Arial"/>
+          <w:color w:val="111111"/>
+        </w:rPr>
+        <w:t>•    **Adopción de Marcos Ágiles Híbridos:** Implementación de metodologías ágiles adaptadas a la realidad municipal a costo cero para mejorar y agilizar los procesos de desarrollo.</w:t>
+      </w:r>
+    </w:p>
+    <w:p>
+      <w:pPr>
+        <w:spacing w:before="40" w:after="40" w:line="240" w:lineRule="auto"/>
+        <w:ind w:left="360"/>
+        <w:jc w:val="both"/>
+        <w:rPr>
+          <w:rFonts w:ascii="Arial" w:hAnsi="Arial" w:cs="Arial"/>
+          <w:color w:val="111111"/>
+        </w:rPr>
+      </w:pPr>
+      <w:r>
+        <w:rPr>
+          <w:rFonts w:ascii="Arial" w:hAnsi="Arial" w:cs="Arial"/>
+          <w:color w:val="111111"/>
+        </w:rPr>
+        <w:t>•    **Estandarización mediante una Arquitectura Base:** Oportunidad de definir e instituir una arquitectura base a modo de *template* como norma obligatoria para unificar las metodologías y mantener una coherencia en las tecnologías utilizadas.</w:t>
       </w:r>
     </w:p>
     <w:p>
@@ -1051,25 +1105,43 @@
           <w:rFonts w:ascii="Arial" w:hAnsi="Arial" w:cs="Arial"/>
           <w:color w:val="111111"/>
         </w:rPr>
-        <w:t>•    **Cambios Rápidos en Demandas de Gestión:** Necesidad de acelerar entregas sin comprometer la seguridad ni la mantenibilidad.</w:t>
-      </w:r>
-    </w:p>
-    <w:p>
-      <w:pPr>
-        <w:spacing w:before="40" w:after="40" w:line="240" w:lineRule="auto"/>
-        <w:ind w:left="360"/>
-        <w:jc w:val="both"/>
-        <w:rPr>
-          <w:rFonts w:ascii="Arial" w:hAnsi="Arial" w:cs="Arial"/>
-          <w:color w:val="111111"/>
-        </w:rPr>
-      </w:pPr>
-      <w:r>
-        <w:rPr>
-          <w:rFonts w:ascii="Arial" w:hAnsi="Arial" w:cs="Arial"/>
-          <w:color w:val="111111"/>
-        </w:rPr>
-        <w:t>•    **Riesgos de Ciberseguridad y Fuga de Datos:** Vulnerabilidades en código heredado o uso inadvertido de IA pública compartiendo datos institucionales.</w:t>
+        <w:t>•    **Demandas Institucionales Cambiantes e Imprevistas:** Variación rápida en las prioridades de las distintas Secretarías que exigen respuestas inmediatas y desordenan la planificación del área.</w:t>
+      </w:r>
+    </w:p>
+    <w:p>
+      <w:pPr>
+        <w:spacing w:before="40" w:after="40" w:line="240" w:lineRule="auto"/>
+        <w:ind w:left="360"/>
+        <w:jc w:val="both"/>
+        <w:rPr>
+          <w:rFonts w:ascii="Arial" w:hAnsi="Arial" w:cs="Arial"/>
+          <w:color w:val="111111"/>
+        </w:rPr>
+      </w:pPr>
+      <w:r>
+        <w:rPr>
+          <w:rFonts w:ascii="Arial" w:hAnsi="Arial" w:cs="Arial"/>
+          <w:color w:val="111111"/>
+        </w:rPr>
+        <w:t>•    **Dificultad de Integración Técnica con Sistemas y Bases Legacy:** Complejidad para consumir o integrar datos de aplicaciones antiguas que carecen de APIs o servicios web unificados, generando duplicación de funciones al no contar con interfaces modernas de integración.</w:t>
+      </w:r>
+    </w:p>
+    <w:p>
+      <w:pPr>
+        <w:spacing w:before="40" w:after="40" w:line="240" w:lineRule="auto"/>
+        <w:ind w:left="360"/>
+        <w:jc w:val="both"/>
+        <w:rPr>
+          <w:rFonts w:ascii="Arial" w:hAnsi="Arial" w:cs="Arial"/>
+          <w:color w:val="111111"/>
+        </w:rPr>
+      </w:pPr>
+      <w:r>
+        <w:rPr>
+          <w:rFonts w:ascii="Arial" w:hAnsi="Arial" w:cs="Arial"/>
+          <w:color w:val="111111"/>
+        </w:rPr>
+        <w:t>•    **Riesgos de Ciberseguridad y Fuga de Información:** Vulnerabilidades en código antiguo no actualizado o uso de herramientas externas que pongan en riesgo la información municipal.</w:t>
       </w:r>
     </w:p>
     <w:p>
@@ -3798,7 +3870,7 @@
     <w:link w:val="EncabezadoCar"/>
     <w:uiPriority w:val="99"/>
     <w:unhideWhenUsed/>
-    <w:rsid w:val="002B5A75"/>
+    <w:rsid w:val="000839A3"/>
     <w:pPr>
       <w:tabs>
         <w:tab w:val="center" w:pos="4252"/>
@@ -3812,7 +3884,7 @@
     <w:basedOn w:val="Fuentedeprrafopredeter"/>
     <w:link w:val="Encabezado"/>
     <w:uiPriority w:val="99"/>
-    <w:rsid w:val="002B5A75"/>
+    <w:rsid w:val="000839A3"/>
   </w:style>
   <w:style w:type="paragraph" w:styleId="Piedepgina">
     <w:name w:val="footer"/>
@@ -3820,7 +3892,7 @@
     <w:link w:val="PiedepginaCar"/>
     <w:uiPriority w:val="99"/>
     <w:unhideWhenUsed/>
-    <w:rsid w:val="002B5A75"/>
+    <w:rsid w:val="000839A3"/>
     <w:pPr>
       <w:tabs>
         <w:tab w:val="center" w:pos="4252"/>
@@ -3834,7 +3906,7 @@
     <w:basedOn w:val="Fuentedeprrafopredeter"/>
     <w:link w:val="Piedepgina"/>
     <w:uiPriority w:val="99"/>
-    <w:rsid w:val="002B5A75"/>
+    <w:rsid w:val="000839A3"/>
   </w:style>
 </w:styles>
 </file>

</xml_diff>

<commit_message>
style: Match exact SWOT line breaks and title layout without bold asterisks
</commit_message>
<xml_diff>
--- a/Plan_Trabajo_Concurso_Jefatura_Software.docx
+++ b/Plan_Trabajo_Concurso_Jefatura_Software.docx
@@ -750,398 +750,682 @@
     </w:p>
     <w:p>
       <w:pPr>
-        <w:spacing w:before="200" w:after="60" w:line="240" w:lineRule="auto"/>
-        <w:rPr>
-          <w:rFonts w:ascii="Arial" w:hAnsi="Arial" w:cs="Arial"/>
-          <w:b/>
-          <w:color w:val="222222"/>
-        </w:rPr>
-      </w:pPr>
-      <w:r>
-        <w:rPr>
-          <w:rFonts w:ascii="Arial" w:hAnsi="Arial" w:cs="Arial"/>
-          <w:b/>
-          <w:color w:val="222222"/>
+        <w:spacing w:before="60" w:after="60" w:line="240" w:lineRule="auto"/>
+        <w:jc w:val="both"/>
+        <w:rPr>
+          <w:rFonts w:ascii="Arial" w:hAnsi="Arial" w:cs="Arial"/>
+          <w:color w:val="111111"/>
+        </w:rPr>
+      </w:pPr>
+      <w:r>
+        <w:rPr>
+          <w:rFonts w:ascii="Arial" w:hAnsi="Arial" w:cs="Arial"/>
+          <w:color w:val="111111"/>
         </w:rPr>
         <w:t>Fortalezas</w:t>
       </w:r>
     </w:p>
     <w:p>
       <w:pPr>
-        <w:spacing w:before="40" w:after="40" w:line="240" w:lineRule="auto"/>
-        <w:ind w:left="360"/>
-        <w:jc w:val="both"/>
-        <w:rPr>
-          <w:rFonts w:ascii="Arial" w:hAnsi="Arial" w:cs="Arial"/>
-          <w:color w:val="111111"/>
-        </w:rPr>
-      </w:pPr>
-      <w:r>
-        <w:rPr>
-          <w:rFonts w:ascii="Arial" w:hAnsi="Arial" w:cs="Arial"/>
-          <w:color w:val="111111"/>
-        </w:rPr>
-        <w:t>•    **Personal Técnico Capacitado:** El Departamento dispone de un plantel técnico capacitado capaz de realizar tareas de relevamiento analítico, desarrollo y pruebas de aplicaciones, con un amplio conocimiento del negocio, las normativas y los circuitos administrativos municipales.</w:t>
-      </w:r>
-    </w:p>
-    <w:p>
-      <w:pPr>
-        <w:spacing w:before="40" w:after="40" w:line="240" w:lineRule="auto"/>
-        <w:ind w:left="360"/>
-        <w:jc w:val="both"/>
-        <w:rPr>
-          <w:rFonts w:ascii="Arial" w:hAnsi="Arial" w:cs="Arial"/>
-          <w:color w:val="111111"/>
-        </w:rPr>
-      </w:pPr>
-      <w:r>
-        <w:rPr>
-          <w:rFonts w:ascii="Arial" w:hAnsi="Arial" w:cs="Arial"/>
-          <w:color w:val="111111"/>
-        </w:rPr>
-        <w:t>•    **Disponibilidad de Medios e Infraestructura Básica:** Se cuenta con el mobiliario, equipos y herramientas técnicas suficientes para llevar a cabo la Misión y Funciones del Departamento.</w:t>
-      </w:r>
-    </w:p>
-    <w:p>
-      <w:pPr>
-        <w:spacing w:before="200" w:after="60" w:line="240" w:lineRule="auto"/>
-        <w:rPr>
-          <w:rFonts w:ascii="Arial" w:hAnsi="Arial" w:cs="Arial"/>
-          <w:b/>
-          <w:color w:val="222222"/>
-        </w:rPr>
-      </w:pPr>
-      <w:r>
-        <w:rPr>
-          <w:rFonts w:ascii="Arial" w:hAnsi="Arial" w:cs="Arial"/>
-          <w:b/>
-          <w:color w:val="222222"/>
+        <w:spacing w:before="60" w:after="60" w:line="240" w:lineRule="auto"/>
+        <w:jc w:val="both"/>
+        <w:rPr>
+          <w:rFonts w:ascii="Arial" w:hAnsi="Arial" w:cs="Arial"/>
+          <w:color w:val="111111"/>
+        </w:rPr>
+      </w:pPr>
+      <w:r>
+        <w:rPr>
+          <w:rFonts w:ascii="Arial" w:hAnsi="Arial" w:cs="Arial"/>
+          <w:color w:val="111111"/>
+        </w:rPr>
+        <w:t>Personal Técnico Capacitado:</w:t>
+      </w:r>
+    </w:p>
+    <w:p>
+      <w:pPr>
+        <w:spacing w:before="60" w:after="60" w:line="240" w:lineRule="auto"/>
+        <w:jc w:val="both"/>
+        <w:rPr>
+          <w:rFonts w:ascii="Arial" w:hAnsi="Arial" w:cs="Arial"/>
+          <w:color w:val="111111"/>
+        </w:rPr>
+      </w:pPr>
+      <w:r>
+        <w:rPr>
+          <w:rFonts w:ascii="Arial" w:hAnsi="Arial" w:cs="Arial"/>
+          <w:color w:val="111111"/>
+        </w:rPr>
+        <w:t>El Departamento dispone de un plantel técnico capacitado capaz de realizar tareas de relevamiento analítico, desarrollo y pruebas de aplicaciones, con un amplio conocimiento del negocio, las normativas y los circuitos administrativos municipales.</w:t>
+      </w:r>
+    </w:p>
+    <w:p>
+      <w:pPr>
+        <w:spacing w:before="60" w:after="60" w:line="240" w:lineRule="auto"/>
+        <w:jc w:val="both"/>
+        <w:rPr>
+          <w:rFonts w:ascii="Arial" w:hAnsi="Arial" w:cs="Arial"/>
+          <w:color w:val="111111"/>
+        </w:rPr>
+      </w:pPr>
+      <w:r>
+        <w:rPr>
+          <w:rFonts w:ascii="Arial" w:hAnsi="Arial" w:cs="Arial"/>
+          <w:color w:val="111111"/>
+        </w:rPr>
+        <w:t>Disponibilidad de medios:</w:t>
+      </w:r>
+    </w:p>
+    <w:p>
+      <w:pPr>
+        <w:spacing w:before="60" w:after="60" w:line="240" w:lineRule="auto"/>
+        <w:jc w:val="both"/>
+        <w:rPr>
+          <w:rFonts w:ascii="Arial" w:hAnsi="Arial" w:cs="Arial"/>
+          <w:color w:val="111111"/>
+        </w:rPr>
+      </w:pPr>
+      <w:r>
+        <w:rPr>
+          <w:rFonts w:ascii="Arial" w:hAnsi="Arial" w:cs="Arial"/>
+          <w:color w:val="111111"/>
+        </w:rPr>
+        <w:t>Se cuenta con el suficiente mobiliario y herramientas técnicas suficientes para llevar a cabo la Misión y Funciones del Departamento.</w:t>
+      </w:r>
+    </w:p>
+    <w:p>
+      <w:pPr>
+        <w:spacing w:before="60" w:after="60" w:line="240" w:lineRule="auto"/>
+        <w:jc w:val="both"/>
+        <w:rPr>
+          <w:rFonts w:ascii="Arial" w:hAnsi="Arial" w:cs="Arial"/>
+          <w:color w:val="111111"/>
+        </w:rPr>
+      </w:pPr>
+      <w:r>
+        <w:rPr>
+          <w:rFonts w:ascii="Arial" w:hAnsi="Arial" w:cs="Arial"/>
+          <w:color w:val="111111"/>
         </w:rPr>
         <w:t>Debilidades</w:t>
       </w:r>
     </w:p>
     <w:p>
       <w:pPr>
-        <w:spacing w:before="40" w:after="40" w:line="240" w:lineRule="auto"/>
-        <w:ind w:left="360"/>
-        <w:jc w:val="both"/>
-        <w:rPr>
-          <w:rFonts w:ascii="Arial" w:hAnsi="Arial" w:cs="Arial"/>
-          <w:color w:val="111111"/>
-        </w:rPr>
-      </w:pPr>
-      <w:r>
-        <w:rPr>
-          <w:rFonts w:ascii="Arial" w:hAnsi="Arial" w:cs="Arial"/>
-          <w:color w:val="111111"/>
-        </w:rPr>
-        <w:t>•    **Fragmentación Tecnológica y Coexistencia Legacy:** Coexistencia caótica de tecnologías obsoletas y sin soporte (WebForms con SQL 2005) junto a entornos modernos (.NET, React, Angular, PHP, PostgreSQL), dificultando el mantenimiento continuo.</w:t>
-      </w:r>
-    </w:p>
-    <w:p>
-      <w:pPr>
-        <w:spacing w:before="40" w:after="40" w:line="240" w:lineRule="auto"/>
-        <w:ind w:left="360"/>
-        <w:jc w:val="both"/>
-        <w:rPr>
-          <w:rFonts w:ascii="Arial" w:hAnsi="Arial" w:cs="Arial"/>
-          <w:color w:val="111111"/>
-        </w:rPr>
-      </w:pPr>
-      <w:r>
-        <w:rPr>
-          <w:rFonts w:ascii="Arial" w:hAnsi="Arial" w:cs="Arial"/>
-          <w:color w:val="111111"/>
-        </w:rPr>
-        <w:t>•    **Falta de una Arquitectura Base Estandarizada:** Ausencia de un *template* de arquitectura oficial de cumplimiento obligatorio para uniformar las aplicaciones, dificultando la construcción homogénea de sistemas y la rotación de programadores entre proyectos.</w:t>
-      </w:r>
-    </w:p>
-    <w:p>
-      <w:pPr>
-        <w:spacing w:before="40" w:after="40" w:line="240" w:lineRule="auto"/>
-        <w:ind w:left="360"/>
-        <w:jc w:val="both"/>
-        <w:rPr>
-          <w:rFonts w:ascii="Arial" w:hAnsi="Arial" w:cs="Arial"/>
-          <w:color w:val="111111"/>
-        </w:rPr>
-      </w:pPr>
-      <w:r>
-        <w:rPr>
-          <w:rFonts w:ascii="Arial" w:hAnsi="Arial" w:cs="Arial"/>
-          <w:color w:val="111111"/>
-        </w:rPr>
-        <w:t>•    **Multitarea Extrema y Conocimiento Concentrado (*Single Point of Failure*):** La escasa dotación frente a la alta demanda obliga al personal a atender simultáneamente emergencias de sistemas antiguos de diversas áreas y desarrollos nuevos. Esto genera saltos de contexto constantes y un alto riesgo operativo: la existencia de sistemas críticos que dependen del conocimiento exclusivo de una sola persona.</w:t>
-      </w:r>
-    </w:p>
-    <w:p>
-      <w:pPr>
-        <w:spacing w:before="40" w:after="40" w:line="240" w:lineRule="auto"/>
-        <w:ind w:left="360"/>
-        <w:jc w:val="both"/>
-        <w:rPr>
-          <w:rFonts w:ascii="Arial" w:hAnsi="Arial" w:cs="Arial"/>
-          <w:color w:val="111111"/>
-        </w:rPr>
-      </w:pPr>
-      <w:r>
-        <w:rPr>
-          <w:rFonts w:ascii="Arial" w:hAnsi="Arial" w:cs="Arial"/>
-          <w:color w:val="111111"/>
-        </w:rPr>
-        <w:t>•    **Aislamiento Operativo entre Dependencias:** La distribución física del personal en dos oficinas distintas sin una figura de coordinación transversal genera descoordinación, aislamiento en silos de información y el riesgo de desarrollar funcionalidades duplicadas por falta de comunicación.</w:t>
-      </w:r>
-    </w:p>
-    <w:p>
-      <w:pPr>
-        <w:spacing w:before="40" w:after="40" w:line="240" w:lineRule="auto"/>
-        <w:ind w:left="360"/>
-        <w:jc w:val="both"/>
-        <w:rPr>
-          <w:rFonts w:ascii="Arial" w:hAnsi="Arial" w:cs="Arial"/>
-          <w:color w:val="111111"/>
-        </w:rPr>
-      </w:pPr>
-      <w:r>
-        <w:rPr>
-          <w:rFonts w:ascii="Arial" w:hAnsi="Arial" w:cs="Arial"/>
-          <w:color w:val="111111"/>
-        </w:rPr>
-        <w:t>•    **Estimación y Seguimiento Caóticos:** Uso fragmentado de herramientas para documentar el avance de los proyectos (algunos agentes usan Redmine, otros planillas desactualizadas en Excel o registros informales), impidiendo conocer la capacidad operativa real del departamento.</w:t>
-      </w:r>
-    </w:p>
-    <w:p>
-      <w:pPr>
-        <w:spacing w:before="40" w:after="40" w:line="240" w:lineRule="auto"/>
-        <w:ind w:left="360"/>
-        <w:jc w:val="both"/>
-        <w:rPr>
-          <w:rFonts w:ascii="Arial" w:hAnsi="Arial" w:cs="Arial"/>
-          <w:color w:val="111111"/>
-        </w:rPr>
-      </w:pPr>
-      <w:r>
-        <w:rPr>
-          <w:rFonts w:ascii="Arial" w:hAnsi="Arial" w:cs="Arial"/>
-          <w:color w:val="111111"/>
-        </w:rPr>
-        <w:t>•    **Documentación Inexistente o Desigual:** Falta de manuales de relevamiento, documentación técnica o registros de arquitectura, profundizando la dependencia de programadores específicos.</w:t>
-      </w:r>
-    </w:p>
-    <w:p>
-      <w:pPr>
-        <w:spacing w:before="40" w:after="40" w:line="240" w:lineRule="auto"/>
-        <w:ind w:left="360"/>
-        <w:jc w:val="both"/>
-        <w:rPr>
-          <w:rFonts w:ascii="Arial" w:hAnsi="Arial" w:cs="Arial"/>
-          <w:color w:val="111111"/>
-        </w:rPr>
-      </w:pPr>
-      <w:r>
-        <w:rPr>
-          <w:rFonts w:ascii="Arial" w:hAnsi="Arial" w:cs="Arial"/>
-          <w:color w:val="111111"/>
-        </w:rPr>
-        <w:t>•    **Pruebas de Software Reactivas:** Al no existir el rol de QA (Quality Assurance) ni herramientas de testeo estandarizadas, la verificación de errores depende de los propios desarrolladores o de los usuarios de los aplicativos.</w:t>
-      </w:r>
-    </w:p>
-    <w:p>
-      <w:pPr>
-        <w:spacing w:before="40" w:after="40" w:line="240" w:lineRule="auto"/>
-        <w:ind w:left="360"/>
-        <w:jc w:val="both"/>
-        <w:rPr>
-          <w:rFonts w:ascii="Arial" w:hAnsi="Arial" w:cs="Arial"/>
-          <w:color w:val="111111"/>
-        </w:rPr>
-      </w:pPr>
-      <w:r>
-        <w:rPr>
-          <w:rFonts w:ascii="Arial" w:hAnsi="Arial" w:cs="Arial"/>
-          <w:color w:val="111111"/>
-        </w:rPr>
-        <w:t>•    **Resistencia Interna al Cambio:** Cierta reticencia de algunos agentes a aprender nuevas tecnologías y estándares de desarrollo, insistiendo en utilizar lenguajes o esquemas obsoletos y generando dificultades en la optimización de bases de datos.</w:t>
-      </w:r>
-    </w:p>
-    <w:p>
-      <w:pPr>
-        <w:spacing w:before="200" w:after="60" w:line="240" w:lineRule="auto"/>
-        <w:rPr>
-          <w:rFonts w:ascii="Arial" w:hAnsi="Arial" w:cs="Arial"/>
-          <w:b/>
-          <w:color w:val="222222"/>
-        </w:rPr>
-      </w:pPr>
-      <w:r>
-        <w:rPr>
-          <w:rFonts w:ascii="Arial" w:hAnsi="Arial" w:cs="Arial"/>
-          <w:b/>
-          <w:color w:val="222222"/>
+        <w:spacing w:before="60" w:after="60" w:line="240" w:lineRule="auto"/>
+        <w:jc w:val="both"/>
+        <w:rPr>
+          <w:rFonts w:ascii="Arial" w:hAnsi="Arial" w:cs="Arial"/>
+          <w:color w:val="111111"/>
+        </w:rPr>
+      </w:pPr>
+      <w:r>
+        <w:rPr>
+          <w:rFonts w:ascii="Arial" w:hAnsi="Arial" w:cs="Arial"/>
+          <w:color w:val="111111"/>
+        </w:rPr>
+        <w:t>Fragmentación Tecnológica:</w:t>
+      </w:r>
+    </w:p>
+    <w:p>
+      <w:pPr>
+        <w:spacing w:before="60" w:after="60" w:line="240" w:lineRule="auto"/>
+        <w:jc w:val="both"/>
+        <w:rPr>
+          <w:rFonts w:ascii="Arial" w:hAnsi="Arial" w:cs="Arial"/>
+          <w:color w:val="111111"/>
+        </w:rPr>
+      </w:pPr>
+      <w:r>
+        <w:rPr>
+          <w:rFonts w:ascii="Arial" w:hAnsi="Arial" w:cs="Arial"/>
+          <w:color w:val="111111"/>
+        </w:rPr>
+        <w:t>Coexistencia caótica de tecnologías obsoletas y sin soporte actual (WebForms con SQL 2005) junto a tecnologías modernas (.NET, React, Angular, PHP, PostgreSQL), dificultando el mantenimiento continuo.</w:t>
+      </w:r>
+    </w:p>
+    <w:p>
+      <w:pPr>
+        <w:spacing w:before="60" w:after="60" w:line="240" w:lineRule="auto"/>
+        <w:jc w:val="both"/>
+        <w:rPr>
+          <w:rFonts w:ascii="Arial" w:hAnsi="Arial" w:cs="Arial"/>
+          <w:color w:val="111111"/>
+        </w:rPr>
+      </w:pPr>
+      <w:r>
+        <w:rPr>
+          <w:rFonts w:ascii="Arial" w:hAnsi="Arial" w:cs="Arial"/>
+          <w:color w:val="111111"/>
+        </w:rPr>
+        <w:t>Falta de una Arquitectura Base Estandarizada:</w:t>
+      </w:r>
+    </w:p>
+    <w:p>
+      <w:pPr>
+        <w:spacing w:before="60" w:after="60" w:line="240" w:lineRule="auto"/>
+        <w:jc w:val="both"/>
+        <w:rPr>
+          <w:rFonts w:ascii="Arial" w:hAnsi="Arial" w:cs="Arial"/>
+          <w:color w:val="111111"/>
+        </w:rPr>
+      </w:pPr>
+      <w:r>
+        <w:rPr>
+          <w:rFonts w:ascii="Arial" w:hAnsi="Arial" w:cs="Arial"/>
+          <w:color w:val="111111"/>
+        </w:rPr>
+        <w:t>Ausencia de un template de arquitectura oficial de cumplimiento obligatorio para uniformar las aplicaciones, dificultando la construcción homogénea de sistemas y la rotación de programadores entre proyectos.</w:t>
+      </w:r>
+    </w:p>
+    <w:p>
+      <w:pPr>
+        <w:spacing w:before="60" w:after="60" w:line="240" w:lineRule="auto"/>
+        <w:jc w:val="both"/>
+        <w:rPr>
+          <w:rFonts w:ascii="Arial" w:hAnsi="Arial" w:cs="Arial"/>
+          <w:color w:val="111111"/>
+        </w:rPr>
+      </w:pPr>
+      <w:r>
+        <w:rPr>
+          <w:rFonts w:ascii="Arial" w:hAnsi="Arial" w:cs="Arial"/>
+          <w:color w:val="111111"/>
+        </w:rPr>
+        <w:t>Multitarea Extrema y Conocimiento Concentrado:</w:t>
+      </w:r>
+    </w:p>
+    <w:p>
+      <w:pPr>
+        <w:spacing w:before="60" w:after="60" w:line="240" w:lineRule="auto"/>
+        <w:jc w:val="both"/>
+        <w:rPr>
+          <w:rFonts w:ascii="Arial" w:hAnsi="Arial" w:cs="Arial"/>
+          <w:color w:val="111111"/>
+        </w:rPr>
+      </w:pPr>
+      <w:r>
+        <w:rPr>
+          <w:rFonts w:ascii="Arial" w:hAnsi="Arial" w:cs="Arial"/>
+          <w:color w:val="111111"/>
+        </w:rPr>
+        <w:t>La escasa dotación frente a la alta demanda obliga al personal a atender simultáneamente emergencias de sistemas antiguos de diversas áreas y desarrollos nuevos. Esto genera saltos de contexto constantes y un alto riesgo operativo: la existencia de sistemas críticos que dependen del conocimiento exclusivo de una sola persona.</w:t>
+      </w:r>
+    </w:p>
+    <w:p>
+      <w:pPr>
+        <w:spacing w:before="60" w:after="60" w:line="240" w:lineRule="auto"/>
+        <w:jc w:val="both"/>
+        <w:rPr>
+          <w:rFonts w:ascii="Arial" w:hAnsi="Arial" w:cs="Arial"/>
+          <w:color w:val="111111"/>
+        </w:rPr>
+      </w:pPr>
+      <w:r>
+        <w:rPr>
+          <w:rFonts w:ascii="Arial" w:hAnsi="Arial" w:cs="Arial"/>
+          <w:color w:val="111111"/>
+        </w:rPr>
+        <w:t>Aislamiento Operativo entre Dependencias:</w:t>
+      </w:r>
+    </w:p>
+    <w:p>
+      <w:pPr>
+        <w:spacing w:before="60" w:after="60" w:line="240" w:lineRule="auto"/>
+        <w:jc w:val="both"/>
+        <w:rPr>
+          <w:rFonts w:ascii="Arial" w:hAnsi="Arial" w:cs="Arial"/>
+          <w:color w:val="111111"/>
+        </w:rPr>
+      </w:pPr>
+      <w:r>
+        <w:rPr>
+          <w:rFonts w:ascii="Arial" w:hAnsi="Arial" w:cs="Arial"/>
+          <w:color w:val="111111"/>
+        </w:rPr>
+        <w:t>La distribución física del personal en dos oficinas distintas sin una figura de coordinación transversal genera descoordinación, aislamiento en silos de información y el riesgo de desarrollar funcionalidades duplicadas por falta de comunicación.</w:t>
+      </w:r>
+    </w:p>
+    <w:p>
+      <w:pPr>
+        <w:spacing w:before="60" w:after="60" w:line="240" w:lineRule="auto"/>
+        <w:jc w:val="both"/>
+        <w:rPr>
+          <w:rFonts w:ascii="Arial" w:hAnsi="Arial" w:cs="Arial"/>
+          <w:color w:val="111111"/>
+        </w:rPr>
+      </w:pPr>
+      <w:r>
+        <w:rPr>
+          <w:rFonts w:ascii="Arial" w:hAnsi="Arial" w:cs="Arial"/>
+          <w:color w:val="111111"/>
+        </w:rPr>
+        <w:t>Estimación y Seguimiento Caóticos:</w:t>
+      </w:r>
+    </w:p>
+    <w:p>
+      <w:pPr>
+        <w:spacing w:before="60" w:after="60" w:line="240" w:lineRule="auto"/>
+        <w:jc w:val="both"/>
+        <w:rPr>
+          <w:rFonts w:ascii="Arial" w:hAnsi="Arial" w:cs="Arial"/>
+          <w:color w:val="111111"/>
+        </w:rPr>
+      </w:pPr>
+      <w:r>
+        <w:rPr>
+          <w:rFonts w:ascii="Arial" w:hAnsi="Arial" w:cs="Arial"/>
+          <w:color w:val="111111"/>
+        </w:rPr>
+        <w:t>Uso fragmentado de herramientas para documentar el avance de los proyectos (algunos agentes usan Redmine, otros planillas desactualizadas en Excel o registros informales), impidiendo conocer la capacidad operativa real del departamento.</w:t>
+      </w:r>
+    </w:p>
+    <w:p>
+      <w:pPr>
+        <w:spacing w:before="60" w:after="60" w:line="240" w:lineRule="auto"/>
+        <w:jc w:val="both"/>
+        <w:rPr>
+          <w:rFonts w:ascii="Arial" w:hAnsi="Arial" w:cs="Arial"/>
+          <w:color w:val="111111"/>
+        </w:rPr>
+      </w:pPr>
+      <w:r>
+        <w:rPr>
+          <w:rFonts w:ascii="Arial" w:hAnsi="Arial" w:cs="Arial"/>
+          <w:color w:val="111111"/>
+        </w:rPr>
+        <w:t>Documentación Inexistente o Desigual:</w:t>
+      </w:r>
+    </w:p>
+    <w:p>
+      <w:pPr>
+        <w:spacing w:before="60" w:after="60" w:line="240" w:lineRule="auto"/>
+        <w:jc w:val="both"/>
+        <w:rPr>
+          <w:rFonts w:ascii="Arial" w:hAnsi="Arial" w:cs="Arial"/>
+          <w:color w:val="111111"/>
+        </w:rPr>
+      </w:pPr>
+      <w:r>
+        <w:rPr>
+          <w:rFonts w:ascii="Arial" w:hAnsi="Arial" w:cs="Arial"/>
+          <w:color w:val="111111"/>
+        </w:rPr>
+        <w:t>Falta de manuales de relevamiento, técnicos o registros de arquitectura, profundizando la dependencia de programadores específicos.</w:t>
+      </w:r>
+    </w:p>
+    <w:p>
+      <w:pPr>
+        <w:spacing w:before="60" w:after="60" w:line="240" w:lineRule="auto"/>
+        <w:jc w:val="both"/>
+        <w:rPr>
+          <w:rFonts w:ascii="Arial" w:hAnsi="Arial" w:cs="Arial"/>
+          <w:color w:val="111111"/>
+        </w:rPr>
+      </w:pPr>
+      <w:r>
+        <w:rPr>
+          <w:rFonts w:ascii="Arial" w:hAnsi="Arial" w:cs="Arial"/>
+          <w:color w:val="111111"/>
+        </w:rPr>
+        <w:t>Pruebas de Software Reactivas:</w:t>
+      </w:r>
+    </w:p>
+    <w:p>
+      <w:pPr>
+        <w:spacing w:before="60" w:after="60" w:line="240" w:lineRule="auto"/>
+        <w:jc w:val="both"/>
+        <w:rPr>
+          <w:rFonts w:ascii="Arial" w:hAnsi="Arial" w:cs="Arial"/>
+          <w:color w:val="111111"/>
+        </w:rPr>
+      </w:pPr>
+      <w:r>
+        <w:rPr>
+          <w:rFonts w:ascii="Arial" w:hAnsi="Arial" w:cs="Arial"/>
+          <w:color w:val="111111"/>
+        </w:rPr>
+        <w:t>Al no existir el rol de QA (Quality Assurance) ni herramientas de testeo estandarizadas, la verificación de errores depende de los propios desarrolladores o de los usuarios de los aplicativos.</w:t>
+      </w:r>
+    </w:p>
+    <w:p>
+      <w:pPr>
+        <w:spacing w:before="60" w:after="60" w:line="240" w:lineRule="auto"/>
+        <w:jc w:val="both"/>
+        <w:rPr>
+          <w:rFonts w:ascii="Arial" w:hAnsi="Arial" w:cs="Arial"/>
+          <w:color w:val="111111"/>
+        </w:rPr>
+      </w:pPr>
+      <w:r>
+        <w:rPr>
+          <w:rFonts w:ascii="Arial" w:hAnsi="Arial" w:cs="Arial"/>
+          <w:color w:val="111111"/>
+        </w:rPr>
+        <w:t>Resistencia Interna al Cambio:</w:t>
+      </w:r>
+    </w:p>
+    <w:p>
+      <w:pPr>
+        <w:spacing w:before="60" w:after="60" w:line="240" w:lineRule="auto"/>
+        <w:jc w:val="both"/>
+        <w:rPr>
+          <w:rFonts w:ascii="Arial" w:hAnsi="Arial" w:cs="Arial"/>
+          <w:color w:val="111111"/>
+        </w:rPr>
+      </w:pPr>
+      <w:r>
+        <w:rPr>
+          <w:rFonts w:ascii="Arial" w:hAnsi="Arial" w:cs="Arial"/>
+          <w:color w:val="111111"/>
+        </w:rPr>
+        <w:t>Cierta reticencia de algunos agentes a aprender nuevas tecnologías y estándares de desarrollo, insistiendo en utilizar lenguajes o esquemas obsoletos y generando dificultades en la optimización de bases de datos.</w:t>
+      </w:r>
+    </w:p>
+    <w:p>
+      <w:pPr>
+        <w:spacing w:before="60" w:after="60" w:line="240" w:lineRule="auto"/>
+        <w:jc w:val="both"/>
+        <w:rPr>
+          <w:rFonts w:ascii="Arial" w:hAnsi="Arial" w:cs="Arial"/>
+          <w:color w:val="111111"/>
+        </w:rPr>
+      </w:pPr>
+      <w:r>
+        <w:rPr>
+          <w:rFonts w:ascii="Arial" w:hAnsi="Arial" w:cs="Arial"/>
+          <w:color w:val="111111"/>
         </w:rPr>
         <w:t>Oportunidades</w:t>
       </w:r>
     </w:p>
     <w:p>
       <w:pPr>
-        <w:spacing w:before="40" w:after="40" w:line="240" w:lineRule="auto"/>
-        <w:ind w:left="360"/>
-        <w:jc w:val="both"/>
-        <w:rPr>
-          <w:rFonts w:ascii="Arial" w:hAnsi="Arial" w:cs="Arial"/>
-          <w:color w:val="111111"/>
-        </w:rPr>
-      </w:pPr>
-      <w:r>
-        <w:rPr>
-          <w:rFonts w:ascii="Arial" w:hAnsi="Arial" w:cs="Arial"/>
-          <w:color w:val="111111"/>
-        </w:rPr>
-        <w:t>•    **Gestión Política Favorable:** Voluntad e interés de las autoridades actuales por optimizar, modernizar y jerarquizar las funciones del Departamento.</w:t>
-      </w:r>
-    </w:p>
-    <w:p>
-      <w:pPr>
-        <w:spacing w:before="40" w:after="40" w:line="240" w:lineRule="auto"/>
-        <w:ind w:left="360"/>
-        <w:jc w:val="both"/>
-        <w:rPr>
-          <w:rFonts w:ascii="Arial" w:hAnsi="Arial" w:cs="Arial"/>
-          <w:color w:val="111111"/>
-        </w:rPr>
-      </w:pPr>
-      <w:r>
-        <w:rPr>
-          <w:rFonts w:ascii="Arial" w:hAnsi="Arial" w:cs="Arial"/>
-          <w:color w:val="111111"/>
-        </w:rPr>
-        <w:t>•    **Adopción de Inteligencia Artificial para Agilizar la Producción:** Oportunidad de incorporar herramientas asistidas por IA (asistentes en los IDEs) para acelerar la codificación, automatizar tareas repetitivas de documentación y aumentar la productividad general del departamento.</w:t>
-      </w:r>
-    </w:p>
-    <w:p>
-      <w:pPr>
-        <w:spacing w:before="40" w:after="40" w:line="240" w:lineRule="auto"/>
-        <w:ind w:left="360"/>
-        <w:jc w:val="both"/>
-        <w:rPr>
-          <w:rFonts w:ascii="Arial" w:hAnsi="Arial" w:cs="Arial"/>
-          <w:color w:val="111111"/>
-        </w:rPr>
-      </w:pPr>
-      <w:r>
-        <w:rPr>
-          <w:rFonts w:ascii="Arial" w:hAnsi="Arial" w:cs="Arial"/>
-          <w:color w:val="111111"/>
-        </w:rPr>
-        <w:t>•    **Oferta de Capacitaciones Accesibles:** Gran disponibilidad de ofertas de capacitación técnica (nuevas tecnologías, metodologías ágiles e IDEs con IA) que pueden ser aprovechadas para calificar al personal del área.</w:t>
-      </w:r>
-    </w:p>
-    <w:p>
-      <w:pPr>
-        <w:spacing w:before="40" w:after="40" w:line="240" w:lineRule="auto"/>
-        <w:ind w:left="360"/>
-        <w:jc w:val="both"/>
-        <w:rPr>
-          <w:rFonts w:ascii="Arial" w:hAnsi="Arial" w:cs="Arial"/>
-          <w:color w:val="111111"/>
-        </w:rPr>
-      </w:pPr>
-      <w:r>
-        <w:rPr>
-          <w:rFonts w:ascii="Arial" w:hAnsi="Arial" w:cs="Arial"/>
-          <w:color w:val="111111"/>
-        </w:rPr>
-        <w:t>•    **Adopción de Marcos Ágiles Híbridos:** Implementación de metodologías ágiles adaptadas a la realidad municipal a costo cero para mejorar y agilizar los procesos de desarrollo.</w:t>
-      </w:r>
-    </w:p>
-    <w:p>
-      <w:pPr>
-        <w:spacing w:before="40" w:after="40" w:line="240" w:lineRule="auto"/>
-        <w:ind w:left="360"/>
-        <w:jc w:val="both"/>
-        <w:rPr>
-          <w:rFonts w:ascii="Arial" w:hAnsi="Arial" w:cs="Arial"/>
-          <w:color w:val="111111"/>
-        </w:rPr>
-      </w:pPr>
-      <w:r>
-        <w:rPr>
-          <w:rFonts w:ascii="Arial" w:hAnsi="Arial" w:cs="Arial"/>
-          <w:color w:val="111111"/>
-        </w:rPr>
-        <w:t>•    **Estandarización mediante una Arquitectura Base:** Oportunidad de definir e instituir una arquitectura base a modo de *template* como norma obligatoria para unificar las metodologías y mantener una coherencia en las tecnologías utilizadas.</w:t>
-      </w:r>
-    </w:p>
-    <w:p>
-      <w:pPr>
-        <w:spacing w:before="200" w:after="60" w:line="240" w:lineRule="auto"/>
-        <w:rPr>
-          <w:rFonts w:ascii="Arial" w:hAnsi="Arial" w:cs="Arial"/>
-          <w:b/>
-          <w:color w:val="222222"/>
-        </w:rPr>
-      </w:pPr>
-      <w:r>
-        <w:rPr>
-          <w:rFonts w:ascii="Arial" w:hAnsi="Arial" w:cs="Arial"/>
-          <w:b/>
-          <w:color w:val="222222"/>
+        <w:spacing w:before="60" w:after="60" w:line="240" w:lineRule="auto"/>
+        <w:jc w:val="both"/>
+        <w:rPr>
+          <w:rFonts w:ascii="Arial" w:hAnsi="Arial" w:cs="Arial"/>
+          <w:color w:val="111111"/>
+        </w:rPr>
+      </w:pPr>
+      <w:r>
+        <w:rPr>
+          <w:rFonts w:ascii="Arial" w:hAnsi="Arial" w:cs="Arial"/>
+          <w:color w:val="111111"/>
+        </w:rPr>
+        <w:t>Gestión Política favorable:</w:t>
+      </w:r>
+    </w:p>
+    <w:p>
+      <w:pPr>
+        <w:spacing w:before="60" w:after="60" w:line="240" w:lineRule="auto"/>
+        <w:jc w:val="both"/>
+        <w:rPr>
+          <w:rFonts w:ascii="Arial" w:hAnsi="Arial" w:cs="Arial"/>
+          <w:color w:val="111111"/>
+        </w:rPr>
+      </w:pPr>
+      <w:r>
+        <w:rPr>
+          <w:rFonts w:ascii="Arial" w:hAnsi="Arial" w:cs="Arial"/>
+          <w:color w:val="111111"/>
+        </w:rPr>
+        <w:t>La gestión actual tiene intención de optimizar y modernizar las funciones del Departamento.</w:t>
+      </w:r>
+    </w:p>
+    <w:p>
+      <w:pPr>
+        <w:spacing w:before="60" w:after="60" w:line="240" w:lineRule="auto"/>
+        <w:jc w:val="both"/>
+        <w:rPr>
+          <w:rFonts w:ascii="Arial" w:hAnsi="Arial" w:cs="Arial"/>
+          <w:color w:val="111111"/>
+        </w:rPr>
+      </w:pPr>
+      <w:r>
+        <w:rPr>
+          <w:rFonts w:ascii="Arial" w:hAnsi="Arial" w:cs="Arial"/>
+          <w:color w:val="111111"/>
+        </w:rPr>
+        <w:t>Adopción de Inteligencia Artificial para Agilizar la Producción:</w:t>
+      </w:r>
+    </w:p>
+    <w:p>
+      <w:pPr>
+        <w:spacing w:before="60" w:after="60" w:line="240" w:lineRule="auto"/>
+        <w:jc w:val="both"/>
+        <w:rPr>
+          <w:rFonts w:ascii="Arial" w:hAnsi="Arial" w:cs="Arial"/>
+          <w:color w:val="111111"/>
+        </w:rPr>
+      </w:pPr>
+      <w:r>
+        <w:rPr>
+          <w:rFonts w:ascii="Arial" w:hAnsi="Arial" w:cs="Arial"/>
+          <w:color w:val="111111"/>
+        </w:rPr>
+        <w:t>Oportunidad de incorporar herramientas asistidas por IA (asistentes en los IDEs) para acelerar la codificación, automatizar tareas repetitivas de documentación y aumentar la productividad general del departamento.</w:t>
+      </w:r>
+    </w:p>
+    <w:p>
+      <w:pPr>
+        <w:spacing w:before="60" w:after="60" w:line="240" w:lineRule="auto"/>
+        <w:jc w:val="both"/>
+        <w:rPr>
+          <w:rFonts w:ascii="Arial" w:hAnsi="Arial" w:cs="Arial"/>
+          <w:color w:val="111111"/>
+        </w:rPr>
+      </w:pPr>
+      <w:r>
+        <w:rPr>
+          <w:rFonts w:ascii="Arial" w:hAnsi="Arial" w:cs="Arial"/>
+          <w:color w:val="111111"/>
+        </w:rPr>
+        <w:t>Capacitaciones disponibles y accesibles:</w:t>
+      </w:r>
+    </w:p>
+    <w:p>
+      <w:pPr>
+        <w:spacing w:before="60" w:after="60" w:line="240" w:lineRule="auto"/>
+        <w:jc w:val="both"/>
+        <w:rPr>
+          <w:rFonts w:ascii="Arial" w:hAnsi="Arial" w:cs="Arial"/>
+          <w:color w:val="111111"/>
+        </w:rPr>
+      </w:pPr>
+      <w:r>
+        <w:rPr>
+          <w:rFonts w:ascii="Arial" w:hAnsi="Arial" w:cs="Arial"/>
+          <w:color w:val="111111"/>
+        </w:rPr>
+        <w:t>Hay una gran cantidad de ofertas de capacitaciones técnicas tanto de nuevas tecnologías, metodologías ágiles e IDEs de inteligencia artificial que pueden ser aprovechadas para mejorar las tareas del área.</w:t>
+      </w:r>
+    </w:p>
+    <w:p>
+      <w:pPr>
+        <w:spacing w:before="60" w:after="60" w:line="240" w:lineRule="auto"/>
+        <w:jc w:val="both"/>
+        <w:rPr>
+          <w:rFonts w:ascii="Arial" w:hAnsi="Arial" w:cs="Arial"/>
+          <w:color w:val="111111"/>
+        </w:rPr>
+      </w:pPr>
+      <w:r>
+        <w:rPr>
+          <w:rFonts w:ascii="Arial" w:hAnsi="Arial" w:cs="Arial"/>
+          <w:color w:val="111111"/>
+        </w:rPr>
+        <w:t>Adopción de Marcos Ágiles Híbridos:</w:t>
+      </w:r>
+    </w:p>
+    <w:p>
+      <w:pPr>
+        <w:spacing w:before="60" w:after="60" w:line="240" w:lineRule="auto"/>
+        <w:jc w:val="both"/>
+        <w:rPr>
+          <w:rFonts w:ascii="Arial" w:hAnsi="Arial" w:cs="Arial"/>
+          <w:color w:val="111111"/>
+        </w:rPr>
+      </w:pPr>
+      <w:r>
+        <w:rPr>
+          <w:rFonts w:ascii="Arial" w:hAnsi="Arial" w:cs="Arial"/>
+          <w:color w:val="111111"/>
+        </w:rPr>
+        <w:t>Implementación de metodologías ágiles adaptadas a la realidad municipal a costo cero para mejorar y agilizar los procesos de desarrollo.</w:t>
+      </w:r>
+    </w:p>
+    <w:p>
+      <w:pPr>
+        <w:spacing w:before="60" w:after="60" w:line="240" w:lineRule="auto"/>
+        <w:jc w:val="both"/>
+        <w:rPr>
+          <w:rFonts w:ascii="Arial" w:hAnsi="Arial" w:cs="Arial"/>
+          <w:color w:val="111111"/>
+        </w:rPr>
+      </w:pPr>
+      <w:r>
+        <w:rPr>
+          <w:rFonts w:ascii="Arial" w:hAnsi="Arial" w:cs="Arial"/>
+          <w:color w:val="111111"/>
+        </w:rPr>
+        <w:t>Estandarización mediante una Arquitectura Base:</w:t>
+      </w:r>
+    </w:p>
+    <w:p>
+      <w:pPr>
+        <w:spacing w:before="60" w:after="60" w:line="240" w:lineRule="auto"/>
+        <w:jc w:val="both"/>
+        <w:rPr>
+          <w:rFonts w:ascii="Arial" w:hAnsi="Arial" w:cs="Arial"/>
+          <w:color w:val="111111"/>
+        </w:rPr>
+      </w:pPr>
+      <w:r>
+        <w:rPr>
+          <w:rFonts w:ascii="Arial" w:hAnsi="Arial" w:cs="Arial"/>
+          <w:color w:val="111111"/>
+        </w:rPr>
+        <w:t>Oportunidad de definir e instituir una arquitectura base a modo de template como norma obligatoria para unificar las metodologías y mantener una coherencia en las tecnologías utilizadas.</w:t>
+      </w:r>
+    </w:p>
+    <w:p>
+      <w:pPr>
+        <w:spacing w:before="60" w:after="60" w:line="240" w:lineRule="auto"/>
+        <w:jc w:val="both"/>
+        <w:rPr>
+          <w:rFonts w:ascii="Arial" w:hAnsi="Arial" w:cs="Arial"/>
+          <w:color w:val="111111"/>
+        </w:rPr>
+      </w:pPr>
+      <w:r>
+        <w:rPr>
+          <w:rFonts w:ascii="Arial" w:hAnsi="Arial" w:cs="Arial"/>
+          <w:color w:val="111111"/>
         </w:rPr>
         <w:t>Amenazas</w:t>
       </w:r>
     </w:p>
     <w:p>
       <w:pPr>
-        <w:spacing w:before="40" w:after="40" w:line="240" w:lineRule="auto"/>
-        <w:ind w:left="360"/>
-        <w:jc w:val="both"/>
-        <w:rPr>
-          <w:rFonts w:ascii="Arial" w:hAnsi="Arial" w:cs="Arial"/>
-          <w:color w:val="111111"/>
-        </w:rPr>
-      </w:pPr>
-      <w:r>
-        <w:rPr>
-          <w:rFonts w:ascii="Arial" w:hAnsi="Arial" w:cs="Arial"/>
-          <w:color w:val="111111"/>
-        </w:rPr>
-        <w:t>•    **Demandas Institucionales Cambiantes e Imprevistas:** Variación rápida en las prioridades de las distintas Secretarías que exigen respuestas inmediatas y desordenan la planificación del área.</w:t>
-      </w:r>
-    </w:p>
-    <w:p>
-      <w:pPr>
-        <w:spacing w:before="40" w:after="40" w:line="240" w:lineRule="auto"/>
-        <w:ind w:left="360"/>
-        <w:jc w:val="both"/>
-        <w:rPr>
-          <w:rFonts w:ascii="Arial" w:hAnsi="Arial" w:cs="Arial"/>
-          <w:color w:val="111111"/>
-        </w:rPr>
-      </w:pPr>
-      <w:r>
-        <w:rPr>
-          <w:rFonts w:ascii="Arial" w:hAnsi="Arial" w:cs="Arial"/>
-          <w:color w:val="111111"/>
-        </w:rPr>
-        <w:t>•    **Dificultad de Integración Técnica con Sistemas y Bases Legacy:** Complejidad para consumir o integrar datos de aplicaciones antiguas que carecen de APIs o servicios web unificados, generando duplicación de funciones al no contar con interfaces modernas de integración.</w:t>
-      </w:r>
-    </w:p>
-    <w:p>
-      <w:pPr>
-        <w:spacing w:before="40" w:after="40" w:line="240" w:lineRule="auto"/>
-        <w:ind w:left="360"/>
-        <w:jc w:val="both"/>
-        <w:rPr>
-          <w:rFonts w:ascii="Arial" w:hAnsi="Arial" w:cs="Arial"/>
-          <w:color w:val="111111"/>
-        </w:rPr>
-      </w:pPr>
-      <w:r>
-        <w:rPr>
-          <w:rFonts w:ascii="Arial" w:hAnsi="Arial" w:cs="Arial"/>
-          <w:color w:val="111111"/>
-        </w:rPr>
-        <w:t>•    **Riesgos de Ciberseguridad y Fuga de Información:** Vulnerabilidades en código antiguo no actualizado o uso de herramientas externas que pongan en riesgo la información municipal.</w:t>
+        <w:spacing w:before="60" w:after="60" w:line="240" w:lineRule="auto"/>
+        <w:jc w:val="both"/>
+        <w:rPr>
+          <w:rFonts w:ascii="Arial" w:hAnsi="Arial" w:cs="Arial"/>
+          <w:color w:val="111111"/>
+        </w:rPr>
+      </w:pPr>
+      <w:r>
+        <w:rPr>
+          <w:rFonts w:ascii="Arial" w:hAnsi="Arial" w:cs="Arial"/>
+          <w:color w:val="111111"/>
+        </w:rPr>
+        <w:t>Demandas Institucionales Cambiantes e Imprevistas:</w:t>
+      </w:r>
+    </w:p>
+    <w:p>
+      <w:pPr>
+        <w:spacing w:before="60" w:after="60" w:line="240" w:lineRule="auto"/>
+        <w:jc w:val="both"/>
+        <w:rPr>
+          <w:rFonts w:ascii="Arial" w:hAnsi="Arial" w:cs="Arial"/>
+          <w:color w:val="111111"/>
+        </w:rPr>
+      </w:pPr>
+      <w:r>
+        <w:rPr>
+          <w:rFonts w:ascii="Arial" w:hAnsi="Arial" w:cs="Arial"/>
+          <w:color w:val="111111"/>
+        </w:rPr>
+        <w:t>Variación rápida en las prioridades de las distintas Secretarías que exigen respuestas inmediatas y desordenan la planificación del área.</w:t>
+      </w:r>
+    </w:p>
+    <w:p>
+      <w:pPr>
+        <w:spacing w:before="60" w:after="60" w:line="240" w:lineRule="auto"/>
+        <w:jc w:val="both"/>
+        <w:rPr>
+          <w:rFonts w:ascii="Arial" w:hAnsi="Arial" w:cs="Arial"/>
+          <w:color w:val="111111"/>
+        </w:rPr>
+      </w:pPr>
+      <w:r>
+        <w:rPr>
+          <w:rFonts w:ascii="Arial" w:hAnsi="Arial" w:cs="Arial"/>
+          <w:color w:val="111111"/>
+        </w:rPr>
+        <w:t>Dificultad de Integración Técnica con Sistemas y Bases Legacy:</w:t>
+      </w:r>
+    </w:p>
+    <w:p>
+      <w:pPr>
+        <w:spacing w:before="60" w:after="60" w:line="240" w:lineRule="auto"/>
+        <w:jc w:val="both"/>
+        <w:rPr>
+          <w:rFonts w:ascii="Arial" w:hAnsi="Arial" w:cs="Arial"/>
+          <w:color w:val="111111"/>
+        </w:rPr>
+      </w:pPr>
+      <w:r>
+        <w:rPr>
+          <w:rFonts w:ascii="Arial" w:hAnsi="Arial" w:cs="Arial"/>
+          <w:color w:val="111111"/>
+        </w:rPr>
+        <w:t>Complejidad para consumir o integrar datos de aplicaciones antiguas que carecen de APIs o servicios web unificados, generando duplicación de funciones al no contar con interfaces modernas de integración.</w:t>
+      </w:r>
+    </w:p>
+    <w:p>
+      <w:pPr>
+        <w:spacing w:before="60" w:after="60" w:line="240" w:lineRule="auto"/>
+        <w:jc w:val="both"/>
+        <w:rPr>
+          <w:rFonts w:ascii="Arial" w:hAnsi="Arial" w:cs="Arial"/>
+          <w:color w:val="111111"/>
+        </w:rPr>
+      </w:pPr>
+      <w:r>
+        <w:rPr>
+          <w:rFonts w:ascii="Arial" w:hAnsi="Arial" w:cs="Arial"/>
+          <w:color w:val="111111"/>
+        </w:rPr>
+        <w:t>Riesgos de Ciberseguridad y Fuga de Información:</w:t>
+      </w:r>
+    </w:p>
+    <w:p>
+      <w:pPr>
+        <w:spacing w:before="60" w:after="60" w:line="240" w:lineRule="auto"/>
+        <w:jc w:val="both"/>
+        <w:rPr>
+          <w:rFonts w:ascii="Arial" w:hAnsi="Arial" w:cs="Arial"/>
+          <w:color w:val="111111"/>
+        </w:rPr>
+      </w:pPr>
+      <w:r>
+        <w:rPr>
+          <w:rFonts w:ascii="Arial" w:hAnsi="Arial" w:cs="Arial"/>
+          <w:color w:val="111111"/>
+        </w:rPr>
+        <w:t>Vulnerabilidades en código antiguo no actualizado o uso de herramientas externas que pongan en riesgo la información municipal.</w:t>
       </w:r>
     </w:p>
     <w:p>
@@ -3870,7 +4154,7 @@
     <w:link w:val="EncabezadoCar"/>
     <w:uiPriority w:val="99"/>
     <w:unhideWhenUsed/>
-    <w:rsid w:val="000839A3"/>
+    <w:rsid w:val="00BA7178"/>
     <w:pPr>
       <w:tabs>
         <w:tab w:val="center" w:pos="4252"/>
@@ -3884,7 +4168,7 @@
     <w:basedOn w:val="Fuentedeprrafopredeter"/>
     <w:link w:val="Encabezado"/>
     <w:uiPriority w:val="99"/>
-    <w:rsid w:val="000839A3"/>
+    <w:rsid w:val="00BA7178"/>
   </w:style>
   <w:style w:type="paragraph" w:styleId="Piedepgina">
     <w:name w:val="footer"/>
@@ -3892,7 +4176,7 @@
     <w:link w:val="PiedepginaCar"/>
     <w:uiPriority w:val="99"/>
     <w:unhideWhenUsed/>
-    <w:rsid w:val="000839A3"/>
+    <w:rsid w:val="00BA7178"/>
     <w:pPr>
       <w:tabs>
         <w:tab w:val="center" w:pos="4252"/>
@@ -3906,7 +4190,7 @@
     <w:basedOn w:val="Fuentedeprrafopredeter"/>
     <w:link w:val="Piedepgina"/>
     <w:uiPriority w:val="99"/>
-    <w:rsid w:val="000839A3"/>
+    <w:rsid w:val="00BA7178"/>
   </w:style>
 </w:styles>
 </file>

</xml_diff>

<commit_message>
style: Restore bullet points to each SWOT item
</commit_message>
<xml_diff>
--- a/Plan_Trabajo_Concurso_Jefatura_Software.docx
+++ b/Plan_Trabajo_Concurso_Jefatura_Software.docx
@@ -750,6 +750,42 @@
     </w:p>
     <w:p>
       <w:pPr>
+        <w:spacing w:before="200" w:after="60" w:line="240" w:lineRule="auto"/>
+        <w:rPr>
+          <w:rFonts w:ascii="Arial" w:hAnsi="Arial" w:cs="Arial"/>
+          <w:b/>
+          <w:color w:val="222222"/>
+        </w:rPr>
+      </w:pPr>
+      <w:r>
+        <w:rPr>
+          <w:rFonts w:ascii="Arial" w:hAnsi="Arial" w:cs="Arial"/>
+          <w:b/>
+          <w:color w:val="222222"/>
+        </w:rPr>
+        <w:t>Fortalezas</w:t>
+      </w:r>
+    </w:p>
+    <w:p>
+      <w:pPr>
+        <w:spacing w:before="40" w:after="40" w:line="240" w:lineRule="auto"/>
+        <w:ind w:left="360"/>
+        <w:jc w:val="both"/>
+        <w:rPr>
+          <w:rFonts w:ascii="Arial" w:hAnsi="Arial" w:cs="Arial"/>
+          <w:color w:val="111111"/>
+        </w:rPr>
+      </w:pPr>
+      <w:r>
+        <w:rPr>
+          <w:rFonts w:ascii="Arial" w:hAnsi="Arial" w:cs="Arial"/>
+          <w:color w:val="111111"/>
+        </w:rPr>
+        <w:t>•  Personal Técnico Capacitado:</w:t>
+      </w:r>
+    </w:p>
+    <w:p>
+      <w:pPr>
         <w:spacing w:before="60" w:after="60" w:line="240" w:lineRule="auto"/>
         <w:jc w:val="both"/>
         <w:rPr>
@@ -762,7 +798,25 @@
           <w:rFonts w:ascii="Arial" w:hAnsi="Arial" w:cs="Arial"/>
           <w:color w:val="111111"/>
         </w:rPr>
-        <w:t>Fortalezas</w:t>
+        <w:t>El Departamento dispone de un plantel técnico capacitado capaz de realizar tareas de relevamiento analítico, desarrollo y pruebas de aplicaciones, con un amplio conocimiento del negocio, las normativas y los circuitos administrativos municipales.</w:t>
+      </w:r>
+    </w:p>
+    <w:p>
+      <w:pPr>
+        <w:spacing w:before="40" w:after="40" w:line="240" w:lineRule="auto"/>
+        <w:ind w:left="360"/>
+        <w:jc w:val="both"/>
+        <w:rPr>
+          <w:rFonts w:ascii="Arial" w:hAnsi="Arial" w:cs="Arial"/>
+          <w:color w:val="111111"/>
+        </w:rPr>
+      </w:pPr>
+      <w:r>
+        <w:rPr>
+          <w:rFonts w:ascii="Arial" w:hAnsi="Arial" w:cs="Arial"/>
+          <w:color w:val="111111"/>
+        </w:rPr>
+        <w:t>•  Disponibilidad de medios:</w:t>
       </w:r>
     </w:p>
     <w:p>
@@ -779,7 +833,43 @@
           <w:rFonts w:ascii="Arial" w:hAnsi="Arial" w:cs="Arial"/>
           <w:color w:val="111111"/>
         </w:rPr>
-        <w:t>Personal Técnico Capacitado:</w:t>
+        <w:t>Se cuenta con el suficiente mobiliario y herramientas técnicas suficientes para llevar a cabo la Misión y Funciones del Departamento.</w:t>
+      </w:r>
+    </w:p>
+    <w:p>
+      <w:pPr>
+        <w:spacing w:before="200" w:after="60" w:line="240" w:lineRule="auto"/>
+        <w:rPr>
+          <w:rFonts w:ascii="Arial" w:hAnsi="Arial" w:cs="Arial"/>
+          <w:b/>
+          <w:color w:val="222222"/>
+        </w:rPr>
+      </w:pPr>
+      <w:r>
+        <w:rPr>
+          <w:rFonts w:ascii="Arial" w:hAnsi="Arial" w:cs="Arial"/>
+          <w:b/>
+          <w:color w:val="222222"/>
+        </w:rPr>
+        <w:t>Debilidades</w:t>
+      </w:r>
+    </w:p>
+    <w:p>
+      <w:pPr>
+        <w:spacing w:before="40" w:after="40" w:line="240" w:lineRule="auto"/>
+        <w:ind w:left="360"/>
+        <w:jc w:val="both"/>
+        <w:rPr>
+          <w:rFonts w:ascii="Arial" w:hAnsi="Arial" w:cs="Arial"/>
+          <w:color w:val="111111"/>
+        </w:rPr>
+      </w:pPr>
+      <w:r>
+        <w:rPr>
+          <w:rFonts w:ascii="Arial" w:hAnsi="Arial" w:cs="Arial"/>
+          <w:color w:val="111111"/>
+        </w:rPr>
+        <w:t>•  Fragmentación Tecnológica:</w:t>
       </w:r>
     </w:p>
     <w:p>
@@ -796,7 +886,25 @@
           <w:rFonts w:ascii="Arial" w:hAnsi="Arial" w:cs="Arial"/>
           <w:color w:val="111111"/>
         </w:rPr>
-        <w:t>El Departamento dispone de un plantel técnico capacitado capaz de realizar tareas de relevamiento analítico, desarrollo y pruebas de aplicaciones, con un amplio conocimiento del negocio, las normativas y los circuitos administrativos municipales.</w:t>
+        <w:t>Coexistencia caótica de tecnologías obsoletas y sin soporte actual (WebForms con SQL 2005) junto a tecnologías modernas (.NET, React, Angular, PHP, PostgreSQL), dificultando el mantenimiento continuo.</w:t>
+      </w:r>
+    </w:p>
+    <w:p>
+      <w:pPr>
+        <w:spacing w:before="40" w:after="40" w:line="240" w:lineRule="auto"/>
+        <w:ind w:left="360"/>
+        <w:jc w:val="both"/>
+        <w:rPr>
+          <w:rFonts w:ascii="Arial" w:hAnsi="Arial" w:cs="Arial"/>
+          <w:color w:val="111111"/>
+        </w:rPr>
+      </w:pPr>
+      <w:r>
+        <w:rPr>
+          <w:rFonts w:ascii="Arial" w:hAnsi="Arial" w:cs="Arial"/>
+          <w:color w:val="111111"/>
+        </w:rPr>
+        <w:t>•  Falta de una Arquitectura Base Estandarizada:</w:t>
       </w:r>
     </w:p>
     <w:p>
@@ -813,7 +921,25 @@
           <w:rFonts w:ascii="Arial" w:hAnsi="Arial" w:cs="Arial"/>
           <w:color w:val="111111"/>
         </w:rPr>
-        <w:t>Disponibilidad de medios:</w:t>
+        <w:t>Ausencia de un template de arquitectura oficial de cumplimiento obligatorio para uniformar las aplicaciones, dificultando la construcción homogénea de sistemas y la rotación de programadores entre proyectos.</w:t>
+      </w:r>
+    </w:p>
+    <w:p>
+      <w:pPr>
+        <w:spacing w:before="40" w:after="40" w:line="240" w:lineRule="auto"/>
+        <w:ind w:left="360"/>
+        <w:jc w:val="both"/>
+        <w:rPr>
+          <w:rFonts w:ascii="Arial" w:hAnsi="Arial" w:cs="Arial"/>
+          <w:color w:val="111111"/>
+        </w:rPr>
+      </w:pPr>
+      <w:r>
+        <w:rPr>
+          <w:rFonts w:ascii="Arial" w:hAnsi="Arial" w:cs="Arial"/>
+          <w:color w:val="111111"/>
+        </w:rPr>
+        <w:t>•  Multitarea Extrema y Conocimiento Concentrado:</w:t>
       </w:r>
     </w:p>
     <w:p>
@@ -830,7 +956,25 @@
           <w:rFonts w:ascii="Arial" w:hAnsi="Arial" w:cs="Arial"/>
           <w:color w:val="111111"/>
         </w:rPr>
-        <w:t>Se cuenta con el suficiente mobiliario y herramientas técnicas suficientes para llevar a cabo la Misión y Funciones del Departamento.</w:t>
+        <w:t>La escasa dotación frente a la alta demanda obliga al personal a atender simultáneamente emergencias de sistemas antiguos de diversas áreas y desarrollos nuevos. Esto genera saltos de contexto constantes y un alto riesgo operativo: la existencia de sistemas críticos que dependen del conocimiento exclusivo de una sola persona.</w:t>
+      </w:r>
+    </w:p>
+    <w:p>
+      <w:pPr>
+        <w:spacing w:before="40" w:after="40" w:line="240" w:lineRule="auto"/>
+        <w:ind w:left="360"/>
+        <w:jc w:val="both"/>
+        <w:rPr>
+          <w:rFonts w:ascii="Arial" w:hAnsi="Arial" w:cs="Arial"/>
+          <w:color w:val="111111"/>
+        </w:rPr>
+      </w:pPr>
+      <w:r>
+        <w:rPr>
+          <w:rFonts w:ascii="Arial" w:hAnsi="Arial" w:cs="Arial"/>
+          <w:color w:val="111111"/>
+        </w:rPr>
+        <w:t>•  Aislamiento Operativo entre Dependencias:</w:t>
       </w:r>
     </w:p>
     <w:p>
@@ -847,7 +991,25 @@
           <w:rFonts w:ascii="Arial" w:hAnsi="Arial" w:cs="Arial"/>
           <w:color w:val="111111"/>
         </w:rPr>
-        <w:t>Debilidades</w:t>
+        <w:t>La distribución física del personal en dos oficinas distintas sin una figura de coordinación transversal genera descoordinación, aislamiento en silos de información y el riesgo de desarrollar funcionalidades duplicadas por falta de comunicación.</w:t>
+      </w:r>
+    </w:p>
+    <w:p>
+      <w:pPr>
+        <w:spacing w:before="40" w:after="40" w:line="240" w:lineRule="auto"/>
+        <w:ind w:left="360"/>
+        <w:jc w:val="both"/>
+        <w:rPr>
+          <w:rFonts w:ascii="Arial" w:hAnsi="Arial" w:cs="Arial"/>
+          <w:color w:val="111111"/>
+        </w:rPr>
+      </w:pPr>
+      <w:r>
+        <w:rPr>
+          <w:rFonts w:ascii="Arial" w:hAnsi="Arial" w:cs="Arial"/>
+          <w:color w:val="111111"/>
+        </w:rPr>
+        <w:t>•  Estimación y Seguimiento Caóticos:</w:t>
       </w:r>
     </w:p>
     <w:p>
@@ -864,7 +1026,25 @@
           <w:rFonts w:ascii="Arial" w:hAnsi="Arial" w:cs="Arial"/>
           <w:color w:val="111111"/>
         </w:rPr>
-        <w:t>Fragmentación Tecnológica:</w:t>
+        <w:t>Uso fragmentado de herramientas para documentar el avance de los proyectos (algunos agentes usan Redmine, otros planillas desactualizadas en Excel o registros informales), impidiendo conocer la capacidad operativa real del departamento.</w:t>
+      </w:r>
+    </w:p>
+    <w:p>
+      <w:pPr>
+        <w:spacing w:before="40" w:after="40" w:line="240" w:lineRule="auto"/>
+        <w:ind w:left="360"/>
+        <w:jc w:val="both"/>
+        <w:rPr>
+          <w:rFonts w:ascii="Arial" w:hAnsi="Arial" w:cs="Arial"/>
+          <w:color w:val="111111"/>
+        </w:rPr>
+      </w:pPr>
+      <w:r>
+        <w:rPr>
+          <w:rFonts w:ascii="Arial" w:hAnsi="Arial" w:cs="Arial"/>
+          <w:color w:val="111111"/>
+        </w:rPr>
+        <w:t>•  Documentación Inexistente o Desigual:</w:t>
       </w:r>
     </w:p>
     <w:p>
@@ -881,7 +1061,25 @@
           <w:rFonts w:ascii="Arial" w:hAnsi="Arial" w:cs="Arial"/>
           <w:color w:val="111111"/>
         </w:rPr>
-        <w:t>Coexistencia caótica de tecnologías obsoletas y sin soporte actual (WebForms con SQL 2005) junto a tecnologías modernas (.NET, React, Angular, PHP, PostgreSQL), dificultando el mantenimiento continuo.</w:t>
+        <w:t>Falta de manuales de relevamiento, técnicos o registros de arquitectura, profundizando la dependencia de programadores específicos.</w:t>
+      </w:r>
+    </w:p>
+    <w:p>
+      <w:pPr>
+        <w:spacing w:before="40" w:after="40" w:line="240" w:lineRule="auto"/>
+        <w:ind w:left="360"/>
+        <w:jc w:val="both"/>
+        <w:rPr>
+          <w:rFonts w:ascii="Arial" w:hAnsi="Arial" w:cs="Arial"/>
+          <w:color w:val="111111"/>
+        </w:rPr>
+      </w:pPr>
+      <w:r>
+        <w:rPr>
+          <w:rFonts w:ascii="Arial" w:hAnsi="Arial" w:cs="Arial"/>
+          <w:color w:val="111111"/>
+        </w:rPr>
+        <w:t>•  Pruebas de Software Reactivas:</w:t>
       </w:r>
     </w:p>
     <w:p>
@@ -898,7 +1096,25 @@
           <w:rFonts w:ascii="Arial" w:hAnsi="Arial" w:cs="Arial"/>
           <w:color w:val="111111"/>
         </w:rPr>
-        <w:t>Falta de una Arquitectura Base Estandarizada:</w:t>
+        <w:t>Al no existir el rol de QA (Quality Assurance) ni herramientas de testeo estandarizadas, la verificación de errores depende de los propios desarrolladores o de los usuarios de los aplicativos.</w:t>
+      </w:r>
+    </w:p>
+    <w:p>
+      <w:pPr>
+        <w:spacing w:before="40" w:after="40" w:line="240" w:lineRule="auto"/>
+        <w:ind w:left="360"/>
+        <w:jc w:val="both"/>
+        <w:rPr>
+          <w:rFonts w:ascii="Arial" w:hAnsi="Arial" w:cs="Arial"/>
+          <w:color w:val="111111"/>
+        </w:rPr>
+      </w:pPr>
+      <w:r>
+        <w:rPr>
+          <w:rFonts w:ascii="Arial" w:hAnsi="Arial" w:cs="Arial"/>
+          <w:color w:val="111111"/>
+        </w:rPr>
+        <w:t>•  Resistencia Interna al Cambio:</w:t>
       </w:r>
     </w:p>
     <w:p>
@@ -915,7 +1131,43 @@
           <w:rFonts w:ascii="Arial" w:hAnsi="Arial" w:cs="Arial"/>
           <w:color w:val="111111"/>
         </w:rPr>
-        <w:t>Ausencia de un template de arquitectura oficial de cumplimiento obligatorio para uniformar las aplicaciones, dificultando la construcción homogénea de sistemas y la rotación de programadores entre proyectos.</w:t>
+        <w:t>Cierta reticencia de algunos agentes a aprender nuevas tecnologías y estándares de desarrollo, insistiendo en utilizar lenguajes o esquemas obsoletos y generando dificultades en la optimización de bases de datos.</w:t>
+      </w:r>
+    </w:p>
+    <w:p>
+      <w:pPr>
+        <w:spacing w:before="200" w:after="60" w:line="240" w:lineRule="auto"/>
+        <w:rPr>
+          <w:rFonts w:ascii="Arial" w:hAnsi="Arial" w:cs="Arial"/>
+          <w:b/>
+          <w:color w:val="222222"/>
+        </w:rPr>
+      </w:pPr>
+      <w:r>
+        <w:rPr>
+          <w:rFonts w:ascii="Arial" w:hAnsi="Arial" w:cs="Arial"/>
+          <w:b/>
+          <w:color w:val="222222"/>
+        </w:rPr>
+        <w:t>Oportunidades</w:t>
+      </w:r>
+    </w:p>
+    <w:p>
+      <w:pPr>
+        <w:spacing w:before="40" w:after="40" w:line="240" w:lineRule="auto"/>
+        <w:ind w:left="360"/>
+        <w:jc w:val="both"/>
+        <w:rPr>
+          <w:rFonts w:ascii="Arial" w:hAnsi="Arial" w:cs="Arial"/>
+          <w:color w:val="111111"/>
+        </w:rPr>
+      </w:pPr>
+      <w:r>
+        <w:rPr>
+          <w:rFonts w:ascii="Arial" w:hAnsi="Arial" w:cs="Arial"/>
+          <w:color w:val="111111"/>
+        </w:rPr>
+        <w:t>•  Gestión Política favorable:</w:t>
       </w:r>
     </w:p>
     <w:p>
@@ -932,7 +1184,25 @@
           <w:rFonts w:ascii="Arial" w:hAnsi="Arial" w:cs="Arial"/>
           <w:color w:val="111111"/>
         </w:rPr>
-        <w:t>Multitarea Extrema y Conocimiento Concentrado:</w:t>
+        <w:t>La gestión actual tiene intención de optimizar y modernizar las funciones del Departamento.</w:t>
+      </w:r>
+    </w:p>
+    <w:p>
+      <w:pPr>
+        <w:spacing w:before="40" w:after="40" w:line="240" w:lineRule="auto"/>
+        <w:ind w:left="360"/>
+        <w:jc w:val="both"/>
+        <w:rPr>
+          <w:rFonts w:ascii="Arial" w:hAnsi="Arial" w:cs="Arial"/>
+          <w:color w:val="111111"/>
+        </w:rPr>
+      </w:pPr>
+      <w:r>
+        <w:rPr>
+          <w:rFonts w:ascii="Arial" w:hAnsi="Arial" w:cs="Arial"/>
+          <w:color w:val="111111"/>
+        </w:rPr>
+        <w:t>•  Adopción de Inteligencia Artificial para Agilizar la Producción:</w:t>
       </w:r>
     </w:p>
     <w:p>
@@ -949,7 +1219,25 @@
           <w:rFonts w:ascii="Arial" w:hAnsi="Arial" w:cs="Arial"/>
           <w:color w:val="111111"/>
         </w:rPr>
-        <w:t>La escasa dotación frente a la alta demanda obliga al personal a atender simultáneamente emergencias de sistemas antiguos de diversas áreas y desarrollos nuevos. Esto genera saltos de contexto constantes y un alto riesgo operativo: la existencia de sistemas críticos que dependen del conocimiento exclusivo de una sola persona.</w:t>
+        <w:t>Oportunidad de incorporar herramientas asistidas por IA (asistentes en los IDEs) para acelerar la codificación, automatizar tareas repetitivas de documentación y aumentar la productividad general del departamento.</w:t>
+      </w:r>
+    </w:p>
+    <w:p>
+      <w:pPr>
+        <w:spacing w:before="40" w:after="40" w:line="240" w:lineRule="auto"/>
+        <w:ind w:left="360"/>
+        <w:jc w:val="both"/>
+        <w:rPr>
+          <w:rFonts w:ascii="Arial" w:hAnsi="Arial" w:cs="Arial"/>
+          <w:color w:val="111111"/>
+        </w:rPr>
+      </w:pPr>
+      <w:r>
+        <w:rPr>
+          <w:rFonts w:ascii="Arial" w:hAnsi="Arial" w:cs="Arial"/>
+          <w:color w:val="111111"/>
+        </w:rPr>
+        <w:t>•  Capacitaciones disponibles y accesibles:</w:t>
       </w:r>
     </w:p>
     <w:p>
@@ -966,7 +1254,25 @@
           <w:rFonts w:ascii="Arial" w:hAnsi="Arial" w:cs="Arial"/>
           <w:color w:val="111111"/>
         </w:rPr>
-        <w:t>Aislamiento Operativo entre Dependencias:</w:t>
+        <w:t>Hay una gran cantidad de ofertas de capacitaciones técnicas tanto de nuevas tecnologías, metodologías ágiles e IDEs de inteligencia artificial que pueden ser aprovechadas para mejorar las tareas del área.</w:t>
+      </w:r>
+    </w:p>
+    <w:p>
+      <w:pPr>
+        <w:spacing w:before="40" w:after="40" w:line="240" w:lineRule="auto"/>
+        <w:ind w:left="360"/>
+        <w:jc w:val="both"/>
+        <w:rPr>
+          <w:rFonts w:ascii="Arial" w:hAnsi="Arial" w:cs="Arial"/>
+          <w:color w:val="111111"/>
+        </w:rPr>
+      </w:pPr>
+      <w:r>
+        <w:rPr>
+          <w:rFonts w:ascii="Arial" w:hAnsi="Arial" w:cs="Arial"/>
+          <w:color w:val="111111"/>
+        </w:rPr>
+        <w:t>•  Adopción de Marcos Ágiles Híbridos:</w:t>
       </w:r>
     </w:p>
     <w:p>
@@ -983,7 +1289,25 @@
           <w:rFonts w:ascii="Arial" w:hAnsi="Arial" w:cs="Arial"/>
           <w:color w:val="111111"/>
         </w:rPr>
-        <w:t>La distribución física del personal en dos oficinas distintas sin una figura de coordinación transversal genera descoordinación, aislamiento en silos de información y el riesgo de desarrollar funcionalidades duplicadas por falta de comunicación.</w:t>
+        <w:t>Implementación de metodologías ágiles adaptadas a la realidad municipal a costo cero para mejorar y agilizar los procesos de desarrollo.</w:t>
+      </w:r>
+    </w:p>
+    <w:p>
+      <w:pPr>
+        <w:spacing w:before="40" w:after="40" w:line="240" w:lineRule="auto"/>
+        <w:ind w:left="360"/>
+        <w:jc w:val="both"/>
+        <w:rPr>
+          <w:rFonts w:ascii="Arial" w:hAnsi="Arial" w:cs="Arial"/>
+          <w:color w:val="111111"/>
+        </w:rPr>
+      </w:pPr>
+      <w:r>
+        <w:rPr>
+          <w:rFonts w:ascii="Arial" w:hAnsi="Arial" w:cs="Arial"/>
+          <w:color w:val="111111"/>
+        </w:rPr>
+        <w:t>•  Estandarización mediante una Arquitectura Base:</w:t>
       </w:r>
     </w:p>
     <w:p>
@@ -1000,7 +1324,43 @@
           <w:rFonts w:ascii="Arial" w:hAnsi="Arial" w:cs="Arial"/>
           <w:color w:val="111111"/>
         </w:rPr>
-        <w:t>Estimación y Seguimiento Caóticos:</w:t>
+        <w:t>Oportunidad de definir e instituir una arquitectura base a modo de template como norma obligatoria para unificar las metodologías y mantener una coherencia en las tecnologías utilizadas.</w:t>
+      </w:r>
+    </w:p>
+    <w:p>
+      <w:pPr>
+        <w:spacing w:before="200" w:after="60" w:line="240" w:lineRule="auto"/>
+        <w:rPr>
+          <w:rFonts w:ascii="Arial" w:hAnsi="Arial" w:cs="Arial"/>
+          <w:b/>
+          <w:color w:val="222222"/>
+        </w:rPr>
+      </w:pPr>
+      <w:r>
+        <w:rPr>
+          <w:rFonts w:ascii="Arial" w:hAnsi="Arial" w:cs="Arial"/>
+          <w:b/>
+          <w:color w:val="222222"/>
+        </w:rPr>
+        <w:t>Amenazas</w:t>
+      </w:r>
+    </w:p>
+    <w:p>
+      <w:pPr>
+        <w:spacing w:before="40" w:after="40" w:line="240" w:lineRule="auto"/>
+        <w:ind w:left="360"/>
+        <w:jc w:val="both"/>
+        <w:rPr>
+          <w:rFonts w:ascii="Arial" w:hAnsi="Arial" w:cs="Arial"/>
+          <w:color w:val="111111"/>
+        </w:rPr>
+      </w:pPr>
+      <w:r>
+        <w:rPr>
+          <w:rFonts w:ascii="Arial" w:hAnsi="Arial" w:cs="Arial"/>
+          <w:color w:val="111111"/>
+        </w:rPr>
+        <w:t>•  Demandas Institucionales Cambiantes e Imprevistas:</w:t>
       </w:r>
     </w:p>
     <w:p>
@@ -1017,7 +1377,25 @@
           <w:rFonts w:ascii="Arial" w:hAnsi="Arial" w:cs="Arial"/>
           <w:color w:val="111111"/>
         </w:rPr>
-        <w:t>Uso fragmentado de herramientas para documentar el avance de los proyectos (algunos agentes usan Redmine, otros planillas desactualizadas en Excel o registros informales), impidiendo conocer la capacidad operativa real del departamento.</w:t>
+        <w:t>Variación rápida en las prioridades de las distintas Secretarías que exigen respuestas inmediatas y desordenan la planificación del área.</w:t>
+      </w:r>
+    </w:p>
+    <w:p>
+      <w:pPr>
+        <w:spacing w:before="40" w:after="40" w:line="240" w:lineRule="auto"/>
+        <w:ind w:left="360"/>
+        <w:jc w:val="both"/>
+        <w:rPr>
+          <w:rFonts w:ascii="Arial" w:hAnsi="Arial" w:cs="Arial"/>
+          <w:color w:val="111111"/>
+        </w:rPr>
+      </w:pPr>
+      <w:r>
+        <w:rPr>
+          <w:rFonts w:ascii="Arial" w:hAnsi="Arial" w:cs="Arial"/>
+          <w:color w:val="111111"/>
+        </w:rPr>
+        <w:t>•  Dificultad de Integración Técnica con Sistemas y Bases Legacy:</w:t>
       </w:r>
     </w:p>
     <w:p>
@@ -1034,381 +1412,25 @@
           <w:rFonts w:ascii="Arial" w:hAnsi="Arial" w:cs="Arial"/>
           <w:color w:val="111111"/>
         </w:rPr>
-        <w:t>Documentación Inexistente o Desigual:</w:t>
-      </w:r>
-    </w:p>
-    <w:p>
-      <w:pPr>
-        <w:spacing w:before="60" w:after="60" w:line="240" w:lineRule="auto"/>
-        <w:jc w:val="both"/>
-        <w:rPr>
-          <w:rFonts w:ascii="Arial" w:hAnsi="Arial" w:cs="Arial"/>
-          <w:color w:val="111111"/>
-        </w:rPr>
-      </w:pPr>
-      <w:r>
-        <w:rPr>
-          <w:rFonts w:ascii="Arial" w:hAnsi="Arial" w:cs="Arial"/>
-          <w:color w:val="111111"/>
-        </w:rPr>
-        <w:t>Falta de manuales de relevamiento, técnicos o registros de arquitectura, profundizando la dependencia de programadores específicos.</w:t>
-      </w:r>
-    </w:p>
-    <w:p>
-      <w:pPr>
-        <w:spacing w:before="60" w:after="60" w:line="240" w:lineRule="auto"/>
-        <w:jc w:val="both"/>
-        <w:rPr>
-          <w:rFonts w:ascii="Arial" w:hAnsi="Arial" w:cs="Arial"/>
-          <w:color w:val="111111"/>
-        </w:rPr>
-      </w:pPr>
-      <w:r>
-        <w:rPr>
-          <w:rFonts w:ascii="Arial" w:hAnsi="Arial" w:cs="Arial"/>
-          <w:color w:val="111111"/>
-        </w:rPr>
-        <w:t>Pruebas de Software Reactivas:</w:t>
-      </w:r>
-    </w:p>
-    <w:p>
-      <w:pPr>
-        <w:spacing w:before="60" w:after="60" w:line="240" w:lineRule="auto"/>
-        <w:jc w:val="both"/>
-        <w:rPr>
-          <w:rFonts w:ascii="Arial" w:hAnsi="Arial" w:cs="Arial"/>
-          <w:color w:val="111111"/>
-        </w:rPr>
-      </w:pPr>
-      <w:r>
-        <w:rPr>
-          <w:rFonts w:ascii="Arial" w:hAnsi="Arial" w:cs="Arial"/>
-          <w:color w:val="111111"/>
-        </w:rPr>
-        <w:t>Al no existir el rol de QA (Quality Assurance) ni herramientas de testeo estandarizadas, la verificación de errores depende de los propios desarrolladores o de los usuarios de los aplicativos.</w:t>
-      </w:r>
-    </w:p>
-    <w:p>
-      <w:pPr>
-        <w:spacing w:before="60" w:after="60" w:line="240" w:lineRule="auto"/>
-        <w:jc w:val="both"/>
-        <w:rPr>
-          <w:rFonts w:ascii="Arial" w:hAnsi="Arial" w:cs="Arial"/>
-          <w:color w:val="111111"/>
-        </w:rPr>
-      </w:pPr>
-      <w:r>
-        <w:rPr>
-          <w:rFonts w:ascii="Arial" w:hAnsi="Arial" w:cs="Arial"/>
-          <w:color w:val="111111"/>
-        </w:rPr>
-        <w:t>Resistencia Interna al Cambio:</w:t>
-      </w:r>
-    </w:p>
-    <w:p>
-      <w:pPr>
-        <w:spacing w:before="60" w:after="60" w:line="240" w:lineRule="auto"/>
-        <w:jc w:val="both"/>
-        <w:rPr>
-          <w:rFonts w:ascii="Arial" w:hAnsi="Arial" w:cs="Arial"/>
-          <w:color w:val="111111"/>
-        </w:rPr>
-      </w:pPr>
-      <w:r>
-        <w:rPr>
-          <w:rFonts w:ascii="Arial" w:hAnsi="Arial" w:cs="Arial"/>
-          <w:color w:val="111111"/>
-        </w:rPr>
-        <w:t>Cierta reticencia de algunos agentes a aprender nuevas tecnologías y estándares de desarrollo, insistiendo en utilizar lenguajes o esquemas obsoletos y generando dificultades en la optimización de bases de datos.</w:t>
-      </w:r>
-    </w:p>
-    <w:p>
-      <w:pPr>
-        <w:spacing w:before="60" w:after="60" w:line="240" w:lineRule="auto"/>
-        <w:jc w:val="both"/>
-        <w:rPr>
-          <w:rFonts w:ascii="Arial" w:hAnsi="Arial" w:cs="Arial"/>
-          <w:color w:val="111111"/>
-        </w:rPr>
-      </w:pPr>
-      <w:r>
-        <w:rPr>
-          <w:rFonts w:ascii="Arial" w:hAnsi="Arial" w:cs="Arial"/>
-          <w:color w:val="111111"/>
-        </w:rPr>
-        <w:t>Oportunidades</w:t>
-      </w:r>
-    </w:p>
-    <w:p>
-      <w:pPr>
-        <w:spacing w:before="60" w:after="60" w:line="240" w:lineRule="auto"/>
-        <w:jc w:val="both"/>
-        <w:rPr>
-          <w:rFonts w:ascii="Arial" w:hAnsi="Arial" w:cs="Arial"/>
-          <w:color w:val="111111"/>
-        </w:rPr>
-      </w:pPr>
-      <w:r>
-        <w:rPr>
-          <w:rFonts w:ascii="Arial" w:hAnsi="Arial" w:cs="Arial"/>
-          <w:color w:val="111111"/>
-        </w:rPr>
-        <w:t>Gestión Política favorable:</w:t>
-      </w:r>
-    </w:p>
-    <w:p>
-      <w:pPr>
-        <w:spacing w:before="60" w:after="60" w:line="240" w:lineRule="auto"/>
-        <w:jc w:val="both"/>
-        <w:rPr>
-          <w:rFonts w:ascii="Arial" w:hAnsi="Arial" w:cs="Arial"/>
-          <w:color w:val="111111"/>
-        </w:rPr>
-      </w:pPr>
-      <w:r>
-        <w:rPr>
-          <w:rFonts w:ascii="Arial" w:hAnsi="Arial" w:cs="Arial"/>
-          <w:color w:val="111111"/>
-        </w:rPr>
-        <w:t>La gestión actual tiene intención de optimizar y modernizar las funciones del Departamento.</w:t>
-      </w:r>
-    </w:p>
-    <w:p>
-      <w:pPr>
-        <w:spacing w:before="60" w:after="60" w:line="240" w:lineRule="auto"/>
-        <w:jc w:val="both"/>
-        <w:rPr>
-          <w:rFonts w:ascii="Arial" w:hAnsi="Arial" w:cs="Arial"/>
-          <w:color w:val="111111"/>
-        </w:rPr>
-      </w:pPr>
-      <w:r>
-        <w:rPr>
-          <w:rFonts w:ascii="Arial" w:hAnsi="Arial" w:cs="Arial"/>
-          <w:color w:val="111111"/>
-        </w:rPr>
-        <w:t>Adopción de Inteligencia Artificial para Agilizar la Producción:</w:t>
-      </w:r>
-    </w:p>
-    <w:p>
-      <w:pPr>
-        <w:spacing w:before="60" w:after="60" w:line="240" w:lineRule="auto"/>
-        <w:jc w:val="both"/>
-        <w:rPr>
-          <w:rFonts w:ascii="Arial" w:hAnsi="Arial" w:cs="Arial"/>
-          <w:color w:val="111111"/>
-        </w:rPr>
-      </w:pPr>
-      <w:r>
-        <w:rPr>
-          <w:rFonts w:ascii="Arial" w:hAnsi="Arial" w:cs="Arial"/>
-          <w:color w:val="111111"/>
-        </w:rPr>
-        <w:t>Oportunidad de incorporar herramientas asistidas por IA (asistentes en los IDEs) para acelerar la codificación, automatizar tareas repetitivas de documentación y aumentar la productividad general del departamento.</w:t>
-      </w:r>
-    </w:p>
-    <w:p>
-      <w:pPr>
-        <w:spacing w:before="60" w:after="60" w:line="240" w:lineRule="auto"/>
-        <w:jc w:val="both"/>
-        <w:rPr>
-          <w:rFonts w:ascii="Arial" w:hAnsi="Arial" w:cs="Arial"/>
-          <w:color w:val="111111"/>
-        </w:rPr>
-      </w:pPr>
-      <w:r>
-        <w:rPr>
-          <w:rFonts w:ascii="Arial" w:hAnsi="Arial" w:cs="Arial"/>
-          <w:color w:val="111111"/>
-        </w:rPr>
-        <w:t>Capacitaciones disponibles y accesibles:</w:t>
-      </w:r>
-    </w:p>
-    <w:p>
-      <w:pPr>
-        <w:spacing w:before="60" w:after="60" w:line="240" w:lineRule="auto"/>
-        <w:jc w:val="both"/>
-        <w:rPr>
-          <w:rFonts w:ascii="Arial" w:hAnsi="Arial" w:cs="Arial"/>
-          <w:color w:val="111111"/>
-        </w:rPr>
-      </w:pPr>
-      <w:r>
-        <w:rPr>
-          <w:rFonts w:ascii="Arial" w:hAnsi="Arial" w:cs="Arial"/>
-          <w:color w:val="111111"/>
-        </w:rPr>
-        <w:t>Hay una gran cantidad de ofertas de capacitaciones técnicas tanto de nuevas tecnologías, metodologías ágiles e IDEs de inteligencia artificial que pueden ser aprovechadas para mejorar las tareas del área.</w:t>
-      </w:r>
-    </w:p>
-    <w:p>
-      <w:pPr>
-        <w:spacing w:before="60" w:after="60" w:line="240" w:lineRule="auto"/>
-        <w:jc w:val="both"/>
-        <w:rPr>
-          <w:rFonts w:ascii="Arial" w:hAnsi="Arial" w:cs="Arial"/>
-          <w:color w:val="111111"/>
-        </w:rPr>
-      </w:pPr>
-      <w:r>
-        <w:rPr>
-          <w:rFonts w:ascii="Arial" w:hAnsi="Arial" w:cs="Arial"/>
-          <w:color w:val="111111"/>
-        </w:rPr>
-        <w:t>Adopción de Marcos Ágiles Híbridos:</w:t>
-      </w:r>
-    </w:p>
-    <w:p>
-      <w:pPr>
-        <w:spacing w:before="60" w:after="60" w:line="240" w:lineRule="auto"/>
-        <w:jc w:val="both"/>
-        <w:rPr>
-          <w:rFonts w:ascii="Arial" w:hAnsi="Arial" w:cs="Arial"/>
-          <w:color w:val="111111"/>
-        </w:rPr>
-      </w:pPr>
-      <w:r>
-        <w:rPr>
-          <w:rFonts w:ascii="Arial" w:hAnsi="Arial" w:cs="Arial"/>
-          <w:color w:val="111111"/>
-        </w:rPr>
-        <w:t>Implementación de metodologías ágiles adaptadas a la realidad municipal a costo cero para mejorar y agilizar los procesos de desarrollo.</w:t>
-      </w:r>
-    </w:p>
-    <w:p>
-      <w:pPr>
-        <w:spacing w:before="60" w:after="60" w:line="240" w:lineRule="auto"/>
-        <w:jc w:val="both"/>
-        <w:rPr>
-          <w:rFonts w:ascii="Arial" w:hAnsi="Arial" w:cs="Arial"/>
-          <w:color w:val="111111"/>
-        </w:rPr>
-      </w:pPr>
-      <w:r>
-        <w:rPr>
-          <w:rFonts w:ascii="Arial" w:hAnsi="Arial" w:cs="Arial"/>
-          <w:color w:val="111111"/>
-        </w:rPr>
-        <w:t>Estandarización mediante una Arquitectura Base:</w:t>
-      </w:r>
-    </w:p>
-    <w:p>
-      <w:pPr>
-        <w:spacing w:before="60" w:after="60" w:line="240" w:lineRule="auto"/>
-        <w:jc w:val="both"/>
-        <w:rPr>
-          <w:rFonts w:ascii="Arial" w:hAnsi="Arial" w:cs="Arial"/>
-          <w:color w:val="111111"/>
-        </w:rPr>
-      </w:pPr>
-      <w:r>
-        <w:rPr>
-          <w:rFonts w:ascii="Arial" w:hAnsi="Arial" w:cs="Arial"/>
-          <w:color w:val="111111"/>
-        </w:rPr>
-        <w:t>Oportunidad de definir e instituir una arquitectura base a modo de template como norma obligatoria para unificar las metodologías y mantener una coherencia en las tecnologías utilizadas.</w:t>
-      </w:r>
-    </w:p>
-    <w:p>
-      <w:pPr>
-        <w:spacing w:before="60" w:after="60" w:line="240" w:lineRule="auto"/>
-        <w:jc w:val="both"/>
-        <w:rPr>
-          <w:rFonts w:ascii="Arial" w:hAnsi="Arial" w:cs="Arial"/>
-          <w:color w:val="111111"/>
-        </w:rPr>
-      </w:pPr>
-      <w:r>
-        <w:rPr>
-          <w:rFonts w:ascii="Arial" w:hAnsi="Arial" w:cs="Arial"/>
-          <w:color w:val="111111"/>
-        </w:rPr>
-        <w:t>Amenazas</w:t>
-      </w:r>
-    </w:p>
-    <w:p>
-      <w:pPr>
-        <w:spacing w:before="60" w:after="60" w:line="240" w:lineRule="auto"/>
-        <w:jc w:val="both"/>
-        <w:rPr>
-          <w:rFonts w:ascii="Arial" w:hAnsi="Arial" w:cs="Arial"/>
-          <w:color w:val="111111"/>
-        </w:rPr>
-      </w:pPr>
-      <w:r>
-        <w:rPr>
-          <w:rFonts w:ascii="Arial" w:hAnsi="Arial" w:cs="Arial"/>
-          <w:color w:val="111111"/>
-        </w:rPr>
-        <w:t>Demandas Institucionales Cambiantes e Imprevistas:</w:t>
-      </w:r>
-    </w:p>
-    <w:p>
-      <w:pPr>
-        <w:spacing w:before="60" w:after="60" w:line="240" w:lineRule="auto"/>
-        <w:jc w:val="both"/>
-        <w:rPr>
-          <w:rFonts w:ascii="Arial" w:hAnsi="Arial" w:cs="Arial"/>
-          <w:color w:val="111111"/>
-        </w:rPr>
-      </w:pPr>
-      <w:r>
-        <w:rPr>
-          <w:rFonts w:ascii="Arial" w:hAnsi="Arial" w:cs="Arial"/>
-          <w:color w:val="111111"/>
-        </w:rPr>
-        <w:t>Variación rápida en las prioridades de las distintas Secretarías que exigen respuestas inmediatas y desordenan la planificación del área.</w:t>
-      </w:r>
-    </w:p>
-    <w:p>
-      <w:pPr>
-        <w:spacing w:before="60" w:after="60" w:line="240" w:lineRule="auto"/>
-        <w:jc w:val="both"/>
-        <w:rPr>
-          <w:rFonts w:ascii="Arial" w:hAnsi="Arial" w:cs="Arial"/>
-          <w:color w:val="111111"/>
-        </w:rPr>
-      </w:pPr>
-      <w:r>
-        <w:rPr>
-          <w:rFonts w:ascii="Arial" w:hAnsi="Arial" w:cs="Arial"/>
-          <w:color w:val="111111"/>
-        </w:rPr>
-        <w:t>Dificultad de Integración Técnica con Sistemas y Bases Legacy:</w:t>
-      </w:r>
-    </w:p>
-    <w:p>
-      <w:pPr>
-        <w:spacing w:before="60" w:after="60" w:line="240" w:lineRule="auto"/>
-        <w:jc w:val="both"/>
-        <w:rPr>
-          <w:rFonts w:ascii="Arial" w:hAnsi="Arial" w:cs="Arial"/>
-          <w:color w:val="111111"/>
-        </w:rPr>
-      </w:pPr>
-      <w:r>
-        <w:rPr>
-          <w:rFonts w:ascii="Arial" w:hAnsi="Arial" w:cs="Arial"/>
-          <w:color w:val="111111"/>
-        </w:rPr>
         <w:t>Complejidad para consumir o integrar datos de aplicaciones antiguas que carecen de APIs o servicios web unificados, generando duplicación de funciones al no contar con interfaces modernas de integración.</w:t>
       </w:r>
     </w:p>
     <w:p>
       <w:pPr>
-        <w:spacing w:before="60" w:after="60" w:line="240" w:lineRule="auto"/>
-        <w:jc w:val="both"/>
-        <w:rPr>
-          <w:rFonts w:ascii="Arial" w:hAnsi="Arial" w:cs="Arial"/>
-          <w:color w:val="111111"/>
-        </w:rPr>
-      </w:pPr>
-      <w:r>
-        <w:rPr>
-          <w:rFonts w:ascii="Arial" w:hAnsi="Arial" w:cs="Arial"/>
-          <w:color w:val="111111"/>
-        </w:rPr>
-        <w:t>Riesgos de Ciberseguridad y Fuga de Información:</w:t>
+        <w:spacing w:before="40" w:after="40" w:line="240" w:lineRule="auto"/>
+        <w:ind w:left="360"/>
+        <w:jc w:val="both"/>
+        <w:rPr>
+          <w:rFonts w:ascii="Arial" w:hAnsi="Arial" w:cs="Arial"/>
+          <w:color w:val="111111"/>
+        </w:rPr>
+      </w:pPr>
+      <w:r>
+        <w:rPr>
+          <w:rFonts w:ascii="Arial" w:hAnsi="Arial" w:cs="Arial"/>
+          <w:color w:val="111111"/>
+        </w:rPr>
+        <w:t>•  Riesgos de Ciberseguridad y Fuga de Información:</w:t>
       </w:r>
     </w:p>
     <w:p>
@@ -4154,7 +4176,7 @@
     <w:link w:val="EncabezadoCar"/>
     <w:uiPriority w:val="99"/>
     <w:unhideWhenUsed/>
-    <w:rsid w:val="00BA7178"/>
+    <w:rsid w:val="00CA5F3B"/>
     <w:pPr>
       <w:tabs>
         <w:tab w:val="center" w:pos="4252"/>
@@ -4168,7 +4190,7 @@
     <w:basedOn w:val="Fuentedeprrafopredeter"/>
     <w:link w:val="Encabezado"/>
     <w:uiPriority w:val="99"/>
-    <w:rsid w:val="00BA7178"/>
+    <w:rsid w:val="00CA5F3B"/>
   </w:style>
   <w:style w:type="paragraph" w:styleId="Piedepgina">
     <w:name w:val="footer"/>
@@ -4176,7 +4198,7 @@
     <w:link w:val="PiedepginaCar"/>
     <w:uiPriority w:val="99"/>
     <w:unhideWhenUsed/>
-    <w:rsid w:val="00BA7178"/>
+    <w:rsid w:val="00CA5F3B"/>
     <w:pPr>
       <w:tabs>
         <w:tab w:val="center" w:pos="4252"/>
@@ -4190,7 +4212,7 @@
     <w:basedOn w:val="Fuentedeprrafopredeter"/>
     <w:link w:val="Piedepgina"/>
     <w:uiPriority w:val="99"/>
-    <w:rsid w:val="00BA7178"/>
+    <w:rsid w:val="00CA5F3B"/>
   </w:style>
 </w:styles>
 </file>

</xml_diff>

<commit_message>
fix: Strictly keep user original text in SWOT with only requested corrections
</commit_message>
<xml_diff>
--- a/Plan_Trabajo_Concurso_Jefatura_Software.docx
+++ b/Plan_Trabajo_Concurso_Jefatura_Software.docx
@@ -798,7 +798,7 @@
           <w:rFonts w:ascii="Arial" w:hAnsi="Arial" w:cs="Arial"/>
           <w:color w:val="111111"/>
         </w:rPr>
-        <w:t>El Departamento dispone de un plantel técnico capacitado capaz de realizar tareas de relevamiento analítico, desarrollo y pruebas de aplicaciones, con un amplio conocimiento del negocio, las normativas y los circuitos administrativos municipales.</w:t>
+        <w:t>El Departamento dispone de un plantel técnico capacitado que pueden realizar tareas de relevamiento analítico, desarrollo y testing de aplicaciones además de conocer las normativas, circuitos administrativos, trámites y reglas operativas de la administración pública local.</w:t>
       </w:r>
     </w:p>
     <w:p>
@@ -833,7 +833,7 @@
           <w:rFonts w:ascii="Arial" w:hAnsi="Arial" w:cs="Arial"/>
           <w:color w:val="111111"/>
         </w:rPr>
-        <w:t>Se cuenta con el suficiente mobiliario y herramientas técnicas suficientes para llevar a cabo la Misión y Funciones del Departamento.</w:t>
+        <w:t>Se cuenta con el suficiente mobiliario y herramientas técnicas para llevar a cabo la Misión y Funciones del Departamento.</w:t>
       </w:r>
     </w:p>
     <w:p>
@@ -886,7 +886,7 @@
           <w:rFonts w:ascii="Arial" w:hAnsi="Arial" w:cs="Arial"/>
           <w:color w:val="111111"/>
         </w:rPr>
-        <w:t>Coexistencia caótica de tecnologías obsoletas y sin soporte actual (WebForms con SQL 2005) junto a tecnologías modernas (.NET, React, Angular, PHP, PostgreSQL), dificultando el mantenimiento continuo.</w:t>
+        <w:t>Coexistencia caótica de tecnologías obsoletas y sin soporte actual (WebForms con SQL 2005) junto a tecnologías modernas (.NET, React, Angular, PHP, PostgreSQL).</w:t>
       </w:r>
     </w:p>
     <w:p>
@@ -921,7 +921,7 @@
           <w:rFonts w:ascii="Arial" w:hAnsi="Arial" w:cs="Arial"/>
           <w:color w:val="111111"/>
         </w:rPr>
-        <w:t>Ausencia de un template de arquitectura oficial de cumplimiento obligatorio para uniformar las aplicaciones, dificultando la construcción homogénea de sistemas y la rotación de programadores entre proyectos.</w:t>
+        <w:t>Ausencia de una arquitectura base de cumplimiento obligatorio a modo de "template" para uniformar las aplicaciones y de esta forma facilitar el desarrollo de los sistemas y la rotación de programadores entre distintos sistemas.</w:t>
       </w:r>
     </w:p>
     <w:p>
@@ -956,7 +956,7 @@
           <w:rFonts w:ascii="Arial" w:hAnsi="Arial" w:cs="Arial"/>
           <w:color w:val="111111"/>
         </w:rPr>
-        <w:t>La escasa dotación frente a la alta demanda obliga al personal a atender simultáneamente emergencias de sistemas antiguos de diversas áreas y desarrollos nuevos. Esto genera saltos de contexto constantes y un alto riesgo operativo: la existencia de sistemas críticos que dependen del conocimiento exclusivo de una sola persona.</w:t>
+        <w:t>La escasa dotación frente a la alta demanda obliga al personal a atender simultáneamente emergencias de sistemas antiguos de diversas áreas y desarrollos nuevos. Esto genera saltos de contextos constantes y un alto riesgo operativo: la existencia de sistemas críticos que dependen del conocimiento exclusivo de una sola persona.</w:t>
       </w:r>
     </w:p>
     <w:p>
@@ -991,7 +991,7 @@
           <w:rFonts w:ascii="Arial" w:hAnsi="Arial" w:cs="Arial"/>
           <w:color w:val="111111"/>
         </w:rPr>
-        <w:t>La distribución física del personal en dos oficinas distintas sin una figura de coordinación transversal genera descoordinación, aislamiento en silos de información y el riesgo de desarrollar funcionalidades duplicadas por falta de comunicación.</w:t>
+        <w:t>La distribución física del personal en dos oficinas distintas y sin un agente que coordine ambas, genera descoordinación, aislamiento en silos de información y el riesgo de desarrollar funcionalidades duplicadas por falta de comunicación.</w:t>
       </w:r>
     </w:p>
     <w:p>
@@ -1114,7 +1114,7 @@
           <w:rFonts w:ascii="Arial" w:hAnsi="Arial" w:cs="Arial"/>
           <w:color w:val="111111"/>
         </w:rPr>
-        <w:t>•  Resistencia Interna al Cambio:</w:t>
+        <w:t>•  Resistencia al cambio:</w:t>
       </w:r>
     </w:p>
     <w:p>
@@ -1131,7 +1131,7 @@
           <w:rFonts w:ascii="Arial" w:hAnsi="Arial" w:cs="Arial"/>
           <w:color w:val="111111"/>
         </w:rPr>
-        <w:t>Cierta reticencia de algunos agentes a aprender nuevas tecnologías y estándares de desarrollo, insistiendo en utilizar lenguajes o esquemas obsoletos y generando dificultades en la optimización de bases de datos.</w:t>
+        <w:t>Algunos agentes se rehúsan a aprender nuevas tecnologías y mejorar las formas de desarrollo, insistiendo en utilizar lenguajes o arquitecturas obsoletas, generando conflictos en la optimización de las bases de datos.</w:t>
       </w:r>
     </w:p>
     <w:p>
@@ -1167,6 +1167,111 @@
           <w:rFonts w:ascii="Arial" w:hAnsi="Arial" w:cs="Arial"/>
           <w:color w:val="111111"/>
         </w:rPr>
+        <w:t>•  Adopción de Inteligencia Artificial para Agilizar la Producción:</w:t>
+      </w:r>
+    </w:p>
+    <w:p>
+      <w:pPr>
+        <w:spacing w:before="60" w:after="60" w:line="240" w:lineRule="auto"/>
+        <w:jc w:val="both"/>
+        <w:rPr>
+          <w:rFonts w:ascii="Arial" w:hAnsi="Arial" w:cs="Arial"/>
+          <w:color w:val="111111"/>
+        </w:rPr>
+      </w:pPr>
+      <w:r>
+        <w:rPr>
+          <w:rFonts w:ascii="Arial" w:hAnsi="Arial" w:cs="Arial"/>
+          <w:color w:val="111111"/>
+        </w:rPr>
+        <w:t>Oportunidad de incorporar herramientas asistidas por IA (asistentes en los IDEs) para acelerar la codificación, automatizar tareas repetitivas de documentación, y aumentar la productividad general del departamento.</w:t>
+      </w:r>
+    </w:p>
+    <w:p>
+      <w:pPr>
+        <w:spacing w:before="40" w:after="40" w:line="240" w:lineRule="auto"/>
+        <w:ind w:left="360"/>
+        <w:jc w:val="both"/>
+        <w:rPr>
+          <w:rFonts w:ascii="Arial" w:hAnsi="Arial" w:cs="Arial"/>
+          <w:color w:val="111111"/>
+        </w:rPr>
+      </w:pPr>
+      <w:r>
+        <w:rPr>
+          <w:rFonts w:ascii="Arial" w:hAnsi="Arial" w:cs="Arial"/>
+          <w:color w:val="111111"/>
+        </w:rPr>
+        <w:t>•  Adopción de Marcos Ágiles Híbridos:</w:t>
+      </w:r>
+    </w:p>
+    <w:p>
+      <w:pPr>
+        <w:spacing w:before="60" w:after="60" w:line="240" w:lineRule="auto"/>
+        <w:jc w:val="both"/>
+        <w:rPr>
+          <w:rFonts w:ascii="Arial" w:hAnsi="Arial" w:cs="Arial"/>
+          <w:color w:val="111111"/>
+        </w:rPr>
+      </w:pPr>
+      <w:r>
+        <w:rPr>
+          <w:rFonts w:ascii="Arial" w:hAnsi="Arial" w:cs="Arial"/>
+          <w:color w:val="111111"/>
+        </w:rPr>
+        <w:t>Implementación de metodologías ágiles adaptadas a la realidad municipal a costo cero para mejorar y agilizar los procesos de desarrollo.</w:t>
+      </w:r>
+    </w:p>
+    <w:p>
+      <w:pPr>
+        <w:spacing w:before="40" w:after="40" w:line="240" w:lineRule="auto"/>
+        <w:ind w:left="360"/>
+        <w:jc w:val="both"/>
+        <w:rPr>
+          <w:rFonts w:ascii="Arial" w:hAnsi="Arial" w:cs="Arial"/>
+          <w:color w:val="111111"/>
+        </w:rPr>
+      </w:pPr>
+      <w:r>
+        <w:rPr>
+          <w:rFonts w:ascii="Arial" w:hAnsi="Arial" w:cs="Arial"/>
+          <w:color w:val="111111"/>
+        </w:rPr>
+        <w:t>•  Estandarización mediante la Arquitectura Base:</w:t>
+      </w:r>
+    </w:p>
+    <w:p>
+      <w:pPr>
+        <w:spacing w:before="60" w:after="60" w:line="240" w:lineRule="auto"/>
+        <w:jc w:val="both"/>
+        <w:rPr>
+          <w:rFonts w:ascii="Arial" w:hAnsi="Arial" w:cs="Arial"/>
+          <w:color w:val="111111"/>
+        </w:rPr>
+      </w:pPr>
+      <w:r>
+        <w:rPr>
+          <w:rFonts w:ascii="Arial" w:hAnsi="Arial" w:cs="Arial"/>
+          <w:color w:val="111111"/>
+        </w:rPr>
+        <w:t>Implementar una arquitectura base a modo de “template” como norma obligatoria para todos los desarrollos y de esa manera unificar las metodologías y mantener una coherencia en las tecnologías utilizadas.</w:t>
+      </w:r>
+    </w:p>
+    <w:p>
+      <w:pPr>
+        <w:spacing w:before="40" w:after="40" w:line="240" w:lineRule="auto"/>
+        <w:ind w:left="360"/>
+        <w:jc w:val="both"/>
+        <w:rPr>
+          <w:rFonts w:ascii="Arial" w:hAnsi="Arial" w:cs="Arial"/>
+          <w:color w:val="111111"/>
+        </w:rPr>
+      </w:pPr>
+      <w:r>
+        <w:rPr>
+          <w:rFonts w:ascii="Arial" w:hAnsi="Arial" w:cs="Arial"/>
+          <w:color w:val="111111"/>
+        </w:rPr>
         <w:t>•  Gestión Política favorable:</w:t>
       </w:r>
     </w:p>
@@ -1202,7 +1307,7 @@
           <w:rFonts w:ascii="Arial" w:hAnsi="Arial" w:cs="Arial"/>
           <w:color w:val="111111"/>
         </w:rPr>
-        <w:t>•  Adopción de Inteligencia Artificial para Agilizar la Producción:</w:t>
+        <w:t>•  Capacitaciones disponibles y accesibles:</w:t>
       </w:r>
     </w:p>
     <w:p>
@@ -1219,25 +1324,43 @@
           <w:rFonts w:ascii="Arial" w:hAnsi="Arial" w:cs="Arial"/>
           <w:color w:val="111111"/>
         </w:rPr>
-        <w:t>Oportunidad de incorporar herramientas asistidas por IA (asistentes en los IDEs) para acelerar la codificación, automatizar tareas repetitivas de documentación y aumentar la productividad general del departamento.</w:t>
-      </w:r>
-    </w:p>
-    <w:p>
-      <w:pPr>
-        <w:spacing w:before="40" w:after="40" w:line="240" w:lineRule="auto"/>
-        <w:ind w:left="360"/>
-        <w:jc w:val="both"/>
-        <w:rPr>
-          <w:rFonts w:ascii="Arial" w:hAnsi="Arial" w:cs="Arial"/>
-          <w:color w:val="111111"/>
-        </w:rPr>
-      </w:pPr>
-      <w:r>
-        <w:rPr>
-          <w:rFonts w:ascii="Arial" w:hAnsi="Arial" w:cs="Arial"/>
-          <w:color w:val="111111"/>
-        </w:rPr>
-        <w:t>•  Capacitaciones disponibles y accesibles:</w:t>
+        <w:t>Hay una gran cantidad de ofertas de capacitaciones técnicas tanto de nuevas tecnologías, metodologías ágiles e IDEs de inteligencia artificial que pueden ser aprovechadas para mejorar las tareas del área.</w:t>
+      </w:r>
+    </w:p>
+    <w:p>
+      <w:pPr>
+        <w:spacing w:before="200" w:after="60" w:line="240" w:lineRule="auto"/>
+        <w:rPr>
+          <w:rFonts w:ascii="Arial" w:hAnsi="Arial" w:cs="Arial"/>
+          <w:b/>
+          <w:color w:val="222222"/>
+        </w:rPr>
+      </w:pPr>
+      <w:r>
+        <w:rPr>
+          <w:rFonts w:ascii="Arial" w:hAnsi="Arial" w:cs="Arial"/>
+          <w:b/>
+          <w:color w:val="222222"/>
+        </w:rPr>
+        <w:t>Amenazas</w:t>
+      </w:r>
+    </w:p>
+    <w:p>
+      <w:pPr>
+        <w:spacing w:before="40" w:after="40" w:line="240" w:lineRule="auto"/>
+        <w:ind w:left="360"/>
+        <w:jc w:val="both"/>
+        <w:rPr>
+          <w:rFonts w:ascii="Arial" w:hAnsi="Arial" w:cs="Arial"/>
+          <w:color w:val="111111"/>
+        </w:rPr>
+      </w:pPr>
+      <w:r>
+        <w:rPr>
+          <w:rFonts w:ascii="Arial" w:hAnsi="Arial" w:cs="Arial"/>
+          <w:color w:val="111111"/>
+        </w:rPr>
+        <w:t>•  Falta de una óptima integración entre sistemas legacy y nuevos aplicativos:</w:t>
       </w:r>
     </w:p>
     <w:p>
@@ -1254,200 +1377,7 @@
           <w:rFonts w:ascii="Arial" w:hAnsi="Arial" w:cs="Arial"/>
           <w:color w:val="111111"/>
         </w:rPr>
-        <w:t>Hay una gran cantidad de ofertas de capacitaciones técnicas tanto de nuevas tecnologías, metodologías ágiles e IDEs de inteligencia artificial que pueden ser aprovechadas para mejorar las tareas del área.</w:t>
-      </w:r>
-    </w:p>
-    <w:p>
-      <w:pPr>
-        <w:spacing w:before="40" w:after="40" w:line="240" w:lineRule="auto"/>
-        <w:ind w:left="360"/>
-        <w:jc w:val="both"/>
-        <w:rPr>
-          <w:rFonts w:ascii="Arial" w:hAnsi="Arial" w:cs="Arial"/>
-          <w:color w:val="111111"/>
-        </w:rPr>
-      </w:pPr>
-      <w:r>
-        <w:rPr>
-          <w:rFonts w:ascii="Arial" w:hAnsi="Arial" w:cs="Arial"/>
-          <w:color w:val="111111"/>
-        </w:rPr>
-        <w:t>•  Adopción de Marcos Ágiles Híbridos:</w:t>
-      </w:r>
-    </w:p>
-    <w:p>
-      <w:pPr>
-        <w:spacing w:before="60" w:after="60" w:line="240" w:lineRule="auto"/>
-        <w:jc w:val="both"/>
-        <w:rPr>
-          <w:rFonts w:ascii="Arial" w:hAnsi="Arial" w:cs="Arial"/>
-          <w:color w:val="111111"/>
-        </w:rPr>
-      </w:pPr>
-      <w:r>
-        <w:rPr>
-          <w:rFonts w:ascii="Arial" w:hAnsi="Arial" w:cs="Arial"/>
-          <w:color w:val="111111"/>
-        </w:rPr>
-        <w:t>Implementación de metodologías ágiles adaptadas a la realidad municipal a costo cero para mejorar y agilizar los procesos de desarrollo.</w:t>
-      </w:r>
-    </w:p>
-    <w:p>
-      <w:pPr>
-        <w:spacing w:before="40" w:after="40" w:line="240" w:lineRule="auto"/>
-        <w:ind w:left="360"/>
-        <w:jc w:val="both"/>
-        <w:rPr>
-          <w:rFonts w:ascii="Arial" w:hAnsi="Arial" w:cs="Arial"/>
-          <w:color w:val="111111"/>
-        </w:rPr>
-      </w:pPr>
-      <w:r>
-        <w:rPr>
-          <w:rFonts w:ascii="Arial" w:hAnsi="Arial" w:cs="Arial"/>
-          <w:color w:val="111111"/>
-        </w:rPr>
-        <w:t>•  Estandarización mediante una Arquitectura Base:</w:t>
-      </w:r>
-    </w:p>
-    <w:p>
-      <w:pPr>
-        <w:spacing w:before="60" w:after="60" w:line="240" w:lineRule="auto"/>
-        <w:jc w:val="both"/>
-        <w:rPr>
-          <w:rFonts w:ascii="Arial" w:hAnsi="Arial" w:cs="Arial"/>
-          <w:color w:val="111111"/>
-        </w:rPr>
-      </w:pPr>
-      <w:r>
-        <w:rPr>
-          <w:rFonts w:ascii="Arial" w:hAnsi="Arial" w:cs="Arial"/>
-          <w:color w:val="111111"/>
-        </w:rPr>
-        <w:t>Oportunidad de definir e instituir una arquitectura base a modo de template como norma obligatoria para unificar las metodologías y mantener una coherencia en las tecnologías utilizadas.</w:t>
-      </w:r>
-    </w:p>
-    <w:p>
-      <w:pPr>
-        <w:spacing w:before="200" w:after="60" w:line="240" w:lineRule="auto"/>
-        <w:rPr>
-          <w:rFonts w:ascii="Arial" w:hAnsi="Arial" w:cs="Arial"/>
-          <w:b/>
-          <w:color w:val="222222"/>
-        </w:rPr>
-      </w:pPr>
-      <w:r>
-        <w:rPr>
-          <w:rFonts w:ascii="Arial" w:hAnsi="Arial" w:cs="Arial"/>
-          <w:b/>
-          <w:color w:val="222222"/>
-        </w:rPr>
-        <w:t>Amenazas</w:t>
-      </w:r>
-    </w:p>
-    <w:p>
-      <w:pPr>
-        <w:spacing w:before="40" w:after="40" w:line="240" w:lineRule="auto"/>
-        <w:ind w:left="360"/>
-        <w:jc w:val="both"/>
-        <w:rPr>
-          <w:rFonts w:ascii="Arial" w:hAnsi="Arial" w:cs="Arial"/>
-          <w:color w:val="111111"/>
-        </w:rPr>
-      </w:pPr>
-      <w:r>
-        <w:rPr>
-          <w:rFonts w:ascii="Arial" w:hAnsi="Arial" w:cs="Arial"/>
-          <w:color w:val="111111"/>
-        </w:rPr>
-        <w:t>•  Demandas Institucionales Cambiantes e Imprevistas:</w:t>
-      </w:r>
-    </w:p>
-    <w:p>
-      <w:pPr>
-        <w:spacing w:before="60" w:after="60" w:line="240" w:lineRule="auto"/>
-        <w:jc w:val="both"/>
-        <w:rPr>
-          <w:rFonts w:ascii="Arial" w:hAnsi="Arial" w:cs="Arial"/>
-          <w:color w:val="111111"/>
-        </w:rPr>
-      </w:pPr>
-      <w:r>
-        <w:rPr>
-          <w:rFonts w:ascii="Arial" w:hAnsi="Arial" w:cs="Arial"/>
-          <w:color w:val="111111"/>
-        </w:rPr>
-        <w:t>Variación rápida en las prioridades de las distintas Secretarías que exigen respuestas inmediatas y desordenan la planificación del área.</w:t>
-      </w:r>
-    </w:p>
-    <w:p>
-      <w:pPr>
-        <w:spacing w:before="40" w:after="40" w:line="240" w:lineRule="auto"/>
-        <w:ind w:left="360"/>
-        <w:jc w:val="both"/>
-        <w:rPr>
-          <w:rFonts w:ascii="Arial" w:hAnsi="Arial" w:cs="Arial"/>
-          <w:color w:val="111111"/>
-        </w:rPr>
-      </w:pPr>
-      <w:r>
-        <w:rPr>
-          <w:rFonts w:ascii="Arial" w:hAnsi="Arial" w:cs="Arial"/>
-          <w:color w:val="111111"/>
-        </w:rPr>
-        <w:t>•  Dificultad de Integración Técnica con Sistemas y Bases Legacy:</w:t>
-      </w:r>
-    </w:p>
-    <w:p>
-      <w:pPr>
-        <w:spacing w:before="60" w:after="60" w:line="240" w:lineRule="auto"/>
-        <w:jc w:val="both"/>
-        <w:rPr>
-          <w:rFonts w:ascii="Arial" w:hAnsi="Arial" w:cs="Arial"/>
-          <w:color w:val="111111"/>
-        </w:rPr>
-      </w:pPr>
-      <w:r>
-        <w:rPr>
-          <w:rFonts w:ascii="Arial" w:hAnsi="Arial" w:cs="Arial"/>
-          <w:color w:val="111111"/>
-        </w:rPr>
-        <w:t>Complejidad para consumir o integrar datos de aplicaciones antiguas que carecen de APIs o servicios web unificados, generando duplicación de funciones al no contar con interfaces modernas de integración.</w:t>
-      </w:r>
-    </w:p>
-    <w:p>
-      <w:pPr>
-        <w:spacing w:before="40" w:after="40" w:line="240" w:lineRule="auto"/>
-        <w:ind w:left="360"/>
-        <w:jc w:val="both"/>
-        <w:rPr>
-          <w:rFonts w:ascii="Arial" w:hAnsi="Arial" w:cs="Arial"/>
-          <w:color w:val="111111"/>
-        </w:rPr>
-      </w:pPr>
-      <w:r>
-        <w:rPr>
-          <w:rFonts w:ascii="Arial" w:hAnsi="Arial" w:cs="Arial"/>
-          <w:color w:val="111111"/>
-        </w:rPr>
-        <w:t>•  Riesgos de Ciberseguridad y Fuga de Información:</w:t>
-      </w:r>
-    </w:p>
-    <w:p>
-      <w:pPr>
-        <w:spacing w:before="60" w:after="60" w:line="240" w:lineRule="auto"/>
-        <w:jc w:val="both"/>
-        <w:rPr>
-          <w:rFonts w:ascii="Arial" w:hAnsi="Arial" w:cs="Arial"/>
-          <w:color w:val="111111"/>
-        </w:rPr>
-      </w:pPr>
-      <w:r>
-        <w:rPr>
-          <w:rFonts w:ascii="Arial" w:hAnsi="Arial" w:cs="Arial"/>
-          <w:color w:val="111111"/>
-        </w:rPr>
-        <w:t>Vulnerabilidades en código antiguo no actualizado o uso de herramientas externas que pongan en riesgo la información municipal.</w:t>
+        <w:t>Algunos sistemas duplican funciones debido a la imposibilidad de integrar la forma en que acceden a las bases de datos más antiguas con nuevos aplicativos, generando duplicación de funciones al no haber APIs o sistemas que unifiquen la consumición de estos datos.</w:t>
       </w:r>
     </w:p>
     <w:p>
@@ -4176,7 +4106,7 @@
     <w:link w:val="EncabezadoCar"/>
     <w:uiPriority w:val="99"/>
     <w:unhideWhenUsed/>
-    <w:rsid w:val="00CA5F3B"/>
+    <w:rsid w:val="00C55567"/>
     <w:pPr>
       <w:tabs>
         <w:tab w:val="center" w:pos="4252"/>
@@ -4190,7 +4120,7 @@
     <w:basedOn w:val="Fuentedeprrafopredeter"/>
     <w:link w:val="Encabezado"/>
     <w:uiPriority w:val="99"/>
-    <w:rsid w:val="00CA5F3B"/>
+    <w:rsid w:val="00C55567"/>
   </w:style>
   <w:style w:type="paragraph" w:styleId="Piedepgina">
     <w:name w:val="footer"/>
@@ -4198,7 +4128,7 @@
     <w:link w:val="PiedepginaCar"/>
     <w:uiPriority w:val="99"/>
     <w:unhideWhenUsed/>
-    <w:rsid w:val="00CA5F3B"/>
+    <w:rsid w:val="00C55567"/>
     <w:pPr>
       <w:tabs>
         <w:tab w:val="center" w:pos="4252"/>
@@ -4212,7 +4142,7 @@
     <w:basedOn w:val="Fuentedeprrafopredeter"/>
     <w:link w:val="Piedepgina"/>
     <w:uiPriority w:val="99"/>
-    <w:rsid w:val="00CA5F3B"/>
+    <w:rsid w:val="00C55567"/>
   </w:style>
 </w:styles>
 </file>

</xml_diff>

<commit_message>
style: Match exact paragraph breaks for SWOT items
</commit_message>
<xml_diff>
--- a/Plan_Trabajo_Concurso_Jefatura_Software.docx
+++ b/Plan_Trabajo_Concurso_Jefatura_Software.docx
@@ -444,7 +444,7 @@
     </w:p>
     <w:p>
       <w:pPr>
-        <w:spacing w:before="60" w:after="60"/>
+        <w:spacing w:before="40" w:after="120"/>
         <w:jc w:val="both"/>
         <w:rPr>
           <w:rFonts w:ascii="Arial" w:hAnsi="Arial" w:cs="Arial"/>
@@ -482,7 +482,7 @@
     </w:p>
     <w:p>
       <w:pPr>
-        <w:spacing w:before="60" w:after="60" w:line="240" w:lineRule="auto"/>
+        <w:spacing w:before="40" w:after="120" w:line="240" w:lineRule="auto"/>
         <w:jc w:val="both"/>
         <w:rPr>
           <w:rFonts w:ascii="Arial" w:hAnsi="Arial" w:cs="Arial"/>
@@ -499,7 +499,7 @@
     </w:p>
     <w:p>
       <w:pPr>
-        <w:spacing w:before="60" w:after="60" w:line="240" w:lineRule="auto"/>
+        <w:spacing w:before="40" w:after="120" w:line="240" w:lineRule="auto"/>
         <w:jc w:val="both"/>
         <w:rPr>
           <w:rFonts w:ascii="Arial" w:hAnsi="Arial" w:cs="Arial"/>
@@ -536,7 +536,7 @@
     </w:p>
     <w:p>
       <w:pPr>
-        <w:spacing w:before="60" w:after="60" w:line="240" w:lineRule="auto"/>
+        <w:spacing w:before="40" w:after="120" w:line="240" w:lineRule="auto"/>
         <w:jc w:val="both"/>
         <w:rPr>
           <w:rFonts w:ascii="Arial" w:hAnsi="Arial" w:cs="Arial"/>
@@ -553,7 +553,7 @@
     </w:p>
     <w:p>
       <w:pPr>
-        <w:spacing w:before="60" w:after="60" w:line="240" w:lineRule="auto"/>
+        <w:spacing w:before="40" w:after="120" w:line="240" w:lineRule="auto"/>
         <w:jc w:val="both"/>
         <w:rPr>
           <w:rFonts w:ascii="Arial" w:hAnsi="Arial" w:cs="Arial"/>
@@ -570,16 +570,17 @@
     </w:p>
     <w:p>
       <w:pPr>
-        <w:spacing w:before="60" w:after="60" w:line="240" w:lineRule="auto"/>
-        <w:jc w:val="both"/>
-        <w:rPr>
-          <w:rFonts w:ascii="Arial" w:hAnsi="Arial" w:cs="Arial"/>
-          <w:color w:val="111111"/>
-        </w:rPr>
-      </w:pPr>
-      <w:r>
-        <w:rPr>
-          <w:rFonts w:ascii="Arial" w:hAnsi="Arial" w:cs="Arial"/>
+        <w:spacing w:before="120" w:after="20" w:line="240" w:lineRule="auto"/>
+        <w:rPr>
+          <w:rFonts w:ascii="Arial" w:hAnsi="Arial" w:cs="Arial"/>
+          <w:b/>
+          <w:color w:val="111111"/>
+        </w:rPr>
+      </w:pPr>
+      <w:r>
+        <w:rPr>
+          <w:rFonts w:ascii="Arial" w:hAnsi="Arial" w:cs="Arial"/>
+          <w:b/>
           <w:color w:val="111111"/>
         </w:rPr>
         <w:t>De acuerdo con la normativa municipal que rige la estructura orgánica y el nomenclador de funciones del área (citada en la bibliografía oficial del concurso), el Departamento tiene encomendadas las siguientes funciones primarias:</w:t>
@@ -713,7 +714,7 @@
     </w:p>
     <w:p>
       <w:pPr>
-        <w:spacing w:before="60" w:after="60" w:line="240" w:lineRule="auto"/>
+        <w:spacing w:before="40" w:after="120" w:line="240" w:lineRule="auto"/>
         <w:jc w:val="both"/>
         <w:rPr>
           <w:rFonts w:ascii="Arial" w:hAnsi="Arial" w:cs="Arial"/>
@@ -768,6 +769,851 @@
     </w:p>
     <w:p>
       <w:pPr>
+        <w:spacing w:before="120" w:after="20" w:line="240" w:lineRule="auto"/>
+        <w:rPr>
+          <w:rFonts w:ascii="Arial" w:hAnsi="Arial" w:cs="Arial"/>
+          <w:b/>
+          <w:color w:val="111111"/>
+        </w:rPr>
+      </w:pPr>
+      <w:r>
+        <w:rPr>
+          <w:rFonts w:ascii="Arial" w:hAnsi="Arial" w:cs="Arial"/>
+          <w:b/>
+          <w:color w:val="111111"/>
+        </w:rPr>
+        <w:t>* Personal Técnico Capacitado:</w:t>
+      </w:r>
+    </w:p>
+    <w:p>
+      <w:pPr>
+        <w:spacing w:before="40" w:after="120" w:line="240" w:lineRule="auto"/>
+        <w:jc w:val="both"/>
+        <w:rPr>
+          <w:rFonts w:ascii="Arial" w:hAnsi="Arial" w:cs="Arial"/>
+          <w:color w:val="111111"/>
+        </w:rPr>
+      </w:pPr>
+      <w:r>
+        <w:rPr>
+          <w:rFonts w:ascii="Arial" w:hAnsi="Arial" w:cs="Arial"/>
+          <w:color w:val="111111"/>
+        </w:rPr>
+        <w:t>El Departamento dispone de un plantel técnico capacitado que pueden realizar tareas de relevamiento analítico, desarrollo y testing de aplicaciones además de conocer las normativas, circuitos administrativos, trámites y reglas operativas de la administración pública local.</w:t>
+      </w:r>
+    </w:p>
+    <w:p>
+      <w:pPr>
+        <w:spacing w:before="120" w:after="20" w:line="240" w:lineRule="auto"/>
+        <w:rPr>
+          <w:rFonts w:ascii="Arial" w:hAnsi="Arial" w:cs="Arial"/>
+          <w:b/>
+          <w:color w:val="111111"/>
+        </w:rPr>
+      </w:pPr>
+      <w:r>
+        <w:rPr>
+          <w:rFonts w:ascii="Arial" w:hAnsi="Arial" w:cs="Arial"/>
+          <w:b/>
+          <w:color w:val="111111"/>
+        </w:rPr>
+        <w:t>* Disponibilidad de medios:</w:t>
+      </w:r>
+    </w:p>
+    <w:p>
+      <w:pPr>
+        <w:spacing w:before="40" w:after="120" w:line="240" w:lineRule="auto"/>
+        <w:jc w:val="both"/>
+        <w:rPr>
+          <w:rFonts w:ascii="Arial" w:hAnsi="Arial" w:cs="Arial"/>
+          <w:color w:val="111111"/>
+        </w:rPr>
+      </w:pPr>
+      <w:r>
+        <w:rPr>
+          <w:rFonts w:ascii="Arial" w:hAnsi="Arial" w:cs="Arial"/>
+          <w:color w:val="111111"/>
+        </w:rPr>
+        <w:t>Se cuenta con el suficiente mobiliario y herramientas técnicas para llevar a cabo la Misión y Funciones del Departamento.</w:t>
+      </w:r>
+    </w:p>
+    <w:p>
+      <w:pPr>
+        <w:spacing w:before="200" w:after="60" w:line="240" w:lineRule="auto"/>
+        <w:rPr>
+          <w:rFonts w:ascii="Arial" w:hAnsi="Arial" w:cs="Arial"/>
+          <w:b/>
+          <w:color w:val="222222"/>
+        </w:rPr>
+      </w:pPr>
+      <w:r>
+        <w:rPr>
+          <w:rFonts w:ascii="Arial" w:hAnsi="Arial" w:cs="Arial"/>
+          <w:b/>
+          <w:color w:val="222222"/>
+        </w:rPr>
+        <w:t>Debilidades</w:t>
+      </w:r>
+    </w:p>
+    <w:p>
+      <w:pPr>
+        <w:spacing w:before="120" w:after="20" w:line="240" w:lineRule="auto"/>
+        <w:rPr>
+          <w:rFonts w:ascii="Arial" w:hAnsi="Arial" w:cs="Arial"/>
+          <w:b/>
+          <w:color w:val="111111"/>
+        </w:rPr>
+      </w:pPr>
+      <w:r>
+        <w:rPr>
+          <w:rFonts w:ascii="Arial" w:hAnsi="Arial" w:cs="Arial"/>
+          <w:b/>
+          <w:color w:val="111111"/>
+        </w:rPr>
+        <w:t>* Fragmentación Tecnológica:</w:t>
+      </w:r>
+    </w:p>
+    <w:p>
+      <w:pPr>
+        <w:spacing w:before="40" w:after="120" w:line="240" w:lineRule="auto"/>
+        <w:jc w:val="both"/>
+        <w:rPr>
+          <w:rFonts w:ascii="Arial" w:hAnsi="Arial" w:cs="Arial"/>
+          <w:color w:val="111111"/>
+        </w:rPr>
+      </w:pPr>
+      <w:r>
+        <w:rPr>
+          <w:rFonts w:ascii="Arial" w:hAnsi="Arial" w:cs="Arial"/>
+          <w:color w:val="111111"/>
+        </w:rPr>
+        <w:t>Coexistencia caótica de tecnologías obsoletas y sin soporte actual (WebForms con SQL 2005) junto a tecnologías modernas (.NET, React, Angular, PHP, PostgreSQL).</w:t>
+      </w:r>
+    </w:p>
+    <w:p>
+      <w:pPr>
+        <w:spacing w:before="120" w:after="20" w:line="240" w:lineRule="auto"/>
+        <w:rPr>
+          <w:rFonts w:ascii="Arial" w:hAnsi="Arial" w:cs="Arial"/>
+          <w:b/>
+          <w:color w:val="111111"/>
+        </w:rPr>
+      </w:pPr>
+      <w:r>
+        <w:rPr>
+          <w:rFonts w:ascii="Arial" w:hAnsi="Arial" w:cs="Arial"/>
+          <w:b/>
+          <w:color w:val="111111"/>
+        </w:rPr>
+        <w:t>* Falta de una Arquitectura Base Estandarizada:</w:t>
+      </w:r>
+    </w:p>
+    <w:p>
+      <w:pPr>
+        <w:spacing w:before="40" w:after="120" w:line="240" w:lineRule="auto"/>
+        <w:jc w:val="both"/>
+        <w:rPr>
+          <w:rFonts w:ascii="Arial" w:hAnsi="Arial" w:cs="Arial"/>
+          <w:color w:val="111111"/>
+        </w:rPr>
+      </w:pPr>
+      <w:r>
+        <w:rPr>
+          <w:rFonts w:ascii="Arial" w:hAnsi="Arial" w:cs="Arial"/>
+          <w:color w:val="111111"/>
+        </w:rPr>
+        <w:t>Ausencia de una arquitectura base de cumplimiento obligatorio a modo de "template" para uniformar las aplicaciones y de esta forma facilitar el desarrollo de los sistemas y la rotación de programadores entre distintos sistemas.</w:t>
+      </w:r>
+    </w:p>
+    <w:p>
+      <w:pPr>
+        <w:spacing w:before="120" w:after="20" w:line="240" w:lineRule="auto"/>
+        <w:rPr>
+          <w:rFonts w:ascii="Arial" w:hAnsi="Arial" w:cs="Arial"/>
+          <w:b/>
+          <w:color w:val="111111"/>
+        </w:rPr>
+      </w:pPr>
+      <w:r>
+        <w:rPr>
+          <w:rFonts w:ascii="Arial" w:hAnsi="Arial" w:cs="Arial"/>
+          <w:b/>
+          <w:color w:val="111111"/>
+        </w:rPr>
+        <w:t>* Multitarea Extrema y Conocimiento Concentrado:</w:t>
+      </w:r>
+    </w:p>
+    <w:p>
+      <w:pPr>
+        <w:spacing w:before="40" w:after="120" w:line="240" w:lineRule="auto"/>
+        <w:jc w:val="both"/>
+        <w:rPr>
+          <w:rFonts w:ascii="Arial" w:hAnsi="Arial" w:cs="Arial"/>
+          <w:color w:val="111111"/>
+        </w:rPr>
+      </w:pPr>
+      <w:r>
+        <w:rPr>
+          <w:rFonts w:ascii="Arial" w:hAnsi="Arial" w:cs="Arial"/>
+          <w:color w:val="111111"/>
+        </w:rPr>
+        <w:t>La escasa dotación frente a la alta demanda obliga al personal a atender simultáneamente emergencias de sistemas antiguos de diversas áreas y desarrollos nuevos. Esto genera saltos de contextos constantes y un alto riesgo operativo: la existencia de sistemas críticos que dependen del conocimiento exclusivo de una sola persona.</w:t>
+      </w:r>
+    </w:p>
+    <w:p>
+      <w:pPr>
+        <w:spacing w:before="120" w:after="20" w:line="240" w:lineRule="auto"/>
+        <w:rPr>
+          <w:rFonts w:ascii="Arial" w:hAnsi="Arial" w:cs="Arial"/>
+          <w:b/>
+          <w:color w:val="111111"/>
+        </w:rPr>
+      </w:pPr>
+      <w:r>
+        <w:rPr>
+          <w:rFonts w:ascii="Arial" w:hAnsi="Arial" w:cs="Arial"/>
+          <w:b/>
+          <w:color w:val="111111"/>
+        </w:rPr>
+        <w:t>* Aislamiento Operativo entre Dependencias:</w:t>
+      </w:r>
+    </w:p>
+    <w:p>
+      <w:pPr>
+        <w:spacing w:before="40" w:after="120" w:line="240" w:lineRule="auto"/>
+        <w:jc w:val="both"/>
+        <w:rPr>
+          <w:rFonts w:ascii="Arial" w:hAnsi="Arial" w:cs="Arial"/>
+          <w:color w:val="111111"/>
+        </w:rPr>
+      </w:pPr>
+      <w:r>
+        <w:rPr>
+          <w:rFonts w:ascii="Arial" w:hAnsi="Arial" w:cs="Arial"/>
+          <w:color w:val="111111"/>
+        </w:rPr>
+        <w:t>La distribución física del personal en dos oficinas distintas y sin un agente que coordine ambas, genera descoordinación, aislamiento en silos de información y el riesgo de desarrollar funcionalidades duplicadas por falta de comunicación.</w:t>
+      </w:r>
+    </w:p>
+    <w:p>
+      <w:pPr>
+        <w:spacing w:before="120" w:after="20" w:line="240" w:lineRule="auto"/>
+        <w:rPr>
+          <w:rFonts w:ascii="Arial" w:hAnsi="Arial" w:cs="Arial"/>
+          <w:b/>
+          <w:color w:val="111111"/>
+        </w:rPr>
+      </w:pPr>
+      <w:r>
+        <w:rPr>
+          <w:rFonts w:ascii="Arial" w:hAnsi="Arial" w:cs="Arial"/>
+          <w:b/>
+          <w:color w:val="111111"/>
+        </w:rPr>
+        <w:t>* Estimación y Seguimiento Caóticos:</w:t>
+      </w:r>
+    </w:p>
+    <w:p>
+      <w:pPr>
+        <w:spacing w:before="40" w:after="120" w:line="240" w:lineRule="auto"/>
+        <w:jc w:val="both"/>
+        <w:rPr>
+          <w:rFonts w:ascii="Arial" w:hAnsi="Arial" w:cs="Arial"/>
+          <w:color w:val="111111"/>
+        </w:rPr>
+      </w:pPr>
+      <w:r>
+        <w:rPr>
+          <w:rFonts w:ascii="Arial" w:hAnsi="Arial" w:cs="Arial"/>
+          <w:color w:val="111111"/>
+        </w:rPr>
+        <w:t>Uso fragmentado de herramientas para documentar el avance de los proyectos (algunos agentes usan Redmine, otros planillas desactualizadas en Excel o registros informales), impidiendo conocer la capacidad operativa real del departamento.</w:t>
+      </w:r>
+    </w:p>
+    <w:p>
+      <w:pPr>
+        <w:spacing w:before="120" w:after="20" w:line="240" w:lineRule="auto"/>
+        <w:rPr>
+          <w:rFonts w:ascii="Arial" w:hAnsi="Arial" w:cs="Arial"/>
+          <w:b/>
+          <w:color w:val="111111"/>
+        </w:rPr>
+      </w:pPr>
+      <w:r>
+        <w:rPr>
+          <w:rFonts w:ascii="Arial" w:hAnsi="Arial" w:cs="Arial"/>
+          <w:b/>
+          <w:color w:val="111111"/>
+        </w:rPr>
+        <w:t>* Documentación Inexistente o Desigual:</w:t>
+      </w:r>
+    </w:p>
+    <w:p>
+      <w:pPr>
+        <w:spacing w:before="40" w:after="120" w:line="240" w:lineRule="auto"/>
+        <w:jc w:val="both"/>
+        <w:rPr>
+          <w:rFonts w:ascii="Arial" w:hAnsi="Arial" w:cs="Arial"/>
+          <w:color w:val="111111"/>
+        </w:rPr>
+      </w:pPr>
+      <w:r>
+        <w:rPr>
+          <w:rFonts w:ascii="Arial" w:hAnsi="Arial" w:cs="Arial"/>
+          <w:color w:val="111111"/>
+        </w:rPr>
+        <w:t>Falta de manuales de relevamiento, técnicos o registros de arquitectura, profundizando la dependencia de programadores específicos.</w:t>
+      </w:r>
+    </w:p>
+    <w:p>
+      <w:pPr>
+        <w:spacing w:before="120" w:after="20" w:line="240" w:lineRule="auto"/>
+        <w:rPr>
+          <w:rFonts w:ascii="Arial" w:hAnsi="Arial" w:cs="Arial"/>
+          <w:b/>
+          <w:color w:val="111111"/>
+        </w:rPr>
+      </w:pPr>
+      <w:r>
+        <w:rPr>
+          <w:rFonts w:ascii="Arial" w:hAnsi="Arial" w:cs="Arial"/>
+          <w:b/>
+          <w:color w:val="111111"/>
+        </w:rPr>
+        <w:t>* Pruebas de Software Reactivas:</w:t>
+      </w:r>
+    </w:p>
+    <w:p>
+      <w:pPr>
+        <w:spacing w:before="40" w:after="120" w:line="240" w:lineRule="auto"/>
+        <w:jc w:val="both"/>
+        <w:rPr>
+          <w:rFonts w:ascii="Arial" w:hAnsi="Arial" w:cs="Arial"/>
+          <w:color w:val="111111"/>
+        </w:rPr>
+      </w:pPr>
+      <w:r>
+        <w:rPr>
+          <w:rFonts w:ascii="Arial" w:hAnsi="Arial" w:cs="Arial"/>
+          <w:color w:val="111111"/>
+        </w:rPr>
+        <w:t>Al no existir el rol de QA (Quality Assurance) ni herramientas de testeo estandarizadas, la verificación de errores depende de los propios desarrolladores o de los usuarios de los aplicativos.</w:t>
+      </w:r>
+    </w:p>
+    <w:p>
+      <w:pPr>
+        <w:spacing w:before="120" w:after="20" w:line="240" w:lineRule="auto"/>
+        <w:rPr>
+          <w:rFonts w:ascii="Arial" w:hAnsi="Arial" w:cs="Arial"/>
+          <w:b/>
+          <w:color w:val="111111"/>
+        </w:rPr>
+      </w:pPr>
+      <w:r>
+        <w:rPr>
+          <w:rFonts w:ascii="Arial" w:hAnsi="Arial" w:cs="Arial"/>
+          <w:b/>
+          <w:color w:val="111111"/>
+        </w:rPr>
+        <w:t>* Resistencia al cambio:</w:t>
+      </w:r>
+    </w:p>
+    <w:p>
+      <w:pPr>
+        <w:spacing w:before="40" w:after="120" w:line="240" w:lineRule="auto"/>
+        <w:jc w:val="both"/>
+        <w:rPr>
+          <w:rFonts w:ascii="Arial" w:hAnsi="Arial" w:cs="Arial"/>
+          <w:color w:val="111111"/>
+        </w:rPr>
+      </w:pPr>
+      <w:r>
+        <w:rPr>
+          <w:rFonts w:ascii="Arial" w:hAnsi="Arial" w:cs="Arial"/>
+          <w:color w:val="111111"/>
+        </w:rPr>
+        <w:t>Algunos agentes se rehúsan a aprender nuevas tecnologías y mejorar las formas de desarrollo, insistiendo en utilizar lenguajes o arquitecturas obsoletas, generando conflictos en la optimización de las bases de datos.</w:t>
+      </w:r>
+    </w:p>
+    <w:p>
+      <w:pPr>
+        <w:spacing w:before="200" w:after="60" w:line="240" w:lineRule="auto"/>
+        <w:rPr>
+          <w:rFonts w:ascii="Arial" w:hAnsi="Arial" w:cs="Arial"/>
+          <w:b/>
+          <w:color w:val="222222"/>
+        </w:rPr>
+      </w:pPr>
+      <w:r>
+        <w:rPr>
+          <w:rFonts w:ascii="Arial" w:hAnsi="Arial" w:cs="Arial"/>
+          <w:b/>
+          <w:color w:val="222222"/>
+        </w:rPr>
+        <w:t>Oportunidades</w:t>
+      </w:r>
+    </w:p>
+    <w:p>
+      <w:pPr>
+        <w:spacing w:before="120" w:after="20" w:line="240" w:lineRule="auto"/>
+        <w:rPr>
+          <w:rFonts w:ascii="Arial" w:hAnsi="Arial" w:cs="Arial"/>
+          <w:b/>
+          <w:color w:val="111111"/>
+        </w:rPr>
+      </w:pPr>
+      <w:r>
+        <w:rPr>
+          <w:rFonts w:ascii="Arial" w:hAnsi="Arial" w:cs="Arial"/>
+          <w:b/>
+          <w:color w:val="111111"/>
+        </w:rPr>
+        <w:t>* Adopción de Inteligencia Artificial para Agilizar la Producción:</w:t>
+      </w:r>
+    </w:p>
+    <w:p>
+      <w:pPr>
+        <w:spacing w:before="40" w:after="120" w:line="240" w:lineRule="auto"/>
+        <w:jc w:val="both"/>
+        <w:rPr>
+          <w:rFonts w:ascii="Arial" w:hAnsi="Arial" w:cs="Arial"/>
+          <w:color w:val="111111"/>
+        </w:rPr>
+      </w:pPr>
+      <w:r>
+        <w:rPr>
+          <w:rFonts w:ascii="Arial" w:hAnsi="Arial" w:cs="Arial"/>
+          <w:color w:val="111111"/>
+        </w:rPr>
+        <w:t>Oportunidad de incorporar herramientas asistidas por IA (asistentes en los IDEs) para acelerar la codificación, automatizar tareas repetitivas de documentación, y aumentar la productividad general del departamento.</w:t>
+      </w:r>
+    </w:p>
+    <w:p>
+      <w:pPr>
+        <w:spacing w:before="120" w:after="20" w:line="240" w:lineRule="auto"/>
+        <w:rPr>
+          <w:rFonts w:ascii="Arial" w:hAnsi="Arial" w:cs="Arial"/>
+          <w:b/>
+          <w:color w:val="111111"/>
+        </w:rPr>
+      </w:pPr>
+      <w:r>
+        <w:rPr>
+          <w:rFonts w:ascii="Arial" w:hAnsi="Arial" w:cs="Arial"/>
+          <w:b/>
+          <w:color w:val="111111"/>
+        </w:rPr>
+        <w:t>* Adopción de Marcos Ágiles Híbridos:</w:t>
+      </w:r>
+    </w:p>
+    <w:p>
+      <w:pPr>
+        <w:spacing w:before="40" w:after="120" w:line="240" w:lineRule="auto"/>
+        <w:jc w:val="both"/>
+        <w:rPr>
+          <w:rFonts w:ascii="Arial" w:hAnsi="Arial" w:cs="Arial"/>
+          <w:color w:val="111111"/>
+        </w:rPr>
+      </w:pPr>
+      <w:r>
+        <w:rPr>
+          <w:rFonts w:ascii="Arial" w:hAnsi="Arial" w:cs="Arial"/>
+          <w:color w:val="111111"/>
+        </w:rPr>
+        <w:t>Implementación de metodologías ágiles adaptadas a la realidad municipal a costo cero para mejorar y agilizar los procesos de desarrollo.</w:t>
+      </w:r>
+    </w:p>
+    <w:p>
+      <w:pPr>
+        <w:spacing w:before="120" w:after="20" w:line="240" w:lineRule="auto"/>
+        <w:rPr>
+          <w:rFonts w:ascii="Arial" w:hAnsi="Arial" w:cs="Arial"/>
+          <w:b/>
+          <w:color w:val="111111"/>
+        </w:rPr>
+      </w:pPr>
+      <w:r>
+        <w:rPr>
+          <w:rFonts w:ascii="Arial" w:hAnsi="Arial" w:cs="Arial"/>
+          <w:b/>
+          <w:color w:val="111111"/>
+        </w:rPr>
+        <w:t>* Estandarización mediante la Arquitectura Base:</w:t>
+      </w:r>
+    </w:p>
+    <w:p>
+      <w:pPr>
+        <w:spacing w:before="40" w:after="120" w:line="240" w:lineRule="auto"/>
+        <w:jc w:val="both"/>
+        <w:rPr>
+          <w:rFonts w:ascii="Arial" w:hAnsi="Arial" w:cs="Arial"/>
+          <w:color w:val="111111"/>
+        </w:rPr>
+      </w:pPr>
+      <w:r>
+        <w:rPr>
+          <w:rFonts w:ascii="Arial" w:hAnsi="Arial" w:cs="Arial"/>
+          <w:color w:val="111111"/>
+        </w:rPr>
+        <w:t>Implementar una arquitectura base a modo de “template” como norma obligatoria para todos los desarrollos y de esa manera unificar las metodologías y mantener una coherencia en las tecnologías utilizadas.</w:t>
+      </w:r>
+    </w:p>
+    <w:p>
+      <w:pPr>
+        <w:spacing w:before="120" w:after="20" w:line="240" w:lineRule="auto"/>
+        <w:rPr>
+          <w:rFonts w:ascii="Arial" w:hAnsi="Arial" w:cs="Arial"/>
+          <w:b/>
+          <w:color w:val="111111"/>
+        </w:rPr>
+      </w:pPr>
+      <w:r>
+        <w:rPr>
+          <w:rFonts w:ascii="Arial" w:hAnsi="Arial" w:cs="Arial"/>
+          <w:b/>
+          <w:color w:val="111111"/>
+        </w:rPr>
+        <w:t>* Gestión Política favorable:</w:t>
+      </w:r>
+    </w:p>
+    <w:p>
+      <w:pPr>
+        <w:spacing w:before="40" w:after="120" w:line="240" w:lineRule="auto"/>
+        <w:jc w:val="both"/>
+        <w:rPr>
+          <w:rFonts w:ascii="Arial" w:hAnsi="Arial" w:cs="Arial"/>
+          <w:color w:val="111111"/>
+        </w:rPr>
+      </w:pPr>
+      <w:r>
+        <w:rPr>
+          <w:rFonts w:ascii="Arial" w:hAnsi="Arial" w:cs="Arial"/>
+          <w:color w:val="111111"/>
+        </w:rPr>
+        <w:t>La gestión actual tiene intención de optimizar y modernizar las funciones del Departamento.</w:t>
+      </w:r>
+    </w:p>
+    <w:p>
+      <w:pPr>
+        <w:spacing w:before="120" w:after="20" w:line="240" w:lineRule="auto"/>
+        <w:rPr>
+          <w:rFonts w:ascii="Arial" w:hAnsi="Arial" w:cs="Arial"/>
+          <w:b/>
+          <w:color w:val="111111"/>
+        </w:rPr>
+      </w:pPr>
+      <w:r>
+        <w:rPr>
+          <w:rFonts w:ascii="Arial" w:hAnsi="Arial" w:cs="Arial"/>
+          <w:b/>
+          <w:color w:val="111111"/>
+        </w:rPr>
+        <w:t>* Capacitaciones disponibles y accesibles:</w:t>
+      </w:r>
+    </w:p>
+    <w:p>
+      <w:pPr>
+        <w:spacing w:before="40" w:after="120" w:line="240" w:lineRule="auto"/>
+        <w:jc w:val="both"/>
+        <w:rPr>
+          <w:rFonts w:ascii="Arial" w:hAnsi="Arial" w:cs="Arial"/>
+          <w:color w:val="111111"/>
+        </w:rPr>
+      </w:pPr>
+      <w:r>
+        <w:rPr>
+          <w:rFonts w:ascii="Arial" w:hAnsi="Arial" w:cs="Arial"/>
+          <w:color w:val="111111"/>
+        </w:rPr>
+        <w:t>Hay una gran cantidad de ofertas de capacitaciones técnicas tanto de nuevas tecnologías, metodologías ágiles e IDEs de inteligencia artificial que pueden ser aprovechadas para mejorar las tareas del área.</w:t>
+      </w:r>
+    </w:p>
+    <w:p>
+      <w:pPr>
+        <w:spacing w:before="200" w:after="60" w:line="240" w:lineRule="auto"/>
+        <w:rPr>
+          <w:rFonts w:ascii="Arial" w:hAnsi="Arial" w:cs="Arial"/>
+          <w:b/>
+          <w:color w:val="222222"/>
+        </w:rPr>
+      </w:pPr>
+      <w:r>
+        <w:rPr>
+          <w:rFonts w:ascii="Arial" w:hAnsi="Arial" w:cs="Arial"/>
+          <w:b/>
+          <w:color w:val="222222"/>
+        </w:rPr>
+        <w:t>Amenazas</w:t>
+      </w:r>
+    </w:p>
+    <w:p>
+      <w:pPr>
+        <w:spacing w:before="120" w:after="20" w:line="240" w:lineRule="auto"/>
+        <w:rPr>
+          <w:rFonts w:ascii="Arial" w:hAnsi="Arial" w:cs="Arial"/>
+          <w:b/>
+          <w:color w:val="111111"/>
+        </w:rPr>
+      </w:pPr>
+      <w:r>
+        <w:rPr>
+          <w:rFonts w:ascii="Arial" w:hAnsi="Arial" w:cs="Arial"/>
+          <w:b/>
+          <w:color w:val="111111"/>
+        </w:rPr>
+        <w:t>* Falta de una óptima integración entre sistemas legacy y nuevos aplicativos:</w:t>
+      </w:r>
+    </w:p>
+    <w:p>
+      <w:pPr>
+        <w:spacing w:before="40" w:after="120" w:line="240" w:lineRule="auto"/>
+        <w:jc w:val="both"/>
+        <w:rPr>
+          <w:rFonts w:ascii="Arial" w:hAnsi="Arial" w:cs="Arial"/>
+          <w:color w:val="111111"/>
+        </w:rPr>
+      </w:pPr>
+      <w:r>
+        <w:rPr>
+          <w:rFonts w:ascii="Arial" w:hAnsi="Arial" w:cs="Arial"/>
+          <w:color w:val="111111"/>
+        </w:rPr>
+        <w:t>Algunos sistemas duplican funciones debido a la imposibilidad de integrar la forma en que acceden a las bases de datos más antiguas con nuevos aplicativos, generando duplicación de funciones al no haber APIs o sistemas que unifiquen la consumición de estos datos.</w:t>
+      </w:r>
+    </w:p>
+    <w:p>
+      <w:pPr>
+        <w:spacing w:before="280" w:after="80" w:line="240" w:lineRule="auto"/>
+        <w:rPr>
+          <w:rFonts w:ascii="Arial" w:hAnsi="Arial" w:cs="Arial"/>
+          <w:b/>
+          <w:color w:val="1B365D"/>
+          <w:sz w:val="26"/>
+        </w:rPr>
+      </w:pPr>
+      <w:r>
+        <w:rPr>
+          <w:rFonts w:ascii="Arial" w:hAnsi="Arial" w:cs="Arial"/>
+          <w:b/>
+          <w:color w:val="1B365D"/>
+          <w:sz w:val="26"/>
+        </w:rPr>
+        <w:t>4. Objetivos</w:t>
+      </w:r>
+    </w:p>
+    <w:p>
+      <w:pPr>
+        <w:spacing w:before="200" w:after="60" w:line="240" w:lineRule="auto"/>
+        <w:rPr>
+          <w:rFonts w:ascii="Arial" w:hAnsi="Arial" w:cs="Arial"/>
+          <w:b/>
+          <w:color w:val="222222"/>
+        </w:rPr>
+      </w:pPr>
+      <w:r>
+        <w:rPr>
+          <w:rFonts w:ascii="Arial" w:hAnsi="Arial" w:cs="Arial"/>
+          <w:b/>
+          <w:color w:val="222222"/>
+        </w:rPr>
+        <w:t>4.1. Objetivo General</w:t>
+      </w:r>
+    </w:p>
+    <w:p>
+      <w:pPr>
+        <w:spacing w:before="40" w:after="120" w:line="240" w:lineRule="auto"/>
+        <w:jc w:val="both"/>
+        <w:rPr>
+          <w:rFonts w:ascii="Arial" w:hAnsi="Arial" w:cs="Arial"/>
+          <w:color w:val="111111"/>
+        </w:rPr>
+      </w:pPr>
+      <w:r>
+        <w:rPr>
+          <w:rFonts w:ascii="Arial" w:hAnsi="Arial" w:cs="Arial"/>
+          <w:color w:val="111111"/>
+        </w:rPr>
+        <w:t>Fortalecer la capacidad institucional del Departamento de Gestión, Desarrollo e Innovación en Sistemas de Software mediante una organización basada en equipos colaborativos, conocimiento compartido, procedimientos estandarizados y gobierno técnico, asegurando que el software municipal sea seguro, escalable y sostenible en el tiempo.</w:t>
+      </w:r>
+    </w:p>
+    <w:p>
+      <w:pPr>
+        <w:spacing w:before="200" w:after="60" w:line="240" w:lineRule="auto"/>
+        <w:rPr>
+          <w:rFonts w:ascii="Arial" w:hAnsi="Arial" w:cs="Arial"/>
+          <w:b/>
+          <w:color w:val="222222"/>
+        </w:rPr>
+      </w:pPr>
+      <w:r>
+        <w:rPr>
+          <w:rFonts w:ascii="Arial" w:hAnsi="Arial" w:cs="Arial"/>
+          <w:b/>
+          <w:color w:val="222222"/>
+        </w:rPr>
+        <w:t>4.2. Objetivos Específicos</w:t>
+      </w:r>
+    </w:p>
+    <w:p>
+      <w:pPr>
+        <w:spacing w:before="80" w:after="40" w:line="240" w:lineRule="auto"/>
+        <w:jc w:val="both"/>
+        <w:rPr>
+          <w:rFonts w:ascii="Arial" w:hAnsi="Arial" w:cs="Arial"/>
+          <w:color w:val="111111"/>
+        </w:rPr>
+      </w:pPr>
+      <w:r>
+        <w:rPr>
+          <w:rFonts w:ascii="Arial" w:hAnsi="Arial" w:cs="Arial"/>
+          <w:color w:val="111111"/>
+        </w:rPr>
+        <w:t>1. Estructurar un modelo de gestión ágil adaptativo (Kanban + Iteraciones) liderado activamente por la Jefatura.</w:t>
+      </w:r>
+    </w:p>
+    <w:p>
+      <w:pPr>
+        <w:spacing w:before="80" w:after="40" w:line="240" w:lineRule="auto"/>
+        <w:jc w:val="both"/>
+        <w:rPr>
+          <w:rFonts w:ascii="Arial" w:hAnsi="Arial" w:cs="Arial"/>
+          <w:color w:val="111111"/>
+        </w:rPr>
+      </w:pPr>
+      <w:r>
+        <w:rPr>
+          <w:rFonts w:ascii="Arial" w:hAnsi="Arial" w:cs="Arial"/>
+          <w:color w:val="111111"/>
+        </w:rPr>
+        <w:t>2. Eliminar los puntos únicos de falla (*Single Point of Failure*) mediante la asignación de **Referentes Secundarios** en todos los sistemas críticos.</w:t>
+      </w:r>
+    </w:p>
+    <w:p>
+      <w:pPr>
+        <w:spacing w:before="80" w:after="40" w:line="240" w:lineRule="auto"/>
+        <w:jc w:val="both"/>
+        <w:rPr>
+          <w:rFonts w:ascii="Arial" w:hAnsi="Arial" w:cs="Arial"/>
+          <w:color w:val="111111"/>
+        </w:rPr>
+      </w:pPr>
+      <w:r>
+        <w:rPr>
+          <w:rFonts w:ascii="Arial" w:hAnsi="Arial" w:cs="Arial"/>
+          <w:color w:val="111111"/>
+        </w:rPr>
+        <w:t>3. Desarticular el aislamiento operativo entre las oficinas físicas a través de canales de comunicación abierta y herramientas colaborativas.</w:t>
+      </w:r>
+    </w:p>
+    <w:p>
+      <w:pPr>
+        <w:spacing w:before="80" w:after="40" w:line="240" w:lineRule="auto"/>
+        <w:jc w:val="both"/>
+        <w:rPr>
+          <w:rFonts w:ascii="Arial" w:hAnsi="Arial" w:cs="Arial"/>
+          <w:color w:val="111111"/>
+        </w:rPr>
+      </w:pPr>
+      <w:r>
+        <w:rPr>
+          <w:rFonts w:ascii="Arial" w:hAnsi="Arial" w:cs="Arial"/>
+          <w:color w:val="111111"/>
+        </w:rPr>
+        <w:t>4. Institucionalizar el uso obligatorio del *template* de arquitectura base municipal y guías de buenas prácticas de programación.</w:t>
+      </w:r>
+    </w:p>
+    <w:p>
+      <w:pPr>
+        <w:spacing w:before="80" w:after="40" w:line="240" w:lineRule="auto"/>
+        <w:jc w:val="both"/>
+        <w:rPr>
+          <w:rFonts w:ascii="Arial" w:hAnsi="Arial" w:cs="Arial"/>
+          <w:color w:val="111111"/>
+        </w:rPr>
+      </w:pPr>
+      <w:r>
+        <w:rPr>
+          <w:rFonts w:ascii="Arial" w:hAnsi="Arial" w:cs="Arial"/>
+          <w:color w:val="111111"/>
+        </w:rPr>
+        <w:t>5. Establecer un protocolo estricto de **Gobierno Técnico de Proveedores Externos** para garantizar la soberanía del código y la documentación.</w:t>
+      </w:r>
+    </w:p>
+    <w:p>
+      <w:pPr>
+        <w:spacing w:before="80" w:after="40" w:line="240" w:lineRule="auto"/>
+        <w:jc w:val="both"/>
+        <w:rPr>
+          <w:rFonts w:ascii="Arial" w:hAnsi="Arial" w:cs="Arial"/>
+          <w:color w:val="111111"/>
+        </w:rPr>
+      </w:pPr>
+      <w:r>
+        <w:rPr>
+          <w:rFonts w:ascii="Arial" w:hAnsi="Arial" w:cs="Arial"/>
+          <w:color w:val="111111"/>
+        </w:rPr>
+        <w:t>6. Regular el uso de Inteligencia Artificial mediante pautas de seguridad (escenario real) y proyectar licencias corporativas (escenario ideal).</w:t>
+      </w:r>
+    </w:p>
+    <w:p>
+      <w:pPr>
+        <w:spacing w:before="280" w:after="80" w:line="240" w:lineRule="auto"/>
+        <w:rPr>
+          <w:rFonts w:ascii="Arial" w:hAnsi="Arial" w:cs="Arial"/>
+          <w:b/>
+          <w:color w:val="1B365D"/>
+          <w:sz w:val="26"/>
+        </w:rPr>
+      </w:pPr>
+      <w:r>
+        <w:rPr>
+          <w:rFonts w:ascii="Arial" w:hAnsi="Arial" w:cs="Arial"/>
+          <w:b/>
+          <w:color w:val="1B365D"/>
+          <w:sz w:val="26"/>
+        </w:rPr>
+        <w:t>5. Propuesta de Mejora y Optimización con Recursos Actuales (SIN PRESUPUESTO - Plan Realista)</w:t>
+      </w:r>
+    </w:p>
+    <w:p>
+      <w:pPr>
+        <w:spacing w:before="120" w:after="20" w:line="240" w:lineRule="auto"/>
+        <w:rPr>
+          <w:rFonts w:ascii="Arial" w:hAnsi="Arial" w:cs="Arial"/>
+          <w:b/>
+          <w:color w:val="111111"/>
+        </w:rPr>
+      </w:pPr>
+      <w:r>
+        <w:rPr>
+          <w:rFonts w:ascii="Arial" w:hAnsi="Arial" w:cs="Arial"/>
+          <w:b/>
+          <w:color w:val="111111"/>
+        </w:rPr>
+        <w:t>Esta sección constituye el corazón operativo del plan a corto plazo. Agrupa todas las iniciativas procedimentales y organizacionales que se implementarán **utilizando exclusivamente el capital humano y las herramientas existentes (Costo $0)**, transformando los procedimientos en la columna vertebral del departamento:</w:t>
+      </w:r>
+    </w:p>
+    <w:p>
+      <w:pPr>
+        <w:spacing w:before="200" w:after="60" w:line="240" w:lineRule="auto"/>
+        <w:rPr>
+          <w:rFonts w:ascii="Arial" w:hAnsi="Arial" w:cs="Arial"/>
+          <w:b/>
+          <w:color w:val="222222"/>
+        </w:rPr>
+      </w:pPr>
+      <w:r>
+        <w:rPr>
+          <w:rFonts w:ascii="Arial" w:hAnsi="Arial" w:cs="Arial"/>
+          <w:b/>
+          <w:color w:val="222222"/>
+        </w:rPr>
+        <w:t>1. Implementación de Agilidad Adaptativa y Liderazgo Híbrido de la Jefatura</w:t>
+      </w:r>
+    </w:p>
+    <w:p>
+      <w:pPr>
         <w:spacing w:before="40" w:after="40" w:line="240" w:lineRule="auto"/>
         <w:ind w:left="360"/>
         <w:jc w:val="both"/>
@@ -781,24 +1627,25 @@
           <w:rFonts w:ascii="Arial" w:hAnsi="Arial" w:cs="Arial"/>
           <w:color w:val="111111"/>
         </w:rPr>
-        <w:t>•  Personal Técnico Capacitado:</w:t>
-      </w:r>
-    </w:p>
-    <w:p>
-      <w:pPr>
-        <w:spacing w:before="60" w:after="60" w:line="240" w:lineRule="auto"/>
-        <w:jc w:val="both"/>
-        <w:rPr>
-          <w:rFonts w:ascii="Arial" w:hAnsi="Arial" w:cs="Arial"/>
-          <w:color w:val="111111"/>
-        </w:rPr>
-      </w:pPr>
-      <w:r>
-        <w:rPr>
-          <w:rFonts w:ascii="Arial" w:hAnsi="Arial" w:cs="Arial"/>
-          <w:color w:val="111111"/>
-        </w:rPr>
-        <w:t>El Departamento dispone de un plantel técnico capacitado que pueden realizar tareas de relevamiento analítico, desarrollo y testing de aplicaciones además de conocer las normativas, circuitos administrativos, trámites y reglas operativas de la administración pública local.</w:t>
+        <w:t>•    **Modelo Híbrido (Kanban + Iteraciones Cortas):** Se aplicará *Kanban* para ordenar el mantenimiento continuo e incidencias de sistemas *legacy*, e *iteraciones cortas* (Sprints) para nuevos desarrollos. No se impondrá Scrum de forma rígida a todo el personal.</w:t>
+      </w:r>
+    </w:p>
+    <w:p>
+      <w:pPr>
+        <w:spacing w:before="120" w:after="20" w:line="240" w:lineRule="auto"/>
+        <w:rPr>
+          <w:rFonts w:ascii="Arial" w:hAnsi="Arial" w:cs="Arial"/>
+          <w:b/>
+          <w:color w:val="111111"/>
+        </w:rPr>
+      </w:pPr>
+      <w:r>
+        <w:rPr>
+          <w:rFonts w:ascii="Arial" w:hAnsi="Arial" w:cs="Arial"/>
+          <w:b/>
+          <w:color w:val="111111"/>
+        </w:rPr>
+        <w:t>*   **El Jefe de Departamento como *Scrum Master Global* y Gestor Gerencial:** La Jefatura asumirá un doble rol activo:</w:t>
       </w:r>
     </w:p>
     <w:p>
@@ -816,42 +1663,7 @@
           <w:rFonts w:ascii="Arial" w:hAnsi="Arial" w:cs="Arial"/>
           <w:color w:val="111111"/>
         </w:rPr>
-        <w:t>•  Disponibilidad de medios:</w:t>
-      </w:r>
-    </w:p>
-    <w:p>
-      <w:pPr>
-        <w:spacing w:before="60" w:after="60" w:line="240" w:lineRule="auto"/>
-        <w:jc w:val="both"/>
-        <w:rPr>
-          <w:rFonts w:ascii="Arial" w:hAnsi="Arial" w:cs="Arial"/>
-          <w:color w:val="111111"/>
-        </w:rPr>
-      </w:pPr>
-      <w:r>
-        <w:rPr>
-          <w:rFonts w:ascii="Arial" w:hAnsi="Arial" w:cs="Arial"/>
-          <w:color w:val="111111"/>
-        </w:rPr>
-        <w:t>Se cuenta con el suficiente mobiliario y herramientas técnicas para llevar a cabo la Misión y Funciones del Departamento.</w:t>
-      </w:r>
-    </w:p>
-    <w:p>
-      <w:pPr>
-        <w:spacing w:before="200" w:after="60" w:line="240" w:lineRule="auto"/>
-        <w:rPr>
-          <w:rFonts w:ascii="Arial" w:hAnsi="Arial" w:cs="Arial"/>
-          <w:b/>
-          <w:color w:val="222222"/>
-        </w:rPr>
-      </w:pPr>
-      <w:r>
-        <w:rPr>
-          <w:rFonts w:ascii="Arial" w:hAnsi="Arial" w:cs="Arial"/>
-          <w:b/>
-          <w:color w:val="222222"/>
-        </w:rPr>
-        <w:t>Debilidades</w:t>
+        <w:t>•    *Como Scrum Master Global:* Orquestará operativamente las células, destrabará bloqueos diarios, facilitará la comunicación entre las dos oficinas físicas y **actuará como filtro coordinador para evitar el desarrollo de funcionalidades duplicadas**.</w:t>
       </w:r>
     </w:p>
     <w:p>
@@ -869,24 +1681,7 @@
           <w:rFonts w:ascii="Arial" w:hAnsi="Arial" w:cs="Arial"/>
           <w:color w:val="111111"/>
         </w:rPr>
-        <w:t>•  Fragmentación Tecnológica:</w:t>
-      </w:r>
-    </w:p>
-    <w:p>
-      <w:pPr>
-        <w:spacing w:before="60" w:after="60" w:line="240" w:lineRule="auto"/>
-        <w:jc w:val="both"/>
-        <w:rPr>
-          <w:rFonts w:ascii="Arial" w:hAnsi="Arial" w:cs="Arial"/>
-          <w:color w:val="111111"/>
-        </w:rPr>
-      </w:pPr>
-      <w:r>
-        <w:rPr>
-          <w:rFonts w:ascii="Arial" w:hAnsi="Arial" w:cs="Arial"/>
-          <w:color w:val="111111"/>
-        </w:rPr>
-        <w:t>Coexistencia caótica de tecnologías obsoletas y sin soporte actual (WebForms con SQL 2005) junto a tecnologías modernas (.NET, React, Angular, PHP, PostgreSQL).</w:t>
+        <w:t>•    *Como Gestor Gerencial:* Evaluará el rendimiento global del departamento, medirá la capacidad operativa en Redmine y garantizará la alineación estratégica con las autoridades.</w:t>
       </w:r>
     </w:p>
     <w:p>
@@ -904,24 +1699,25 @@
           <w:rFonts w:ascii="Arial" w:hAnsi="Arial" w:cs="Arial"/>
           <w:color w:val="111111"/>
         </w:rPr>
-        <w:t>•  Falta de una Arquitectura Base Estandarizada:</w:t>
-      </w:r>
-    </w:p>
-    <w:p>
-      <w:pPr>
-        <w:spacing w:before="60" w:after="60" w:line="240" w:lineRule="auto"/>
-        <w:jc w:val="both"/>
-        <w:rPr>
-          <w:rFonts w:ascii="Arial" w:hAnsi="Arial" w:cs="Arial"/>
-          <w:color w:val="111111"/>
-        </w:rPr>
-      </w:pPr>
-      <w:r>
-        <w:rPr>
-          <w:rFonts w:ascii="Arial" w:hAnsi="Arial" w:cs="Arial"/>
-          <w:color w:val="111111"/>
-        </w:rPr>
-        <w:t>Ausencia de una arquitectura base de cumplimiento obligatorio a modo de "template" para uniformar las aplicaciones y de esta forma facilitar el desarrollo de los sistemas y la rotación de programadores entre distintos sistemas.</w:t>
+        <w:t>•    **El "Product Owner" Institucional:** El rol de *Product Owner* recaerá en los referentes o jefaturas de las Secretarías usuarias solicitantes, quienes serán responsables de priorizar su propio *Backlog* de necesidades.</w:t>
+      </w:r>
+    </w:p>
+    <w:p>
+      <w:pPr>
+        <w:spacing w:before="200" w:after="60" w:line="240" w:lineRule="auto"/>
+        <w:rPr>
+          <w:rFonts w:ascii="Arial" w:hAnsi="Arial" w:cs="Arial"/>
+          <w:b/>
+          <w:color w:val="222222"/>
+        </w:rPr>
+      </w:pPr>
+      <w:r>
+        <w:rPr>
+          <w:rFonts w:ascii="Arial" w:hAnsi="Arial" w:cs="Arial"/>
+          <w:b/>
+          <w:color w:val="222222"/>
+        </w:rPr>
+        <w:t>2. Integración Operativa y Mitigación de Riesgos (Referentes Secundarios)</w:t>
       </w:r>
     </w:p>
     <w:p>
@@ -939,24 +1735,7 @@
           <w:rFonts w:ascii="Arial" w:hAnsi="Arial" w:cs="Arial"/>
           <w:color w:val="111111"/>
         </w:rPr>
-        <w:t>•  Multitarea Extrema y Conocimiento Concentrado:</w:t>
-      </w:r>
-    </w:p>
-    <w:p>
-      <w:pPr>
-        <w:spacing w:before="60" w:after="60" w:line="240" w:lineRule="auto"/>
-        <w:jc w:val="both"/>
-        <w:rPr>
-          <w:rFonts w:ascii="Arial" w:hAnsi="Arial" w:cs="Arial"/>
-          <w:color w:val="111111"/>
-        </w:rPr>
-      </w:pPr>
-      <w:r>
-        <w:rPr>
-          <w:rFonts w:ascii="Arial" w:hAnsi="Arial" w:cs="Arial"/>
-          <w:color w:val="111111"/>
-        </w:rPr>
-        <w:t>La escasa dotación frente a la alta demanda obliga al personal a atender simultáneamente emergencias de sistemas antiguos de diversas áreas y desarrollos nuevos. Esto genera saltos de contextos constantes y un alto riesgo operativo: la existencia de sistemas críticos que dependen del conocimiento exclusivo de una sola persona.</w:t>
+        <w:t>•    **Comunicación Abierta entre Oficinas:** Se mantendrá la distribución física en dos dependencias, pero se erradicará el aislamiento *operativo* mediante ceremonias ágiles conjuntas (Dailies de 15 min, Plannings) y uso unificado de repositorios.</w:t>
       </w:r>
     </w:p>
     <w:p>
@@ -974,24 +1753,25 @@
           <w:rFonts w:ascii="Arial" w:hAnsi="Arial" w:cs="Arial"/>
           <w:color w:val="111111"/>
         </w:rPr>
-        <w:t>•  Aislamiento Operativo entre Dependencias:</w:t>
-      </w:r>
-    </w:p>
-    <w:p>
-      <w:pPr>
-        <w:spacing w:before="60" w:after="60" w:line="240" w:lineRule="auto"/>
-        <w:jc w:val="both"/>
-        <w:rPr>
-          <w:rFonts w:ascii="Arial" w:hAnsi="Arial" w:cs="Arial"/>
-          <w:color w:val="111111"/>
-        </w:rPr>
-      </w:pPr>
-      <w:r>
-        <w:rPr>
-          <w:rFonts w:ascii="Arial" w:hAnsi="Arial" w:cs="Arial"/>
-          <w:color w:val="111111"/>
-        </w:rPr>
-        <w:t>La distribución física del personal en dos oficinas distintas y sin un agente que coordine ambas, genera descoordinación, aislamiento en silos de información y el riesgo de desarrollar funcionalidades duplicadas por falta de comunicación.</w:t>
+        <w:t>•    **Asignación Dinámica y "Referentes Secundarios":** Para terminar con la dependencia de una sola persona en sistemas críticos, se implementará la figura del *Referente Secundario*. Mediante la asignación dinámica por fases (*shadowing* y capacitación cruzada), un programador acompañará al referente principal en tareas de mantenimiento y análisis, logrando la transferencia práctica del conocimiento sin tocar el escalafón.</w:t>
+      </w:r>
+    </w:p>
+    <w:p>
+      <w:pPr>
+        <w:spacing w:before="200" w:after="60" w:line="240" w:lineRule="auto"/>
+        <w:rPr>
+          <w:rFonts w:ascii="Arial" w:hAnsi="Arial" w:cs="Arial"/>
+          <w:b/>
+          <w:color w:val="222222"/>
+        </w:rPr>
+      </w:pPr>
+      <w:r>
+        <w:rPr>
+          <w:rFonts w:ascii="Arial" w:hAnsi="Arial" w:cs="Arial"/>
+          <w:b/>
+          <w:color w:val="222222"/>
+        </w:rPr>
+        <w:t>3. Estandarización de Código y Buenas Prácticas (Sin Herramientas Automatizadas)</w:t>
       </w:r>
     </w:p>
     <w:p>
@@ -1009,24 +1789,7 @@
           <w:rFonts w:ascii="Arial" w:hAnsi="Arial" w:cs="Arial"/>
           <w:color w:val="111111"/>
         </w:rPr>
-        <w:t>•  Estimación y Seguimiento Caóticos:</w:t>
-      </w:r>
-    </w:p>
-    <w:p>
-      <w:pPr>
-        <w:spacing w:before="60" w:after="60" w:line="240" w:lineRule="auto"/>
-        <w:jc w:val="both"/>
-        <w:rPr>
-          <w:rFonts w:ascii="Arial" w:hAnsi="Arial" w:cs="Arial"/>
-          <w:color w:val="111111"/>
-        </w:rPr>
-      </w:pPr>
-      <w:r>
-        <w:rPr>
-          <w:rFonts w:ascii="Arial" w:hAnsi="Arial" w:cs="Arial"/>
-          <w:color w:val="111111"/>
-        </w:rPr>
-        <w:t>Uso fragmentado de herramientas para documentar el avance de los proyectos (algunos agentes usan Redmine, otros planillas desactualizadas en Excel o registros informales), impidiendo conocer la capacidad operativa real del departamento.</w:t>
+        <w:t>•    Dado que actualmente no se cuenta con herramientas de revisión automatizada y la revisión manual cruzada entre pares sobrecargaría a los programadores Senior, la calidad se asegurará **definiendo y exigiendo buenas prácticas de programación y guías de estilo obligatorias**.</w:t>
       </w:r>
     </w:p>
     <w:p>
@@ -1044,24 +1807,43 @@
           <w:rFonts w:ascii="Arial" w:hAnsi="Arial" w:cs="Arial"/>
           <w:color w:val="111111"/>
         </w:rPr>
-        <w:t>•  Documentación Inexistente o Desigual:</w:t>
-      </w:r>
-    </w:p>
-    <w:p>
-      <w:pPr>
-        <w:spacing w:before="60" w:after="60" w:line="240" w:lineRule="auto"/>
-        <w:jc w:val="both"/>
-        <w:rPr>
-          <w:rFonts w:ascii="Arial" w:hAnsi="Arial" w:cs="Arial"/>
-          <w:color w:val="111111"/>
-        </w:rPr>
-      </w:pPr>
-      <w:r>
-        <w:rPr>
-          <w:rFonts w:ascii="Arial" w:hAnsi="Arial" w:cs="Arial"/>
-          <w:color w:val="111111"/>
-        </w:rPr>
-        <w:t>Falta de manuales de relevamiento, técnicos o registros de arquitectura, profundizando la dependencia de programadores específicos.</w:t>
+        <w:t>•    **Obligatoriedad del Template de Arquitectura Base:** Se establecerá como norma inquebrantable que todo nuevo desarrollo o refactorización relevante deba construirse sobre la arquitectura base desarrollada en la Municipalidad. Ningún desarrollo nuevo podrá iniciarse en tecnologías obsoletas (*Congelamiento Legacy*).</w:t>
+      </w:r>
+    </w:p>
+    <w:p>
+      <w:pPr>
+        <w:spacing w:before="200" w:after="60" w:line="240" w:lineRule="auto"/>
+        <w:rPr>
+          <w:rFonts w:ascii="Arial" w:hAnsi="Arial" w:cs="Arial"/>
+          <w:b/>
+          <w:color w:val="222222"/>
+        </w:rPr>
+      </w:pPr>
+      <w:r>
+        <w:rPr>
+          <w:rFonts w:ascii="Arial" w:hAnsi="Arial" w:cs="Arial"/>
+          <w:b/>
+          <w:color w:val="222222"/>
+        </w:rPr>
+        <w:t>4. Control y Recepción Técnica de Software Tercerizado</w:t>
+      </w:r>
+    </w:p>
+    <w:p>
+      <w:pPr>
+        <w:spacing w:before="120" w:after="20" w:line="240" w:lineRule="auto"/>
+        <w:rPr>
+          <w:rFonts w:ascii="Arial" w:hAnsi="Arial" w:cs="Arial"/>
+          <w:b/>
+          <w:color w:val="111111"/>
+        </w:rPr>
+      </w:pPr>
+      <w:r>
+        <w:rPr>
+          <w:rFonts w:ascii="Arial" w:hAnsi="Arial" w:cs="Arial"/>
+          <w:b/>
+          <w:color w:val="111111"/>
+        </w:rPr>
+        <w:t>*   La contratación externa de software no debe significar la pérdida de control técnico por parte del departamento. Se establecerán pautas procedimentales donde todo proveedor deba:</w:t>
       </w:r>
     </w:p>
     <w:p>
@@ -1079,24 +1861,7 @@
           <w:rFonts w:ascii="Arial" w:hAnsi="Arial" w:cs="Arial"/>
           <w:color w:val="111111"/>
         </w:rPr>
-        <w:t>•  Pruebas de Software Reactivas:</w:t>
-      </w:r>
-    </w:p>
-    <w:p>
-      <w:pPr>
-        <w:spacing w:before="60" w:after="60" w:line="240" w:lineRule="auto"/>
-        <w:jc w:val="both"/>
-        <w:rPr>
-          <w:rFonts w:ascii="Arial" w:hAnsi="Arial" w:cs="Arial"/>
-          <w:color w:val="111111"/>
-        </w:rPr>
-      </w:pPr>
-      <w:r>
-        <w:rPr>
-          <w:rFonts w:ascii="Arial" w:hAnsi="Arial" w:cs="Arial"/>
-          <w:color w:val="111111"/>
-        </w:rPr>
-        <w:t>Al no existir el rol de QA (Quality Assurance) ni herramientas de testeo estandarizadas, la verificación de errores depende de los propios desarrolladores o de los usuarios de los aplicativos.</w:t>
+        <w:t>•    Alinear su desarrollo a los estándares de arquitectura del Municipio.</w:t>
       </w:r>
     </w:p>
     <w:p>
@@ -1114,42 +1879,7 @@
           <w:rFonts w:ascii="Arial" w:hAnsi="Arial" w:cs="Arial"/>
           <w:color w:val="111111"/>
         </w:rPr>
-        <w:t>•  Resistencia al cambio:</w:t>
-      </w:r>
-    </w:p>
-    <w:p>
-      <w:pPr>
-        <w:spacing w:before="60" w:after="60" w:line="240" w:lineRule="auto"/>
-        <w:jc w:val="both"/>
-        <w:rPr>
-          <w:rFonts w:ascii="Arial" w:hAnsi="Arial" w:cs="Arial"/>
-          <w:color w:val="111111"/>
-        </w:rPr>
-      </w:pPr>
-      <w:r>
-        <w:rPr>
-          <w:rFonts w:ascii="Arial" w:hAnsi="Arial" w:cs="Arial"/>
-          <w:color w:val="111111"/>
-        </w:rPr>
-        <w:t>Algunos agentes se rehúsan a aprender nuevas tecnologías y mejorar las formas de desarrollo, insistiendo en utilizar lenguajes o arquitecturas obsoletas, generando conflictos en la optimización de las bases de datos.</w:t>
-      </w:r>
-    </w:p>
-    <w:p>
-      <w:pPr>
-        <w:spacing w:before="200" w:after="60" w:line="240" w:lineRule="auto"/>
-        <w:rPr>
-          <w:rFonts w:ascii="Arial" w:hAnsi="Arial" w:cs="Arial"/>
-          <w:b/>
-          <w:color w:val="222222"/>
-        </w:rPr>
-      </w:pPr>
-      <w:r>
-        <w:rPr>
-          <w:rFonts w:ascii="Arial" w:hAnsi="Arial" w:cs="Arial"/>
-          <w:b/>
-          <w:color w:val="222222"/>
-        </w:rPr>
-        <w:t>Oportunidades</w:t>
+        <w:t>•    Entregar obligatoriamente código fuente, manuales técnicos y diccionarios de datos actualizados.</w:t>
       </w:r>
     </w:p>
     <w:p>
@@ -1167,24 +1897,43 @@
           <w:rFonts w:ascii="Arial" w:hAnsi="Arial" w:cs="Arial"/>
           <w:color w:val="111111"/>
         </w:rPr>
-        <w:t>•  Adopción de Inteligencia Artificial para Agilizar la Producción:</w:t>
-      </w:r>
-    </w:p>
-    <w:p>
-      <w:pPr>
-        <w:spacing w:before="60" w:after="60" w:line="240" w:lineRule="auto"/>
-        <w:jc w:val="both"/>
-        <w:rPr>
-          <w:rFonts w:ascii="Arial" w:hAnsi="Arial" w:cs="Arial"/>
-          <w:color w:val="111111"/>
-        </w:rPr>
-      </w:pPr>
-      <w:r>
-        <w:rPr>
-          <w:rFonts w:ascii="Arial" w:hAnsi="Arial" w:cs="Arial"/>
-          <w:color w:val="111111"/>
-        </w:rPr>
-        <w:t>Oportunidad de incorporar herramientas asistidas por IA (asistentes en los IDEs) para acelerar la codificación, automatizar tareas repetitivas de documentación, y aumentar la productividad general del departamento.</w:t>
+        <w:t>•    Someterse a pruebas de recepción validadas por el personal técnico del Departamento antes de la aceptación final.</w:t>
+      </w:r>
+    </w:p>
+    <w:p>
+      <w:pPr>
+        <w:spacing w:before="200" w:after="60" w:line="240" w:lineRule="auto"/>
+        <w:rPr>
+          <w:rFonts w:ascii="Arial" w:hAnsi="Arial" w:cs="Arial"/>
+          <w:b/>
+          <w:color w:val="222222"/>
+        </w:rPr>
+      </w:pPr>
+      <w:r>
+        <w:rPr>
+          <w:rFonts w:ascii="Arial" w:hAnsi="Arial" w:cs="Arial"/>
+          <w:b/>
+          <w:color w:val="222222"/>
+        </w:rPr>
+        <w:t>5. Pautas para el Uso e Integración de Inteligencia Artificial para Agilizar la Producción</w:t>
+      </w:r>
+    </w:p>
+    <w:p>
+      <w:pPr>
+        <w:spacing w:before="120" w:after="20" w:line="240" w:lineRule="auto"/>
+        <w:rPr>
+          <w:rFonts w:ascii="Arial" w:hAnsi="Arial" w:cs="Arial"/>
+          <w:b/>
+          <w:color w:val="111111"/>
+        </w:rPr>
+      </w:pPr>
+      <w:r>
+        <w:rPr>
+          <w:rFonts w:ascii="Arial" w:hAnsi="Arial" w:cs="Arial"/>
+          <w:b/>
+          <w:color w:val="111111"/>
+        </w:rPr>
+        <w:t>*   Para aprovechar el potencial de la IA en la aceleración de desarrollos sin comprometer la seguridad institucional:</w:t>
       </w:r>
     </w:p>
     <w:p>
@@ -1202,24 +1951,7 @@
           <w:rFonts w:ascii="Arial" w:hAnsi="Arial" w:cs="Arial"/>
           <w:color w:val="111111"/>
         </w:rPr>
-        <w:t>•  Adopción de Marcos Ágiles Híbridos:</w:t>
-      </w:r>
-    </w:p>
-    <w:p>
-      <w:pPr>
-        <w:spacing w:before="60" w:after="60" w:line="240" w:lineRule="auto"/>
-        <w:jc w:val="both"/>
-        <w:rPr>
-          <w:rFonts w:ascii="Arial" w:hAnsi="Arial" w:cs="Arial"/>
-          <w:color w:val="111111"/>
-        </w:rPr>
-      </w:pPr>
-      <w:r>
-        <w:rPr>
-          <w:rFonts w:ascii="Arial" w:hAnsi="Arial" w:cs="Arial"/>
-          <w:color w:val="111111"/>
-        </w:rPr>
-        <w:t>Implementación de metodologías ágiles adaptadas a la realidad municipal a costo cero para mejorar y agilizar los procesos de desarrollo.</w:t>
+        <w:t>•    Se guiará al equipo en el uso de herramientas de IA como asistentes de código para optimizar tiempos de desarrollo y documentación.</w:t>
       </w:r>
     </w:p>
     <w:p>
@@ -1237,24 +1969,63 @@
           <w:rFonts w:ascii="Arial" w:hAnsi="Arial" w:cs="Arial"/>
           <w:color w:val="111111"/>
         </w:rPr>
-        <w:t>•  Estandarización mediante la Arquitectura Base:</w:t>
-      </w:r>
-    </w:p>
-    <w:p>
-      <w:pPr>
-        <w:spacing w:before="60" w:after="60" w:line="240" w:lineRule="auto"/>
-        <w:jc w:val="both"/>
-        <w:rPr>
-          <w:rFonts w:ascii="Arial" w:hAnsi="Arial" w:cs="Arial"/>
-          <w:color w:val="111111"/>
-        </w:rPr>
-      </w:pPr>
-      <w:r>
-        <w:rPr>
-          <w:rFonts w:ascii="Arial" w:hAnsi="Arial" w:cs="Arial"/>
-          <w:color w:val="111111"/>
-        </w:rPr>
-        <w:t>Implementar una arquitectura base a modo de “template” como norma obligatoria para todos los desarrollos y de esa manera unificar las metodologías y mantener una coherencia en las tecnologías utilizadas.</w:t>
+        <w:t>•    Se fijará la pauta clara de no introducir datos personales de ciudadanos ni credenciales sensibles en servicios públicos de IA.</w:t>
+      </w:r>
+    </w:p>
+    <w:p>
+      <w:pPr>
+        <w:spacing w:before="280" w:after="80" w:line="240" w:lineRule="auto"/>
+        <w:rPr>
+          <w:rFonts w:ascii="Arial" w:hAnsi="Arial" w:cs="Arial"/>
+          <w:b/>
+          <w:color w:val="1B365D"/>
+          <w:sz w:val="26"/>
+        </w:rPr>
+      </w:pPr>
+      <w:r>
+        <w:rPr>
+          <w:rFonts w:ascii="Arial" w:hAnsi="Arial" w:cs="Arial"/>
+          <w:b/>
+          <w:color w:val="1B365D"/>
+          <w:sz w:val="26"/>
+        </w:rPr>
+        <w:t>6. Proyección con Incorporación de Recursos (CON PRESUPUESTO - Plan Proyectado a Mediano/Largo Plazo)</w:t>
+      </w:r>
+    </w:p>
+    <w:p>
+      <w:pPr>
+        <w:spacing w:before="120" w:after="20" w:line="240" w:lineRule="auto"/>
+        <w:rPr>
+          <w:rFonts w:ascii="Arial" w:hAnsi="Arial" w:cs="Arial"/>
+          <w:b/>
+          <w:color w:val="111111"/>
+        </w:rPr>
+      </w:pPr>
+      <w:r>
+        <w:rPr>
+          <w:rFonts w:ascii="Arial" w:hAnsi="Arial" w:cs="Arial"/>
+          <w:b/>
+          <w:color w:val="111111"/>
+        </w:rPr>
+        <w:t>Esta sección contempla la evolución tecnológica y la innovación del departamento a través de una inversión presupuestaria escalonada y justificada en necesidades concretas:</w:t>
+      </w:r>
+    </w:p>
+    <w:p>
+      <w:pPr>
+        <w:spacing w:before="200" w:after="60" w:line="240" w:lineRule="auto"/>
+        <w:rPr>
+          <w:rFonts w:ascii="Arial" w:hAnsi="Arial" w:cs="Arial"/>
+          <w:b/>
+          <w:color w:val="222222"/>
+        </w:rPr>
+      </w:pPr>
+      <w:r>
+        <w:rPr>
+          <w:rFonts w:ascii="Arial" w:hAnsi="Arial" w:cs="Arial"/>
+          <w:b/>
+          <w:color w:val="222222"/>
+        </w:rPr>
+        <w:t>1. Herramientas Tecnológicas y Licencias Corporativas</w:t>
       </w:r>
     </w:p>
     <w:p>
@@ -1272,24 +2043,7 @@
           <w:rFonts w:ascii="Arial" w:hAnsi="Arial" w:cs="Arial"/>
           <w:color w:val="111111"/>
         </w:rPr>
-        <w:t>•  Gestión Política favorable:</w:t>
-      </w:r>
-    </w:p>
-    <w:p>
-      <w:pPr>
-        <w:spacing w:before="60" w:after="60" w:line="240" w:lineRule="auto"/>
-        <w:jc w:val="both"/>
-        <w:rPr>
-          <w:rFonts w:ascii="Arial" w:hAnsi="Arial" w:cs="Arial"/>
-          <w:color w:val="111111"/>
-        </w:rPr>
-      </w:pPr>
-      <w:r>
-        <w:rPr>
-          <w:rFonts w:ascii="Arial" w:hAnsi="Arial" w:cs="Arial"/>
-          <w:color w:val="111111"/>
-        </w:rPr>
-        <w:t>La gestión actual tiene intención de optimizar y modernizar las funciones del Departamento.</w:t>
+        <w:t>•    **Licencias Corporativas de IA para IDEs (ej. GitHub Copilot / Tabnine):** Adquisición de licencias corporativas oficiales administradas por el Municipio, garantizando entornos seguros, privados y con tokens oficiales para aumentar drásticamente la productividad del equipo.</w:t>
       </w:r>
     </w:p>
     <w:p>
@@ -1307,42 +2061,7 @@
           <w:rFonts w:ascii="Arial" w:hAnsi="Arial" w:cs="Arial"/>
           <w:color w:val="111111"/>
         </w:rPr>
-        <w:t>•  Capacitaciones disponibles y accesibles:</w:t>
-      </w:r>
-    </w:p>
-    <w:p>
-      <w:pPr>
-        <w:spacing w:before="60" w:after="60" w:line="240" w:lineRule="auto"/>
-        <w:jc w:val="both"/>
-        <w:rPr>
-          <w:rFonts w:ascii="Arial" w:hAnsi="Arial" w:cs="Arial"/>
-          <w:color w:val="111111"/>
-        </w:rPr>
-      </w:pPr>
-      <w:r>
-        <w:rPr>
-          <w:rFonts w:ascii="Arial" w:hAnsi="Arial" w:cs="Arial"/>
-          <w:color w:val="111111"/>
-        </w:rPr>
-        <w:t>Hay una gran cantidad de ofertas de capacitaciones técnicas tanto de nuevas tecnologías, metodologías ágiles e IDEs de inteligencia artificial que pueden ser aprovechadas para mejorar las tareas del área.</w:t>
-      </w:r>
-    </w:p>
-    <w:p>
-      <w:pPr>
-        <w:spacing w:before="200" w:after="60" w:line="240" w:lineRule="auto"/>
-        <w:rPr>
-          <w:rFonts w:ascii="Arial" w:hAnsi="Arial" w:cs="Arial"/>
-          <w:b/>
-          <w:color w:val="222222"/>
-        </w:rPr>
-      </w:pPr>
-      <w:r>
-        <w:rPr>
-          <w:rFonts w:ascii="Arial" w:hAnsi="Arial" w:cs="Arial"/>
-          <w:b/>
-          <w:color w:val="222222"/>
-        </w:rPr>
-        <w:t>Amenazas</w:t>
+        <w:t>•    **Plataformas de Control Automático de Calidad (ej. SonarQube):** Adquisición de licencias para herramientas de análisis estático que verifiquen automáticamente el cumplimiento de las guías de estilo y detecten deudas técnicas o vulnerabilidades antes de la entrega.</w:t>
       </w:r>
     </w:p>
     <w:p>
@@ -1360,24 +2079,79 @@
           <w:rFonts w:ascii="Arial" w:hAnsi="Arial" w:cs="Arial"/>
           <w:color w:val="111111"/>
         </w:rPr>
-        <w:t>•  Falta de una óptima integración entre sistemas legacy y nuevos aplicativos:</w:t>
-      </w:r>
-    </w:p>
-    <w:p>
-      <w:pPr>
-        <w:spacing w:before="60" w:after="60" w:line="240" w:lineRule="auto"/>
-        <w:jc w:val="both"/>
-        <w:rPr>
-          <w:rFonts w:ascii="Arial" w:hAnsi="Arial" w:cs="Arial"/>
-          <w:color w:val="111111"/>
-        </w:rPr>
-      </w:pPr>
-      <w:r>
-        <w:rPr>
-          <w:rFonts w:ascii="Arial" w:hAnsi="Arial" w:cs="Arial"/>
-          <w:color w:val="111111"/>
-        </w:rPr>
-        <w:t>Algunos sistemas duplican funciones debido a la imposibilidad de integrar la forma en que acceden a las bases de datos más antiguas con nuevos aplicativos, generando duplicación de funciones al no haber APIs o sistemas que unifiquen la consumición de estos datos.</w:t>
+        <w:t>•    **Migración e Infraestructura en Contenedores (Docker):** Asignación de presupuesto y tiempo operativo para migrar paulatinamente sistemas *legacy* hacia entornos *Dockerizados*. Esto facilitará la labor del Departamento de Infraestructura/Redes (encargado exclusivo de los despliegues y DevOps), entregándoles paquetes estandarizados.</w:t>
+      </w:r>
+    </w:p>
+    <w:p>
+      <w:pPr>
+        <w:spacing w:before="200" w:after="60" w:line="240" w:lineRule="auto"/>
+        <w:rPr>
+          <w:rFonts w:ascii="Arial" w:hAnsi="Arial" w:cs="Arial"/>
+          <w:b/>
+          <w:color w:val="222222"/>
+        </w:rPr>
+      </w:pPr>
+      <w:r>
+        <w:rPr>
+          <w:rFonts w:ascii="Arial" w:hAnsi="Arial" w:cs="Arial"/>
+          <w:b/>
+          <w:color w:val="222222"/>
+        </w:rPr>
+        <w:t>2. Capacitación Continua Formal</w:t>
+      </w:r>
+    </w:p>
+    <w:p>
+      <w:pPr>
+        <w:spacing w:before="40" w:after="40" w:line="240" w:lineRule="auto"/>
+        <w:ind w:left="360"/>
+        <w:jc w:val="both"/>
+        <w:rPr>
+          <w:rFonts w:ascii="Arial" w:hAnsi="Arial" w:cs="Arial"/>
+          <w:color w:val="111111"/>
+        </w:rPr>
+      </w:pPr>
+      <w:r>
+        <w:rPr>
+          <w:rFonts w:ascii="Arial" w:hAnsi="Arial" w:cs="Arial"/>
+          <w:color w:val="111111"/>
+        </w:rPr>
+        <w:t>•    Financiamiento de cursos de formación profesional en **Arquitecturas Limpias (*Clean Architecture*)**, Patrones de Diseño, Microservicios y APIs REST.</w:t>
+      </w:r>
+    </w:p>
+    <w:p>
+      <w:pPr>
+        <w:spacing w:before="200" w:after="60" w:line="240" w:lineRule="auto"/>
+        <w:rPr>
+          <w:rFonts w:ascii="Arial" w:hAnsi="Arial" w:cs="Arial"/>
+          <w:b/>
+          <w:color w:val="222222"/>
+        </w:rPr>
+      </w:pPr>
+      <w:r>
+        <w:rPr>
+          <w:rFonts w:ascii="Arial" w:hAnsi="Arial" w:cs="Arial"/>
+          <w:b/>
+          <w:color w:val="222222"/>
+        </w:rPr>
+        <w:t>3. Equipamiento para Trabajo Colaborativo Inter-Oficinas</w:t>
+      </w:r>
+    </w:p>
+    <w:p>
+      <w:pPr>
+        <w:spacing w:before="40" w:after="40" w:line="240" w:lineRule="auto"/>
+        <w:ind w:left="360"/>
+        <w:jc w:val="both"/>
+        <w:rPr>
+          <w:rFonts w:ascii="Arial" w:hAnsi="Arial" w:cs="Arial"/>
+          <w:color w:val="111111"/>
+        </w:rPr>
+      </w:pPr>
+      <w:r>
+        <w:rPr>
+          <w:rFonts w:ascii="Arial" w:hAnsi="Arial" w:cs="Arial"/>
+          <w:color w:val="111111"/>
+        </w:rPr>
+        <w:t>•    Provisión de insumos informáticos básicos no cuantitativos: adquisición de **webcams y auriculares con micrófono** para los puestos de trabajo, facilitando las reuniones virtuales de coordinación entre las dos oficinas físicas y las áreas usuarias.</w:t>
       </w:r>
     </w:p>
     <w:p>
@@ -1397,162 +2171,370 @@
           <w:color w:val="1B365D"/>
           <w:sz w:val="26"/>
         </w:rPr>
-        <w:t>4. Objetivos</w:t>
-      </w:r>
-    </w:p>
-    <w:p>
-      <w:pPr>
-        <w:spacing w:before="200" w:after="60" w:line="240" w:lineRule="auto"/>
-        <w:rPr>
-          <w:rFonts w:ascii="Arial" w:hAnsi="Arial" w:cs="Arial"/>
-          <w:b/>
-          <w:color w:val="222222"/>
-        </w:rPr>
-      </w:pPr>
-      <w:r>
-        <w:rPr>
-          <w:rFonts w:ascii="Arial" w:hAnsi="Arial" w:cs="Arial"/>
-          <w:b/>
-          <w:color w:val="222222"/>
-        </w:rPr>
-        <w:t>4.1. Objetivo General</w:t>
-      </w:r>
-    </w:p>
-    <w:p>
-      <w:pPr>
-        <w:spacing w:before="60" w:after="60" w:line="240" w:lineRule="auto"/>
-        <w:jc w:val="both"/>
-        <w:rPr>
-          <w:rFonts w:ascii="Arial" w:hAnsi="Arial" w:cs="Arial"/>
-          <w:color w:val="111111"/>
-        </w:rPr>
-      </w:pPr>
-      <w:r>
-        <w:rPr>
-          <w:rFonts w:ascii="Arial" w:hAnsi="Arial" w:cs="Arial"/>
-          <w:color w:val="111111"/>
-        </w:rPr>
-        <w:t>Fortalecer la capacidad institucional del Departamento de Gestión, Desarrollo e Innovación en Sistemas de Software mediante una organización basada en equipos colaborativos, conocimiento compartido, procedimientos estandarizados y gobierno técnico, asegurando que el software municipal sea seguro, escalable y sostenible en el tiempo.</w:t>
-      </w:r>
-    </w:p>
-    <w:p>
-      <w:pPr>
-        <w:spacing w:before="200" w:after="60" w:line="240" w:lineRule="auto"/>
-        <w:rPr>
-          <w:rFonts w:ascii="Arial" w:hAnsi="Arial" w:cs="Arial"/>
-          <w:b/>
-          <w:color w:val="222222"/>
-        </w:rPr>
-      </w:pPr>
-      <w:r>
-        <w:rPr>
-          <w:rFonts w:ascii="Arial" w:hAnsi="Arial" w:cs="Arial"/>
-          <w:b/>
-          <w:color w:val="222222"/>
-        </w:rPr>
-        <w:t>4.2. Objetivos Específicos</w:t>
-      </w:r>
-    </w:p>
-    <w:p>
-      <w:pPr>
-        <w:spacing w:before="80" w:after="40" w:line="240" w:lineRule="auto"/>
-        <w:jc w:val="both"/>
-        <w:rPr>
-          <w:rFonts w:ascii="Arial" w:hAnsi="Arial" w:cs="Arial"/>
-          <w:color w:val="111111"/>
-        </w:rPr>
-      </w:pPr>
-      <w:r>
-        <w:rPr>
-          <w:rFonts w:ascii="Arial" w:hAnsi="Arial" w:cs="Arial"/>
-          <w:color w:val="111111"/>
-        </w:rPr>
-        <w:t>1. Estructurar un modelo de gestión ágil adaptativo (Kanban + Iteraciones) liderado activamente por la Jefatura.</w:t>
-      </w:r>
-    </w:p>
-    <w:p>
-      <w:pPr>
-        <w:spacing w:before="80" w:after="40" w:line="240" w:lineRule="auto"/>
-        <w:jc w:val="both"/>
-        <w:rPr>
-          <w:rFonts w:ascii="Arial" w:hAnsi="Arial" w:cs="Arial"/>
-          <w:color w:val="111111"/>
-        </w:rPr>
-      </w:pPr>
-      <w:r>
-        <w:rPr>
-          <w:rFonts w:ascii="Arial" w:hAnsi="Arial" w:cs="Arial"/>
-          <w:color w:val="111111"/>
-        </w:rPr>
-        <w:t>2. Eliminar los puntos únicos de falla (*Single Point of Failure*) mediante la asignación de **Referentes Secundarios** en todos los sistemas críticos.</w:t>
-      </w:r>
-    </w:p>
-    <w:p>
-      <w:pPr>
-        <w:spacing w:before="80" w:after="40" w:line="240" w:lineRule="auto"/>
-        <w:jc w:val="both"/>
-        <w:rPr>
-          <w:rFonts w:ascii="Arial" w:hAnsi="Arial" w:cs="Arial"/>
-          <w:color w:val="111111"/>
-        </w:rPr>
-      </w:pPr>
-      <w:r>
-        <w:rPr>
-          <w:rFonts w:ascii="Arial" w:hAnsi="Arial" w:cs="Arial"/>
-          <w:color w:val="111111"/>
-        </w:rPr>
-        <w:t>3. Desarticular el aislamiento operativo entre las oficinas físicas a través de canales de comunicación abierta y herramientas colaborativas.</w:t>
-      </w:r>
-    </w:p>
-    <w:p>
-      <w:pPr>
-        <w:spacing w:before="80" w:after="40" w:line="240" w:lineRule="auto"/>
-        <w:jc w:val="both"/>
-        <w:rPr>
-          <w:rFonts w:ascii="Arial" w:hAnsi="Arial" w:cs="Arial"/>
-          <w:color w:val="111111"/>
-        </w:rPr>
-      </w:pPr>
-      <w:r>
-        <w:rPr>
-          <w:rFonts w:ascii="Arial" w:hAnsi="Arial" w:cs="Arial"/>
-          <w:color w:val="111111"/>
-        </w:rPr>
-        <w:t>4. Institucionalizar el uso obligatorio del *template* de arquitectura base municipal y guías de buenas prácticas de programación.</w:t>
-      </w:r>
-    </w:p>
-    <w:p>
-      <w:pPr>
-        <w:spacing w:before="80" w:after="40" w:line="240" w:lineRule="auto"/>
-        <w:jc w:val="both"/>
-        <w:rPr>
-          <w:rFonts w:ascii="Arial" w:hAnsi="Arial" w:cs="Arial"/>
-          <w:color w:val="111111"/>
-        </w:rPr>
-      </w:pPr>
-      <w:r>
-        <w:rPr>
-          <w:rFonts w:ascii="Arial" w:hAnsi="Arial" w:cs="Arial"/>
-          <w:color w:val="111111"/>
-        </w:rPr>
-        <w:t>5. Establecer un protocolo estricto de **Gobierno Técnico de Proveedores Externos** para garantizar la soberanía del código y la documentación.</w:t>
-      </w:r>
-    </w:p>
-    <w:p>
-      <w:pPr>
-        <w:spacing w:before="80" w:after="40" w:line="240" w:lineRule="auto"/>
-        <w:jc w:val="both"/>
-        <w:rPr>
-          <w:rFonts w:ascii="Arial" w:hAnsi="Arial" w:cs="Arial"/>
-          <w:color w:val="111111"/>
-        </w:rPr>
-      </w:pPr>
-      <w:r>
-        <w:rPr>
-          <w:rFonts w:ascii="Arial" w:hAnsi="Arial" w:cs="Arial"/>
-          <w:color w:val="111111"/>
-        </w:rPr>
-        <w:t>6. Regular el uso de Inteligencia Artificial mediante pautas de seguridad (escenario real) y proyectar licencias corporativas (escenario ideal).</w:t>
+        <w:t>7. Implementación y Gestión (Hoja de Ruta por Etapas)</w:t>
+      </w:r>
+    </w:p>
+    <w:p>
+      <w:pPr>
+        <w:spacing w:before="120" w:after="20" w:line="240" w:lineRule="auto"/>
+        <w:rPr>
+          <w:rFonts w:ascii="Arial" w:hAnsi="Arial" w:cs="Arial"/>
+          <w:b/>
+          <w:color w:val="111111"/>
+        </w:rPr>
+      </w:pPr>
+      <w:r>
+        <w:rPr>
+          <w:rFonts w:ascii="Arial" w:hAnsi="Arial" w:cs="Arial"/>
+          <w:b/>
+          <w:color w:val="111111"/>
+        </w:rPr>
+        <w:t>La transformación del departamento se ejecutará bajo un marco de **adopción progresiva (Roadmap Ágil)** estructurado en 3 etapas principales y un proceso permanente:</w:t>
+      </w:r>
+    </w:p>
+    <w:p>
+      <w:pPr>
+        <w:spacing w:before="40" w:after="120" w:line="240" w:lineRule="auto"/>
+        <w:jc w:val="both"/>
+        <w:rPr>
+          <w:rFonts w:ascii="Arial" w:hAnsi="Arial" w:cs="Arial"/>
+          <w:color w:val="111111"/>
+        </w:rPr>
+      </w:pPr>
+      <w:r>
+        <w:rPr>
+          <w:rFonts w:ascii="Arial" w:hAnsi="Arial" w:cs="Arial"/>
+          <w:color w:val="111111"/>
+        </w:rPr>
+        <w:t>```</w:t>
+      </w:r>
+    </w:p>
+    <w:p>
+      <w:pPr>
+        <w:spacing w:before="40" w:after="120" w:line="240" w:lineRule="auto"/>
+        <w:jc w:val="both"/>
+        <w:rPr>
+          <w:rFonts w:ascii="Arial" w:hAnsi="Arial" w:cs="Arial"/>
+          <w:color w:val="111111"/>
+        </w:rPr>
+      </w:pPr>
+      <w:r>
+        <w:rPr>
+          <w:rFonts w:ascii="Arial" w:hAnsi="Arial" w:cs="Arial"/>
+          <w:color w:val="111111"/>
+        </w:rPr>
+        <w:t xml:space="preserve">[Etapa I: Conocer y Ordenar] </w:t>
+      </w:r>
+      <w:r>
+        <w:rPr>
+          <w:rFonts w:ascii="Segoe UI Symbol" w:hAnsi="Segoe UI Symbol" w:cs="Segoe UI Symbol"/>
+          <w:color w:val="111111"/>
+        </w:rPr>
+        <w:t>➔</w:t>
+      </w:r>
+      <w:r>
+        <w:rPr>
+          <w:rFonts w:ascii="Arial" w:hAnsi="Arial" w:cs="Arial"/>
+          <w:color w:val="111111"/>
+        </w:rPr>
+        <w:t xml:space="preserve"> [Etapa II: Integrar y Estandarizar] </w:t>
+      </w:r>
+      <w:r>
+        <w:rPr>
+          <w:rFonts w:ascii="Segoe UI Symbol" w:hAnsi="Segoe UI Symbol" w:cs="Segoe UI Symbol"/>
+          <w:color w:val="111111"/>
+        </w:rPr>
+        <w:t>➔</w:t>
+      </w:r>
+      <w:r>
+        <w:rPr>
+          <w:rFonts w:ascii="Arial" w:hAnsi="Arial" w:cs="Arial"/>
+          <w:color w:val="111111"/>
+        </w:rPr>
+        <w:t xml:space="preserve"> [Etapa III: Consolidar e Innovar] </w:t>
+      </w:r>
+      <w:r>
+        <w:rPr>
+          <w:rFonts w:ascii="Segoe UI Symbol" w:hAnsi="Segoe UI Symbol" w:cs="Segoe UI Symbol"/>
+          <w:color w:val="111111"/>
+        </w:rPr>
+        <w:t>➔</w:t>
+      </w:r>
+      <w:r>
+        <w:rPr>
+          <w:rFonts w:ascii="Arial" w:hAnsi="Arial" w:cs="Arial"/>
+          <w:color w:val="111111"/>
+        </w:rPr>
+        <w:t xml:space="preserve"> [Proceso Permanente]</w:t>
+      </w:r>
+    </w:p>
+    <w:p>
+      <w:pPr>
+        <w:spacing w:before="40" w:after="120" w:line="240" w:lineRule="auto"/>
+        <w:jc w:val="both"/>
+        <w:rPr>
+          <w:rFonts w:ascii="Arial" w:hAnsi="Arial" w:cs="Arial"/>
+          <w:color w:val="111111"/>
+        </w:rPr>
+      </w:pPr>
+      <w:r>
+        <w:rPr>
+          <w:rFonts w:ascii="Arial" w:hAnsi="Arial" w:cs="Arial"/>
+          <w:color w:val="111111"/>
+        </w:rPr>
+        <w:t>```</w:t>
+      </w:r>
+    </w:p>
+    <w:p>
+      <w:pPr>
+        <w:spacing w:before="40" w:after="40" w:line="240" w:lineRule="auto"/>
+        <w:ind w:left="360"/>
+        <w:jc w:val="both"/>
+        <w:rPr>
+          <w:rFonts w:ascii="Arial" w:hAnsi="Arial" w:cs="Arial"/>
+          <w:color w:val="111111"/>
+        </w:rPr>
+      </w:pPr>
+      <w:r>
+        <w:rPr>
+          <w:rFonts w:ascii="Arial" w:hAnsi="Arial" w:cs="Arial"/>
+          <w:color w:val="111111"/>
+        </w:rPr>
+        <w:t>•    **Etapa I – Conocer y Ordenar (Sprints 1 a 4):**</w:t>
+      </w:r>
+    </w:p>
+    <w:p>
+      <w:pPr>
+        <w:spacing w:before="40" w:after="40" w:line="240" w:lineRule="auto"/>
+        <w:ind w:left="360"/>
+        <w:jc w:val="both"/>
+        <w:rPr>
+          <w:rFonts w:ascii="Arial" w:hAnsi="Arial" w:cs="Arial"/>
+          <w:color w:val="111111"/>
+        </w:rPr>
+      </w:pPr>
+      <w:r>
+        <w:rPr>
+          <w:rFonts w:ascii="Arial" w:hAnsi="Arial" w:cs="Arial"/>
+          <w:color w:val="111111"/>
+        </w:rPr>
+        <w:t>•    Relevamiento de competencias y consolidación del Inventario de Sistemas.</w:t>
+      </w:r>
+    </w:p>
+    <w:p>
+      <w:pPr>
+        <w:spacing w:before="40" w:after="40" w:line="240" w:lineRule="auto"/>
+        <w:ind w:left="360"/>
+        <w:jc w:val="both"/>
+        <w:rPr>
+          <w:rFonts w:ascii="Arial" w:hAnsi="Arial" w:cs="Arial"/>
+          <w:color w:val="111111"/>
+        </w:rPr>
+      </w:pPr>
+      <w:r>
+        <w:rPr>
+          <w:rFonts w:ascii="Arial" w:hAnsi="Arial" w:cs="Arial"/>
+          <w:color w:val="111111"/>
+        </w:rPr>
+        <w:t>•    Conformación de la Cartera Única de Proyectos (evaluación previa de reutilización antes de crear código nuevo).</w:t>
+      </w:r>
+    </w:p>
+    <w:p>
+      <w:pPr>
+        <w:spacing w:before="40" w:after="40" w:line="240" w:lineRule="auto"/>
+        <w:ind w:left="360"/>
+        <w:jc w:val="both"/>
+        <w:rPr>
+          <w:rFonts w:ascii="Arial" w:hAnsi="Arial" w:cs="Arial"/>
+          <w:color w:val="111111"/>
+        </w:rPr>
+      </w:pPr>
+      <w:r>
+        <w:rPr>
+          <w:rFonts w:ascii="Arial" w:hAnsi="Arial" w:cs="Arial"/>
+          <w:color w:val="111111"/>
+        </w:rPr>
+        <w:t>•    Unificación del seguimiento obligatorio en Redmine y asignación de los primeros *Referentes Secundarios*.</w:t>
+      </w:r>
+    </w:p>
+    <w:p>
+      <w:pPr>
+        <w:spacing w:before="40" w:after="40" w:line="240" w:lineRule="auto"/>
+        <w:ind w:left="360"/>
+        <w:jc w:val="both"/>
+        <w:rPr>
+          <w:rFonts w:ascii="Arial" w:hAnsi="Arial" w:cs="Arial"/>
+          <w:color w:val="111111"/>
+        </w:rPr>
+      </w:pPr>
+      <w:r>
+        <w:rPr>
+          <w:rFonts w:ascii="Arial" w:hAnsi="Arial" w:cs="Arial"/>
+          <w:color w:val="111111"/>
+        </w:rPr>
+        <w:t>•    **Etapa II – Integrar y Estandarizar (Sprints 5 a 12):**</w:t>
+      </w:r>
+    </w:p>
+    <w:p>
+      <w:pPr>
+        <w:spacing w:before="40" w:after="40" w:line="240" w:lineRule="auto"/>
+        <w:ind w:left="360"/>
+        <w:jc w:val="both"/>
+        <w:rPr>
+          <w:rFonts w:ascii="Arial" w:hAnsi="Arial" w:cs="Arial"/>
+          <w:color w:val="111111"/>
+        </w:rPr>
+      </w:pPr>
+      <w:r>
+        <w:rPr>
+          <w:rFonts w:ascii="Arial" w:hAnsi="Arial" w:cs="Arial"/>
+          <w:color w:val="111111"/>
+        </w:rPr>
+        <w:t>•    Puesta en marcha de las reuniones de coordinación transversal entre ambas oficinas.</w:t>
+      </w:r>
+    </w:p>
+    <w:p>
+      <w:pPr>
+        <w:spacing w:before="40" w:after="40" w:line="240" w:lineRule="auto"/>
+        <w:ind w:left="360"/>
+        <w:jc w:val="both"/>
+        <w:rPr>
+          <w:rFonts w:ascii="Arial" w:hAnsi="Arial" w:cs="Arial"/>
+          <w:color w:val="111111"/>
+        </w:rPr>
+      </w:pPr>
+      <w:r>
+        <w:rPr>
+          <w:rFonts w:ascii="Arial" w:hAnsi="Arial" w:cs="Arial"/>
+          <w:color w:val="111111"/>
+        </w:rPr>
+        <w:t>•    Difusión y exigencia obligatoria de las Guías de Buenas Prácticas y del Template de Arquitectura Base.</w:t>
+      </w:r>
+    </w:p>
+    <w:p>
+      <w:pPr>
+        <w:spacing w:before="40" w:after="40" w:line="240" w:lineRule="auto"/>
+        <w:ind w:left="360"/>
+        <w:jc w:val="both"/>
+        <w:rPr>
+          <w:rFonts w:ascii="Arial" w:hAnsi="Arial" w:cs="Arial"/>
+          <w:color w:val="111111"/>
+        </w:rPr>
+      </w:pPr>
+      <w:r>
+        <w:rPr>
+          <w:rFonts w:ascii="Arial" w:hAnsi="Arial" w:cs="Arial"/>
+          <w:color w:val="111111"/>
+        </w:rPr>
+        <w:t>•    Implementación del protocolo de Gobierno Técnico de Proveedores Externos.</w:t>
+      </w:r>
+    </w:p>
+    <w:p>
+      <w:pPr>
+        <w:spacing w:before="40" w:after="40" w:line="240" w:lineRule="auto"/>
+        <w:ind w:left="360"/>
+        <w:jc w:val="both"/>
+        <w:rPr>
+          <w:rFonts w:ascii="Arial" w:hAnsi="Arial" w:cs="Arial"/>
+          <w:color w:val="111111"/>
+        </w:rPr>
+      </w:pPr>
+      <w:r>
+        <w:rPr>
+          <w:rFonts w:ascii="Arial" w:hAnsi="Arial" w:cs="Arial"/>
+          <w:color w:val="111111"/>
+        </w:rPr>
+        <w:t>•    **Etapa III – Consolidar y Evaluar (Sprints 13+):**</w:t>
+      </w:r>
+    </w:p>
+    <w:p>
+      <w:pPr>
+        <w:spacing w:before="40" w:after="40" w:line="240" w:lineRule="auto"/>
+        <w:ind w:left="360"/>
+        <w:jc w:val="both"/>
+        <w:rPr>
+          <w:rFonts w:ascii="Arial" w:hAnsi="Arial" w:cs="Arial"/>
+          <w:color w:val="111111"/>
+        </w:rPr>
+      </w:pPr>
+      <w:r>
+        <w:rPr>
+          <w:rFonts w:ascii="Arial" w:hAnsi="Arial" w:cs="Arial"/>
+          <w:color w:val="111111"/>
+        </w:rPr>
+        <w:t>•    Evaluación de los indicadores de riesgo operacional.</w:t>
+      </w:r>
+    </w:p>
+    <w:p>
+      <w:pPr>
+        <w:spacing w:before="40" w:after="40" w:line="240" w:lineRule="auto"/>
+        <w:ind w:left="360"/>
+        <w:jc w:val="both"/>
+        <w:rPr>
+          <w:rFonts w:ascii="Arial" w:hAnsi="Arial" w:cs="Arial"/>
+          <w:color w:val="111111"/>
+        </w:rPr>
+      </w:pPr>
+      <w:r>
+        <w:rPr>
+          <w:rFonts w:ascii="Arial" w:hAnsi="Arial" w:cs="Arial"/>
+          <w:color w:val="111111"/>
+        </w:rPr>
+        <w:t>•    Paso a producción de aplicaciones dockerizadas en sinergia con el área de Redes.</w:t>
+      </w:r>
+    </w:p>
+    <w:p>
+      <w:pPr>
+        <w:spacing w:before="40" w:after="40" w:line="240" w:lineRule="auto"/>
+        <w:ind w:left="360"/>
+        <w:jc w:val="both"/>
+        <w:rPr>
+          <w:rFonts w:ascii="Arial" w:hAnsi="Arial" w:cs="Arial"/>
+          <w:color w:val="111111"/>
+        </w:rPr>
+      </w:pPr>
+      <w:r>
+        <w:rPr>
+          <w:rFonts w:ascii="Arial" w:hAnsi="Arial" w:cs="Arial"/>
+          <w:color w:val="111111"/>
+        </w:rPr>
+        <w:t>•    Implementación gradual de revisiones de código cruzadas (*peer review*) en GitLab para cambios críticos.</w:t>
+      </w:r>
+    </w:p>
+    <w:p>
+      <w:pPr>
+        <w:spacing w:before="40" w:after="40" w:line="240" w:lineRule="auto"/>
+        <w:ind w:left="360"/>
+        <w:jc w:val="both"/>
+        <w:rPr>
+          <w:rFonts w:ascii="Arial" w:hAnsi="Arial" w:cs="Arial"/>
+          <w:color w:val="111111"/>
+        </w:rPr>
+      </w:pPr>
+      <w:r>
+        <w:rPr>
+          <w:rFonts w:ascii="Arial" w:hAnsi="Arial" w:cs="Arial"/>
+          <w:color w:val="111111"/>
+        </w:rPr>
+        <w:t>•    **Proceso Permanente – Mejora Continua e Innovación:**</w:t>
+      </w:r>
+    </w:p>
+    <w:p>
+      <w:pPr>
+        <w:spacing w:before="40" w:after="40" w:line="240" w:lineRule="auto"/>
+        <w:ind w:left="360"/>
+        <w:jc w:val="both"/>
+        <w:rPr>
+          <w:rFonts w:ascii="Arial" w:hAnsi="Arial" w:cs="Arial"/>
+          <w:color w:val="111111"/>
+        </w:rPr>
+      </w:pPr>
+      <w:r>
+        <w:rPr>
+          <w:rFonts w:ascii="Arial" w:hAnsi="Arial" w:cs="Arial"/>
+          <w:color w:val="111111"/>
+        </w:rPr>
+        <w:t>•    Revisión periódica de procedimientos, actualización de capacitaciones y evaluación fundamentada de nuevas tecnologías (IA corporativa y automatización).</w:t>
       </w:r>
     </w:p>
     <w:p>
@@ -1572,999 +2554,22 @@
           <w:color w:val="1B365D"/>
           <w:sz w:val="26"/>
         </w:rPr>
-        <w:t>5. Propuesta de Mejora y Optimización con Recursos Actuales (SIN PRESUPUESTO - Plan Realista)</w:t>
-      </w:r>
-    </w:p>
-    <w:p>
-      <w:pPr>
-        <w:spacing w:before="60" w:after="60" w:line="240" w:lineRule="auto"/>
-        <w:jc w:val="both"/>
-        <w:rPr>
-          <w:rFonts w:ascii="Arial" w:hAnsi="Arial" w:cs="Arial"/>
-          <w:color w:val="111111"/>
-        </w:rPr>
-      </w:pPr>
-      <w:r>
-        <w:rPr>
-          <w:rFonts w:ascii="Arial" w:hAnsi="Arial" w:cs="Arial"/>
-          <w:color w:val="111111"/>
-        </w:rPr>
-        <w:t>Esta sección constituye el corazón operativo del plan a corto plazo. Agrupa todas las iniciativas procedimentales y organizacionales que se implementarán **utilizando exclusivamente el capital humano y las herramientas existentes (Costo $0)**, transformando los procedimientos en la columna vertebral del departamento:</w:t>
-      </w:r>
-    </w:p>
-    <w:p>
-      <w:pPr>
-        <w:spacing w:before="200" w:after="60" w:line="240" w:lineRule="auto"/>
-        <w:rPr>
-          <w:rFonts w:ascii="Arial" w:hAnsi="Arial" w:cs="Arial"/>
-          <w:b/>
-          <w:color w:val="222222"/>
-        </w:rPr>
-      </w:pPr>
-      <w:r>
-        <w:rPr>
-          <w:rFonts w:ascii="Arial" w:hAnsi="Arial" w:cs="Arial"/>
-          <w:b/>
-          <w:color w:val="222222"/>
-        </w:rPr>
-        <w:t>1. Implementación de Agilidad Adaptativa y Liderazgo Híbrido de la Jefatura</w:t>
-      </w:r>
-    </w:p>
-    <w:p>
-      <w:pPr>
-        <w:spacing w:before="40" w:after="40" w:line="240" w:lineRule="auto"/>
-        <w:ind w:left="360"/>
-        <w:jc w:val="both"/>
-        <w:rPr>
-          <w:rFonts w:ascii="Arial" w:hAnsi="Arial" w:cs="Arial"/>
-          <w:color w:val="111111"/>
-        </w:rPr>
-      </w:pPr>
-      <w:r>
-        <w:rPr>
-          <w:rFonts w:ascii="Arial" w:hAnsi="Arial" w:cs="Arial"/>
-          <w:color w:val="111111"/>
-        </w:rPr>
-        <w:t>•    **Modelo Híbrido (Kanban + Iteraciones Cortas):** Se aplicará *Kanban* para ordenar el mantenimiento continuo e incidencias de sistemas *legacy*, e *iteraciones cortas* (Sprints) para nuevos desarrollos. No se impondrá Scrum de forma rígida a todo el personal.</w:t>
-      </w:r>
-    </w:p>
-    <w:p>
-      <w:pPr>
-        <w:spacing w:before="40" w:after="40" w:line="240" w:lineRule="auto"/>
-        <w:ind w:left="360"/>
-        <w:jc w:val="both"/>
-        <w:rPr>
-          <w:rFonts w:ascii="Arial" w:hAnsi="Arial" w:cs="Arial"/>
-          <w:color w:val="111111"/>
-        </w:rPr>
-      </w:pPr>
-      <w:r>
-        <w:rPr>
-          <w:rFonts w:ascii="Arial" w:hAnsi="Arial" w:cs="Arial"/>
-          <w:color w:val="111111"/>
-        </w:rPr>
-        <w:t>•    **El Jefe de Departamento como *Scrum Master Global* y Gestor Gerencial:** La Jefatura asumirá un doble rol activo:</w:t>
-      </w:r>
-    </w:p>
-    <w:p>
-      <w:pPr>
-        <w:spacing w:before="40" w:after="40" w:line="240" w:lineRule="auto"/>
-        <w:ind w:left="360"/>
-        <w:jc w:val="both"/>
-        <w:rPr>
-          <w:rFonts w:ascii="Arial" w:hAnsi="Arial" w:cs="Arial"/>
-          <w:color w:val="111111"/>
-        </w:rPr>
-      </w:pPr>
-      <w:r>
-        <w:rPr>
-          <w:rFonts w:ascii="Arial" w:hAnsi="Arial" w:cs="Arial"/>
-          <w:color w:val="111111"/>
-        </w:rPr>
-        <w:t>•    *Como Scrum Master Global:* Orquestará operativamente las células, destrabará bloqueos diarios, facilitará la comunicación entre las dos oficinas físicas y **actuará como filtro coordinador para evitar el desarrollo de funcionalidades duplicadas**.</w:t>
-      </w:r>
-    </w:p>
-    <w:p>
-      <w:pPr>
-        <w:spacing w:before="40" w:after="40" w:line="240" w:lineRule="auto"/>
-        <w:ind w:left="360"/>
-        <w:jc w:val="both"/>
-        <w:rPr>
-          <w:rFonts w:ascii="Arial" w:hAnsi="Arial" w:cs="Arial"/>
-          <w:color w:val="111111"/>
-        </w:rPr>
-      </w:pPr>
-      <w:r>
-        <w:rPr>
-          <w:rFonts w:ascii="Arial" w:hAnsi="Arial" w:cs="Arial"/>
-          <w:color w:val="111111"/>
-        </w:rPr>
-        <w:t>•    *Como Gestor Gerencial:* Evaluará el rendimiento global del departamento, medirá la capacidad operativa en Redmine y garantizará la alineación estratégica con las autoridades.</w:t>
-      </w:r>
-    </w:p>
-    <w:p>
-      <w:pPr>
-        <w:spacing w:before="40" w:after="40" w:line="240" w:lineRule="auto"/>
-        <w:ind w:left="360"/>
-        <w:jc w:val="both"/>
-        <w:rPr>
-          <w:rFonts w:ascii="Arial" w:hAnsi="Arial" w:cs="Arial"/>
-          <w:color w:val="111111"/>
-        </w:rPr>
-      </w:pPr>
-      <w:r>
-        <w:rPr>
-          <w:rFonts w:ascii="Arial" w:hAnsi="Arial" w:cs="Arial"/>
-          <w:color w:val="111111"/>
-        </w:rPr>
-        <w:t>•    **El "Product Owner" Institucional:** El rol de *Product Owner* recaerá en los referentes o jefaturas de las Secretarías usuarias solicitantes, quienes serán responsables de priorizar su propio *Backlog* de necesidades.</w:t>
-      </w:r>
-    </w:p>
-    <w:p>
-      <w:pPr>
-        <w:spacing w:before="200" w:after="60" w:line="240" w:lineRule="auto"/>
-        <w:rPr>
-          <w:rFonts w:ascii="Arial" w:hAnsi="Arial" w:cs="Arial"/>
-          <w:b/>
-          <w:color w:val="222222"/>
-        </w:rPr>
-      </w:pPr>
-      <w:r>
-        <w:rPr>
-          <w:rFonts w:ascii="Arial" w:hAnsi="Arial" w:cs="Arial"/>
-          <w:b/>
-          <w:color w:val="222222"/>
-        </w:rPr>
-        <w:t>2. Integración Operativa y Mitigación de Riesgos (Referentes Secundarios)</w:t>
-      </w:r>
-    </w:p>
-    <w:p>
-      <w:pPr>
-        <w:spacing w:before="40" w:after="40" w:line="240" w:lineRule="auto"/>
-        <w:ind w:left="360"/>
-        <w:jc w:val="both"/>
-        <w:rPr>
-          <w:rFonts w:ascii="Arial" w:hAnsi="Arial" w:cs="Arial"/>
-          <w:color w:val="111111"/>
-        </w:rPr>
-      </w:pPr>
-      <w:r>
-        <w:rPr>
-          <w:rFonts w:ascii="Arial" w:hAnsi="Arial" w:cs="Arial"/>
-          <w:color w:val="111111"/>
-        </w:rPr>
-        <w:t>•    **Comunicación Abierta entre Oficinas:** Se mantendrá la distribución física en dos dependencias, pero se erradicará el aislamiento *operativo* mediante ceremonias ágiles conjuntas (Dailies de 15 min, Plannings) y uso unificado de repositorios.</w:t>
-      </w:r>
-    </w:p>
-    <w:p>
-      <w:pPr>
-        <w:spacing w:before="40" w:after="40" w:line="240" w:lineRule="auto"/>
-        <w:ind w:left="360"/>
-        <w:jc w:val="both"/>
-        <w:rPr>
-          <w:rFonts w:ascii="Arial" w:hAnsi="Arial" w:cs="Arial"/>
-          <w:color w:val="111111"/>
-        </w:rPr>
-      </w:pPr>
-      <w:r>
-        <w:rPr>
-          <w:rFonts w:ascii="Arial" w:hAnsi="Arial" w:cs="Arial"/>
-          <w:color w:val="111111"/>
-        </w:rPr>
-        <w:t>•    **Asignación Dinámica y "Referentes Secundarios":** Para terminar con la dependencia de una sola persona en sistemas críticos, se implementará la figura del *Referente Secundario*. Mediante la asignación dinámica por fases (*shadowing* y capacitación cruzada), un programador acompañará al referente principal en tareas de mantenimiento y análisis, logrando la transferencia práctica del conocimiento sin tocar el escalafón.</w:t>
-      </w:r>
-    </w:p>
-    <w:p>
-      <w:pPr>
-        <w:spacing w:before="200" w:after="60" w:line="240" w:lineRule="auto"/>
-        <w:rPr>
-          <w:rFonts w:ascii="Arial" w:hAnsi="Arial" w:cs="Arial"/>
-          <w:b/>
-          <w:color w:val="222222"/>
-        </w:rPr>
-      </w:pPr>
-      <w:r>
-        <w:rPr>
-          <w:rFonts w:ascii="Arial" w:hAnsi="Arial" w:cs="Arial"/>
-          <w:b/>
-          <w:color w:val="222222"/>
-        </w:rPr>
-        <w:t>3. Estandarización de Código y Buenas Prácticas (Sin Herramientas Automatizadas)</w:t>
-      </w:r>
-    </w:p>
-    <w:p>
-      <w:pPr>
-        <w:spacing w:before="40" w:after="40" w:line="240" w:lineRule="auto"/>
-        <w:ind w:left="360"/>
-        <w:jc w:val="both"/>
-        <w:rPr>
-          <w:rFonts w:ascii="Arial" w:hAnsi="Arial" w:cs="Arial"/>
-          <w:color w:val="111111"/>
-        </w:rPr>
-      </w:pPr>
-      <w:r>
-        <w:rPr>
-          <w:rFonts w:ascii="Arial" w:hAnsi="Arial" w:cs="Arial"/>
-          <w:color w:val="111111"/>
-        </w:rPr>
-        <w:t>•    Dado que actualmente no se cuenta con herramientas de revisión automatizada y la revisión manual cruzada entre pares sobrecargaría a los programadores Senior, la calidad se asegurará **definiendo y exigiendo buenas prácticas de programación y guías de estilo obligatorias**.</w:t>
-      </w:r>
-    </w:p>
-    <w:p>
-      <w:pPr>
-        <w:spacing w:before="40" w:after="40" w:line="240" w:lineRule="auto"/>
-        <w:ind w:left="360"/>
-        <w:jc w:val="both"/>
-        <w:rPr>
-          <w:rFonts w:ascii="Arial" w:hAnsi="Arial" w:cs="Arial"/>
-          <w:color w:val="111111"/>
-        </w:rPr>
-      </w:pPr>
-      <w:r>
-        <w:rPr>
-          <w:rFonts w:ascii="Arial" w:hAnsi="Arial" w:cs="Arial"/>
-          <w:color w:val="111111"/>
-        </w:rPr>
-        <w:t>•    **Obligatoriedad del Template de Arquitectura Base:** Se establecerá como norma inquebrantable que todo nuevo desarrollo o refactorización relevante deba construirse sobre la arquitectura base desarrollada en la Municipalidad. Ningún desarrollo nuevo podrá iniciarse en tecnologías obsoletas (*Congelamiento Legacy*).</w:t>
-      </w:r>
-    </w:p>
-    <w:p>
-      <w:pPr>
-        <w:spacing w:before="200" w:after="60" w:line="240" w:lineRule="auto"/>
-        <w:rPr>
-          <w:rFonts w:ascii="Arial" w:hAnsi="Arial" w:cs="Arial"/>
-          <w:b/>
-          <w:color w:val="222222"/>
-        </w:rPr>
-      </w:pPr>
-      <w:r>
-        <w:rPr>
-          <w:rFonts w:ascii="Arial" w:hAnsi="Arial" w:cs="Arial"/>
-          <w:b/>
-          <w:color w:val="222222"/>
-        </w:rPr>
-        <w:t>4. Control y Recepción Técnica de Software Tercerizado</w:t>
-      </w:r>
-    </w:p>
-    <w:p>
-      <w:pPr>
-        <w:spacing w:before="40" w:after="40" w:line="240" w:lineRule="auto"/>
-        <w:ind w:left="360"/>
-        <w:jc w:val="both"/>
-        <w:rPr>
-          <w:rFonts w:ascii="Arial" w:hAnsi="Arial" w:cs="Arial"/>
-          <w:color w:val="111111"/>
-        </w:rPr>
-      </w:pPr>
-      <w:r>
-        <w:rPr>
-          <w:rFonts w:ascii="Arial" w:hAnsi="Arial" w:cs="Arial"/>
-          <w:color w:val="111111"/>
-        </w:rPr>
-        <w:t>•    La contratación externa de software no debe significar la pérdida de control técnico por parte del departamento. Se establecerán pautas procedimentales donde todo proveedor deba:</w:t>
-      </w:r>
-    </w:p>
-    <w:p>
-      <w:pPr>
-        <w:spacing w:before="40" w:after="40" w:line="240" w:lineRule="auto"/>
-        <w:ind w:left="360"/>
-        <w:jc w:val="both"/>
-        <w:rPr>
-          <w:rFonts w:ascii="Arial" w:hAnsi="Arial" w:cs="Arial"/>
-          <w:color w:val="111111"/>
-        </w:rPr>
-      </w:pPr>
-      <w:r>
-        <w:rPr>
-          <w:rFonts w:ascii="Arial" w:hAnsi="Arial" w:cs="Arial"/>
-          <w:color w:val="111111"/>
-        </w:rPr>
-        <w:t>•    Alinear su desarrollo a los estándares de arquitectura del Municipio.</w:t>
-      </w:r>
-    </w:p>
-    <w:p>
-      <w:pPr>
-        <w:spacing w:before="40" w:after="40" w:line="240" w:lineRule="auto"/>
-        <w:ind w:left="360"/>
-        <w:jc w:val="both"/>
-        <w:rPr>
-          <w:rFonts w:ascii="Arial" w:hAnsi="Arial" w:cs="Arial"/>
-          <w:color w:val="111111"/>
-        </w:rPr>
-      </w:pPr>
-      <w:r>
-        <w:rPr>
-          <w:rFonts w:ascii="Arial" w:hAnsi="Arial" w:cs="Arial"/>
-          <w:color w:val="111111"/>
-        </w:rPr>
-        <w:t>•    Entregar obligatoriamente código fuente, manuales técnicos y diccionarios de datos actualizados.</w:t>
-      </w:r>
-    </w:p>
-    <w:p>
-      <w:pPr>
-        <w:spacing w:before="40" w:after="40" w:line="240" w:lineRule="auto"/>
-        <w:ind w:left="360"/>
-        <w:jc w:val="both"/>
-        <w:rPr>
-          <w:rFonts w:ascii="Arial" w:hAnsi="Arial" w:cs="Arial"/>
-          <w:color w:val="111111"/>
-        </w:rPr>
-      </w:pPr>
-      <w:r>
-        <w:rPr>
-          <w:rFonts w:ascii="Arial" w:hAnsi="Arial" w:cs="Arial"/>
-          <w:color w:val="111111"/>
-        </w:rPr>
-        <w:t>•    Someterse a pruebas de recepción validadas por el personal técnico del Departamento antes de la aceptación final.</w:t>
-      </w:r>
-    </w:p>
-    <w:p>
-      <w:pPr>
-        <w:spacing w:before="200" w:after="60" w:line="240" w:lineRule="auto"/>
-        <w:rPr>
-          <w:rFonts w:ascii="Arial" w:hAnsi="Arial" w:cs="Arial"/>
-          <w:b/>
-          <w:color w:val="222222"/>
-        </w:rPr>
-      </w:pPr>
-      <w:r>
-        <w:rPr>
-          <w:rFonts w:ascii="Arial" w:hAnsi="Arial" w:cs="Arial"/>
-          <w:b/>
-          <w:color w:val="222222"/>
-        </w:rPr>
-        <w:t>5. Pautas para el Uso e Integración de Inteligencia Artificial para Agilizar la Producción</w:t>
-      </w:r>
-    </w:p>
-    <w:p>
-      <w:pPr>
-        <w:spacing w:before="40" w:after="40" w:line="240" w:lineRule="auto"/>
-        <w:ind w:left="360"/>
-        <w:jc w:val="both"/>
-        <w:rPr>
-          <w:rFonts w:ascii="Arial" w:hAnsi="Arial" w:cs="Arial"/>
-          <w:color w:val="111111"/>
-        </w:rPr>
-      </w:pPr>
-      <w:r>
-        <w:rPr>
-          <w:rFonts w:ascii="Arial" w:hAnsi="Arial" w:cs="Arial"/>
-          <w:color w:val="111111"/>
-        </w:rPr>
-        <w:t>•    Para aprovechar el potencial de la IA en la aceleración de desarrollos sin comprometer la seguridad institucional:</w:t>
-      </w:r>
-    </w:p>
-    <w:p>
-      <w:pPr>
-        <w:spacing w:before="40" w:after="40" w:line="240" w:lineRule="auto"/>
-        <w:ind w:left="360"/>
-        <w:jc w:val="both"/>
-        <w:rPr>
-          <w:rFonts w:ascii="Arial" w:hAnsi="Arial" w:cs="Arial"/>
-          <w:color w:val="111111"/>
-        </w:rPr>
-      </w:pPr>
-      <w:r>
-        <w:rPr>
-          <w:rFonts w:ascii="Arial" w:hAnsi="Arial" w:cs="Arial"/>
-          <w:color w:val="111111"/>
-        </w:rPr>
-        <w:t>•    Se guiará al equipo en el uso de herramientas de IA como asistentes de código para optimizar tiempos de desarrollo y documentación.</w:t>
-      </w:r>
-    </w:p>
-    <w:p>
-      <w:pPr>
-        <w:spacing w:before="40" w:after="40" w:line="240" w:lineRule="auto"/>
-        <w:ind w:left="360"/>
-        <w:jc w:val="both"/>
-        <w:rPr>
-          <w:rFonts w:ascii="Arial" w:hAnsi="Arial" w:cs="Arial"/>
-          <w:color w:val="111111"/>
-        </w:rPr>
-      </w:pPr>
-      <w:r>
-        <w:rPr>
-          <w:rFonts w:ascii="Arial" w:hAnsi="Arial" w:cs="Arial"/>
-          <w:color w:val="111111"/>
-        </w:rPr>
-        <w:t>•    Se fijará la pauta clara de no introducir datos personales de ciudadanos ni credenciales sensibles en servicios públicos de IA.</w:t>
-      </w:r>
-    </w:p>
-    <w:p>
-      <w:pPr>
-        <w:spacing w:before="280" w:after="80" w:line="240" w:lineRule="auto"/>
-        <w:rPr>
-          <w:rFonts w:ascii="Arial" w:hAnsi="Arial" w:cs="Arial"/>
-          <w:b/>
-          <w:color w:val="1B365D"/>
-          <w:sz w:val="26"/>
-        </w:rPr>
-      </w:pPr>
-      <w:r>
-        <w:rPr>
-          <w:rFonts w:ascii="Arial" w:hAnsi="Arial" w:cs="Arial"/>
-          <w:b/>
-          <w:color w:val="1B365D"/>
-          <w:sz w:val="26"/>
-        </w:rPr>
-        <w:t>6. Proyección con Incorporación de Recursos (CON PRESUPUESTO - Plan Proyectado a Mediano/Largo Plazo)</w:t>
-      </w:r>
-    </w:p>
-    <w:p>
-      <w:pPr>
-        <w:spacing w:before="60" w:after="60" w:line="240" w:lineRule="auto"/>
-        <w:jc w:val="both"/>
-        <w:rPr>
-          <w:rFonts w:ascii="Arial" w:hAnsi="Arial" w:cs="Arial"/>
-          <w:color w:val="111111"/>
-        </w:rPr>
-      </w:pPr>
-      <w:r>
-        <w:rPr>
-          <w:rFonts w:ascii="Arial" w:hAnsi="Arial" w:cs="Arial"/>
-          <w:color w:val="111111"/>
-        </w:rPr>
-        <w:t>Esta sección contempla la evolución tecnológica y la innovación del departamento a través de una inversión presupuestaria escalonada y justificada en necesidades concretas:</w:t>
-      </w:r>
-    </w:p>
-    <w:p>
-      <w:pPr>
-        <w:spacing w:before="200" w:after="60" w:line="240" w:lineRule="auto"/>
-        <w:rPr>
-          <w:rFonts w:ascii="Arial" w:hAnsi="Arial" w:cs="Arial"/>
-          <w:b/>
-          <w:color w:val="222222"/>
-        </w:rPr>
-      </w:pPr>
-      <w:r>
-        <w:rPr>
-          <w:rFonts w:ascii="Arial" w:hAnsi="Arial" w:cs="Arial"/>
-          <w:b/>
-          <w:color w:val="222222"/>
-        </w:rPr>
-        <w:t>1. Herramientas Tecnológicas y Licencias Corporativas</w:t>
-      </w:r>
-    </w:p>
-    <w:p>
-      <w:pPr>
-        <w:spacing w:before="40" w:after="40" w:line="240" w:lineRule="auto"/>
-        <w:ind w:left="360"/>
-        <w:jc w:val="both"/>
-        <w:rPr>
-          <w:rFonts w:ascii="Arial" w:hAnsi="Arial" w:cs="Arial"/>
-          <w:color w:val="111111"/>
-        </w:rPr>
-      </w:pPr>
-      <w:r>
-        <w:rPr>
-          <w:rFonts w:ascii="Arial" w:hAnsi="Arial" w:cs="Arial"/>
-          <w:color w:val="111111"/>
-        </w:rPr>
-        <w:t>•    **Licencias Corporativas de IA para IDEs (ej. GitHub Copilot / Tabnine):** Adquisición de licencias corporativas oficiales administradas por el Municipio, garantizando entornos seguros, privados y con tokens oficiales para aumentar drásticamente la productividad del equipo.</w:t>
-      </w:r>
-    </w:p>
-    <w:p>
-      <w:pPr>
-        <w:spacing w:before="40" w:after="40" w:line="240" w:lineRule="auto"/>
-        <w:ind w:left="360"/>
-        <w:jc w:val="both"/>
-        <w:rPr>
-          <w:rFonts w:ascii="Arial" w:hAnsi="Arial" w:cs="Arial"/>
-          <w:color w:val="111111"/>
-        </w:rPr>
-      </w:pPr>
-      <w:r>
-        <w:rPr>
-          <w:rFonts w:ascii="Arial" w:hAnsi="Arial" w:cs="Arial"/>
-          <w:color w:val="111111"/>
-        </w:rPr>
-        <w:t>•    **Plataformas de Control Automático de Calidad (ej. SonarQube):** Adquisición de licencias para herramientas de análisis estático que verifiquen automáticamente el cumplimiento de las guías de estilo y detecten deudas técnicas o vulnerabilidades antes de la entrega.</w:t>
-      </w:r>
-    </w:p>
-    <w:p>
-      <w:pPr>
-        <w:spacing w:before="40" w:after="40" w:line="240" w:lineRule="auto"/>
-        <w:ind w:left="360"/>
-        <w:jc w:val="both"/>
-        <w:rPr>
-          <w:rFonts w:ascii="Arial" w:hAnsi="Arial" w:cs="Arial"/>
-          <w:color w:val="111111"/>
-        </w:rPr>
-      </w:pPr>
-      <w:r>
-        <w:rPr>
-          <w:rFonts w:ascii="Arial" w:hAnsi="Arial" w:cs="Arial"/>
-          <w:color w:val="111111"/>
-        </w:rPr>
-        <w:t>•    **Migración e Infraestructura en Contenedores (Docker):** Asignación de presupuesto y tiempo operativo para migrar paulatinamente sistemas *legacy* hacia entornos *Dockerizados*. Esto facilitará la labor del Departamento de Infraestructura/Redes (encargado exclusivo de los despliegues y DevOps), entregándoles paquetes estandarizados.</w:t>
-      </w:r>
-    </w:p>
-    <w:p>
-      <w:pPr>
-        <w:spacing w:before="200" w:after="60" w:line="240" w:lineRule="auto"/>
-        <w:rPr>
-          <w:rFonts w:ascii="Arial" w:hAnsi="Arial" w:cs="Arial"/>
-          <w:b/>
-          <w:color w:val="222222"/>
-        </w:rPr>
-      </w:pPr>
-      <w:r>
-        <w:rPr>
-          <w:rFonts w:ascii="Arial" w:hAnsi="Arial" w:cs="Arial"/>
-          <w:b/>
-          <w:color w:val="222222"/>
-        </w:rPr>
-        <w:t>2. Capacitación Continua Formal</w:t>
-      </w:r>
-    </w:p>
-    <w:p>
-      <w:pPr>
-        <w:spacing w:before="40" w:after="40" w:line="240" w:lineRule="auto"/>
-        <w:ind w:left="360"/>
-        <w:jc w:val="both"/>
-        <w:rPr>
-          <w:rFonts w:ascii="Arial" w:hAnsi="Arial" w:cs="Arial"/>
-          <w:color w:val="111111"/>
-        </w:rPr>
-      </w:pPr>
-      <w:r>
-        <w:rPr>
-          <w:rFonts w:ascii="Arial" w:hAnsi="Arial" w:cs="Arial"/>
-          <w:color w:val="111111"/>
-        </w:rPr>
-        <w:t>•    Financiamiento de cursos de formación profesional en **Arquitecturas Limpias (*Clean Architecture*)**, Patrones de Diseño, Microservicios y APIs REST.</w:t>
-      </w:r>
-    </w:p>
-    <w:p>
-      <w:pPr>
-        <w:spacing w:before="200" w:after="60" w:line="240" w:lineRule="auto"/>
-        <w:rPr>
-          <w:rFonts w:ascii="Arial" w:hAnsi="Arial" w:cs="Arial"/>
-          <w:b/>
-          <w:color w:val="222222"/>
-        </w:rPr>
-      </w:pPr>
-      <w:r>
-        <w:rPr>
-          <w:rFonts w:ascii="Arial" w:hAnsi="Arial" w:cs="Arial"/>
-          <w:b/>
-          <w:color w:val="222222"/>
-        </w:rPr>
-        <w:t>3. Equipamiento para Trabajo Colaborativo Inter-Oficinas</w:t>
-      </w:r>
-    </w:p>
-    <w:p>
-      <w:pPr>
-        <w:spacing w:before="40" w:after="40" w:line="240" w:lineRule="auto"/>
-        <w:ind w:left="360"/>
-        <w:jc w:val="both"/>
-        <w:rPr>
-          <w:rFonts w:ascii="Arial" w:hAnsi="Arial" w:cs="Arial"/>
-          <w:color w:val="111111"/>
-        </w:rPr>
-      </w:pPr>
-      <w:r>
-        <w:rPr>
-          <w:rFonts w:ascii="Arial" w:hAnsi="Arial" w:cs="Arial"/>
-          <w:color w:val="111111"/>
-        </w:rPr>
-        <w:t>•    Provisión de insumos informáticos básicos no cuantitativos: adquisición de **webcams y auriculares con micrófono** para los puestos de trabajo, facilitando las reuniones virtuales de coordinación entre las dos oficinas físicas y las áreas usuarias.</w:t>
-      </w:r>
-    </w:p>
-    <w:p>
-      <w:pPr>
-        <w:spacing w:before="280" w:after="80" w:line="240" w:lineRule="auto"/>
-        <w:rPr>
-          <w:rFonts w:ascii="Arial" w:hAnsi="Arial" w:cs="Arial"/>
-          <w:b/>
-          <w:color w:val="1B365D"/>
-          <w:sz w:val="26"/>
-        </w:rPr>
-      </w:pPr>
-      <w:r>
-        <w:rPr>
-          <w:rFonts w:ascii="Arial" w:hAnsi="Arial" w:cs="Arial"/>
-          <w:b/>
-          <w:color w:val="1B365D"/>
-          <w:sz w:val="26"/>
-        </w:rPr>
-        <w:t>7. Implementación y Gestión (Hoja de Ruta por Etapas)</w:t>
-      </w:r>
-    </w:p>
-    <w:p>
-      <w:pPr>
-        <w:spacing w:before="60" w:after="60" w:line="240" w:lineRule="auto"/>
-        <w:jc w:val="both"/>
-        <w:rPr>
-          <w:rFonts w:ascii="Arial" w:hAnsi="Arial" w:cs="Arial"/>
-          <w:color w:val="111111"/>
-        </w:rPr>
-      </w:pPr>
-      <w:r>
-        <w:rPr>
-          <w:rFonts w:ascii="Arial" w:hAnsi="Arial" w:cs="Arial"/>
-          <w:color w:val="111111"/>
-        </w:rPr>
-        <w:t>La transformación del departamento se ejecutará bajo un marco de **adopción progresiva (Roadmap Ágil)** estructurado en 3 etapas principales y un proceso permanente:</w:t>
-      </w:r>
-    </w:p>
-    <w:p>
-      <w:pPr>
-        <w:spacing w:before="60" w:after="60" w:line="240" w:lineRule="auto"/>
-        <w:jc w:val="both"/>
-        <w:rPr>
-          <w:rFonts w:ascii="Arial" w:hAnsi="Arial" w:cs="Arial"/>
-          <w:color w:val="111111"/>
-        </w:rPr>
-      </w:pPr>
-      <w:r>
-        <w:rPr>
-          <w:rFonts w:ascii="Arial" w:hAnsi="Arial" w:cs="Arial"/>
-          <w:color w:val="111111"/>
-        </w:rPr>
-        <w:t>```</w:t>
-      </w:r>
-    </w:p>
-    <w:p>
-      <w:pPr>
-        <w:spacing w:before="60" w:after="60" w:line="240" w:lineRule="auto"/>
-        <w:jc w:val="both"/>
-        <w:rPr>
-          <w:rFonts w:ascii="Arial" w:hAnsi="Arial" w:cs="Arial"/>
-          <w:color w:val="111111"/>
-        </w:rPr>
-      </w:pPr>
-      <w:r>
-        <w:rPr>
-          <w:rFonts w:ascii="Arial" w:hAnsi="Arial" w:cs="Arial"/>
-          <w:color w:val="111111"/>
-        </w:rPr>
-        <w:t xml:space="preserve">[Etapa I: Conocer y Ordenar] </w:t>
-      </w:r>
-      <w:r>
-        <w:rPr>
-          <w:rFonts w:ascii="Segoe UI Symbol" w:hAnsi="Segoe UI Symbol" w:cs="Segoe UI Symbol"/>
-          <w:color w:val="111111"/>
-        </w:rPr>
-        <w:t>➔</w:t>
-      </w:r>
-      <w:r>
-        <w:rPr>
-          <w:rFonts w:ascii="Arial" w:hAnsi="Arial" w:cs="Arial"/>
-          <w:color w:val="111111"/>
-        </w:rPr>
-        <w:t xml:space="preserve"> [Etapa II: Integrar y Estandarizar] </w:t>
-      </w:r>
-      <w:r>
-        <w:rPr>
-          <w:rFonts w:ascii="Segoe UI Symbol" w:hAnsi="Segoe UI Symbol" w:cs="Segoe UI Symbol"/>
-          <w:color w:val="111111"/>
-        </w:rPr>
-        <w:t>➔</w:t>
-      </w:r>
-      <w:r>
-        <w:rPr>
-          <w:rFonts w:ascii="Arial" w:hAnsi="Arial" w:cs="Arial"/>
-          <w:color w:val="111111"/>
-        </w:rPr>
-        <w:t xml:space="preserve"> [Etapa III: Consolidar e Innovar] </w:t>
-      </w:r>
-      <w:r>
-        <w:rPr>
-          <w:rFonts w:ascii="Segoe UI Symbol" w:hAnsi="Segoe UI Symbol" w:cs="Segoe UI Symbol"/>
-          <w:color w:val="111111"/>
-        </w:rPr>
-        <w:t>➔</w:t>
-      </w:r>
-      <w:r>
-        <w:rPr>
-          <w:rFonts w:ascii="Arial" w:hAnsi="Arial" w:cs="Arial"/>
-          <w:color w:val="111111"/>
-        </w:rPr>
-        <w:t xml:space="preserve"> [Proceso Permanente]</w:t>
-      </w:r>
-    </w:p>
-    <w:p>
-      <w:pPr>
-        <w:spacing w:before="60" w:after="60" w:line="240" w:lineRule="auto"/>
-        <w:jc w:val="both"/>
-        <w:rPr>
-          <w:rFonts w:ascii="Arial" w:hAnsi="Arial" w:cs="Arial"/>
-          <w:color w:val="111111"/>
-        </w:rPr>
-      </w:pPr>
-      <w:r>
-        <w:rPr>
-          <w:rFonts w:ascii="Arial" w:hAnsi="Arial" w:cs="Arial"/>
-          <w:color w:val="111111"/>
-        </w:rPr>
-        <w:t>```</w:t>
-      </w:r>
-    </w:p>
-    <w:p>
-      <w:pPr>
-        <w:spacing w:before="40" w:after="40" w:line="240" w:lineRule="auto"/>
-        <w:ind w:left="360"/>
-        <w:jc w:val="both"/>
-        <w:rPr>
-          <w:rFonts w:ascii="Arial" w:hAnsi="Arial" w:cs="Arial"/>
-          <w:color w:val="111111"/>
-        </w:rPr>
-      </w:pPr>
-      <w:r>
-        <w:rPr>
-          <w:rFonts w:ascii="Arial" w:hAnsi="Arial" w:cs="Arial"/>
-          <w:color w:val="111111"/>
-        </w:rPr>
-        <w:t>•    **Etapa I – Conocer y Ordenar (Sprints 1 a 4):**</w:t>
-      </w:r>
-    </w:p>
-    <w:p>
-      <w:pPr>
-        <w:spacing w:before="40" w:after="40" w:line="240" w:lineRule="auto"/>
-        <w:ind w:left="360"/>
-        <w:jc w:val="both"/>
-        <w:rPr>
-          <w:rFonts w:ascii="Arial" w:hAnsi="Arial" w:cs="Arial"/>
-          <w:color w:val="111111"/>
-        </w:rPr>
-      </w:pPr>
-      <w:r>
-        <w:rPr>
-          <w:rFonts w:ascii="Arial" w:hAnsi="Arial" w:cs="Arial"/>
-          <w:color w:val="111111"/>
-        </w:rPr>
-        <w:t>•    Relevamiento de competencias y consolidación del Inventario de Sistemas.</w:t>
-      </w:r>
-    </w:p>
-    <w:p>
-      <w:pPr>
-        <w:spacing w:before="40" w:after="40" w:line="240" w:lineRule="auto"/>
-        <w:ind w:left="360"/>
-        <w:jc w:val="both"/>
-        <w:rPr>
-          <w:rFonts w:ascii="Arial" w:hAnsi="Arial" w:cs="Arial"/>
-          <w:color w:val="111111"/>
-        </w:rPr>
-      </w:pPr>
-      <w:r>
-        <w:rPr>
-          <w:rFonts w:ascii="Arial" w:hAnsi="Arial" w:cs="Arial"/>
-          <w:color w:val="111111"/>
-        </w:rPr>
-        <w:t>•    Conformación de la Cartera Única de Proyectos (evaluación previa de reutilización antes de crear código nuevo).</w:t>
-      </w:r>
-    </w:p>
-    <w:p>
-      <w:pPr>
-        <w:spacing w:before="40" w:after="40" w:line="240" w:lineRule="auto"/>
-        <w:ind w:left="360"/>
-        <w:jc w:val="both"/>
-        <w:rPr>
-          <w:rFonts w:ascii="Arial" w:hAnsi="Arial" w:cs="Arial"/>
-          <w:color w:val="111111"/>
-        </w:rPr>
-      </w:pPr>
-      <w:r>
-        <w:rPr>
-          <w:rFonts w:ascii="Arial" w:hAnsi="Arial" w:cs="Arial"/>
-          <w:color w:val="111111"/>
-        </w:rPr>
-        <w:t>•    Unificación del seguimiento obligatorio en Redmine y asignación de los primeros *Referentes Secundarios*.</w:t>
-      </w:r>
-    </w:p>
-    <w:p>
-      <w:pPr>
-        <w:spacing w:before="40" w:after="40" w:line="240" w:lineRule="auto"/>
-        <w:ind w:left="360"/>
-        <w:jc w:val="both"/>
-        <w:rPr>
-          <w:rFonts w:ascii="Arial" w:hAnsi="Arial" w:cs="Arial"/>
-          <w:color w:val="111111"/>
-        </w:rPr>
-      </w:pPr>
-      <w:r>
-        <w:rPr>
-          <w:rFonts w:ascii="Arial" w:hAnsi="Arial" w:cs="Arial"/>
-          <w:color w:val="111111"/>
-        </w:rPr>
-        <w:t>•    **Etapa II – Integrar y Estandarizar (Sprints 5 a 12):**</w:t>
-      </w:r>
-    </w:p>
-    <w:p>
-      <w:pPr>
-        <w:spacing w:before="40" w:after="40" w:line="240" w:lineRule="auto"/>
-        <w:ind w:left="360"/>
-        <w:jc w:val="both"/>
-        <w:rPr>
-          <w:rFonts w:ascii="Arial" w:hAnsi="Arial" w:cs="Arial"/>
-          <w:color w:val="111111"/>
-        </w:rPr>
-      </w:pPr>
-      <w:r>
-        <w:rPr>
-          <w:rFonts w:ascii="Arial" w:hAnsi="Arial" w:cs="Arial"/>
-          <w:color w:val="111111"/>
-        </w:rPr>
-        <w:t>•    Puesta en marcha de las reuniones de coordinación transversal entre ambas oficinas.</w:t>
-      </w:r>
-    </w:p>
-    <w:p>
-      <w:pPr>
-        <w:spacing w:before="40" w:after="40" w:line="240" w:lineRule="auto"/>
-        <w:ind w:left="360"/>
-        <w:jc w:val="both"/>
-        <w:rPr>
-          <w:rFonts w:ascii="Arial" w:hAnsi="Arial" w:cs="Arial"/>
-          <w:color w:val="111111"/>
-        </w:rPr>
-      </w:pPr>
-      <w:r>
-        <w:rPr>
-          <w:rFonts w:ascii="Arial" w:hAnsi="Arial" w:cs="Arial"/>
-          <w:color w:val="111111"/>
-        </w:rPr>
-        <w:t>•    Difusión y exigencia obligatoria de las Guías de Buenas Prácticas y del Template de Arquitectura Base.</w:t>
-      </w:r>
-    </w:p>
-    <w:p>
-      <w:pPr>
-        <w:spacing w:before="40" w:after="40" w:line="240" w:lineRule="auto"/>
-        <w:ind w:left="360"/>
-        <w:jc w:val="both"/>
-        <w:rPr>
-          <w:rFonts w:ascii="Arial" w:hAnsi="Arial" w:cs="Arial"/>
-          <w:color w:val="111111"/>
-        </w:rPr>
-      </w:pPr>
-      <w:r>
-        <w:rPr>
-          <w:rFonts w:ascii="Arial" w:hAnsi="Arial" w:cs="Arial"/>
-          <w:color w:val="111111"/>
-        </w:rPr>
-        <w:t>•    Implementación del protocolo de Gobierno Técnico de Proveedores Externos.</w:t>
-      </w:r>
-    </w:p>
-    <w:p>
-      <w:pPr>
-        <w:spacing w:before="40" w:after="40" w:line="240" w:lineRule="auto"/>
-        <w:ind w:left="360"/>
-        <w:jc w:val="both"/>
-        <w:rPr>
-          <w:rFonts w:ascii="Arial" w:hAnsi="Arial" w:cs="Arial"/>
-          <w:color w:val="111111"/>
-        </w:rPr>
-      </w:pPr>
-      <w:r>
-        <w:rPr>
-          <w:rFonts w:ascii="Arial" w:hAnsi="Arial" w:cs="Arial"/>
-          <w:color w:val="111111"/>
-        </w:rPr>
-        <w:t>•    **Etapa III – Consolidar y Evaluar (Sprints 13+):**</w:t>
-      </w:r>
-    </w:p>
-    <w:p>
-      <w:pPr>
-        <w:spacing w:before="40" w:after="40" w:line="240" w:lineRule="auto"/>
-        <w:ind w:left="360"/>
-        <w:jc w:val="both"/>
-        <w:rPr>
-          <w:rFonts w:ascii="Arial" w:hAnsi="Arial" w:cs="Arial"/>
-          <w:color w:val="111111"/>
-        </w:rPr>
-      </w:pPr>
-      <w:r>
-        <w:rPr>
-          <w:rFonts w:ascii="Arial" w:hAnsi="Arial" w:cs="Arial"/>
-          <w:color w:val="111111"/>
-        </w:rPr>
-        <w:t>•    Evaluación de los indicadores de riesgo operacional.</w:t>
-      </w:r>
-    </w:p>
-    <w:p>
-      <w:pPr>
-        <w:spacing w:before="40" w:after="40" w:line="240" w:lineRule="auto"/>
-        <w:ind w:left="360"/>
-        <w:jc w:val="both"/>
-        <w:rPr>
-          <w:rFonts w:ascii="Arial" w:hAnsi="Arial" w:cs="Arial"/>
-          <w:color w:val="111111"/>
-        </w:rPr>
-      </w:pPr>
-      <w:r>
-        <w:rPr>
-          <w:rFonts w:ascii="Arial" w:hAnsi="Arial" w:cs="Arial"/>
-          <w:color w:val="111111"/>
-        </w:rPr>
-        <w:t>•    Paso a producción de aplicaciones dockerizadas en sinergia con el área de Redes.</w:t>
-      </w:r>
-    </w:p>
-    <w:p>
-      <w:pPr>
-        <w:spacing w:before="40" w:after="40" w:line="240" w:lineRule="auto"/>
-        <w:ind w:left="360"/>
-        <w:jc w:val="both"/>
-        <w:rPr>
-          <w:rFonts w:ascii="Arial" w:hAnsi="Arial" w:cs="Arial"/>
-          <w:color w:val="111111"/>
-        </w:rPr>
-      </w:pPr>
-      <w:r>
-        <w:rPr>
-          <w:rFonts w:ascii="Arial" w:hAnsi="Arial" w:cs="Arial"/>
-          <w:color w:val="111111"/>
-        </w:rPr>
-        <w:t>•    Implementación gradual de revisiones de código cruzadas (*peer review*) en GitLab para cambios críticos.</w:t>
-      </w:r>
-    </w:p>
-    <w:p>
-      <w:pPr>
-        <w:spacing w:before="40" w:after="40" w:line="240" w:lineRule="auto"/>
-        <w:ind w:left="360"/>
-        <w:jc w:val="both"/>
-        <w:rPr>
-          <w:rFonts w:ascii="Arial" w:hAnsi="Arial" w:cs="Arial"/>
-          <w:color w:val="111111"/>
-        </w:rPr>
-      </w:pPr>
-      <w:r>
-        <w:rPr>
-          <w:rFonts w:ascii="Arial" w:hAnsi="Arial" w:cs="Arial"/>
-          <w:color w:val="111111"/>
-        </w:rPr>
-        <w:t>•    **Proceso Permanente – Mejora Continua e Innovación:**</w:t>
-      </w:r>
-    </w:p>
-    <w:p>
-      <w:pPr>
-        <w:spacing w:before="40" w:after="40" w:line="240" w:lineRule="auto"/>
-        <w:ind w:left="360"/>
-        <w:jc w:val="both"/>
-        <w:rPr>
-          <w:rFonts w:ascii="Arial" w:hAnsi="Arial" w:cs="Arial"/>
-          <w:color w:val="111111"/>
-        </w:rPr>
-      </w:pPr>
-      <w:r>
-        <w:rPr>
-          <w:rFonts w:ascii="Arial" w:hAnsi="Arial" w:cs="Arial"/>
-          <w:color w:val="111111"/>
-        </w:rPr>
-        <w:t>•    Revisión periódica de procedimientos, actualización de capacitaciones y evaluación fundamentada de nuevas tecnologías (IA corporativa y automatización).</w:t>
-      </w:r>
-    </w:p>
-    <w:p>
-      <w:pPr>
-        <w:spacing w:before="280" w:after="80" w:line="240" w:lineRule="auto"/>
-        <w:rPr>
-          <w:rFonts w:ascii="Arial" w:hAnsi="Arial" w:cs="Arial"/>
-          <w:b/>
-          <w:color w:val="1B365D"/>
-          <w:sz w:val="26"/>
-        </w:rPr>
-      </w:pPr>
-      <w:r>
-        <w:rPr>
-          <w:rFonts w:ascii="Arial" w:hAnsi="Arial" w:cs="Arial"/>
-          <w:b/>
-          <w:color w:val="1B365D"/>
-          <w:sz w:val="26"/>
-        </w:rPr>
         <w:t>8. Evaluación y Control (Matriz Unificada de Indicadores)</w:t>
       </w:r>
     </w:p>
     <w:p>
       <w:pPr>
-        <w:spacing w:before="60" w:after="60" w:line="240" w:lineRule="auto"/>
-        <w:jc w:val="both"/>
-        <w:rPr>
-          <w:rFonts w:ascii="Arial" w:hAnsi="Arial" w:cs="Arial"/>
-          <w:color w:val="111111"/>
-        </w:rPr>
-      </w:pPr>
-      <w:r>
-        <w:rPr>
-          <w:rFonts w:ascii="Arial" w:hAnsi="Arial" w:cs="Arial"/>
+        <w:spacing w:before="120" w:after="20" w:line="240" w:lineRule="auto"/>
+        <w:rPr>
+          <w:rFonts w:ascii="Arial" w:hAnsi="Arial" w:cs="Arial"/>
+          <w:b/>
+          <w:color w:val="111111"/>
+        </w:rPr>
+      </w:pPr>
+      <w:r>
+        <w:rPr>
+          <w:rFonts w:ascii="Arial" w:hAnsi="Arial" w:cs="Arial"/>
+          <w:b/>
           <w:color w:val="111111"/>
         </w:rPr>
         <w:t>El éxito de la propuesta se evaluará mediante una combinación de **Métricas Ejecutivas de Proceso** y **Métricas de Reducción de Riesgo Institucional**:</w:t>
@@ -2610,7 +2615,7 @@
           </w:tcPr>
           <w:p>
             <w:pPr>
-              <w:spacing w:before="60" w:after="60" w:line="240" w:lineRule="auto"/>
+              <w:spacing w:before="120" w:after="20" w:line="240" w:lineRule="auto"/>
               <w:jc w:val="center"/>
               <w:rPr>
                 <w:rFonts w:ascii="Arial" w:hAnsi="Arial" w:cs="Arial"/>
@@ -2640,7 +2645,7 @@
           </w:tcPr>
           <w:p>
             <w:pPr>
-              <w:spacing w:before="60" w:after="60" w:line="240" w:lineRule="auto"/>
+              <w:spacing w:before="120" w:after="20" w:line="240" w:lineRule="auto"/>
               <w:jc w:val="center"/>
               <w:rPr>
                 <w:rFonts w:ascii="Arial" w:hAnsi="Arial" w:cs="Arial"/>
@@ -2670,7 +2675,7 @@
           </w:tcPr>
           <w:p>
             <w:pPr>
-              <w:spacing w:before="60" w:after="60" w:line="240" w:lineRule="auto"/>
+              <w:spacing w:before="120" w:after="20" w:line="240" w:lineRule="auto"/>
               <w:jc w:val="center"/>
               <w:rPr>
                 <w:rFonts w:ascii="Arial" w:hAnsi="Arial" w:cs="Arial"/>
@@ -2705,8 +2710,7 @@
           </w:tcPr>
           <w:p>
             <w:pPr>
-              <w:spacing w:before="60" w:after="60" w:line="240" w:lineRule="auto"/>
-              <w:jc w:val="both"/>
+              <w:spacing w:before="120" w:after="20" w:line="240" w:lineRule="auto"/>
               <w:rPr>
                 <w:rFonts w:ascii="Arial" w:hAnsi="Arial" w:cs="Arial"/>
                 <w:color w:val="222222"/>
@@ -2730,8 +2734,7 @@
           </w:tcPr>
           <w:p>
             <w:pPr>
-              <w:spacing w:before="60" w:after="60" w:line="240" w:lineRule="auto"/>
-              <w:jc w:val="both"/>
+              <w:spacing w:before="120" w:after="20" w:line="240" w:lineRule="auto"/>
               <w:rPr>
                 <w:rFonts w:ascii="Arial" w:hAnsi="Arial" w:cs="Arial"/>
                 <w:color w:val="222222"/>
@@ -2755,8 +2758,7 @@
           </w:tcPr>
           <w:p>
             <w:pPr>
-              <w:spacing w:before="60" w:after="60" w:line="240" w:lineRule="auto"/>
-              <w:jc w:val="both"/>
+              <w:spacing w:before="120" w:after="20" w:line="240" w:lineRule="auto"/>
               <w:rPr>
                 <w:rFonts w:ascii="Arial" w:hAnsi="Arial" w:cs="Arial"/>
                 <w:color w:val="222222"/>
@@ -2791,8 +2793,7 @@
           </w:tcPr>
           <w:p>
             <w:pPr>
-              <w:spacing w:before="60" w:after="60" w:line="240" w:lineRule="auto"/>
-              <w:jc w:val="both"/>
+              <w:spacing w:before="120" w:after="20" w:line="240" w:lineRule="auto"/>
               <w:rPr>
                 <w:rFonts w:ascii="Arial" w:hAnsi="Arial" w:cs="Arial"/>
                 <w:color w:val="222222"/>
@@ -2819,8 +2820,7 @@
           </w:tcPr>
           <w:p>
             <w:pPr>
-              <w:spacing w:before="60" w:after="60" w:line="240" w:lineRule="auto"/>
-              <w:jc w:val="both"/>
+              <w:spacing w:before="120" w:after="20" w:line="240" w:lineRule="auto"/>
               <w:rPr>
                 <w:rFonts w:ascii="Arial" w:hAnsi="Arial" w:cs="Arial"/>
                 <w:color w:val="222222"/>
@@ -2847,8 +2847,7 @@
           </w:tcPr>
           <w:p>
             <w:pPr>
-              <w:spacing w:before="60" w:after="60" w:line="240" w:lineRule="auto"/>
-              <w:jc w:val="both"/>
+              <w:spacing w:before="120" w:after="20" w:line="240" w:lineRule="auto"/>
               <w:rPr>
                 <w:rFonts w:ascii="Arial" w:hAnsi="Arial" w:cs="Arial"/>
                 <w:color w:val="222222"/>
@@ -2880,8 +2879,7 @@
           </w:tcPr>
           <w:p>
             <w:pPr>
-              <w:spacing w:before="60" w:after="60" w:line="240" w:lineRule="auto"/>
-              <w:jc w:val="both"/>
+              <w:spacing w:before="120" w:after="20" w:line="240" w:lineRule="auto"/>
               <w:rPr>
                 <w:rFonts w:ascii="Arial" w:hAnsi="Arial" w:cs="Arial"/>
                 <w:color w:val="222222"/>
@@ -2905,8 +2903,7 @@
           </w:tcPr>
           <w:p>
             <w:pPr>
-              <w:spacing w:before="60" w:after="60" w:line="240" w:lineRule="auto"/>
-              <w:jc w:val="both"/>
+              <w:spacing w:before="120" w:after="20" w:line="240" w:lineRule="auto"/>
               <w:rPr>
                 <w:rFonts w:ascii="Arial" w:hAnsi="Arial" w:cs="Arial"/>
                 <w:color w:val="222222"/>
@@ -2930,8 +2927,7 @@
           </w:tcPr>
           <w:p>
             <w:pPr>
-              <w:spacing w:before="60" w:after="60" w:line="240" w:lineRule="auto"/>
-              <w:jc w:val="both"/>
+              <w:spacing w:before="120" w:after="20" w:line="240" w:lineRule="auto"/>
               <w:rPr>
                 <w:rFonts w:ascii="Arial" w:hAnsi="Arial" w:cs="Arial"/>
                 <w:color w:val="222222"/>
@@ -2966,8 +2962,7 @@
           </w:tcPr>
           <w:p>
             <w:pPr>
-              <w:spacing w:before="60" w:after="60" w:line="240" w:lineRule="auto"/>
-              <w:jc w:val="both"/>
+              <w:spacing w:before="120" w:after="20" w:line="240" w:lineRule="auto"/>
               <w:rPr>
                 <w:rFonts w:ascii="Arial" w:hAnsi="Arial" w:cs="Arial"/>
                 <w:color w:val="222222"/>
@@ -2994,8 +2989,7 @@
           </w:tcPr>
           <w:p>
             <w:pPr>
-              <w:spacing w:before="60" w:after="60" w:line="240" w:lineRule="auto"/>
-              <w:jc w:val="both"/>
+              <w:spacing w:before="120" w:after="20" w:line="240" w:lineRule="auto"/>
               <w:rPr>
                 <w:rFonts w:ascii="Arial" w:hAnsi="Arial" w:cs="Arial"/>
                 <w:color w:val="222222"/>
@@ -3038,8 +3032,7 @@
           </w:tcPr>
           <w:p>
             <w:pPr>
-              <w:spacing w:before="60" w:after="60" w:line="240" w:lineRule="auto"/>
-              <w:jc w:val="both"/>
+              <w:spacing w:before="120" w:after="20" w:line="240" w:lineRule="auto"/>
               <w:rPr>
                 <w:rFonts w:ascii="Arial" w:hAnsi="Arial" w:cs="Arial"/>
                 <w:color w:val="222222"/>
@@ -3071,8 +3064,7 @@
           </w:tcPr>
           <w:p>
             <w:pPr>
-              <w:spacing w:before="60" w:after="60" w:line="240" w:lineRule="auto"/>
-              <w:jc w:val="both"/>
+              <w:spacing w:before="120" w:after="20" w:line="240" w:lineRule="auto"/>
               <w:rPr>
                 <w:rFonts w:ascii="Arial" w:hAnsi="Arial" w:cs="Arial"/>
                 <w:color w:val="222222"/>
@@ -3096,8 +3088,7 @@
           </w:tcPr>
           <w:p>
             <w:pPr>
-              <w:spacing w:before="60" w:after="60" w:line="240" w:lineRule="auto"/>
-              <w:jc w:val="both"/>
+              <w:spacing w:before="120" w:after="20" w:line="240" w:lineRule="auto"/>
               <w:rPr>
                 <w:rFonts w:ascii="Arial" w:hAnsi="Arial" w:cs="Arial"/>
                 <w:color w:val="222222"/>
@@ -3121,8 +3112,7 @@
           </w:tcPr>
           <w:p>
             <w:pPr>
-              <w:spacing w:before="60" w:after="60" w:line="240" w:lineRule="auto"/>
-              <w:jc w:val="both"/>
+              <w:spacing w:before="120" w:after="20" w:line="240" w:lineRule="auto"/>
               <w:rPr>
                 <w:rFonts w:ascii="Arial" w:hAnsi="Arial" w:cs="Arial"/>
                 <w:color w:val="222222"/>
@@ -3157,8 +3147,7 @@
           </w:tcPr>
           <w:p>
             <w:pPr>
-              <w:spacing w:before="60" w:after="60" w:line="240" w:lineRule="auto"/>
-              <w:jc w:val="both"/>
+              <w:spacing w:before="120" w:after="20" w:line="240" w:lineRule="auto"/>
               <w:rPr>
                 <w:rFonts w:ascii="Arial" w:hAnsi="Arial" w:cs="Arial"/>
                 <w:color w:val="222222"/>
@@ -3185,8 +3174,7 @@
           </w:tcPr>
           <w:p>
             <w:pPr>
-              <w:spacing w:before="60" w:after="60" w:line="240" w:lineRule="auto"/>
-              <w:jc w:val="both"/>
+              <w:spacing w:before="120" w:after="20" w:line="240" w:lineRule="auto"/>
               <w:rPr>
                 <w:rFonts w:ascii="Arial" w:hAnsi="Arial" w:cs="Arial"/>
                 <w:color w:val="222222"/>
@@ -3213,8 +3201,7 @@
           </w:tcPr>
           <w:p>
             <w:pPr>
-              <w:spacing w:before="60" w:after="60" w:line="240" w:lineRule="auto"/>
-              <w:jc w:val="both"/>
+              <w:spacing w:before="120" w:after="20" w:line="240" w:lineRule="auto"/>
               <w:rPr>
                 <w:rFonts w:ascii="Arial" w:hAnsi="Arial" w:cs="Arial"/>
                 <w:color w:val="222222"/>
@@ -3246,8 +3233,7 @@
           </w:tcPr>
           <w:p>
             <w:pPr>
-              <w:spacing w:before="60" w:after="60" w:line="240" w:lineRule="auto"/>
-              <w:jc w:val="both"/>
+              <w:spacing w:before="120" w:after="20" w:line="240" w:lineRule="auto"/>
               <w:rPr>
                 <w:rFonts w:ascii="Arial" w:hAnsi="Arial" w:cs="Arial"/>
                 <w:color w:val="222222"/>
@@ -3271,8 +3257,7 @@
           </w:tcPr>
           <w:p>
             <w:pPr>
-              <w:spacing w:before="60" w:after="60" w:line="240" w:lineRule="auto"/>
-              <w:jc w:val="both"/>
+              <w:spacing w:before="120" w:after="20" w:line="240" w:lineRule="auto"/>
               <w:rPr>
                 <w:rFonts w:ascii="Arial" w:hAnsi="Arial" w:cs="Arial"/>
                 <w:color w:val="222222"/>
@@ -3296,8 +3281,7 @@
           </w:tcPr>
           <w:p>
             <w:pPr>
-              <w:spacing w:before="60" w:after="60" w:line="240" w:lineRule="auto"/>
-              <w:jc w:val="both"/>
+              <w:spacing w:before="120" w:after="20" w:line="240" w:lineRule="auto"/>
               <w:rPr>
                 <w:rFonts w:ascii="Arial" w:hAnsi="Arial" w:cs="Arial"/>
                 <w:color w:val="222222"/>
@@ -3318,10 +3302,10 @@
     </w:tbl>
     <w:p>
       <w:pPr>
-        <w:spacing w:before="60" w:after="60" w:line="240" w:lineRule="auto"/>
-        <w:jc w:val="both"/>
-        <w:rPr>
-          <w:rFonts w:ascii="Arial" w:hAnsi="Arial" w:cs="Arial"/>
+        <w:spacing w:before="120" w:after="20" w:line="240" w:lineRule="auto"/>
+        <w:rPr>
+          <w:rFonts w:ascii="Arial" w:hAnsi="Arial" w:cs="Arial"/>
+          <w:b/>
           <w:color w:val="111111"/>
         </w:rPr>
       </w:pPr>
@@ -3348,16 +3332,17 @@
     </w:p>
     <w:p>
       <w:pPr>
-        <w:spacing w:before="60" w:after="60" w:line="240" w:lineRule="auto"/>
-        <w:jc w:val="both"/>
-        <w:rPr>
-          <w:rFonts w:ascii="Arial" w:hAnsi="Arial" w:cs="Arial"/>
-          <w:color w:val="111111"/>
-        </w:rPr>
-      </w:pPr>
-      <w:r>
-        <w:rPr>
-          <w:rFonts w:ascii="Arial" w:hAnsi="Arial" w:cs="Arial"/>
+        <w:spacing w:before="120" w:after="20" w:line="240" w:lineRule="auto"/>
+        <w:rPr>
+          <w:rFonts w:ascii="Arial" w:hAnsi="Arial" w:cs="Arial"/>
+          <w:b/>
+          <w:color w:val="111111"/>
+        </w:rPr>
+      </w:pPr>
+      <w:r>
+        <w:rPr>
+          <w:rFonts w:ascii="Arial" w:hAnsi="Arial" w:cs="Arial"/>
+          <w:b/>
           <w:color w:val="111111"/>
         </w:rPr>
         <w:t>Aprovechando la estructura del *Grupo Ocupacional Computación* vigente (sin solicitar la creación de nuevos cargos en el escalafón), el flujo operativo se organizará dinámicamente:</w:t>
@@ -3436,7 +3421,7 @@
     </w:p>
     <w:p>
       <w:pPr>
-        <w:spacing w:before="60" w:after="60" w:line="240" w:lineRule="auto"/>
+        <w:spacing w:before="40" w:after="120" w:line="240" w:lineRule="auto"/>
         <w:jc w:val="both"/>
         <w:rPr>
           <w:rFonts w:ascii="Arial" w:hAnsi="Arial" w:cs="Arial"/>
@@ -3453,7 +3438,7 @@
     </w:p>
     <w:p>
       <w:pPr>
-        <w:spacing w:before="60" w:after="60" w:line="240" w:lineRule="auto"/>
+        <w:spacing w:before="40" w:after="120" w:line="240" w:lineRule="auto"/>
         <w:jc w:val="both"/>
         <w:rPr>
           <w:rFonts w:ascii="Arial" w:hAnsi="Arial" w:cs="Arial"/>
@@ -3470,7 +3455,7 @@
     </w:p>
     <w:p>
       <w:pPr>
-        <w:spacing w:before="60" w:after="60" w:line="240" w:lineRule="auto"/>
+        <w:spacing w:before="40" w:after="120" w:line="240" w:lineRule="auto"/>
         <w:jc w:val="both"/>
         <w:rPr>
           <w:rFonts w:ascii="Arial" w:hAnsi="Arial" w:cs="Arial"/>
@@ -3487,7 +3472,7 @@
     </w:p>
     <w:p>
       <w:pPr>
-        <w:spacing w:before="60" w:after="60" w:line="240" w:lineRule="auto"/>
+        <w:spacing w:before="40" w:after="120" w:line="240" w:lineRule="auto"/>
         <w:jc w:val="both"/>
         <w:rPr>
           <w:rFonts w:ascii="Arial" w:hAnsi="Arial" w:cs="Arial"/>
@@ -4106,7 +4091,7 @@
     <w:link w:val="EncabezadoCar"/>
     <w:uiPriority w:val="99"/>
     <w:unhideWhenUsed/>
-    <w:rsid w:val="00C55567"/>
+    <w:rsid w:val="00A42106"/>
     <w:pPr>
       <w:tabs>
         <w:tab w:val="center" w:pos="4252"/>
@@ -4120,7 +4105,7 @@
     <w:basedOn w:val="Fuentedeprrafopredeter"/>
     <w:link w:val="Encabezado"/>
     <w:uiPriority w:val="99"/>
-    <w:rsid w:val="00C55567"/>
+    <w:rsid w:val="00A42106"/>
   </w:style>
   <w:style w:type="paragraph" w:styleId="Piedepgina">
     <w:name w:val="footer"/>
@@ -4128,7 +4113,7 @@
     <w:link w:val="PiedepginaCar"/>
     <w:uiPriority w:val="99"/>
     <w:unhideWhenUsed/>
-    <w:rsid w:val="00C55567"/>
+    <w:rsid w:val="00A42106"/>
     <w:pPr>
       <w:tabs>
         <w:tab w:val="center" w:pos="4252"/>
@@ -4142,7 +4127,7 @@
     <w:basedOn w:val="Fuentedeprrafopredeter"/>
     <w:link w:val="Piedepgina"/>
     <w:uiPriority w:val="99"/>
-    <w:rsid w:val="00C55567"/>
+    <w:rsid w:val="00A42106"/>
   </w:style>
 </w:styles>
 </file>

</xml_diff>

<commit_message>
fix: Replace asterisks with real circular bullets in Markdown and DOCX
</commit_message>
<xml_diff>
--- a/Plan_Trabajo_Concurso_Jefatura_Software.docx
+++ b/Plan_Trabajo_Concurso_Jefatura_Software.docx
@@ -782,7 +782,7 @@
           <w:b/>
           <w:color w:val="111111"/>
         </w:rPr>
-        <w:t>* Personal Técnico Capacitado:</w:t>
+        <w:t>• Personal Técnico Capacitado:</w:t>
       </w:r>
     </w:p>
     <w:p>
@@ -817,7 +817,7 @@
           <w:b/>
           <w:color w:val="111111"/>
         </w:rPr>
-        <w:t>* Disponibilidad de medios:</w:t>
+        <w:t>• Disponibilidad de medios:</w:t>
       </w:r>
     </w:p>
     <w:p>
@@ -870,7 +870,7 @@
           <w:b/>
           <w:color w:val="111111"/>
         </w:rPr>
-        <w:t>* Fragmentación Tecnológica:</w:t>
+        <w:t>• Fragmentación Tecnológica:</w:t>
       </w:r>
     </w:p>
     <w:p>
@@ -905,7 +905,7 @@
           <w:b/>
           <w:color w:val="111111"/>
         </w:rPr>
-        <w:t>* Falta de una Arquitectura Base Estandarizada:</w:t>
+        <w:t>• Falta de una Arquitectura Base Estandarizada:</w:t>
       </w:r>
     </w:p>
     <w:p>
@@ -940,7 +940,7 @@
           <w:b/>
           <w:color w:val="111111"/>
         </w:rPr>
-        <w:t>* Multitarea Extrema y Conocimiento Concentrado:</w:t>
+        <w:t>• Multitarea Extrema y Conocimiento Concentrado:</w:t>
       </w:r>
     </w:p>
     <w:p>
@@ -975,7 +975,7 @@
           <w:b/>
           <w:color w:val="111111"/>
         </w:rPr>
-        <w:t>* Aislamiento Operativo entre Dependencias:</w:t>
+        <w:t>• Aislamiento Operativo entre Dependencias:</w:t>
       </w:r>
     </w:p>
     <w:p>
@@ -1010,7 +1010,7 @@
           <w:b/>
           <w:color w:val="111111"/>
         </w:rPr>
-        <w:t>* Estimación y Seguimiento Caóticos:</w:t>
+        <w:t>• Estimación y Seguimiento Caóticos:</w:t>
       </w:r>
     </w:p>
     <w:p>
@@ -1045,7 +1045,7 @@
           <w:b/>
           <w:color w:val="111111"/>
         </w:rPr>
-        <w:t>* Documentación Inexistente o Desigual:</w:t>
+        <w:t>• Documentación Inexistente o Desigual:</w:t>
       </w:r>
     </w:p>
     <w:p>
@@ -1080,7 +1080,7 @@
           <w:b/>
           <w:color w:val="111111"/>
         </w:rPr>
-        <w:t>* Pruebas de Software Reactivas:</w:t>
+        <w:t>• Pruebas de Software Reactivas:</w:t>
       </w:r>
     </w:p>
     <w:p>
@@ -1115,7 +1115,7 @@
           <w:b/>
           <w:color w:val="111111"/>
         </w:rPr>
-        <w:t>* Resistencia al cambio:</w:t>
+        <w:t>• Resistencia al cambio:</w:t>
       </w:r>
     </w:p>
     <w:p>
@@ -1168,7 +1168,7 @@
           <w:b/>
           <w:color w:val="111111"/>
         </w:rPr>
-        <w:t>* Adopción de Inteligencia Artificial para Agilizar la Producción:</w:t>
+        <w:t>• Adopción de Inteligencia Artificial para Agilizar la Producción:</w:t>
       </w:r>
     </w:p>
     <w:p>
@@ -1203,7 +1203,7 @@
           <w:b/>
           <w:color w:val="111111"/>
         </w:rPr>
-        <w:t>* Adopción de Marcos Ágiles Híbridos:</w:t>
+        <w:t>• Adopción de Marcos Ágiles Híbridos:</w:t>
       </w:r>
     </w:p>
     <w:p>
@@ -1238,7 +1238,7 @@
           <w:b/>
           <w:color w:val="111111"/>
         </w:rPr>
-        <w:t>* Estandarización mediante la Arquitectura Base:</w:t>
+        <w:t>• Estandarización mediante la Arquitectura Base:</w:t>
       </w:r>
     </w:p>
     <w:p>
@@ -1273,7 +1273,7 @@
           <w:b/>
           <w:color w:val="111111"/>
         </w:rPr>
-        <w:t>* Gestión Política favorable:</w:t>
+        <w:t>• Gestión Política favorable:</w:t>
       </w:r>
     </w:p>
     <w:p>
@@ -1308,7 +1308,7 @@
           <w:b/>
           <w:color w:val="111111"/>
         </w:rPr>
-        <w:t>* Capacitaciones disponibles y accesibles:</w:t>
+        <w:t>• Capacitaciones disponibles y accesibles:</w:t>
       </w:r>
     </w:p>
     <w:p>
@@ -1361,7 +1361,7 @@
           <w:b/>
           <w:color w:val="111111"/>
         </w:rPr>
-        <w:t>* Falta de una óptima integración entre sistemas legacy y nuevos aplicativos:</w:t>
+        <w:t>• Falta de una óptima integración entre sistemas legacy y nuevos aplicativos:</w:t>
       </w:r>
     </w:p>
     <w:p>
@@ -4091,7 +4091,7 @@
     <w:link w:val="EncabezadoCar"/>
     <w:uiPriority w:val="99"/>
     <w:unhideWhenUsed/>
-    <w:rsid w:val="00A42106"/>
+    <w:rsid w:val="007B14B6"/>
     <w:pPr>
       <w:tabs>
         <w:tab w:val="center" w:pos="4252"/>
@@ -4105,7 +4105,7 @@
     <w:basedOn w:val="Fuentedeprrafopredeter"/>
     <w:link w:val="Encabezado"/>
     <w:uiPriority w:val="99"/>
-    <w:rsid w:val="00A42106"/>
+    <w:rsid w:val="007B14B6"/>
   </w:style>
   <w:style w:type="paragraph" w:styleId="Piedepgina">
     <w:name w:val="footer"/>
@@ -4113,7 +4113,7 @@
     <w:link w:val="PiedepginaCar"/>
     <w:uiPriority w:val="99"/>
     <w:unhideWhenUsed/>
-    <w:rsid w:val="00A42106"/>
+    <w:rsid w:val="007B14B6"/>
     <w:pPr>
       <w:tabs>
         <w:tab w:val="center" w:pos="4252"/>
@@ -4127,7 +4127,7 @@
     <w:basedOn w:val="Fuentedeprrafopredeter"/>
     <w:link w:val="Piedepgina"/>
     <w:uiPriority w:val="99"/>
-    <w:rsid w:val="00A42106"/>
+    <w:rsid w:val="007B14B6"/>
   </w:style>
 </w:styles>
 </file>

</xml_diff>

<commit_message>
fix: Restore exact text regarding lack of coordinating agent between projects and offices
</commit_message>
<xml_diff>
--- a/Plan_Trabajo_Concurso_Jefatura_Software.docx
+++ b/Plan_Trabajo_Concurso_Jefatura_Software.docx
@@ -1379,6 +1379,41 @@
           <w:color w:val="111111"/>
         </w:rPr>
         <w:t>Algunos sistemas duplican funciones debido a la imposibilidad de integrar la forma en que acceden a las bases de datos más antiguas con nuevos aplicativos, generando duplicación de funciones al no haber APIs o sistemas que unifiquen la consumición de estos datos.</w:t>
+      </w:r>
+    </w:p>
+    <w:p>
+      <w:pPr>
+        <w:spacing w:before="120" w:after="20" w:line="240" w:lineRule="auto"/>
+        <w:rPr>
+          <w:rFonts w:ascii="Arial" w:hAnsi="Arial" w:cs="Arial"/>
+          <w:b/>
+          <w:color w:val="111111"/>
+        </w:rPr>
+      </w:pPr>
+      <w:r>
+        <w:rPr>
+          <w:rFonts w:ascii="Arial" w:hAnsi="Arial" w:cs="Arial"/>
+          <w:b/>
+          <w:color w:val="111111"/>
+        </w:rPr>
+        <w:t>• Falta de coordinación entre equipos de trabajo:</w:t>
+      </w:r>
+    </w:p>
+    <w:p>
+      <w:pPr>
+        <w:spacing w:before="40" w:after="120" w:line="240" w:lineRule="auto"/>
+        <w:jc w:val="both"/>
+        <w:rPr>
+          <w:rFonts w:ascii="Arial" w:hAnsi="Arial" w:cs="Arial"/>
+          <w:color w:val="111111"/>
+        </w:rPr>
+      </w:pPr>
+      <w:r>
+        <w:rPr>
+          <w:rFonts w:ascii="Arial" w:hAnsi="Arial" w:cs="Arial"/>
+          <w:color w:val="111111"/>
+        </w:rPr>
+        <w:t>Al no haber un agente que actúe como coordinador entre los proyectos ni documentación accesible de los sistemas existentes, los distintos equipos de trabajo desconocen las tareas que realizan los demás generando una duplicación de funcionalidades innecesaria.</w:t>
       </w:r>
     </w:p>
     <w:p>
@@ -4091,7 +4126,7 @@
     <w:link w:val="EncabezadoCar"/>
     <w:uiPriority w:val="99"/>
     <w:unhideWhenUsed/>
-    <w:rsid w:val="007B14B6"/>
+    <w:rsid w:val="00F03A7D"/>
     <w:pPr>
       <w:tabs>
         <w:tab w:val="center" w:pos="4252"/>
@@ -4105,7 +4140,7 @@
     <w:basedOn w:val="Fuentedeprrafopredeter"/>
     <w:link w:val="Encabezado"/>
     <w:uiPriority w:val="99"/>
-    <w:rsid w:val="007B14B6"/>
+    <w:rsid w:val="00F03A7D"/>
   </w:style>
   <w:style w:type="paragraph" w:styleId="Piedepgina">
     <w:name w:val="footer"/>
@@ -4113,7 +4148,7 @@
     <w:link w:val="PiedepginaCar"/>
     <w:uiPriority w:val="99"/>
     <w:unhideWhenUsed/>
-    <w:rsid w:val="007B14B6"/>
+    <w:rsid w:val="00F03A7D"/>
     <w:pPr>
       <w:tabs>
         <w:tab w:val="center" w:pos="4252"/>
@@ -4127,7 +4162,7 @@
     <w:basedOn w:val="Fuentedeprrafopredeter"/>
     <w:link w:val="Piedepgina"/>
     <w:uiPriority w:val="99"/>
-    <w:rsid w:val="007B14B6"/>
+    <w:rsid w:val="00F03A7D"/>
   </w:style>
 </w:styles>
 </file>

</xml_diff>

<commit_message>
fix: Rebuild DOCX in all target directories with exact text
</commit_message>
<xml_diff>
--- a/Plan_Trabajo_Concurso_Jefatura_Software.docx
+++ b/Plan_Trabajo_Concurso_Jefatura_Software.docx
@@ -4126,7 +4126,7 @@
     <w:link w:val="EncabezadoCar"/>
     <w:uiPriority w:val="99"/>
     <w:unhideWhenUsed/>
-    <w:rsid w:val="00F03A7D"/>
+    <w:rsid w:val="00E60FB3"/>
     <w:pPr>
       <w:tabs>
         <w:tab w:val="center" w:pos="4252"/>
@@ -4140,7 +4140,7 @@
     <w:basedOn w:val="Fuentedeprrafopredeter"/>
     <w:link w:val="Encabezado"/>
     <w:uiPriority w:val="99"/>
-    <w:rsid w:val="00F03A7D"/>
+    <w:rsid w:val="00E60FB3"/>
   </w:style>
   <w:style w:type="paragraph" w:styleId="Piedepgina">
     <w:name w:val="footer"/>
@@ -4148,7 +4148,7 @@
     <w:link w:val="PiedepginaCar"/>
     <w:uiPriority w:val="99"/>
     <w:unhideWhenUsed/>
-    <w:rsid w:val="00F03A7D"/>
+    <w:rsid w:val="00E60FB3"/>
     <w:pPr>
       <w:tabs>
         <w:tab w:val="center" w:pos="4252"/>
@@ -4162,7 +4162,7 @@
     <w:basedOn w:val="Fuentedeprrafopredeter"/>
     <w:link w:val="Piedepgina"/>
     <w:uiPriority w:val="99"/>
-    <w:rsid w:val="00F03A7D"/>
+    <w:rsid w:val="00E60FB3"/>
   </w:style>
 </w:styles>
 </file>

</xml_diff>

<commit_message>
fix: Remove physical separation references from SWOT and focus strictly on lack of coordination
</commit_message>
<xml_diff>
--- a/Plan_Trabajo_Concurso_Jefatura_Software.docx
+++ b/Plan_Trabajo_Concurso_Jefatura_Software.docx
@@ -992,7 +992,7 @@
           <w:rFonts w:ascii="Arial" w:hAnsi="Arial" w:cs="Arial"/>
           <w:color w:val="111111"/>
         </w:rPr>
-        <w:t>La distribución física del personal en dos oficinas distintas y sin un agente que coordine ambas, genera descoordinación, aislamiento en silos de información y el riesgo de desarrollar funcionalidades duplicadas por falta de comunicación.</w:t>
+        <w:t>La falta de un agente que coordine el trabajo entre las distintas dependencias genera descoordinación, aislamiento en silos de información y el riesgo de desarrollar funcionalidades duplicadas por falta de comunicación.</w:t>
       </w:r>
     </w:p>
     <w:p>
@@ -4126,7 +4126,7 @@
     <w:link w:val="EncabezadoCar"/>
     <w:uiPriority w:val="99"/>
     <w:unhideWhenUsed/>
-    <w:rsid w:val="00E60FB3"/>
+    <w:rsid w:val="00D73E1A"/>
     <w:pPr>
       <w:tabs>
         <w:tab w:val="center" w:pos="4252"/>
@@ -4140,7 +4140,7 @@
     <w:basedOn w:val="Fuentedeprrafopredeter"/>
     <w:link w:val="Encabezado"/>
     <w:uiPriority w:val="99"/>
-    <w:rsid w:val="00E60FB3"/>
+    <w:rsid w:val="00D73E1A"/>
   </w:style>
   <w:style w:type="paragraph" w:styleId="Piedepgina">
     <w:name w:val="footer"/>
@@ -4148,7 +4148,7 @@
     <w:link w:val="PiedepginaCar"/>
     <w:uiPriority w:val="99"/>
     <w:unhideWhenUsed/>
-    <w:rsid w:val="00E60FB3"/>
+    <w:rsid w:val="00D73E1A"/>
     <w:pPr>
       <w:tabs>
         <w:tab w:val="center" w:pos="4252"/>
@@ -4162,7 +4162,7 @@
     <w:basedOn w:val="Fuentedeprrafopredeter"/>
     <w:link w:val="Piedepgina"/>
     <w:uiPriority w:val="99"/>
-    <w:rsid w:val="00E60FB3"/>
+    <w:rsid w:val="00D73E1A"/>
   </w:style>
 </w:styles>
 </file>

</xml_diff>

<commit_message>
fix: Explicitly mention lack of coordination and lack of coordinating agent
</commit_message>
<xml_diff>
--- a/Plan_Trabajo_Concurso_Jefatura_Software.docx
+++ b/Plan_Trabajo_Concurso_Jefatura_Software.docx
@@ -992,7 +992,7 @@
           <w:rFonts w:ascii="Arial" w:hAnsi="Arial" w:cs="Arial"/>
           <w:color w:val="111111"/>
         </w:rPr>
-        <w:t>La falta de un agente que coordine el trabajo entre las distintas dependencias genera descoordinación, aislamiento en silos de información y el riesgo de desarrollar funcionalidades duplicadas por falta de comunicación.</w:t>
+        <w:t>La falta de coordinación entre las distintas dependencias y la ausencia de un agente que coordine las tareas genera descoordinación, aislamiento en silos de información y el riesgo de desarrollar funcionalidades duplicadas por falta de comunicación.</w:t>
       </w:r>
     </w:p>
     <w:p>
@@ -4126,7 +4126,7 @@
     <w:link w:val="EncabezadoCar"/>
     <w:uiPriority w:val="99"/>
     <w:unhideWhenUsed/>
-    <w:rsid w:val="00D73E1A"/>
+    <w:rsid w:val="00E91E5A"/>
     <w:pPr>
       <w:tabs>
         <w:tab w:val="center" w:pos="4252"/>
@@ -4140,7 +4140,7 @@
     <w:basedOn w:val="Fuentedeprrafopredeter"/>
     <w:link w:val="Encabezado"/>
     <w:uiPriority w:val="99"/>
-    <w:rsid w:val="00D73E1A"/>
+    <w:rsid w:val="00E91E5A"/>
   </w:style>
   <w:style w:type="paragraph" w:styleId="Piedepgina">
     <w:name w:val="footer"/>
@@ -4148,7 +4148,7 @@
     <w:link w:val="PiedepginaCar"/>
     <w:uiPriority w:val="99"/>
     <w:unhideWhenUsed/>
-    <w:rsid w:val="00D73E1A"/>
+    <w:rsid w:val="00E91E5A"/>
     <w:pPr>
       <w:tabs>
         <w:tab w:val="center" w:pos="4252"/>
@@ -4162,7 +4162,7 @@
     <w:basedOn w:val="Fuentedeprrafopredeter"/>
     <w:link w:val="Piedepgina"/>
     <w:uiPriority w:val="99"/>
-    <w:rsid w:val="00D73E1A"/>
+    <w:rsid w:val="00E91E5A"/>
   </w:style>
 </w:styles>
 </file>

</xml_diff>

<commit_message>
fix: Restore 100% exact text from user original file for all SWOT items
</commit_message>
<xml_diff>
--- a/Plan_Trabajo_Concurso_Jefatura_Software.docx
+++ b/Plan_Trabajo_Concurso_Jefatura_Software.docx
@@ -992,7 +992,7 @@
           <w:rFonts w:ascii="Arial" w:hAnsi="Arial" w:cs="Arial"/>
           <w:color w:val="111111"/>
         </w:rPr>
-        <w:t>La falta de coordinación entre las distintas dependencias y la ausencia de un agente que coordine las tareas genera descoordinación, aislamiento en silos de información y el riesgo de desarrollar funcionalidades duplicadas por falta de comunicación.</w:t>
+        <w:t>La distribución física del personal en dos oficinas distintas y sin un agente que coordine ambas, genera descoordinación, aislamiento en silos de información y el riesgo de desarrollar funcionalidades duplicadas por falta de comunicación.</w:t>
       </w:r>
     </w:p>
     <w:p>
@@ -1132,7 +1132,42 @@
           <w:rFonts w:ascii="Arial" w:hAnsi="Arial" w:cs="Arial"/>
           <w:color w:val="111111"/>
         </w:rPr>
-        <w:t>Algunos agentes se rehúsan a aprender nuevas tecnologías y mejorar las formas de desarrollo, insistiendo en utilizar lenguajes o arquitecturas obsoletas, generando conflictos en la optimización de las bases de datos.</w:t>
+        <w:t>Algunos agentes se rehúsan a aprender nuevas tecnologías y mejorar las formas de desarrollo, insistiendo en utilizar lenguajes o arquitecturas obsoletas. Generando conflictos en la optimización de las bases de datos.</w:t>
+      </w:r>
+    </w:p>
+    <w:p>
+      <w:pPr>
+        <w:spacing w:before="120" w:after="20" w:line="240" w:lineRule="auto"/>
+        <w:rPr>
+          <w:rFonts w:ascii="Arial" w:hAnsi="Arial" w:cs="Arial"/>
+          <w:b/>
+          <w:color w:val="111111"/>
+        </w:rPr>
+      </w:pPr>
+      <w:r>
+        <w:rPr>
+          <w:rFonts w:ascii="Arial" w:hAnsi="Arial" w:cs="Arial"/>
+          <w:b/>
+          <w:color w:val="111111"/>
+        </w:rPr>
+        <w:t>• Falta de coordinación entre equipos de trabajo:</w:t>
+      </w:r>
+    </w:p>
+    <w:p>
+      <w:pPr>
+        <w:spacing w:before="40" w:after="120" w:line="240" w:lineRule="auto"/>
+        <w:jc w:val="both"/>
+        <w:rPr>
+          <w:rFonts w:ascii="Arial" w:hAnsi="Arial" w:cs="Arial"/>
+          <w:color w:val="111111"/>
+        </w:rPr>
+      </w:pPr>
+      <w:r>
+        <w:rPr>
+          <w:rFonts w:ascii="Arial" w:hAnsi="Arial" w:cs="Arial"/>
+          <w:color w:val="111111"/>
+        </w:rPr>
+        <w:t>Al no haber un agente que actúe como coordinador entre los proyectos ni documentación accesible de los sistemas existentes, los distintos equipos de trabajo desconocen las tareas que realizan los demás generando una duplicación de funcionalidades innecesaria.</w:t>
       </w:r>
     </w:p>
     <w:p>
@@ -1378,42 +1413,7 @@
           <w:rFonts w:ascii="Arial" w:hAnsi="Arial" w:cs="Arial"/>
           <w:color w:val="111111"/>
         </w:rPr>
-        <w:t>Algunos sistemas duplican funciones debido a la imposibilidad de integrar la forma en que acceden a las bases de datos más antiguas con nuevos aplicativos, generando duplicación de funciones al no haber APIs o sistemas que unifiquen la consumición de estos datos.</w:t>
-      </w:r>
-    </w:p>
-    <w:p>
-      <w:pPr>
-        <w:spacing w:before="120" w:after="20" w:line="240" w:lineRule="auto"/>
-        <w:rPr>
-          <w:rFonts w:ascii="Arial" w:hAnsi="Arial" w:cs="Arial"/>
-          <w:b/>
-          <w:color w:val="111111"/>
-        </w:rPr>
-      </w:pPr>
-      <w:r>
-        <w:rPr>
-          <w:rFonts w:ascii="Arial" w:hAnsi="Arial" w:cs="Arial"/>
-          <w:b/>
-          <w:color w:val="111111"/>
-        </w:rPr>
-        <w:t>• Falta de coordinación entre equipos de trabajo:</w:t>
-      </w:r>
-    </w:p>
-    <w:p>
-      <w:pPr>
-        <w:spacing w:before="40" w:after="120" w:line="240" w:lineRule="auto"/>
-        <w:jc w:val="both"/>
-        <w:rPr>
-          <w:rFonts w:ascii="Arial" w:hAnsi="Arial" w:cs="Arial"/>
-          <w:color w:val="111111"/>
-        </w:rPr>
-      </w:pPr>
-      <w:r>
-        <w:rPr>
-          <w:rFonts w:ascii="Arial" w:hAnsi="Arial" w:cs="Arial"/>
-          <w:color w:val="111111"/>
-        </w:rPr>
-        <w:t>Al no haber un agente que actúe como coordinador entre los proyectos ni documentación accesible de los sistemas existentes, los distintos equipos de trabajo desconocen las tareas que realizan los demás generando una duplicación de funcionalidades innecesaria.</w:t>
+        <w:t>Algunos sistemas duplican funciones debido a la imposibilidad de integrar la forma en que acceden a las bases de datos más antiguas con nuevos aplicativos. Generando duplicación de funciones al no haber APIs o sistemas que unifiquen la consumición de estos datos.</w:t>
       </w:r>
     </w:p>
     <w:p>
@@ -4126,7 +4126,7 @@
     <w:link w:val="EncabezadoCar"/>
     <w:uiPriority w:val="99"/>
     <w:unhideWhenUsed/>
-    <w:rsid w:val="00E91E5A"/>
+    <w:rsid w:val="007007E3"/>
     <w:pPr>
       <w:tabs>
         <w:tab w:val="center" w:pos="4252"/>
@@ -4140,7 +4140,7 @@
     <w:basedOn w:val="Fuentedeprrafopredeter"/>
     <w:link w:val="Encabezado"/>
     <w:uiPriority w:val="99"/>
-    <w:rsid w:val="00E91E5A"/>
+    <w:rsid w:val="007007E3"/>
   </w:style>
   <w:style w:type="paragraph" w:styleId="Piedepgina">
     <w:name w:val="footer"/>
@@ -4148,7 +4148,7 @@
     <w:link w:val="PiedepginaCar"/>
     <w:uiPriority w:val="99"/>
     <w:unhideWhenUsed/>
-    <w:rsid w:val="00E91E5A"/>
+    <w:rsid w:val="007007E3"/>
     <w:pPr>
       <w:tabs>
         <w:tab w:val="center" w:pos="4252"/>
@@ -4162,7 +4162,7 @@
     <w:basedOn w:val="Fuentedeprrafopredeter"/>
     <w:link w:val="Piedepgina"/>
     <w:uiPriority w:val="99"/>
-    <w:rsid w:val="00E91E5A"/>
+    <w:rsid w:val="007007E3"/>
   </w:style>
 </w:styles>
 </file>

</xml_diff>

<commit_message>
Regenerate complete docx preserving exact FODA
</commit_message>
<xml_diff>
--- a/Plan_Trabajo_Concurso_Jefatura_Software.docx
+++ b/Plan_Trabajo_Concurso_Jefatura_Software.docx
@@ -4126,7 +4126,7 @@
     <w:link w:val="EncabezadoCar"/>
     <w:uiPriority w:val="99"/>
     <w:unhideWhenUsed/>
-    <w:rsid w:val="007007E3"/>
+    <w:rsid w:val="00A66A45"/>
     <w:pPr>
       <w:tabs>
         <w:tab w:val="center" w:pos="4252"/>
@@ -4140,7 +4140,7 @@
     <w:basedOn w:val="Fuentedeprrafopredeter"/>
     <w:link w:val="Encabezado"/>
     <w:uiPriority w:val="99"/>
-    <w:rsid w:val="007007E3"/>
+    <w:rsid w:val="00A66A45"/>
   </w:style>
   <w:style w:type="paragraph" w:styleId="Piedepgina">
     <w:name w:val="footer"/>
@@ -4148,7 +4148,7 @@
     <w:link w:val="PiedepginaCar"/>
     <w:uiPriority w:val="99"/>
     <w:unhideWhenUsed/>
-    <w:rsid w:val="007007E3"/>
+    <w:rsid w:val="00A66A45"/>
     <w:pPr>
       <w:tabs>
         <w:tab w:val="center" w:pos="4252"/>
@@ -4162,7 +4162,7 @@
     <w:basedOn w:val="Fuentedeprrafopredeter"/>
     <w:link w:val="Piedepgina"/>
     <w:uiPriority w:val="99"/>
-    <w:rsid w:val="007007E3"/>
+    <w:rsid w:val="00A66A45"/>
   </w:style>
 </w:styles>
 </file>

</xml_diff>